<commit_message>
Updated based on pre-DAT discussion 12/16
</commit_message>
<xml_diff>
--- a/smt-assessment-v1.docx
+++ b/smt-assessment-v1.docx
@@ -2,7 +2,7 @@
 <file path=word/document.xml><?xml version="1.0" encoding="utf-8"?>
 <w:document xmlns:w="http://schemas.openxmlformats.org/wordprocessingml/2006/main" xmlns:m="http://schemas.openxmlformats.org/officeDocument/2006/math" xmlns:r="http://schemas.openxmlformats.org/officeDocument/2006/relationships" xmlns:o="urn:schemas-microsoft-com:office:office" xmlns:v="urn:schemas-microsoft-com:vml" xmlns:w10="urn:schemas-microsoft-com:office:word" xmlns:a="http://schemas.openxmlformats.org/drawingml/2006/main" xmlns:pic="http://schemas.openxmlformats.org/drawingml/2006/picture" xmlns:wp="http://schemas.openxmlformats.org/drawingml/2006/wordprocessingDrawing">
   <w:body>
-    <w:bookmarkStart w:id="67" w:name="X6826eb71b2e7ccf0cae7c428170c7924ae60314"/>
+    <w:bookmarkStart w:id="63" w:name="X6826eb71b2e7ccf0cae7c428170c7924ae60314"/>
     <w:p>
       <w:pPr>
         <w:pStyle w:val="Heading2"/>
@@ -26,7 +26,7 @@
           <w:i/>
           <w:iCs/>
         </w:rPr>
-        <w:t xml:space="preserve">December 15, 2025</w:t>
+        <w:t xml:space="preserve">December 16, 2025</w:t>
       </w:r>
     </w:p>
     <w:bookmarkStart w:id="20" w:name="executive-summary"/>
@@ -36,14 +36,6 @@
       </w:pPr>
       <w:r>
         <w:t xml:space="preserve">Executive Summary</w:t>
-      </w:r>
-    </w:p>
-    <w:p>
-      <w:pPr>
-        <w:pStyle w:val="FirstParagraph"/>
-      </w:pPr>
-      <w:r>
-        <w:t xml:space="preserve">Section 11.2.4 of the Proposed Action and Section 8.1.4. of the Incidental Take Permit provide that during Entrainment Management, the California Department of Water Resources, in coordination with Reclamation, shall provide State Water Project (SWP) and Central Valley Project (CVP) operational outlooks and assessments on a weekly basis to the Fish and Water Operations Group (FWOG).</w:t>
       </w:r>
     </w:p>
     <w:p>
@@ -55,7 +47,7 @@
         </w:numPr>
       </w:pPr>
       <w:r>
-        <w:t xml:space="preserve">Entrainment Management Season has not yet begun for Delta Smelt but First Flush could occur</w:t>
+        <w:t xml:space="preserve">First flush is not anitipated to occur in the weekly outlook, but could initiate the start of the Entrainment Management season for Delta smelt</w:t>
       </w:r>
     </w:p>
     <w:p>
@@ -67,7 +59,7 @@
         </w:numPr>
       </w:pPr>
       <w:r>
-        <w:t xml:space="preserve">Freeport flows and turbidity are increasing this week due to incoming storms</w:t>
+        <w:t xml:space="preserve">Freeport flows and turbidity are expected to increase late this week due to incoming storms</w:t>
       </w:r>
     </w:p>
     <w:p>
@@ -131,181 +123,29 @@
       </w:r>
     </w:p>
     <w:bookmarkEnd w:id="22"/>
-    <w:bookmarkStart w:id="26" w:name="environmental-conditions"/>
+    <w:bookmarkStart w:id="44" w:name="delta-smelt"/>
     <w:p>
       <w:pPr>
         <w:pStyle w:val="Heading3"/>
       </w:pPr>
       <w:r>
-        <w:t xml:space="preserve">Environmental Conditions</w:t>
-      </w:r>
-    </w:p>
-    <w:bookmarkStart w:id="25" w:name="weather-forecasts"/>
-    <w:p>
-      <w:pPr>
-        <w:pStyle w:val="Heading5"/>
-      </w:pPr>
-      <w:r>
-        <w:t xml:space="preserve">Weather Forecasts</w:t>
-      </w:r>
-    </w:p>
-    <w:p>
-      <w:pPr>
-        <w:pStyle w:val="Compact"/>
+        <w:t xml:space="preserve">Delta Smelt</w:t>
+      </w:r>
+    </w:p>
+    <w:bookmarkStart w:id="34" w:name="biological"/>
+    <w:p>
+      <w:pPr>
+        <w:pStyle w:val="Heading4"/>
+      </w:pPr>
+      <w:r>
+        <w:t xml:space="preserve">Biological</w:t>
+      </w:r>
+    </w:p>
+    <w:p>
+      <w:pPr>
         <w:numPr>
           <w:ilvl w:val="0"/>
           <w:numId w:val="1003"/>
-        </w:numPr>
-      </w:pPr>
-      <w:r>
-        <w:rPr>
-          <w:b/>
-          <w:bCs/>
-        </w:rPr>
-        <w:t xml:space="preserve">Stockton, CA</w:t>
-      </w:r>
-      <w:r>
-        <w:t xml:space="preserve">:</w:t>
-      </w:r>
-    </w:p>
-    <w:p>
-      <w:pPr>
-        <w:pStyle w:val="Compact"/>
-        <w:numPr>
-          <w:ilvl w:val="1"/>
-          <w:numId w:val="1004"/>
-        </w:numPr>
-      </w:pPr>
-      <w:r>
-        <w:t xml:space="preserve">🌧 Tuesday Night: A 30 percent chance of showers after 10pm. Cloudy, with a low around 51. Light southeast wind.</w:t>
-      </w:r>
-    </w:p>
-    <w:p>
-      <w:pPr>
-        <w:pStyle w:val="Compact"/>
-        <w:numPr>
-          <w:ilvl w:val="1"/>
-          <w:numId w:val="1004"/>
-        </w:numPr>
-      </w:pPr>
-      <w:r>
-        <w:t xml:space="preserve">🌧 Wednesday: A 40 percent chance of showers before 10am. Partly sunny, with a high near 63. South southeast wind around 5 mph becoming light and variable in the morning.</w:t>
-      </w:r>
-    </w:p>
-    <w:p>
-      <w:pPr>
-        <w:pStyle w:val="Compact"/>
-        <w:numPr>
-          <w:ilvl w:val="0"/>
-          <w:numId w:val="1003"/>
-        </w:numPr>
-      </w:pPr>
-      <w:r>
-        <w:rPr>
-          <w:b/>
-          <w:bCs/>
-        </w:rPr>
-        <w:t xml:space="preserve">Antioch, CA</w:t>
-      </w:r>
-      <w:r>
-        <w:t xml:space="preserve">:</w:t>
-      </w:r>
-    </w:p>
-    <w:p>
-      <w:pPr>
-        <w:pStyle w:val="Compact"/>
-        <w:numPr>
-          <w:ilvl w:val="1"/>
-          <w:numId w:val="1005"/>
-        </w:numPr>
-      </w:pPr>
-      <w:r>
-        <w:t xml:space="preserve">🌧 Tuesday: A 10 percent chance of rain after 4pm. Mostly cloudy, with a high near 57. Light east northeast wind.</w:t>
-      </w:r>
-    </w:p>
-    <w:p>
-      <w:pPr>
-        <w:pStyle w:val="Compact"/>
-        <w:numPr>
-          <w:ilvl w:val="1"/>
-          <w:numId w:val="1005"/>
-        </w:numPr>
-      </w:pPr>
-      <w:r>
-        <w:t xml:space="preserve">🌧 Tuesday Night: A 50 percent chance of rain, mainly after 10pm. Mostly cloudy, with a low around 56. Southwest wind 6 to 9 mph. New precipitation amounts of less than a tenth of an inch possible.</w:t>
-      </w:r>
-    </w:p>
-    <w:p>
-      <w:pPr>
-        <w:pStyle w:val="Compact"/>
-        <w:numPr>
-          <w:ilvl w:val="0"/>
-          <w:numId w:val="1003"/>
-        </w:numPr>
-      </w:pPr>
-      <w:r>
-        <w:t xml:space="preserve">Weather forecasts for</w:t>
-      </w:r>
-      <w:r>
-        <w:t xml:space="preserve"> </w:t>
-      </w:r>
-      <w:hyperlink r:id="rId23">
-        <w:r>
-          <w:rPr>
-            <w:rStyle w:val="Hyperlink"/>
-          </w:rPr>
-          <w:t xml:space="preserve">Stockton, CA</w:t>
-        </w:r>
-      </w:hyperlink>
-      <w:r>
-        <w:t xml:space="preserve"> </w:t>
-      </w:r>
-      <w:r>
-        <w:t xml:space="preserve">and</w:t>
-      </w:r>
-      <w:r>
-        <w:t xml:space="preserve"> </w:t>
-      </w:r>
-      <w:hyperlink r:id="rId24">
-        <w:r>
-          <w:rPr>
-            <w:rStyle w:val="Hyperlink"/>
-          </w:rPr>
-          <w:t xml:space="preserve">Antioch, CA</w:t>
-        </w:r>
-      </w:hyperlink>
-      <w:r>
-        <w:t xml:space="preserve"> </w:t>
-      </w:r>
-      <w:r>
-        <w:t xml:space="preserve">as of December 15, 2025.</w:t>
-      </w:r>
-    </w:p>
-    <w:bookmarkEnd w:id="25"/>
-    <w:bookmarkEnd w:id="26"/>
-    <w:bookmarkStart w:id="48" w:name="delta-smelt"/>
-    <w:p>
-      <w:pPr>
-        <w:pStyle w:val="Heading3"/>
-      </w:pPr>
-      <w:r>
-        <w:t xml:space="preserve">Delta Smelt</w:t>
-      </w:r>
-    </w:p>
-    <w:bookmarkStart w:id="38" w:name="biological"/>
-    <w:p>
-      <w:pPr>
-        <w:pStyle w:val="Heading4"/>
-      </w:pPr>
-      <w:r>
-        <w:t xml:space="preserve">Biological</w:t>
-      </w:r>
-    </w:p>
-    <w:p>
-      <w:pPr>
-        <w:numPr>
-          <w:ilvl w:val="0"/>
-          <w:numId w:val="1006"/>
         </w:numPr>
       </w:pPr>
       <w:r>
@@ -326,7 +166,7 @@
       <w:pPr>
         <w:numPr>
           <w:ilvl w:val="0"/>
-          <w:numId w:val="1006"/>
+          <w:numId w:val="1003"/>
         </w:numPr>
       </w:pPr>
       <w:r>
@@ -347,7 +187,7 @@
       <w:pPr>
         <w:numPr>
           <w:ilvl w:val="0"/>
-          <w:numId w:val="1006"/>
+          <w:numId w:val="1003"/>
         </w:numPr>
       </w:pPr>
       <w:r>
@@ -368,7 +208,7 @@
       <w:pPr>
         <w:numPr>
           <w:ilvl w:val="0"/>
-          <w:numId w:val="1006"/>
+          <w:numId w:val="1003"/>
         </w:numPr>
       </w:pPr>
       <w:r>
@@ -440,7 +280,7 @@
       <w:pPr>
         <w:numPr>
           <w:ilvl w:val="0"/>
-          <w:numId w:val="1006"/>
+          <w:numId w:val="1003"/>
         </w:numPr>
       </w:pPr>
       <w:r>
@@ -474,11 +314,11 @@
         <w:pStyle w:val="Compact"/>
         <w:numPr>
           <w:ilvl w:val="0"/>
-          <w:numId w:val="1007"/>
+          <w:numId w:val="1004"/>
         </w:numPr>
       </w:pPr>
       <w:r>
-        <w:t xml:space="preserve">Since there are few recent detections of Delta Smelt, the Smelt Monitoring Team’s capacity to estimate where they are within the Delta is limited.</w:t>
+        <w:t xml:space="preserve">Since there are few recent detections of Delta Smelt, estimation of distribution within the Delta is limited.</w:t>
       </w:r>
     </w:p>
     <w:p>
@@ -486,7 +326,7 @@
         <w:pStyle w:val="Compact"/>
         <w:numPr>
           <w:ilvl w:val="0"/>
-          <w:numId w:val="1007"/>
+          <w:numId w:val="1004"/>
         </w:numPr>
       </w:pPr>
       <w:r>
@@ -515,7 +355,7 @@
         <w:pStyle w:val="Compact"/>
         <w:numPr>
           <w:ilvl w:val="0"/>
-          <w:numId w:val="1007"/>
+          <w:numId w:val="1004"/>
         </w:numPr>
       </w:pPr>
       <w:r>
@@ -524,7 +364,7 @@
       <w:r>
         <w:t xml:space="preserve"> </w:t>
       </w:r>
-      <w:hyperlink r:id="rId27">
+      <w:hyperlink r:id="rId23">
         <w:r>
           <w:rPr>
             <w:rStyle w:val="Hyperlink"/>
@@ -546,7 +386,7 @@
       <w:tr>
         <w:tc>
           <w:tcPr/>
-          <w:bookmarkStart w:id="28" w:name="tbl-ds-recent-catch"/>
+          <w:bookmarkStart w:id="24" w:name="tbl-ds-recent-catch"/>
           <w:p>
             <w:pPr>
               <w:jc w:val="center"/>
@@ -978,7 +818,7 @@
               </w:tc>
             </w:tr>
           </w:tbl>
-          <w:bookmarkEnd w:id="28"/>
+          <w:bookmarkEnd w:id="24"/>
           <w:p/>
         </w:tc>
       </w:tr>
@@ -996,7 +836,7 @@
       <w:tr>
         <w:tc>
           <w:tcPr/>
-          <w:bookmarkStart w:id="32" w:name="fig-ds-map"/>
+          <w:bookmarkStart w:id="28" w:name="fig-ds-map"/>
           <w:p>
             <w:pPr>
               <w:pStyle w:val="Compact"/>
@@ -1007,18 +847,18 @@
                 <wp:inline>
                   <wp:extent cx="5334000" cy="4667250"/>
                   <wp:effectExtent b="0" l="0" r="0" t="0"/>
-                  <wp:docPr descr="" title="" id="30" name="Picture"/>
+                  <wp:docPr descr="" title="" id="26" name="Picture"/>
                   <a:graphic>
                     <a:graphicData uri="http://schemas.openxmlformats.org/drawingml/2006/picture">
                       <pic:pic>
                         <pic:nvPicPr>
-                          <pic:cNvPr descr="smt-assessment-v1_files/figure-docx/fig-ds-map-1.png" id="31" name="Picture"/>
+                          <pic:cNvPr descr="smt-assessment-v1_files/figure-docx/fig-ds-map-1.png" id="27" name="Picture"/>
                           <pic:cNvPicPr>
                             <a:picLocks noChangeArrowheads="1" noChangeAspect="1"/>
                           </pic:cNvPicPr>
                         </pic:nvPicPr>
                         <pic:blipFill>
-                          <a:blip r:embed="rId29"/>
+                          <a:blip r:embed="rId25"/>
                           <a:stretch>
                             <a:fillRect/>
                           </a:stretch>
@@ -1058,7 +898,7 @@
               <w:t xml:space="preserve">Figure 1: Delta Smelt Distribution for WY 2026</w:t>
             </w:r>
           </w:p>
-          <w:bookmarkEnd w:id="32"/>
+          <w:bookmarkEnd w:id="28"/>
         </w:tc>
       </w:tr>
     </w:tbl>
@@ -1075,7 +915,7 @@
       <w:tr>
         <w:tc>
           <w:tcPr/>
-          <w:bookmarkStart w:id="33" w:name="tbl-catch-all"/>
+          <w:bookmarkStart w:id="29" w:name="tbl-catch-all"/>
           <w:p>
             <w:pPr>
               <w:jc w:val="center"/>
@@ -1321,7 +1161,7 @@
               </w:tc>
             </w:tr>
           </w:tbl>
-          <w:bookmarkEnd w:id="33"/>
+          <w:bookmarkEnd w:id="29"/>
           <w:p/>
         </w:tc>
       </w:tr>
@@ -1339,7 +1179,7 @@
       <w:tr>
         <w:tc>
           <w:tcPr/>
-          <w:bookmarkStart w:id="37" w:name="fig-ds-catch"/>
+          <w:bookmarkStart w:id="33" w:name="fig-ds-catch"/>
           <w:p>
             <w:pPr>
               <w:pStyle w:val="Compact"/>
@@ -1350,18 +1190,18 @@
                 <wp:inline>
                   <wp:extent cx="4620126" cy="3696101"/>
                   <wp:effectExtent b="0" l="0" r="0" t="0"/>
-                  <wp:docPr descr="" title="" id="35" name="Picture"/>
+                  <wp:docPr descr="" title="" id="31" name="Picture"/>
                   <a:graphic>
                     <a:graphicData uri="http://schemas.openxmlformats.org/drawingml/2006/picture">
                       <pic:pic>
                         <pic:nvPicPr>
-                          <pic:cNvPr descr="smt-assessment-v1_files/figure-docx/fig-ds-catch-1.png" id="36" name="Picture"/>
+                          <pic:cNvPr descr="smt-assessment-v1_files/figure-docx/fig-ds-catch-1.png" id="32" name="Picture"/>
                           <pic:cNvPicPr>
                             <a:picLocks noChangeArrowheads="1" noChangeAspect="1"/>
                           </pic:cNvPicPr>
                         </pic:nvPicPr>
                         <pic:blipFill>
-                          <a:blip r:embed="rId34"/>
+                          <a:blip r:embed="rId30"/>
                           <a:stretch>
                             <a:fillRect/>
                           </a:stretch>
@@ -1401,12 +1241,12 @@
               <w:t xml:space="preserve">Figure 2: Time Series of Delta Smelt Catch, WY 2026</w:t>
             </w:r>
           </w:p>
-          <w:bookmarkEnd w:id="37"/>
+          <w:bookmarkEnd w:id="33"/>
         </w:tc>
       </w:tr>
     </w:tbl>
-    <w:bookmarkEnd w:id="38"/>
-    <w:bookmarkStart w:id="43" w:name="environmental"/>
+    <w:bookmarkEnd w:id="34"/>
+    <w:bookmarkStart w:id="39" w:name="environmental"/>
     <w:p>
       <w:pPr>
         <w:pStyle w:val="Heading4"/>
@@ -1415,7 +1255,7 @@
         <w:t xml:space="preserve">Environmental</w:t>
       </w:r>
     </w:p>
-    <w:bookmarkStart w:id="42" w:name="first-flush"/>
+    <w:bookmarkStart w:id="38" w:name="first-flush"/>
     <w:p>
       <w:pPr>
         <w:pStyle w:val="Heading5"/>
@@ -1444,7 +1284,7 @@
         <w:pStyle w:val="Compact"/>
         <w:numPr>
           <w:ilvl w:val="0"/>
-          <w:numId w:val="1008"/>
+          <w:numId w:val="1005"/>
         </w:numPr>
       </w:pPr>
       <w:r>
@@ -1455,7 +1295,7 @@
         <w:t xml:space="preserve">FPT Flow (3-day average)</w:t>
       </w:r>
       <w:r>
-        <w:t xml:space="preserve">: 9835.33 cfs as of Dec 14, 2025</w:t>
+        <w:t xml:space="preserve">: 9925 cfs as of Dec 15, 2025</w:t>
       </w:r>
     </w:p>
     <w:p>
@@ -1463,7 +1303,7 @@
         <w:pStyle w:val="Compact"/>
         <w:numPr>
           <w:ilvl w:val="0"/>
-          <w:numId w:val="1008"/>
+          <w:numId w:val="1005"/>
         </w:numPr>
       </w:pPr>
       <w:r>
@@ -1474,7 +1314,7 @@
         <w:t xml:space="preserve">FPT Turbidity (3-day average)</w:t>
       </w:r>
       <w:r>
-        <w:t xml:space="preserve">: 6.69 FNU as of Dec 14, 2025</w:t>
+        <w:t xml:space="preserve">: 7.03 FNU as of Dec 15, 2025</w:t>
       </w:r>
     </w:p>
     <w:p>
@@ -1486,18 +1326,18 @@
           <wp:inline>
             <wp:extent cx="4533900" cy="3238500"/>
             <wp:effectExtent b="0" l="0" r="0" t="0"/>
-            <wp:docPr descr="" title="" id="40" name="Picture"/>
+            <wp:docPr descr="" title="" id="36" name="Picture"/>
             <a:graphic>
               <a:graphicData uri="http://schemas.openxmlformats.org/drawingml/2006/picture">
                 <pic:pic>
                   <pic:nvPicPr>
-                    <pic:cNvPr descr="smelt_figures/freeport_flow.png" id="41" name="Picture"/>
+                    <pic:cNvPr descr="smelt_figures/freeport_flow.png" id="37" name="Picture"/>
                     <pic:cNvPicPr>
                       <a:picLocks noChangeArrowheads="1" noChangeAspect="1"/>
                     </pic:cNvPicPr>
                   </pic:nvPicPr>
                   <pic:blipFill>
-                    <a:blip r:embed="rId39"/>
+                    <a:blip r:embed="rId35"/>
                     <a:stretch>
                       <a:fillRect/>
                     </a:stretch>
@@ -1524,9 +1364,9 @@
         </w:drawing>
       </w:r>
     </w:p>
-    <w:bookmarkEnd w:id="42"/>
-    <w:bookmarkEnd w:id="43"/>
-    <w:bookmarkStart w:id="47" w:name="real-time-assessment-thresholds"/>
+    <w:bookmarkEnd w:id="38"/>
+    <w:bookmarkEnd w:id="39"/>
+    <w:bookmarkStart w:id="43" w:name="real-time-assessment-thresholds"/>
     <w:p>
       <w:pPr>
         <w:pStyle w:val="Heading4"/>
@@ -1540,14 +1380,14 @@
         <w:pStyle w:val="Compact"/>
         <w:numPr>
           <w:ilvl w:val="0"/>
-          <w:numId w:val="1009"/>
+          <w:numId w:val="1006"/>
         </w:numPr>
       </w:pPr>
       <w:r>
         <w:t xml:space="preserve">Jersey Point Flow (JPF): Reclamation and DWR would compute JPF based on San Joaquin River Inflow at Vernalis, Cosumnes River Inflow, Mokelumne River Inflow, Calaveras River Inflow, Flow from Sacramento River through DCC, Flow from Sacramento River through Georgiana Slough, 65% of in-Delta precipitation, -65% of in-Delta diversions, and -Export Pumping at (Banks + Jones).</w:t>
       </w:r>
     </w:p>
-    <w:bookmarkStart w:id="45" w:name="adult-delta-smelt"/>
+    <w:bookmarkStart w:id="41" w:name="adult-delta-smelt"/>
     <w:p>
       <w:pPr>
         <w:pStyle w:val="Heading5"/>
@@ -1561,7 +1401,7 @@
         <w:pStyle w:val="Compact"/>
         <w:numPr>
           <w:ilvl w:val="0"/>
-          <w:numId w:val="1010"/>
+          <w:numId w:val="1007"/>
         </w:numPr>
       </w:pPr>
       <w:r>
@@ -1573,7 +1413,7 @@
         <w:pStyle w:val="Compact"/>
         <w:numPr>
           <w:ilvl w:val="0"/>
-          <w:numId w:val="1011"/>
+          <w:numId w:val="1008"/>
         </w:numPr>
       </w:pPr>
       <w:r>
@@ -1582,7 +1422,7 @@
       <w:r>
         <w:t xml:space="preserve"> </w:t>
       </w:r>
-      <w:hyperlink r:id="rId44">
+      <w:hyperlink r:id="rId40">
         <w:r>
           <w:rPr>
             <w:rStyle w:val="Hyperlink"/>
@@ -1600,8 +1440,8 @@
         <w:t xml:space="preserve"> </w:t>
       </w:r>
     </w:p>
-    <w:bookmarkEnd w:id="45"/>
-    <w:bookmarkStart w:id="46" w:name="larvaljuvenile-delta-smelt"/>
+    <w:bookmarkEnd w:id="41"/>
+    <w:bookmarkStart w:id="42" w:name="larvaljuvenile-delta-smelt"/>
     <w:p>
       <w:pPr>
         <w:pStyle w:val="Heading5"/>
@@ -1615,17 +1455,17 @@
         <w:pStyle w:val="Compact"/>
         <w:numPr>
           <w:ilvl w:val="0"/>
-          <w:numId w:val="1012"/>
+          <w:numId w:val="1009"/>
         </w:numPr>
       </w:pPr>
       <w:r>
         <w:t xml:space="preserve">Not relevant</w:t>
       </w:r>
     </w:p>
-    <w:bookmarkEnd w:id="46"/>
-    <w:bookmarkEnd w:id="47"/>
-    <w:bookmarkEnd w:id="48"/>
-    <w:bookmarkStart w:id="64" w:name="longfin-smelt"/>
+    <w:bookmarkEnd w:id="42"/>
+    <w:bookmarkEnd w:id="43"/>
+    <w:bookmarkEnd w:id="44"/>
+    <w:bookmarkStart w:id="60" w:name="longfin-smelt"/>
     <w:p>
       <w:pPr>
         <w:pStyle w:val="Heading3"/>
@@ -1634,7 +1474,7 @@
         <w:t xml:space="preserve">Longfin Smelt</w:t>
       </w:r>
     </w:p>
-    <w:bookmarkStart w:id="59" w:name="biological-1"/>
+    <w:bookmarkStart w:id="55" w:name="biological-1"/>
     <w:p>
       <w:pPr>
         <w:pStyle w:val="Heading4"/>
@@ -1647,7 +1487,7 @@
       <w:pPr>
         <w:numPr>
           <w:ilvl w:val="0"/>
-          <w:numId w:val="1013"/>
+          <w:numId w:val="1010"/>
         </w:numPr>
       </w:pPr>
       <w:r>
@@ -1661,14 +1501,14 @@
         <w:t xml:space="preserve"> </w:t>
       </w:r>
       <w:r>
-        <w:t xml:space="preserve">Juvenile, Adult</w:t>
+        <w:t xml:space="preserve">Adult, Juvenile</w:t>
       </w:r>
     </w:p>
     <w:p>
       <w:pPr>
         <w:numPr>
           <w:ilvl w:val="0"/>
-          <w:numId w:val="1013"/>
+          <w:numId w:val="1010"/>
         </w:numPr>
       </w:pPr>
       <w:r>
@@ -1682,7 +1522,7 @@
         <w:t xml:space="preserve"> </w:t>
       </w:r>
       <w:r>
-        <w:t xml:space="preserve">11 adult Longfin Smelt and 29 juvenile Longfin smelt have been detected this water year. See</w:t>
+        <w:t xml:space="preserve">13 adult Longfin Smelt and 31 juvenile Longfin smelt have been detected this water year. See</w:t>
       </w:r>
       <w:r>
         <w:t xml:space="preserve"> </w:t>
@@ -1740,7 +1580,7 @@
       <w:pPr>
         <w:numPr>
           <w:ilvl w:val="0"/>
-          <w:numId w:val="1013"/>
+          <w:numId w:val="1010"/>
         </w:numPr>
       </w:pPr>
       <w:r>
@@ -1773,7 +1613,7 @@
       <w:tr>
         <w:tc>
           <w:tcPr/>
-          <w:bookmarkStart w:id="49" w:name="tbl-lfs-recent-catch"/>
+          <w:bookmarkStart w:id="45" w:name="tbl-lfs-recent-catch"/>
           <w:p>
             <w:pPr>
               <w:jc w:val="center"/>
@@ -2204,8 +2044,168 @@
                 </w:p>
               </w:tc>
             </w:tr>
+            <w:tr>
+              <w:tc>
+                <w:tcPr/>
+                <w:p>
+                  <w:pPr>
+                    <w:pStyle w:val="Compact"/>
+                    <w:jc w:val="left"/>
+                    <w:jc w:val="center"/>
+                  </w:pPr>
+                  <w:r>
+                    <w:t xml:space="preserve">edsm</w:t>
+                  </w:r>
+                </w:p>
+              </w:tc>
+              <w:tc>
+                <w:tcPr/>
+                <w:p>
+                  <w:pPr>
+                    <w:pStyle w:val="Compact"/>
+                    <w:jc w:val="left"/>
+                    <w:jc w:val="center"/>
+                  </w:pPr>
+                  <w:r>
+                    <w:t xml:space="preserve">2025-12-15</w:t>
+                  </w:r>
+                </w:p>
+              </w:tc>
+              <w:tc>
+                <w:tcPr/>
+                <w:p>
+                  <w:pPr>
+                    <w:pStyle w:val="Compact"/>
+                    <w:jc w:val="left"/>
+                    <w:jc w:val="center"/>
+                  </w:pPr>
+                  <w:r>
+                    <w:t xml:space="preserve">West</w:t>
+                  </w:r>
+                </w:p>
+              </w:tc>
+              <w:tc>
+                <w:tcPr/>
+                <w:p>
+                  <w:pPr>
+                    <w:pStyle w:val="Compact"/>
+                    <w:jc w:val="left"/>
+                    <w:jc w:val="center"/>
+                  </w:pPr>
+                  <w:r>
+                    <w:t xml:space="preserve">Suisun Bay</w:t>
+                  </w:r>
+                </w:p>
+              </w:tc>
+              <w:tc>
+                <w:tcPr/>
+                <w:p>
+                  <w:pPr>
+                    <w:pStyle w:val="Compact"/>
+                    <w:jc w:val="left"/>
+                    <w:jc w:val="center"/>
+                  </w:pPr>
+                  <w:r>
+                    <w:t xml:space="preserve">Adult</w:t>
+                  </w:r>
+                </w:p>
+              </w:tc>
+              <w:tc>
+                <w:tcPr/>
+                <w:p>
+                  <w:pPr>
+                    <w:pStyle w:val="Compact"/>
+                    <w:jc w:val="right"/>
+                    <w:jc w:val="center"/>
+                  </w:pPr>
+                  <w:r>
+                    <w:t xml:space="preserve">2</w:t>
+                  </w:r>
+                </w:p>
+              </w:tc>
+            </w:tr>
+            <w:tr>
+              <w:tc>
+                <w:tcPr/>
+                <w:p>
+                  <w:pPr>
+                    <w:pStyle w:val="Compact"/>
+                    <w:jc w:val="left"/>
+                    <w:jc w:val="center"/>
+                  </w:pPr>
+                  <w:r>
+                    <w:t xml:space="preserve">edsm</w:t>
+                  </w:r>
+                </w:p>
+              </w:tc>
+              <w:tc>
+                <w:tcPr/>
+                <w:p>
+                  <w:pPr>
+                    <w:pStyle w:val="Compact"/>
+                    <w:jc w:val="left"/>
+                    <w:jc w:val="center"/>
+                  </w:pPr>
+                  <w:r>
+                    <w:t xml:space="preserve">2025-12-15</w:t>
+                  </w:r>
+                </w:p>
+              </w:tc>
+              <w:tc>
+                <w:tcPr/>
+                <w:p>
+                  <w:pPr>
+                    <w:pStyle w:val="Compact"/>
+                    <w:jc w:val="left"/>
+                    <w:jc w:val="center"/>
+                  </w:pPr>
+                  <w:r>
+                    <w:t xml:space="preserve">West</w:t>
+                  </w:r>
+                </w:p>
+              </w:tc>
+              <w:tc>
+                <w:tcPr/>
+                <w:p>
+                  <w:pPr>
+                    <w:pStyle w:val="Compact"/>
+                    <w:jc w:val="left"/>
+                    <w:jc w:val="center"/>
+                  </w:pPr>
+                  <w:r>
+                    <w:t xml:space="preserve">Suisun Bay</w:t>
+                  </w:r>
+                </w:p>
+              </w:tc>
+              <w:tc>
+                <w:tcPr/>
+                <w:p>
+                  <w:pPr>
+                    <w:pStyle w:val="Compact"/>
+                    <w:jc w:val="left"/>
+                    <w:jc w:val="center"/>
+                  </w:pPr>
+                  <w:r>
+                    <w:t xml:space="preserve">Juvenile</w:t>
+                  </w:r>
+                </w:p>
+              </w:tc>
+              <w:tc>
+                <w:tcPr/>
+                <w:p>
+                  <w:pPr>
+                    <w:pStyle w:val="Compact"/>
+                    <w:jc w:val="right"/>
+                    <w:jc w:val="center"/>
+                  </w:pPr>
+                  <w:r>
+                    <w:t xml:space="preserve">2</w:t>
+                  </w:r>
+                </w:p>
+              </w:tc>
+            </w:tr>
           </w:tbl>
-          <w:bookmarkEnd w:id="49"/>
+          <w:bookmarkEnd w:id="45"/>
           <w:p/>
         </w:tc>
       </w:tr>
@@ -2223,7 +2223,7 @@
       <w:tr>
         <w:tc>
           <w:tcPr/>
-          <w:bookmarkStart w:id="53" w:name="fig-lfs-map"/>
+          <w:bookmarkStart w:id="49" w:name="fig-lfs-map"/>
           <w:p>
             <w:pPr>
               <w:pStyle w:val="Compact"/>
@@ -2234,18 +2234,18 @@
                 <wp:inline>
                   <wp:extent cx="5334000" cy="4667250"/>
                   <wp:effectExtent b="0" l="0" r="0" t="0"/>
-                  <wp:docPr descr="" title="" id="51" name="Picture"/>
+                  <wp:docPr descr="" title="" id="47" name="Picture"/>
                   <a:graphic>
                     <a:graphicData uri="http://schemas.openxmlformats.org/drawingml/2006/picture">
                       <pic:pic>
                         <pic:nvPicPr>
-                          <pic:cNvPr descr="smt-assessment-v1_files/figure-docx/fig-lfs-map-1.png" id="52" name="Picture"/>
+                          <pic:cNvPr descr="smt-assessment-v1_files/figure-docx/fig-lfs-map-1.png" id="48" name="Picture"/>
                           <pic:cNvPicPr>
                             <a:picLocks noChangeArrowheads="1" noChangeAspect="1"/>
                           </pic:cNvPicPr>
                         </pic:nvPicPr>
                         <pic:blipFill>
-                          <a:blip r:embed="rId50"/>
+                          <a:blip r:embed="rId46"/>
                           <a:stretch>
                             <a:fillRect/>
                           </a:stretch>
@@ -2285,7 +2285,7 @@
               <w:t xml:space="preserve">Figure 3: Longfin Smelt Distribution for WY 2026</w:t>
             </w:r>
           </w:p>
-          <w:bookmarkEnd w:id="53"/>
+          <w:bookmarkEnd w:id="49"/>
         </w:tc>
       </w:tr>
     </w:tbl>
@@ -2302,7 +2302,7 @@
       <w:tr>
         <w:tc>
           <w:tcPr/>
-          <w:bookmarkStart w:id="54" w:name="tbl-lfs-catch-all"/>
+          <w:bookmarkStart w:id="50" w:name="tbl-lfs-catch-all"/>
           <w:p>
             <w:pPr>
               <w:jc w:val="center"/>
@@ -2542,7 +2542,7 @@
                     <w:jc w:val="center"/>
                   </w:pPr>
                   <w:r>
-                    <w:t xml:space="preserve">9</w:t>
+                    <w:t xml:space="preserve">11</w:t>
                   </w:r>
                 </w:p>
               </w:tc>
@@ -2596,13 +2596,13 @@
                     <w:jc w:val="center"/>
                   </w:pPr>
                   <w:r>
-                    <w:t xml:space="preserve">23</w:t>
+                    <w:t xml:space="preserve">25</w:t>
                   </w:r>
                 </w:p>
               </w:tc>
             </w:tr>
           </w:tbl>
-          <w:bookmarkEnd w:id="54"/>
+          <w:bookmarkEnd w:id="50"/>
           <w:p/>
         </w:tc>
       </w:tr>
@@ -2620,7 +2620,7 @@
       <w:tr>
         <w:tc>
           <w:tcPr/>
-          <w:bookmarkStart w:id="58" w:name="fig-lfs-catch"/>
+          <w:bookmarkStart w:id="54" w:name="fig-lfs-catch"/>
           <w:p>
             <w:pPr>
               <w:pStyle w:val="Compact"/>
@@ -2631,18 +2631,18 @@
                 <wp:inline>
                   <wp:extent cx="4620126" cy="3696101"/>
                   <wp:effectExtent b="0" l="0" r="0" t="0"/>
-                  <wp:docPr descr="" title="" id="56" name="Picture"/>
+                  <wp:docPr descr="" title="" id="52" name="Picture"/>
                   <a:graphic>
                     <a:graphicData uri="http://schemas.openxmlformats.org/drawingml/2006/picture">
                       <pic:pic>
                         <pic:nvPicPr>
-                          <pic:cNvPr descr="smt-assessment-v1_files/figure-docx/fig-lfs-catch-1.png" id="57" name="Picture"/>
+                          <pic:cNvPr descr="smt-assessment-v1_files/figure-docx/fig-lfs-catch-1.png" id="53" name="Picture"/>
                           <pic:cNvPicPr>
                             <a:picLocks noChangeArrowheads="1" noChangeAspect="1"/>
                           </pic:cNvPicPr>
                         </pic:nvPicPr>
                         <pic:blipFill>
-                          <a:blip r:embed="rId55"/>
+                          <a:blip r:embed="rId51"/>
                           <a:stretch>
                             <a:fillRect/>
                           </a:stretch>
@@ -2682,21 +2682,21 @@
               <w:t xml:space="preserve">Figure 4: Time Series of Longfin Smelt Catch, WY 2026</w:t>
             </w:r>
           </w:p>
-          <w:bookmarkEnd w:id="58"/>
+          <w:bookmarkEnd w:id="54"/>
         </w:tc>
       </w:tr>
     </w:tbl>
-    <w:bookmarkEnd w:id="59"/>
-    <w:bookmarkStart w:id="63" w:name="real-time-asessment-thresholds"/>
+    <w:bookmarkEnd w:id="55"/>
+    <w:bookmarkStart w:id="59" w:name="real-time-assessment-thresholds-1"/>
     <w:p>
       <w:pPr>
         <w:pStyle w:val="Heading4"/>
       </w:pPr>
       <w:r>
-        <w:t xml:space="preserve">Real-time Asessment Thresholds</w:t>
-      </w:r>
-    </w:p>
-    <w:bookmarkStart w:id="60" w:name="X20cb4fe57c6f57bc33c1a6af910e71e88796402"/>
+        <w:t xml:space="preserve">Real-time Assessment Thresholds</w:t>
+      </w:r>
+    </w:p>
+    <w:bookmarkStart w:id="56" w:name="X20cb4fe57c6f57bc33c1a6af910e71e88796402"/>
     <w:p>
       <w:pPr>
         <w:pStyle w:val="Heading5"/>
@@ -2710,7 +2710,7 @@
         <w:pStyle w:val="Compact"/>
         <w:numPr>
           <w:ilvl w:val="0"/>
-          <w:numId w:val="1014"/>
+          <w:numId w:val="1011"/>
         </w:numPr>
       </w:pPr>
       <w:r>
@@ -2722,11 +2722,11 @@
         <w:pStyle w:val="Compact"/>
         <w:numPr>
           <w:ilvl w:val="1"/>
-          <w:numId w:val="1015"/>
+          <w:numId w:val="1012"/>
         </w:numPr>
       </w:pPr>
       <w:r>
-        <w:t xml:space="preserve">7-day average JPF: -607.94 as of Dec 14, 2025</w:t>
+        <w:t xml:space="preserve">7-day average JPF: -616.81 cfs as of Dec 15, 2025</w:t>
       </w:r>
     </w:p>
     <w:p>
@@ -2734,15 +2734,15 @@
         <w:pStyle w:val="Compact"/>
         <w:numPr>
           <w:ilvl w:val="1"/>
-          <w:numId w:val="1015"/>
+          <w:numId w:val="1012"/>
         </w:numPr>
       </w:pPr>
       <w:r>
         <w:t xml:space="preserve">Water year total Age 1+ longfin smelt salvage = 0</w:t>
       </w:r>
     </w:p>
-    <w:bookmarkEnd w:id="60"/>
-    <w:bookmarkStart w:id="61" w:name="adult-longfin-smelt"/>
+    <w:bookmarkEnd w:id="56"/>
+    <w:bookmarkStart w:id="57" w:name="adult-longfin-smelt"/>
     <w:p>
       <w:pPr>
         <w:pStyle w:val="Heading5"/>
@@ -2756,7 +2756,7 @@
         <w:pStyle w:val="Compact"/>
         <w:numPr>
           <w:ilvl w:val="0"/>
-          <w:numId w:val="1016"/>
+          <w:numId w:val="1013"/>
         </w:numPr>
       </w:pPr>
       <w:r>
@@ -2768,11 +2768,11 @@
         <w:pStyle w:val="Compact"/>
         <w:numPr>
           <w:ilvl w:val="1"/>
-          <w:numId w:val="1017"/>
+          <w:numId w:val="1014"/>
         </w:numPr>
       </w:pPr>
       <w:r>
-        <w:t xml:space="preserve">7-day average JPF: -607.94 as of Dec 14, 2025</w:t>
+        <w:t xml:space="preserve">7-day average JPF: -616.81 cfs as of Dec 15, 2025</w:t>
       </w:r>
     </w:p>
     <w:p>
@@ -2780,15 +2780,15 @@
         <w:pStyle w:val="Compact"/>
         <w:numPr>
           <w:ilvl w:val="1"/>
-          <w:numId w:val="1017"/>
+          <w:numId w:val="1014"/>
         </w:numPr>
       </w:pPr>
       <w:r>
         <w:t xml:space="preserve">Water year total adult longfin smelt salvage = 0</w:t>
       </w:r>
     </w:p>
-    <w:bookmarkEnd w:id="61"/>
-    <w:bookmarkStart w:id="62" w:name="larvaljuvenile-longfin-smelt"/>
+    <w:bookmarkEnd w:id="57"/>
+    <w:bookmarkStart w:id="58" w:name="larvaljuvenile-longfin-smelt"/>
     <w:p>
       <w:pPr>
         <w:pStyle w:val="Heading5"/>
@@ -2802,7 +2802,7 @@
         <w:pStyle w:val="Compact"/>
         <w:numPr>
           <w:ilvl w:val="0"/>
-          <w:numId w:val="1018"/>
+          <w:numId w:val="1015"/>
         </w:numPr>
       </w:pPr>
       <w:r>
@@ -2814,17 +2814,17 @@
         <w:pStyle w:val="Compact"/>
         <w:numPr>
           <w:ilvl w:val="1"/>
-          <w:numId w:val="1019"/>
+          <w:numId w:val="1016"/>
         </w:numPr>
       </w:pPr>
       <w:r>
-        <w:t xml:space="preserve">7-day average JPF: -607.94 as of Dec 14, 2025</w:t>
-      </w:r>
-    </w:p>
-    <w:bookmarkEnd w:id="62"/>
-    <w:bookmarkEnd w:id="63"/>
-    <w:bookmarkEnd w:id="64"/>
-    <w:bookmarkStart w:id="65" w:name="end-of-smelt-omr-management"/>
+        <w:t xml:space="preserve">7-day average JPF: -616.81 cfs as of Dec 15, 2025</w:t>
+      </w:r>
+    </w:p>
+    <w:bookmarkEnd w:id="58"/>
+    <w:bookmarkEnd w:id="59"/>
+    <w:bookmarkEnd w:id="60"/>
+    <w:bookmarkStart w:id="61" w:name="end-of-smelt-omr-management"/>
     <w:p>
       <w:pPr>
         <w:pStyle w:val="Heading3"/>
@@ -2838,15 +2838,15 @@
         <w:pStyle w:val="Compact"/>
         <w:numPr>
           <w:ilvl w:val="0"/>
-          <w:numId w:val="1020"/>
+          <w:numId w:val="1017"/>
         </w:numPr>
       </w:pPr>
       <w:r>
         <w:t xml:space="preserve">Not relevant</w:t>
       </w:r>
     </w:p>
-    <w:bookmarkEnd w:id="65"/>
-    <w:bookmarkStart w:id="66" w:name="references"/>
+    <w:bookmarkEnd w:id="61"/>
+    <w:bookmarkStart w:id="62" w:name="references"/>
     <w:p>
       <w:pPr>
         <w:pStyle w:val="Heading3"/>
@@ -2855,8 +2855,8 @@
         <w:t xml:space="preserve">References</w:t>
       </w:r>
     </w:p>
-    <w:bookmarkEnd w:id="66"/>
-    <w:bookmarkEnd w:id="67"/>
+    <w:bookmarkEnd w:id="62"/>
+    <w:bookmarkEnd w:id="63"/>
     <w:sectPr>
       <w:footnotePr>
         <w:numRestart w:val="eachSect"/>
@@ -3122,15 +3122,6 @@
     <w:abstractNumId w:val="991"/>
   </w:num>
   <w:num w:numId="1017">
-    <w:abstractNumId w:val="991"/>
-  </w:num>
-  <w:num w:numId="1018">
-    <w:abstractNumId w:val="991"/>
-  </w:num>
-  <w:num w:numId="1019">
-    <w:abstractNumId w:val="991"/>
-  </w:num>
-  <w:num w:numId="1020">
     <w:abstractNumId w:val="991"/>
   </w:num>
 </w:numbering>

</xml_diff>

<commit_message>
Edits for 12/30 smelt assessment. Updated catch code, added beach seine, added bay study
</commit_message>
<xml_diff>
--- a/smt-assessment-v1.docx
+++ b/smt-assessment-v1.docx
@@ -2,7 +2,7 @@
 <file path=word/document.xml><?xml version="1.0" encoding="utf-8"?>
 <w:document xmlns:w="http://schemas.openxmlformats.org/wordprocessingml/2006/main" xmlns:m="http://schemas.openxmlformats.org/officeDocument/2006/math" xmlns:r="http://schemas.openxmlformats.org/officeDocument/2006/relationships" xmlns:o="urn:schemas-microsoft-com:office:office" xmlns:v="urn:schemas-microsoft-com:vml" xmlns:w10="urn:schemas-microsoft-com:office:word" xmlns:a="http://schemas.openxmlformats.org/drawingml/2006/main" xmlns:pic="http://schemas.openxmlformats.org/drawingml/2006/picture" xmlns:wp="http://schemas.openxmlformats.org/drawingml/2006/wordprocessingDrawing">
   <w:body>
-    <w:bookmarkStart w:id="63" w:name="X6826eb71b2e7ccf0cae7c428170c7924ae60314"/>
+    <w:bookmarkStart w:id="70" w:name="X6826eb71b2e7ccf0cae7c428170c7924ae60314"/>
     <w:p>
       <w:pPr>
         <w:pStyle w:val="Heading2"/>
@@ -26,7 +26,7 @@
           <w:i/>
           <w:iCs/>
         </w:rPr>
-        <w:t xml:space="preserve">December 16, 2025</w:t>
+        <w:t xml:space="preserve">December 29, 2025</w:t>
       </w:r>
     </w:p>
     <w:bookmarkStart w:id="20" w:name="executive-summary"/>
@@ -47,7 +47,7 @@
         </w:numPr>
       </w:pPr>
       <w:r>
-        <w:t xml:space="preserve">First flush is not anitipated to occur in the weekly outlook, but could initiate the start of the Entrainment Management season for Delta smelt</w:t>
+        <w:t xml:space="preserve">Sacramento River turbidity and flows (Freeport) will likely exceed First Flush criteria this week, which will start the entrainment management season</w:t>
       </w:r>
     </w:p>
     <w:p>
@@ -59,19 +59,7 @@
         </w:numPr>
       </w:pPr>
       <w:r>
-        <w:t xml:space="preserve">Freeport flows and turbidity are expected to increase late this week due to incoming storms</w:t>
-      </w:r>
-    </w:p>
-    <w:p>
-      <w:pPr>
-        <w:pStyle w:val="Compact"/>
-        <w:numPr>
-          <w:ilvl w:val="0"/>
-          <w:numId w:val="1001"/>
-        </w:numPr>
-      </w:pPr>
-      <w:r>
-        <w:t xml:space="preserve">No Delta Smelt salvage has been observed this water year</w:t>
+        <w:t xml:space="preserve">No Delta smelt or longfin smelt salvage has been observed this water year</w:t>
       </w:r>
     </w:p>
     <w:bookmarkEnd w:id="20"/>
@@ -123,7 +111,7 @@
       </w:r>
     </w:p>
     <w:bookmarkEnd w:id="22"/>
-    <w:bookmarkStart w:id="44" w:name="delta-smelt"/>
+    <w:bookmarkStart w:id="50" w:name="delta-smelt"/>
     <w:p>
       <w:pPr>
         <w:pStyle w:val="Heading3"/>
@@ -159,7 +147,7 @@
         <w:t xml:space="preserve"> </w:t>
       </w:r>
       <w:r>
-        <w:t xml:space="preserve">Adult, Juvenile</w:t>
+        <w:t xml:space="preserve">Juvenile, Adult</w:t>
       </w:r>
     </w:p>
     <w:p>
@@ -180,7 +168,7 @@
         <w:t xml:space="preserve"> </w:t>
       </w:r>
       <w:r>
-        <w:t xml:space="preserve">10092 (95% CL: 2,302 to 29,101) as of the week of December 8–12, 2025</w:t>
+        <w:t xml:space="preserve">3081 (95% CL: 359 to 11,902) as of the week of December 21–26, 2025</w:t>
       </w:r>
     </w:p>
     <w:p>
@@ -201,7 +189,7 @@
         <w:t xml:space="preserve"> </w:t>
       </w:r>
       <w:r>
-        <w:t xml:space="preserve">A total of 138,743 hatchery Delta Smelt have been released for WY 2026. The most recent releases of 67,583 fish occurred in Belden’s Landing boat ramp in Suisun Marsh on Nov 05, 2025 to Nov 04, 2025.</w:t>
+        <w:t xml:space="preserve">A total of 163,349 hatchery Delta Smelt have been released for WY 2026. The most recent releases of 24,606 fish occurred in Sacramento River at Rio Vista on Dec 16, 2025.</w:t>
       </w:r>
     </w:p>
     <w:p>
@@ -222,7 +210,7 @@
         <w:t xml:space="preserve"> </w:t>
       </w:r>
       <w:r>
-        <w:t xml:space="preserve">6 adult Delta Smelt and 3 juvenile Delta smelt have been detected this water year. See</w:t>
+        <w:t xml:space="preserve">26 adult Delta Smelt and 21 juvenile Delta smelt have been detected this water year. See</w:t>
       </w:r>
       <w:r>
         <w:t xml:space="preserve"> </w:t>
@@ -507,20 +495,20 @@
                     <w:jc w:val="center"/>
                   </w:pPr>
                   <w:r>
-                    <w:t xml:space="preserve">edsm</w:t>
-                  </w:r>
-                </w:p>
-              </w:tc>
-              <w:tc>
-                <w:tcPr/>
-                <w:p>
-                  <w:pPr>
-                    <w:pStyle w:val="Compact"/>
-                    <w:jc w:val="left"/>
-                    <w:jc w:val="center"/>
-                  </w:pPr>
-                  <w:r>
-                    <w:t xml:space="preserve">2025-12-04</w:t>
+                    <w:t xml:space="preserve">DJFMP</w:t>
+                  </w:r>
+                </w:p>
+              </w:tc>
+              <w:tc>
+                <w:tcPr/>
+                <w:p>
+                  <w:pPr>
+                    <w:pStyle w:val="Compact"/>
+                    <w:jc w:val="left"/>
+                    <w:jc w:val="center"/>
+                  </w:pPr>
+                  <w:r>
+                    <w:t xml:space="preserve">2025-12-18</w:t>
                   </w:r>
                 </w:p>
               </w:tc>
@@ -546,20 +534,20 @@
                     <w:jc w:val="center"/>
                   </w:pPr>
                   <w:r>
-                    <w:t xml:space="preserve">Sac DW Ship Channel</w:t>
-                  </w:r>
-                </w:p>
-              </w:tc>
-              <w:tc>
-                <w:tcPr/>
-                <w:p>
-                  <w:pPr>
-                    <w:pStyle w:val="Compact"/>
-                    <w:jc w:val="left"/>
-                    <w:jc w:val="center"/>
-                  </w:pPr>
-                  <w:r>
-                    <w:t xml:space="preserve">Adult</w:t>
+                    <w:t xml:space="preserve">NA</w:t>
+                  </w:r>
+                </w:p>
+              </w:tc>
+              <w:tc>
+                <w:tcPr/>
+                <w:p>
+                  <w:pPr>
+                    <w:pStyle w:val="Compact"/>
+                    <w:jc w:val="left"/>
+                    <w:jc w:val="center"/>
+                  </w:pPr>
+                  <w:r>
+                    <w:t xml:space="preserve">Juvenile</w:t>
                   </w:r>
                 </w:p>
               </w:tc>
@@ -587,20 +575,20 @@
                     <w:jc w:val="center"/>
                   </w:pPr>
                   <w:r>
-                    <w:t xml:space="preserve">edsm</w:t>
-                  </w:r>
-                </w:p>
-              </w:tc>
-              <w:tc>
-                <w:tcPr/>
-                <w:p>
-                  <w:pPr>
-                    <w:pStyle w:val="Compact"/>
-                    <w:jc w:val="left"/>
-                    <w:jc w:val="center"/>
-                  </w:pPr>
-                  <w:r>
-                    <w:t xml:space="preserve">2025-12-09</w:t>
+                    <w:t xml:space="preserve">EDSM</w:t>
+                  </w:r>
+                </w:p>
+              </w:tc>
+              <w:tc>
+                <w:tcPr/>
+                <w:p>
+                  <w:pPr>
+                    <w:pStyle w:val="Compact"/>
+                    <w:jc w:val="left"/>
+                    <w:jc w:val="center"/>
+                  </w:pPr>
+                  <w:r>
+                    <w:t xml:space="preserve">2025-12-16</w:t>
                   </w:r>
                 </w:p>
               </w:tc>
@@ -639,7 +627,7 @@
                     <w:jc w:val="center"/>
                   </w:pPr>
                   <w:r>
-                    <w:t xml:space="preserve">Adult</w:t>
+                    <w:t xml:space="preserve">Juvenile</w:t>
                   </w:r>
                 </w:p>
               </w:tc>
@@ -652,7 +640,7 @@
                     <w:jc w:val="center"/>
                   </w:pPr>
                   <w:r>
-                    <w:t xml:space="preserve">3</w:t>
+                    <w:t xml:space="preserve">2</w:t>
                   </w:r>
                 </w:p>
               </w:tc>
@@ -667,20 +655,20 @@
                     <w:jc w:val="center"/>
                   </w:pPr>
                   <w:r>
-                    <w:t xml:space="preserve">edsm</w:t>
-                  </w:r>
-                </w:p>
-              </w:tc>
-              <w:tc>
-                <w:tcPr/>
-                <w:p>
-                  <w:pPr>
-                    <w:pStyle w:val="Compact"/>
-                    <w:jc w:val="left"/>
-                    <w:jc w:val="center"/>
-                  </w:pPr>
-                  <w:r>
-                    <w:t xml:space="preserve">2025-12-11</w:t>
+                    <w:t xml:space="preserve">EDSM</w:t>
+                  </w:r>
+                </w:p>
+              </w:tc>
+              <w:tc>
+                <w:tcPr/>
+                <w:p>
+                  <w:pPr>
+                    <w:pStyle w:val="Compact"/>
+                    <w:jc w:val="left"/>
+                    <w:jc w:val="center"/>
+                  </w:pPr>
+                  <w:r>
+                    <w:t xml:space="preserve">2025-12-21</w:t>
                   </w:r>
                 </w:p>
               </w:tc>
@@ -719,7 +707,7 @@
                     <w:jc w:val="center"/>
                   </w:pPr>
                   <w:r>
-                    <w:t xml:space="preserve">Adult</w:t>
+                    <w:t xml:space="preserve">Juvenile</w:t>
                   </w:r>
                 </w:p>
               </w:tc>
@@ -747,20 +735,20 @@
                     <w:jc w:val="center"/>
                   </w:pPr>
                   <w:r>
-                    <w:t xml:space="preserve">edsm</w:t>
-                  </w:r>
-                </w:p>
-              </w:tc>
-              <w:tc>
-                <w:tcPr/>
-                <w:p>
-                  <w:pPr>
-                    <w:pStyle w:val="Compact"/>
-                    <w:jc w:val="left"/>
-                    <w:jc w:val="center"/>
-                  </w:pPr>
-                  <w:r>
-                    <w:t xml:space="preserve">2025-12-11</w:t>
+                    <w:t xml:space="preserve">EDSM</w:t>
+                  </w:r>
+                </w:p>
+              </w:tc>
+              <w:tc>
+                <w:tcPr/>
+                <w:p>
+                  <w:pPr>
+                    <w:pStyle w:val="Compact"/>
+                    <w:jc w:val="left"/>
+                    <w:jc w:val="center"/>
+                  </w:pPr>
+                  <w:r>
+                    <w:t xml:space="preserve">2025-12-29</w:t>
                   </w:r>
                 </w:p>
               </w:tc>
@@ -799,7 +787,7 @@
                     <w:jc w:val="center"/>
                   </w:pPr>
                   <w:r>
-                    <w:t xml:space="preserve">Juvenile</w:t>
+                    <w:t xml:space="preserve">Adult</w:t>
                   </w:r>
                 </w:p>
               </w:tc>
@@ -812,7 +800,7 @@
                     <w:jc w:val="center"/>
                   </w:pPr>
                   <w:r>
-                    <w:t xml:space="preserve">3</w:t>
+                    <w:t xml:space="preserve">1</w:t>
                   </w:r>
                 </w:p>
               </w:tc>
@@ -845,7 +833,7 @@
             <w:r>
               <w:drawing>
                 <wp:inline>
-                  <wp:extent cx="5334000" cy="4667250"/>
+                  <wp:extent cx="5334000" cy="4667249"/>
                   <wp:effectExtent b="0" l="0" r="0" t="0"/>
                   <wp:docPr descr="" title="" id="26" name="Picture"/>
                   <a:graphic>
@@ -866,7 +854,7 @@
                         <pic:spPr bwMode="auto">
                           <a:xfrm>
                             <a:off x="0" y="0"/>
-                            <a:ext cx="5334000" cy="4667250"/>
+                            <a:ext cx="5334000" cy="4667249"/>
                           </a:xfrm>
                           <a:prstGeom prst="rect">
                             <a:avLst/>
@@ -1008,7 +996,7 @@
                     <w:jc w:val="center"/>
                   </w:pPr>
                   <w:r>
-                    <w:t xml:space="preserve">edsm</w:t>
+                    <w:t xml:space="preserve">DJFMP</w:t>
                   </w:r>
                 </w:p>
               </w:tc>
@@ -1034,7 +1022,7 @@
                     <w:jc w:val="center"/>
                   </w:pPr>
                   <w:r>
-                    <w:t xml:space="preserve">Adult</w:t>
+                    <w:t xml:space="preserve">Juvenile</w:t>
                   </w:r>
                 </w:p>
               </w:tc>
@@ -1062,20 +1050,20 @@
                     <w:jc w:val="center"/>
                   </w:pPr>
                   <w:r>
-                    <w:t xml:space="preserve">edsm</w:t>
-                  </w:r>
-                </w:p>
-              </w:tc>
-              <w:tc>
-                <w:tcPr/>
-                <w:p>
-                  <w:pPr>
-                    <w:pStyle w:val="Compact"/>
-                    <w:jc w:val="left"/>
-                    <w:jc w:val="center"/>
-                  </w:pPr>
-                  <w:r>
-                    <w:t xml:space="preserve">West</w:t>
+                    <w:t xml:space="preserve">EDSM</w:t>
+                  </w:r>
+                </w:p>
+              </w:tc>
+              <w:tc>
+                <w:tcPr/>
+                <w:p>
+                  <w:pPr>
+                    <w:pStyle w:val="Compact"/>
+                    <w:jc w:val="left"/>
+                    <w:jc w:val="center"/>
+                  </w:pPr>
+                  <w:r>
+                    <w:t xml:space="preserve">North</w:t>
                   </w:r>
                 </w:p>
               </w:tc>
@@ -1101,7 +1089,7 @@
                     <w:jc w:val="center"/>
                   </w:pPr>
                   <w:r>
-                    <w:t xml:space="preserve">5</w:t>
+                    <w:t xml:space="preserve">1</w:t>
                   </w:r>
                 </w:p>
               </w:tc>
@@ -1116,7 +1104,7 @@
                     <w:jc w:val="center"/>
                   </w:pPr>
                   <w:r>
-                    <w:t xml:space="preserve">edsm</w:t>
+                    <w:t xml:space="preserve">EDSM</w:t>
                   </w:r>
                 </w:p>
               </w:tc>
@@ -1142,6 +1130,60 @@
                     <w:jc w:val="center"/>
                   </w:pPr>
                   <w:r>
+                    <w:t xml:space="preserve">Adult</w:t>
+                  </w:r>
+                </w:p>
+              </w:tc>
+              <w:tc>
+                <w:tcPr/>
+                <w:p>
+                  <w:pPr>
+                    <w:pStyle w:val="Compact"/>
+                    <w:jc w:val="right"/>
+                    <w:jc w:val="center"/>
+                  </w:pPr>
+                  <w:r>
+                    <w:t xml:space="preserve">25</w:t>
+                  </w:r>
+                </w:p>
+              </w:tc>
+            </w:tr>
+            <w:tr>
+              <w:tc>
+                <w:tcPr/>
+                <w:p>
+                  <w:pPr>
+                    <w:pStyle w:val="Compact"/>
+                    <w:jc w:val="left"/>
+                    <w:jc w:val="center"/>
+                  </w:pPr>
+                  <w:r>
+                    <w:t xml:space="preserve">EDSM</w:t>
+                  </w:r>
+                </w:p>
+              </w:tc>
+              <w:tc>
+                <w:tcPr/>
+                <w:p>
+                  <w:pPr>
+                    <w:pStyle w:val="Compact"/>
+                    <w:jc w:val="left"/>
+                    <w:jc w:val="center"/>
+                  </w:pPr>
+                  <w:r>
+                    <w:t xml:space="preserve">West</w:t>
+                  </w:r>
+                </w:p>
+              </w:tc>
+              <w:tc>
+                <w:tcPr/>
+                <w:p>
+                  <w:pPr>
+                    <w:pStyle w:val="Compact"/>
+                    <w:jc w:val="left"/>
+                    <w:jc w:val="center"/>
+                  </w:pPr>
+                  <w:r>
                     <w:t xml:space="preserve">Juvenile</w:t>
                   </w:r>
                 </w:p>
@@ -1155,7 +1197,7 @@
                     <w:jc w:val="center"/>
                   </w:pPr>
                   <w:r>
-                    <w:t xml:space="preserve">3</w:t>
+                    <w:t xml:space="preserve">20</w:t>
                   </w:r>
                 </w:p>
               </w:tc>
@@ -1188,7 +1230,7 @@
             <w:r>
               <w:drawing>
                 <wp:inline>
-                  <wp:extent cx="4620126" cy="3696101"/>
+                  <wp:extent cx="4576576" cy="3661261"/>
                   <wp:effectExtent b="0" l="0" r="0" t="0"/>
                   <wp:docPr descr="" title="" id="31" name="Picture"/>
                   <a:graphic>
@@ -1209,7 +1251,7 @@
                         <pic:spPr bwMode="auto">
                           <a:xfrm>
                             <a:off x="0" y="0"/>
-                            <a:ext cx="4620126" cy="3696101"/>
+                            <a:ext cx="4576576" cy="3661261"/>
                           </a:xfrm>
                           <a:prstGeom prst="rect">
                             <a:avLst/>
@@ -1295,7 +1337,7 @@
         <w:t xml:space="preserve">FPT Flow (3-day average)</w:t>
       </w:r>
       <w:r>
-        <w:t xml:space="preserve">: 9925 cfs as of Dec 15, 2025</w:t>
+        <w:t xml:space="preserve">: 68156 cfs as of Dec 28, 2025</w:t>
       </w:r>
     </w:p>
     <w:p>
@@ -1314,7 +1356,7 @@
         <w:t xml:space="preserve">FPT Turbidity (3-day average)</w:t>
       </w:r>
       <w:r>
-        <w:t xml:space="preserve">: 7.03 FNU as of Dec 15, 2025</w:t>
+        <w:t xml:space="preserve">: 104.38 FNU as of Dec 28, 2025</w:t>
       </w:r>
     </w:p>
     <w:p>
@@ -1366,13 +1408,89 @@
     </w:p>
     <w:bookmarkEnd w:id="38"/>
     <w:bookmarkEnd w:id="39"/>
-    <w:bookmarkStart w:id="43" w:name="real-time-assessment-thresholds"/>
+    <w:bookmarkStart w:id="43" w:name="zone-of-influence-analysis"/>
     <w:p>
       <w:pPr>
         <w:pStyle w:val="Heading4"/>
       </w:pPr>
       <w:r>
+        <w:t xml:space="preserve">Zone of Influence Analysis</w:t>
+      </w:r>
+    </w:p>
+    <w:p>
+      <w:pPr>
+        <w:pStyle w:val="FirstParagraph"/>
+      </w:pPr>
+      <w:r>
+        <w:drawing>
+          <wp:inline>
+            <wp:extent cx="5334000" cy="2667000"/>
+            <wp:effectExtent b="0" l="0" r="0" t="0"/>
+            <wp:docPr descr="" title="" id="41" name="Picture"/>
+            <a:graphic>
+              <a:graphicData uri="http://schemas.openxmlformats.org/drawingml/2006/picture">
+                <pic:pic>
+                  <pic:nvPicPr>
+                    <pic:cNvPr descr="delta_hydro_files/figure-html/zoi_graph-1.png" id="42" name="Picture"/>
+                    <pic:cNvPicPr>
+                      <a:picLocks noChangeArrowheads="1" noChangeAspect="1"/>
+                    </pic:cNvPicPr>
+                  </pic:nvPicPr>
+                  <pic:blipFill>
+                    <a:blip r:embed="rId40"/>
+                    <a:stretch>
+                      <a:fillRect/>
+                    </a:stretch>
+                  </pic:blipFill>
+                  <pic:spPr bwMode="auto">
+                    <a:xfrm>
+                      <a:off x="0" y="0"/>
+                      <a:ext cx="5334000" cy="2667000"/>
+                    </a:xfrm>
+                    <a:prstGeom prst="rect">
+                      <a:avLst/>
+                    </a:prstGeom>
+                    <a:noFill/>
+                    <a:ln w="9525">
+                      <a:noFill/>
+                      <a:headEnd/>
+                      <a:tailEnd/>
+                    </a:ln>
+                  </pic:spPr>
+                </pic:pic>
+              </a:graphicData>
+            </a:graphic>
+          </wp:inline>
+        </w:drawing>
+      </w:r>
+    </w:p>
+    <w:bookmarkEnd w:id="43"/>
+    <w:bookmarkStart w:id="44" w:name="particle-tracking-models"/>
+    <w:p>
+      <w:pPr>
+        <w:pStyle w:val="Heading4"/>
+      </w:pPr>
+      <w:r>
+        <w:t xml:space="preserve">Particle Tracking Models</w:t>
+      </w:r>
+    </w:p>
+    <w:bookmarkEnd w:id="44"/>
+    <w:bookmarkStart w:id="48" w:name="real-time-assessment-thresholds"/>
+    <w:p>
+      <w:pPr>
+        <w:pStyle w:val="Heading4"/>
+      </w:pPr>
+      <w:r>
         <w:t xml:space="preserve">Real-time Assessment Thresholds</w:t>
+      </w:r>
+    </w:p>
+    <w:bookmarkStart w:id="46" w:name="adult-delta-smelt"/>
+    <w:p>
+      <w:pPr>
+        <w:pStyle w:val="Heading5"/>
+      </w:pPr>
+      <w:r>
+        <w:t xml:space="preserve">Adult Delta Smelt</w:t>
       </w:r>
     </w:p>
     <w:p>
@@ -1384,16 +1502,7 @@
         </w:numPr>
       </w:pPr>
       <w:r>
-        <w:t xml:space="preserve">Jersey Point Flow (JPF): Reclamation and DWR would compute JPF based on San Joaquin River Inflow at Vernalis, Cosumnes River Inflow, Mokelumne River Inflow, Calaveras River Inflow, Flow from Sacramento River through DCC, Flow from Sacramento River through Georgiana Slough, 65% of in-Delta precipitation, -65% of in-Delta diversions, and -Export Pumping at (Banks + Jones).</w:t>
-      </w:r>
-    </w:p>
-    <w:bookmarkStart w:id="41" w:name="adult-delta-smelt"/>
-    <w:p>
-      <w:pPr>
-        <w:pStyle w:val="Heading5"/>
-      </w:pPr>
-      <w:r>
-        <w:t xml:space="preserve">Adult Delta Smelt</w:t>
+        <w:t xml:space="preserve">Not relevant</w:t>
       </w:r>
     </w:p>
     <w:p>
@@ -1405,24 +1514,12 @@
         </w:numPr>
       </w:pPr>
       <w:r>
-        <w:t xml:space="preserve">Not relevant</w:t>
-      </w:r>
-    </w:p>
-    <w:p>
-      <w:pPr>
-        <w:pStyle w:val="Compact"/>
-        <w:numPr>
-          <w:ilvl w:val="0"/>
-          <w:numId w:val="1008"/>
-        </w:numPr>
-      </w:pPr>
-      <w:r>
         <w:t xml:space="preserve">See</w:t>
       </w:r>
       <w:r>
         <w:t xml:space="preserve"> </w:t>
       </w:r>
-      <w:hyperlink r:id="rId40">
+      <w:hyperlink r:id="rId45">
         <w:r>
           <w:rPr>
             <w:rStyle w:val="Hyperlink"/>
@@ -1440,8 +1537,8 @@
         <w:t xml:space="preserve"> </w:t>
       </w:r>
     </w:p>
-    <w:bookmarkEnd w:id="41"/>
-    <w:bookmarkStart w:id="42" w:name="larvaljuvenile-delta-smelt"/>
+    <w:bookmarkEnd w:id="46"/>
+    <w:bookmarkStart w:id="47" w:name="larvaljuvenile-delta-smelt"/>
     <w:p>
       <w:pPr>
         <w:pStyle w:val="Heading5"/>
@@ -1455,17 +1552,27 @@
         <w:pStyle w:val="Compact"/>
         <w:numPr>
           <w:ilvl w:val="0"/>
-          <w:numId w:val="1009"/>
+          <w:numId w:val="1008"/>
         </w:numPr>
       </w:pPr>
       <w:r>
         <w:t xml:space="preserve">Not relevant</w:t>
       </w:r>
     </w:p>
-    <w:bookmarkEnd w:id="42"/>
-    <w:bookmarkEnd w:id="43"/>
-    <w:bookmarkEnd w:id="44"/>
-    <w:bookmarkStart w:id="60" w:name="longfin-smelt"/>
+    <w:bookmarkEnd w:id="47"/>
+    <w:bookmarkEnd w:id="48"/>
+    <w:bookmarkStart w:id="49" w:name="evalutation"/>
+    <w:p>
+      <w:pPr>
+        <w:pStyle w:val="Heading4"/>
+      </w:pPr>
+      <w:r>
+        <w:t xml:space="preserve">Evalutation</w:t>
+      </w:r>
+    </w:p>
+    <w:bookmarkEnd w:id="49"/>
+    <w:bookmarkEnd w:id="50"/>
+    <w:bookmarkStart w:id="67" w:name="longfin-smelt"/>
     <w:p>
       <w:pPr>
         <w:pStyle w:val="Heading3"/>
@@ -1474,7 +1581,7 @@
         <w:t xml:space="preserve">Longfin Smelt</w:t>
       </w:r>
     </w:p>
-    <w:bookmarkStart w:id="55" w:name="biological-1"/>
+    <w:bookmarkStart w:id="61" w:name="biological-1"/>
     <w:p>
       <w:pPr>
         <w:pStyle w:val="Heading4"/>
@@ -1487,7 +1594,7 @@
       <w:pPr>
         <w:numPr>
           <w:ilvl w:val="0"/>
-          <w:numId w:val="1010"/>
+          <w:numId w:val="1009"/>
         </w:numPr>
       </w:pPr>
       <w:r>
@@ -1501,14 +1608,14 @@
         <w:t xml:space="preserve"> </w:t>
       </w:r>
       <w:r>
-        <w:t xml:space="preserve">Adult, Juvenile</w:t>
+        <w:t xml:space="preserve">Juvenile, Adult</w:t>
       </w:r>
     </w:p>
     <w:p>
       <w:pPr>
         <w:numPr>
           <w:ilvl w:val="0"/>
-          <w:numId w:val="1010"/>
+          <w:numId w:val="1009"/>
         </w:numPr>
       </w:pPr>
       <w:r>
@@ -1522,7 +1629,7 @@
         <w:t xml:space="preserve"> </w:t>
       </w:r>
       <w:r>
-        <w:t xml:space="preserve">13 adult Longfin Smelt and 31 juvenile Longfin smelt have been detected this water year. See</w:t>
+        <w:t xml:space="preserve">152 adult Longfin Smelt and 430 juvenile Longfin smelt have been detected this water year. See</w:t>
       </w:r>
       <w:r>
         <w:t xml:space="preserve"> </w:t>
@@ -1580,7 +1687,7 @@
       <w:pPr>
         <w:numPr>
           <w:ilvl w:val="0"/>
-          <w:numId w:val="1010"/>
+          <w:numId w:val="1009"/>
         </w:numPr>
       </w:pPr>
       <w:r>
@@ -1613,7 +1720,7 @@
       <w:tr>
         <w:tc>
           <w:tcPr/>
-          <w:bookmarkStart w:id="45" w:name="tbl-lfs-recent-catch"/>
+          <w:bookmarkStart w:id="51" w:name="tbl-lfs-recent-catch"/>
           <w:p>
             <w:pPr>
               <w:jc w:val="center"/>
@@ -1734,46 +1841,46 @@
                     <w:jc w:val="center"/>
                   </w:pPr>
                   <w:r>
-                    <w:t xml:space="preserve">edsm</w:t>
-                  </w:r>
-                </w:p>
-              </w:tc>
-              <w:tc>
-                <w:tcPr/>
-                <w:p>
-                  <w:pPr>
-                    <w:pStyle w:val="Compact"/>
-                    <w:jc w:val="left"/>
-                    <w:jc w:val="center"/>
-                  </w:pPr>
-                  <w:r>
-                    <w:t xml:space="preserve">2025-12-10</w:t>
-                  </w:r>
-                </w:p>
-              </w:tc>
-              <w:tc>
-                <w:tcPr/>
-                <w:p>
-                  <w:pPr>
-                    <w:pStyle w:val="Compact"/>
-                    <w:jc w:val="left"/>
-                    <w:jc w:val="center"/>
-                  </w:pPr>
-                  <w:r>
-                    <w:t xml:space="preserve">Far West</w:t>
-                  </w:r>
-                </w:p>
-              </w:tc>
-              <w:tc>
-                <w:tcPr/>
-                <w:p>
-                  <w:pPr>
-                    <w:pStyle w:val="Compact"/>
-                    <w:jc w:val="left"/>
-                    <w:jc w:val="center"/>
-                  </w:pPr>
-                  <w:r>
-                    <w:t xml:space="preserve">Suisun Bay</w:t>
+                    <w:t xml:space="preserve">DJFMP</w:t>
+                  </w:r>
+                </w:p>
+              </w:tc>
+              <w:tc>
+                <w:tcPr/>
+                <w:p>
+                  <w:pPr>
+                    <w:pStyle w:val="Compact"/>
+                    <w:jc w:val="left"/>
+                    <w:jc w:val="center"/>
+                  </w:pPr>
+                  <w:r>
+                    <w:t xml:space="preserve">2025-12-17</w:t>
+                  </w:r>
+                </w:p>
+              </w:tc>
+              <w:tc>
+                <w:tcPr/>
+                <w:p>
+                  <w:pPr>
+                    <w:pStyle w:val="Compact"/>
+                    <w:jc w:val="left"/>
+                    <w:jc w:val="center"/>
+                  </w:pPr>
+                  <w:r>
+                    <w:t xml:space="preserve">N/A</w:t>
+                  </w:r>
+                </w:p>
+              </w:tc>
+              <w:tc>
+                <w:tcPr/>
+                <w:p>
+                  <w:pPr>
+                    <w:pStyle w:val="Compact"/>
+                    <w:jc w:val="left"/>
+                    <w:jc w:val="center"/>
+                  </w:pPr>
+                  <w:r>
+                    <w:t xml:space="preserve">Chipps Island</w:t>
                   </w:r>
                 </w:p>
               </w:tc>
@@ -1799,7 +1906,7 @@
                     <w:jc w:val="center"/>
                   </w:pPr>
                   <w:r>
-                    <w:t xml:space="preserve">2</w:t>
+                    <w:t xml:space="preserve">47</w:t>
                   </w:r>
                 </w:p>
               </w:tc>
@@ -1814,59 +1921,59 @@
                     <w:jc w:val="center"/>
                   </w:pPr>
                   <w:r>
-                    <w:t xml:space="preserve">edsm</w:t>
-                  </w:r>
-                </w:p>
-              </w:tc>
-              <w:tc>
-                <w:tcPr/>
-                <w:p>
-                  <w:pPr>
-                    <w:pStyle w:val="Compact"/>
-                    <w:jc w:val="left"/>
-                    <w:jc w:val="center"/>
-                  </w:pPr>
-                  <w:r>
-                    <w:t xml:space="preserve">2025-12-10</w:t>
-                  </w:r>
-                </w:p>
-              </w:tc>
-              <w:tc>
-                <w:tcPr/>
-                <w:p>
-                  <w:pPr>
-                    <w:pStyle w:val="Compact"/>
-                    <w:jc w:val="left"/>
-                    <w:jc w:val="center"/>
-                  </w:pPr>
-                  <w:r>
-                    <w:t xml:space="preserve">Far West</w:t>
-                  </w:r>
-                </w:p>
-              </w:tc>
-              <w:tc>
-                <w:tcPr/>
-                <w:p>
-                  <w:pPr>
-                    <w:pStyle w:val="Compact"/>
-                    <w:jc w:val="left"/>
-                    <w:jc w:val="center"/>
-                  </w:pPr>
-                  <w:r>
-                    <w:t xml:space="preserve">Suisun Bay</w:t>
-                  </w:r>
-                </w:p>
-              </w:tc>
-              <w:tc>
-                <w:tcPr/>
-                <w:p>
-                  <w:pPr>
-                    <w:pStyle w:val="Compact"/>
-                    <w:jc w:val="left"/>
-                    <w:jc w:val="center"/>
-                  </w:pPr>
-                  <w:r>
-                    <w:t xml:space="preserve">Juvenile</w:t>
+                    <w:t xml:space="preserve">DJFMP</w:t>
+                  </w:r>
+                </w:p>
+              </w:tc>
+              <w:tc>
+                <w:tcPr/>
+                <w:p>
+                  <w:pPr>
+                    <w:pStyle w:val="Compact"/>
+                    <w:jc w:val="left"/>
+                    <w:jc w:val="center"/>
+                  </w:pPr>
+                  <w:r>
+                    <w:t xml:space="preserve">2025-12-22</w:t>
+                  </w:r>
+                </w:p>
+              </w:tc>
+              <w:tc>
+                <w:tcPr/>
+                <w:p>
+                  <w:pPr>
+                    <w:pStyle w:val="Compact"/>
+                    <w:jc w:val="left"/>
+                    <w:jc w:val="center"/>
+                  </w:pPr>
+                  <w:r>
+                    <w:t xml:space="preserve">N/A</w:t>
+                  </w:r>
+                </w:p>
+              </w:tc>
+              <w:tc>
+                <w:tcPr/>
+                <w:p>
+                  <w:pPr>
+                    <w:pStyle w:val="Compact"/>
+                    <w:jc w:val="left"/>
+                    <w:jc w:val="center"/>
+                  </w:pPr>
+                  <w:r>
+                    <w:t xml:space="preserve">Chipps Island</w:t>
+                  </w:r>
+                </w:p>
+              </w:tc>
+              <w:tc>
+                <w:tcPr/>
+                <w:p>
+                  <w:pPr>
+                    <w:pStyle w:val="Compact"/>
+                    <w:jc w:val="left"/>
+                    <w:jc w:val="center"/>
+                  </w:pPr>
+                  <w:r>
+                    <w:t xml:space="preserve">Adult</w:t>
                   </w:r>
                 </w:p>
               </w:tc>
@@ -1879,7 +1986,7 @@
                     <w:jc w:val="center"/>
                   </w:pPr>
                   <w:r>
-                    <w:t xml:space="preserve">6</w:t>
+                    <w:t xml:space="preserve">2</w:t>
                   </w:r>
                 </w:p>
               </w:tc>
@@ -1894,46 +2001,46 @@
                     <w:jc w:val="center"/>
                   </w:pPr>
                   <w:r>
-                    <w:t xml:space="preserve">edsm</w:t>
-                  </w:r>
-                </w:p>
-              </w:tc>
-              <w:tc>
-                <w:tcPr/>
-                <w:p>
-                  <w:pPr>
-                    <w:pStyle w:val="Compact"/>
-                    <w:jc w:val="left"/>
-                    <w:jc w:val="center"/>
-                  </w:pPr>
-                  <w:r>
-                    <w:t xml:space="preserve">2025-12-11</w:t>
-                  </w:r>
-                </w:p>
-              </w:tc>
-              <w:tc>
-                <w:tcPr/>
-                <w:p>
-                  <w:pPr>
-                    <w:pStyle w:val="Compact"/>
-                    <w:jc w:val="left"/>
-                    <w:jc w:val="center"/>
-                  </w:pPr>
-                  <w:r>
-                    <w:t xml:space="preserve">West</w:t>
-                  </w:r>
-                </w:p>
-              </w:tc>
-              <w:tc>
-                <w:tcPr/>
-                <w:p>
-                  <w:pPr>
-                    <w:pStyle w:val="Compact"/>
-                    <w:jc w:val="left"/>
-                    <w:jc w:val="center"/>
-                  </w:pPr>
-                  <w:r>
-                    <w:t xml:space="preserve">Suisun Marsh</w:t>
+                    <w:t xml:space="preserve">DJFMP</w:t>
+                  </w:r>
+                </w:p>
+              </w:tc>
+              <w:tc>
+                <w:tcPr/>
+                <w:p>
+                  <w:pPr>
+                    <w:pStyle w:val="Compact"/>
+                    <w:jc w:val="left"/>
+                    <w:jc w:val="center"/>
+                  </w:pPr>
+                  <w:r>
+                    <w:t xml:space="preserve">2025-12-29</w:t>
+                  </w:r>
+                </w:p>
+              </w:tc>
+              <w:tc>
+                <w:tcPr/>
+                <w:p>
+                  <w:pPr>
+                    <w:pStyle w:val="Compact"/>
+                    <w:jc w:val="left"/>
+                    <w:jc w:val="center"/>
+                  </w:pPr>
+                  <w:r>
+                    <w:t xml:space="preserve">N/A</w:t>
+                  </w:r>
+                </w:p>
+              </w:tc>
+              <w:tc>
+                <w:tcPr/>
+                <w:p>
+                  <w:pPr>
+                    <w:pStyle w:val="Compact"/>
+                    <w:jc w:val="left"/>
+                    <w:jc w:val="center"/>
+                  </w:pPr>
+                  <w:r>
+                    <w:t xml:space="preserve">Chipps Island</w:t>
                   </w:r>
                 </w:p>
               </w:tc>
@@ -1959,7 +2066,7 @@
                     <w:jc w:val="center"/>
                   </w:pPr>
                   <w:r>
-                    <w:t xml:space="preserve">9</w:t>
+                    <w:t xml:space="preserve">5</w:t>
                   </w:r>
                 </w:p>
               </w:tc>
@@ -1974,20 +2081,20 @@
                     <w:jc w:val="center"/>
                   </w:pPr>
                   <w:r>
-                    <w:t xml:space="preserve">edsm</w:t>
-                  </w:r>
-                </w:p>
-              </w:tc>
-              <w:tc>
-                <w:tcPr/>
-                <w:p>
-                  <w:pPr>
-                    <w:pStyle w:val="Compact"/>
-                    <w:jc w:val="left"/>
-                    <w:jc w:val="center"/>
-                  </w:pPr>
-                  <w:r>
-                    <w:t xml:space="preserve">2025-12-11</w:t>
+                    <w:t xml:space="preserve">EDSM</w:t>
+                  </w:r>
+                </w:p>
+              </w:tc>
+              <w:tc>
+                <w:tcPr/>
+                <w:p>
+                  <w:pPr>
+                    <w:pStyle w:val="Compact"/>
+                    <w:jc w:val="left"/>
+                    <w:jc w:val="center"/>
+                  </w:pPr>
+                  <w:r>
+                    <w:t xml:space="preserve">2025-12-17</w:t>
                   </w:r>
                 </w:p>
               </w:tc>
@@ -2026,7 +2133,7 @@
                     <w:jc w:val="center"/>
                   </w:pPr>
                   <w:r>
-                    <w:t xml:space="preserve">Juvenile</w:t>
+                    <w:t xml:space="preserve">Adult</w:t>
                   </w:r>
                 </w:p>
               </w:tc>
@@ -2039,7 +2146,7 @@
                     <w:jc w:val="center"/>
                   </w:pPr>
                   <w:r>
-                    <w:t xml:space="preserve">23</w:t>
+                    <w:t xml:space="preserve">1</w:t>
                   </w:r>
                 </w:p>
               </w:tc>
@@ -2054,20 +2161,20 @@
                     <w:jc w:val="center"/>
                   </w:pPr>
                   <w:r>
-                    <w:t xml:space="preserve">edsm</w:t>
-                  </w:r>
-                </w:p>
-              </w:tc>
-              <w:tc>
-                <w:tcPr/>
-                <w:p>
-                  <w:pPr>
-                    <w:pStyle w:val="Compact"/>
-                    <w:jc w:val="left"/>
-                    <w:jc w:val="center"/>
-                  </w:pPr>
-                  <w:r>
-                    <w:t xml:space="preserve">2025-12-15</w:t>
+                    <w:t xml:space="preserve">EDSM</w:t>
+                  </w:r>
+                </w:p>
+              </w:tc>
+              <w:tc>
+                <w:tcPr/>
+                <w:p>
+                  <w:pPr>
+                    <w:pStyle w:val="Compact"/>
+                    <w:jc w:val="left"/>
+                    <w:jc w:val="center"/>
+                  </w:pPr>
+                  <w:r>
+                    <w:t xml:space="preserve">2025-12-17</w:t>
                   </w:r>
                 </w:p>
               </w:tc>
@@ -2093,20 +2200,20 @@
                     <w:jc w:val="center"/>
                   </w:pPr>
                   <w:r>
-                    <w:t xml:space="preserve">Suisun Bay</w:t>
-                  </w:r>
-                </w:p>
-              </w:tc>
-              <w:tc>
-                <w:tcPr/>
-                <w:p>
-                  <w:pPr>
-                    <w:pStyle w:val="Compact"/>
-                    <w:jc w:val="left"/>
-                    <w:jc w:val="center"/>
-                  </w:pPr>
-                  <w:r>
-                    <w:t xml:space="preserve">Adult</w:t>
+                    <w:t xml:space="preserve">Suisun Marsh</w:t>
+                  </w:r>
+                </w:p>
+              </w:tc>
+              <w:tc>
+                <w:tcPr/>
+                <w:p>
+                  <w:pPr>
+                    <w:pStyle w:val="Compact"/>
+                    <w:jc w:val="left"/>
+                    <w:jc w:val="center"/>
+                  </w:pPr>
+                  <w:r>
+                    <w:t xml:space="preserve">Juvenile</w:t>
                   </w:r>
                 </w:p>
               </w:tc>
@@ -2119,7 +2226,7 @@
                     <w:jc w:val="center"/>
                   </w:pPr>
                   <w:r>
-                    <w:t xml:space="preserve">2</w:t>
+                    <w:t xml:space="preserve">9</w:t>
                   </w:r>
                 </w:p>
               </w:tc>
@@ -2134,20 +2241,20 @@
                     <w:jc w:val="center"/>
                   </w:pPr>
                   <w:r>
-                    <w:t xml:space="preserve">edsm</w:t>
-                  </w:r>
-                </w:p>
-              </w:tc>
-              <w:tc>
-                <w:tcPr/>
-                <w:p>
-                  <w:pPr>
-                    <w:pStyle w:val="Compact"/>
-                    <w:jc w:val="left"/>
-                    <w:jc w:val="center"/>
-                  </w:pPr>
-                  <w:r>
-                    <w:t xml:space="preserve">2025-12-15</w:t>
+                    <w:t xml:space="preserve">EDSM</w:t>
+                  </w:r>
+                </w:p>
+              </w:tc>
+              <w:tc>
+                <w:tcPr/>
+                <w:p>
+                  <w:pPr>
+                    <w:pStyle w:val="Compact"/>
+                    <w:jc w:val="left"/>
+                    <w:jc w:val="center"/>
+                  </w:pPr>
+                  <w:r>
+                    <w:t xml:space="preserve">2025-12-29</w:t>
                   </w:r>
                 </w:p>
               </w:tc>
@@ -2200,12 +2307,172 @@
                   </w:pPr>
                   <w:r>
                     <w:t xml:space="preserve">2</w:t>
+                  </w:r>
+                </w:p>
+              </w:tc>
+            </w:tr>
+            <w:tr>
+              <w:tc>
+                <w:tcPr/>
+                <w:p>
+                  <w:pPr>
+                    <w:pStyle w:val="Compact"/>
+                    <w:jc w:val="left"/>
+                    <w:jc w:val="center"/>
+                  </w:pPr>
+                  <w:r>
+                    <w:t xml:space="preserve">EDSM</w:t>
+                  </w:r>
+                </w:p>
+              </w:tc>
+              <w:tc>
+                <w:tcPr/>
+                <w:p>
+                  <w:pPr>
+                    <w:pStyle w:val="Compact"/>
+                    <w:jc w:val="left"/>
+                    <w:jc w:val="center"/>
+                  </w:pPr>
+                  <w:r>
+                    <w:t xml:space="preserve">2025-12-29</w:t>
+                  </w:r>
+                </w:p>
+              </w:tc>
+              <w:tc>
+                <w:tcPr/>
+                <w:p>
+                  <w:pPr>
+                    <w:pStyle w:val="Compact"/>
+                    <w:jc w:val="left"/>
+                    <w:jc w:val="center"/>
+                  </w:pPr>
+                  <w:r>
+                    <w:t xml:space="preserve">West</w:t>
+                  </w:r>
+                </w:p>
+              </w:tc>
+              <w:tc>
+                <w:tcPr/>
+                <w:p>
+                  <w:pPr>
+                    <w:pStyle w:val="Compact"/>
+                    <w:jc w:val="left"/>
+                    <w:jc w:val="center"/>
+                  </w:pPr>
+                  <w:r>
+                    <w:t xml:space="preserve">Suisun Marsh</w:t>
+                  </w:r>
+                </w:p>
+              </w:tc>
+              <w:tc>
+                <w:tcPr/>
+                <w:p>
+                  <w:pPr>
+                    <w:pStyle w:val="Compact"/>
+                    <w:jc w:val="left"/>
+                    <w:jc w:val="center"/>
+                  </w:pPr>
+                  <w:r>
+                    <w:t xml:space="preserve">Adult</w:t>
+                  </w:r>
+                </w:p>
+              </w:tc>
+              <w:tc>
+                <w:tcPr/>
+                <w:p>
+                  <w:pPr>
+                    <w:pStyle w:val="Compact"/>
+                    <w:jc w:val="right"/>
+                    <w:jc w:val="center"/>
+                  </w:pPr>
+                  <w:r>
+                    <w:t xml:space="preserve">2</w:t>
+                  </w:r>
+                </w:p>
+              </w:tc>
+            </w:tr>
+            <w:tr>
+              <w:tc>
+                <w:tcPr/>
+                <w:p>
+                  <w:pPr>
+                    <w:pStyle w:val="Compact"/>
+                    <w:jc w:val="left"/>
+                    <w:jc w:val="center"/>
+                  </w:pPr>
+                  <w:r>
+                    <w:t xml:space="preserve">EDSM</w:t>
+                  </w:r>
+                </w:p>
+              </w:tc>
+              <w:tc>
+                <w:tcPr/>
+                <w:p>
+                  <w:pPr>
+                    <w:pStyle w:val="Compact"/>
+                    <w:jc w:val="left"/>
+                    <w:jc w:val="center"/>
+                  </w:pPr>
+                  <w:r>
+                    <w:t xml:space="preserve">2025-12-29</w:t>
+                  </w:r>
+                </w:p>
+              </w:tc>
+              <w:tc>
+                <w:tcPr/>
+                <w:p>
+                  <w:pPr>
+                    <w:pStyle w:val="Compact"/>
+                    <w:jc w:val="left"/>
+                    <w:jc w:val="center"/>
+                  </w:pPr>
+                  <w:r>
+                    <w:t xml:space="preserve">West</w:t>
+                  </w:r>
+                </w:p>
+              </w:tc>
+              <w:tc>
+                <w:tcPr/>
+                <w:p>
+                  <w:pPr>
+                    <w:pStyle w:val="Compact"/>
+                    <w:jc w:val="left"/>
+                    <w:jc w:val="center"/>
+                  </w:pPr>
+                  <w:r>
+                    <w:t xml:space="preserve">Suisun Marsh</w:t>
+                  </w:r>
+                </w:p>
+              </w:tc>
+              <w:tc>
+                <w:tcPr/>
+                <w:p>
+                  <w:pPr>
+                    <w:pStyle w:val="Compact"/>
+                    <w:jc w:val="left"/>
+                    <w:jc w:val="center"/>
+                  </w:pPr>
+                  <w:r>
+                    <w:t xml:space="preserve">Juvenile</w:t>
+                  </w:r>
+                </w:p>
+              </w:tc>
+              <w:tc>
+                <w:tcPr/>
+                <w:p>
+                  <w:pPr>
+                    <w:pStyle w:val="Compact"/>
+                    <w:jc w:val="right"/>
+                    <w:jc w:val="center"/>
+                  </w:pPr>
+                  <w:r>
+                    <w:t xml:space="preserve">1</w:t>
                   </w:r>
                 </w:p>
               </w:tc>
             </w:tr>
           </w:tbl>
-          <w:bookmarkEnd w:id="45"/>
+          <w:bookmarkEnd w:id="51"/>
           <w:p/>
         </w:tc>
       </w:tr>
@@ -2223,7 +2490,7 @@
       <w:tr>
         <w:tc>
           <w:tcPr/>
-          <w:bookmarkStart w:id="49" w:name="fig-lfs-map"/>
+          <w:bookmarkStart w:id="55" w:name="fig-lfs-map"/>
           <w:p>
             <w:pPr>
               <w:pStyle w:val="Compact"/>
@@ -2232,20 +2499,20 @@
             <w:r>
               <w:drawing>
                 <wp:inline>
-                  <wp:extent cx="5334000" cy="4667250"/>
+                  <wp:extent cx="5334000" cy="4667249"/>
                   <wp:effectExtent b="0" l="0" r="0" t="0"/>
-                  <wp:docPr descr="" title="" id="47" name="Picture"/>
+                  <wp:docPr descr="" title="" id="53" name="Picture"/>
                   <a:graphic>
                     <a:graphicData uri="http://schemas.openxmlformats.org/drawingml/2006/picture">
                       <pic:pic>
                         <pic:nvPicPr>
-                          <pic:cNvPr descr="smt-assessment-v1_files/figure-docx/fig-lfs-map-1.png" id="48" name="Picture"/>
+                          <pic:cNvPr descr="smt-assessment-v1_files/figure-docx/fig-lfs-map-1.png" id="54" name="Picture"/>
                           <pic:cNvPicPr>
                             <a:picLocks noChangeArrowheads="1" noChangeAspect="1"/>
                           </pic:cNvPicPr>
                         </pic:nvPicPr>
                         <pic:blipFill>
-                          <a:blip r:embed="rId46"/>
+                          <a:blip r:embed="rId52"/>
                           <a:stretch>
                             <a:fillRect/>
                           </a:stretch>
@@ -2253,7 +2520,7 @@
                         <pic:spPr bwMode="auto">
                           <a:xfrm>
                             <a:off x="0" y="0"/>
-                            <a:ext cx="5334000" cy="4667250"/>
+                            <a:ext cx="5334000" cy="4667249"/>
                           </a:xfrm>
                           <a:prstGeom prst="rect">
                             <a:avLst/>
@@ -2285,7 +2552,7 @@
               <w:t xml:space="preserve">Figure 3: Longfin Smelt Distribution for WY 2026</w:t>
             </w:r>
           </w:p>
-          <w:bookmarkEnd w:id="49"/>
+          <w:bookmarkEnd w:id="55"/>
         </w:tc>
       </w:tr>
     </w:tbl>
@@ -2302,7 +2569,7 @@
       <w:tr>
         <w:tc>
           <w:tcPr/>
-          <w:bookmarkStart w:id="50" w:name="tbl-lfs-catch-all"/>
+          <w:bookmarkStart w:id="56" w:name="tbl-lfs-catch-all"/>
           <w:p>
             <w:pPr>
               <w:jc w:val="center"/>
@@ -2395,20 +2662,20 @@
                     <w:jc w:val="center"/>
                   </w:pPr>
                   <w:r>
-                    <w:t xml:space="preserve">edsm</w:t>
-                  </w:r>
-                </w:p>
-              </w:tc>
-              <w:tc>
-                <w:tcPr/>
-                <w:p>
-                  <w:pPr>
-                    <w:pStyle w:val="Compact"/>
-                    <w:jc w:val="left"/>
-                    <w:jc w:val="center"/>
-                  </w:pPr>
-                  <w:r>
-                    <w:t xml:space="preserve">Far West</w:t>
+                    <w:t xml:space="preserve">DJFMP</w:t>
+                  </w:r>
+                </w:p>
+              </w:tc>
+              <w:tc>
+                <w:tcPr/>
+                <w:p>
+                  <w:pPr>
+                    <w:pStyle w:val="Compact"/>
+                    <w:jc w:val="left"/>
+                    <w:jc w:val="center"/>
+                  </w:pPr>
+                  <w:r>
+                    <w:t xml:space="preserve">N/A</w:t>
                   </w:r>
                 </w:p>
               </w:tc>
@@ -2434,7 +2701,7 @@
                     <w:jc w:val="center"/>
                   </w:pPr>
                   <w:r>
-                    <w:t xml:space="preserve">2</w:t>
+                    <w:t xml:space="preserve">54</w:t>
                   </w:r>
                 </w:p>
               </w:tc>
@@ -2449,33 +2716,33 @@
                     <w:jc w:val="center"/>
                   </w:pPr>
                   <w:r>
-                    <w:t xml:space="preserve">edsm</w:t>
-                  </w:r>
-                </w:p>
-              </w:tc>
-              <w:tc>
-                <w:tcPr/>
-                <w:p>
-                  <w:pPr>
-                    <w:pStyle w:val="Compact"/>
-                    <w:jc w:val="left"/>
-                    <w:jc w:val="center"/>
-                  </w:pPr>
-                  <w:r>
-                    <w:t xml:space="preserve">Far West</w:t>
-                  </w:r>
-                </w:p>
-              </w:tc>
-              <w:tc>
-                <w:tcPr/>
-                <w:p>
-                  <w:pPr>
-                    <w:pStyle w:val="Compact"/>
-                    <w:jc w:val="left"/>
-                    <w:jc w:val="center"/>
-                  </w:pPr>
-                  <w:r>
-                    <w:t xml:space="preserve">Juvenile</w:t>
+                    <w:t xml:space="preserve">EDSM</w:t>
+                  </w:r>
+                </w:p>
+              </w:tc>
+              <w:tc>
+                <w:tcPr/>
+                <w:p>
+                  <w:pPr>
+                    <w:pStyle w:val="Compact"/>
+                    <w:jc w:val="left"/>
+                    <w:jc w:val="center"/>
+                  </w:pPr>
+                  <w:r>
+                    <w:t xml:space="preserve">West</w:t>
+                  </w:r>
+                </w:p>
+              </w:tc>
+              <w:tc>
+                <w:tcPr/>
+                <w:p>
+                  <w:pPr>
+                    <w:pStyle w:val="Compact"/>
+                    <w:jc w:val="left"/>
+                    <w:jc w:val="center"/>
+                  </w:pPr>
+                  <w:r>
+                    <w:t xml:space="preserve">Adult</w:t>
                   </w:r>
                 </w:p>
               </w:tc>
@@ -2488,7 +2755,7 @@
                     <w:jc w:val="center"/>
                   </w:pPr>
                   <w:r>
-                    <w:t xml:space="preserve">6</w:t>
+                    <w:t xml:space="preserve">3</w:t>
                   </w:r>
                 </w:p>
               </w:tc>
@@ -2503,7 +2770,7 @@
                     <w:jc w:val="center"/>
                   </w:pPr>
                   <w:r>
-                    <w:t xml:space="preserve">edsm</w:t>
+                    <w:t xml:space="preserve">EDSM</w:t>
                   </w:r>
                 </w:p>
               </w:tc>
@@ -2529,7 +2796,7 @@
                     <w:jc w:val="center"/>
                   </w:pPr>
                   <w:r>
-                    <w:t xml:space="preserve">Adult</w:t>
+                    <w:t xml:space="preserve">Juvenile</w:t>
                   </w:r>
                 </w:p>
               </w:tc>
@@ -2542,67 +2809,13 @@
                     <w:jc w:val="center"/>
                   </w:pPr>
                   <w:r>
-                    <w:t xml:space="preserve">11</w:t>
-                  </w:r>
-                </w:p>
-              </w:tc>
-            </w:tr>
-            <w:tr>
-              <w:tc>
-                <w:tcPr/>
-                <w:p>
-                  <w:pPr>
-                    <w:pStyle w:val="Compact"/>
-                    <w:jc w:val="left"/>
-                    <w:jc w:val="center"/>
-                  </w:pPr>
-                  <w:r>
-                    <w:t xml:space="preserve">edsm</w:t>
-                  </w:r>
-                </w:p>
-              </w:tc>
-              <w:tc>
-                <w:tcPr/>
-                <w:p>
-                  <w:pPr>
-                    <w:pStyle w:val="Compact"/>
-                    <w:jc w:val="left"/>
-                    <w:jc w:val="center"/>
-                  </w:pPr>
-                  <w:r>
-                    <w:t xml:space="preserve">West</w:t>
-                  </w:r>
-                </w:p>
-              </w:tc>
-              <w:tc>
-                <w:tcPr/>
-                <w:p>
-                  <w:pPr>
-                    <w:pStyle w:val="Compact"/>
-                    <w:jc w:val="left"/>
-                    <w:jc w:val="center"/>
-                  </w:pPr>
-                  <w:r>
-                    <w:t xml:space="preserve">Juvenile</w:t>
-                  </w:r>
-                </w:p>
-              </w:tc>
-              <w:tc>
-                <w:tcPr/>
-                <w:p>
-                  <w:pPr>
-                    <w:pStyle w:val="Compact"/>
-                    <w:jc w:val="right"/>
-                    <w:jc w:val="center"/>
-                  </w:pPr>
-                  <w:r>
-                    <w:t xml:space="preserve">25</w:t>
+                    <w:t xml:space="preserve">12</w:t>
                   </w:r>
                 </w:p>
               </w:tc>
             </w:tr>
           </w:tbl>
-          <w:bookmarkEnd w:id="50"/>
+          <w:bookmarkEnd w:id="56"/>
           <w:p/>
         </w:tc>
       </w:tr>
@@ -2620,7 +2833,7 @@
       <w:tr>
         <w:tc>
           <w:tcPr/>
-          <w:bookmarkStart w:id="54" w:name="fig-lfs-catch"/>
+          <w:bookmarkStart w:id="60" w:name="fig-lfs-catch"/>
           <w:p>
             <w:pPr>
               <w:pStyle w:val="Compact"/>
@@ -2629,20 +2842,20 @@
             <w:r>
               <w:drawing>
                 <wp:inline>
-                  <wp:extent cx="4620126" cy="3696101"/>
+                  <wp:extent cx="4576576" cy="3661261"/>
                   <wp:effectExtent b="0" l="0" r="0" t="0"/>
-                  <wp:docPr descr="" title="" id="52" name="Picture"/>
+                  <wp:docPr descr="" title="" id="58" name="Picture"/>
                   <a:graphic>
                     <a:graphicData uri="http://schemas.openxmlformats.org/drawingml/2006/picture">
                       <pic:pic>
                         <pic:nvPicPr>
-                          <pic:cNvPr descr="smt-assessment-v1_files/figure-docx/fig-lfs-catch-1.png" id="53" name="Picture"/>
+                          <pic:cNvPr descr="smt-assessment-v1_files/figure-docx/fig-lfs-catch-1.png" id="59" name="Picture"/>
                           <pic:cNvPicPr>
                             <a:picLocks noChangeArrowheads="1" noChangeAspect="1"/>
                           </pic:cNvPicPr>
                         </pic:nvPicPr>
                         <pic:blipFill>
-                          <a:blip r:embed="rId51"/>
+                          <a:blip r:embed="rId57"/>
                           <a:stretch>
                             <a:fillRect/>
                           </a:stretch>
@@ -2650,7 +2863,7 @@
                         <pic:spPr bwMode="auto">
                           <a:xfrm>
                             <a:off x="0" y="0"/>
-                            <a:ext cx="4620126" cy="3696101"/>
+                            <a:ext cx="4576576" cy="3661261"/>
                           </a:xfrm>
                           <a:prstGeom prst="rect">
                             <a:avLst/>
@@ -2682,12 +2895,12 @@
               <w:t xml:space="preserve">Figure 4: Time Series of Longfin Smelt Catch, WY 2026</w:t>
             </w:r>
           </w:p>
-          <w:bookmarkEnd w:id="54"/>
+          <w:bookmarkEnd w:id="60"/>
         </w:tc>
       </w:tr>
     </w:tbl>
-    <w:bookmarkEnd w:id="55"/>
-    <w:bookmarkStart w:id="59" w:name="real-time-assessment-thresholds-1"/>
+    <w:bookmarkEnd w:id="61"/>
+    <w:bookmarkStart w:id="65" w:name="real-time-assessment-thresholds-1"/>
     <w:p>
       <w:pPr>
         <w:pStyle w:val="Heading4"/>
@@ -2696,7 +2909,7 @@
         <w:t xml:space="preserve">Real-time Assessment Thresholds</w:t>
       </w:r>
     </w:p>
-    <w:bookmarkStart w:id="56" w:name="X20cb4fe57c6f57bc33c1a6af910e71e88796402"/>
+    <w:bookmarkStart w:id="62" w:name="X20cb4fe57c6f57bc33c1a6af910e71e88796402"/>
     <w:p>
       <w:pPr>
         <w:pStyle w:val="Heading5"/>
@@ -2710,7 +2923,7 @@
         <w:pStyle w:val="Compact"/>
         <w:numPr>
           <w:ilvl w:val="0"/>
-          <w:numId w:val="1011"/>
+          <w:numId w:val="1010"/>
         </w:numPr>
       </w:pPr>
       <w:r>
@@ -2722,11 +2935,11 @@
         <w:pStyle w:val="Compact"/>
         <w:numPr>
           <w:ilvl w:val="1"/>
-          <w:numId w:val="1012"/>
+          <w:numId w:val="1011"/>
         </w:numPr>
       </w:pPr>
       <w:r>
-        <w:t xml:space="preserve">7-day average JPF: -616.81 cfs as of Dec 15, 2025</w:t>
+        <w:t xml:space="preserve">7-day average JPF: 7801 cfs as of Dec 28, 2025</w:t>
       </w:r>
     </w:p>
     <w:p>
@@ -2734,15 +2947,15 @@
         <w:pStyle w:val="Compact"/>
         <w:numPr>
           <w:ilvl w:val="1"/>
-          <w:numId w:val="1012"/>
+          <w:numId w:val="1011"/>
         </w:numPr>
       </w:pPr>
       <w:r>
         <w:t xml:space="preserve">Water year total Age 1+ longfin smelt salvage = 0</w:t>
       </w:r>
     </w:p>
-    <w:bookmarkEnd w:id="56"/>
-    <w:bookmarkStart w:id="57" w:name="adult-longfin-smelt"/>
+    <w:bookmarkEnd w:id="62"/>
+    <w:bookmarkStart w:id="63" w:name="adult-longfin-smelt"/>
     <w:p>
       <w:pPr>
         <w:pStyle w:val="Heading5"/>
@@ -2756,7 +2969,7 @@
         <w:pStyle w:val="Compact"/>
         <w:numPr>
           <w:ilvl w:val="0"/>
-          <w:numId w:val="1013"/>
+          <w:numId w:val="1012"/>
         </w:numPr>
       </w:pPr>
       <w:r>
@@ -2768,11 +2981,11 @@
         <w:pStyle w:val="Compact"/>
         <w:numPr>
           <w:ilvl w:val="1"/>
-          <w:numId w:val="1014"/>
+          <w:numId w:val="1013"/>
         </w:numPr>
       </w:pPr>
       <w:r>
-        <w:t xml:space="preserve">7-day average JPF: -616.81 cfs as of Dec 15, 2025</w:t>
+        <w:t xml:space="preserve">7-day average JPF: 7801 cfs as of Dec 28, 2025</w:t>
       </w:r>
     </w:p>
     <w:p>
@@ -2780,15 +2993,15 @@
         <w:pStyle w:val="Compact"/>
         <w:numPr>
           <w:ilvl w:val="1"/>
-          <w:numId w:val="1014"/>
+          <w:numId w:val="1013"/>
         </w:numPr>
       </w:pPr>
       <w:r>
         <w:t xml:space="preserve">Water year total adult longfin smelt salvage = 0</w:t>
       </w:r>
     </w:p>
-    <w:bookmarkEnd w:id="57"/>
-    <w:bookmarkStart w:id="58" w:name="larvaljuvenile-longfin-smelt"/>
+    <w:bookmarkEnd w:id="63"/>
+    <w:bookmarkStart w:id="64" w:name="larvaljuvenile-longfin-smelt"/>
     <w:p>
       <w:pPr>
         <w:pStyle w:val="Heading5"/>
@@ -2802,7 +3015,7 @@
         <w:pStyle w:val="Compact"/>
         <w:numPr>
           <w:ilvl w:val="0"/>
-          <w:numId w:val="1015"/>
+          <w:numId w:val="1014"/>
         </w:numPr>
       </w:pPr>
       <w:r>
@@ -2814,17 +3027,27 @@
         <w:pStyle w:val="Compact"/>
         <w:numPr>
           <w:ilvl w:val="1"/>
-          <w:numId w:val="1016"/>
+          <w:numId w:val="1015"/>
         </w:numPr>
       </w:pPr>
       <w:r>
-        <w:t xml:space="preserve">7-day average JPF: -616.81 cfs as of Dec 15, 2025</w:t>
-      </w:r>
-    </w:p>
-    <w:bookmarkEnd w:id="58"/>
-    <w:bookmarkEnd w:id="59"/>
-    <w:bookmarkEnd w:id="60"/>
-    <w:bookmarkStart w:id="61" w:name="end-of-smelt-omr-management"/>
+        <w:t xml:space="preserve">7-day average JPF: 7801 cfs as of Dec 28, 2025</w:t>
+      </w:r>
+    </w:p>
+    <w:bookmarkEnd w:id="64"/>
+    <w:bookmarkEnd w:id="65"/>
+    <w:bookmarkStart w:id="66" w:name="evaluation"/>
+    <w:p>
+      <w:pPr>
+        <w:pStyle w:val="Heading4"/>
+      </w:pPr>
+      <w:r>
+        <w:t xml:space="preserve">Evaluation</w:t>
+      </w:r>
+    </w:p>
+    <w:bookmarkEnd w:id="66"/>
+    <w:bookmarkEnd w:id="67"/>
+    <w:bookmarkStart w:id="68" w:name="end-of-smelt-omr-management"/>
     <w:p>
       <w:pPr>
         <w:pStyle w:val="Heading3"/>
@@ -2838,15 +3061,15 @@
         <w:pStyle w:val="Compact"/>
         <w:numPr>
           <w:ilvl w:val="0"/>
-          <w:numId w:val="1017"/>
+          <w:numId w:val="1016"/>
         </w:numPr>
       </w:pPr>
       <w:r>
         <w:t xml:space="preserve">Not relevant</w:t>
       </w:r>
     </w:p>
-    <w:bookmarkEnd w:id="61"/>
-    <w:bookmarkStart w:id="62" w:name="references"/>
+    <w:bookmarkEnd w:id="68"/>
+    <w:bookmarkStart w:id="69" w:name="references"/>
     <w:p>
       <w:pPr>
         <w:pStyle w:val="Heading3"/>
@@ -2855,8 +3078,8 @@
         <w:t xml:space="preserve">References</w:t>
       </w:r>
     </w:p>
-    <w:bookmarkEnd w:id="62"/>
-    <w:bookmarkEnd w:id="63"/>
+    <w:bookmarkEnd w:id="69"/>
+    <w:bookmarkEnd w:id="70"/>
     <w:sectPr>
       <w:footnotePr>
         <w:numRestart w:val="eachSect"/>
@@ -3119,9 +3342,6 @@
     <w:abstractNumId w:val="991"/>
   </w:num>
   <w:num w:numId="1016">
-    <w:abstractNumId w:val="991"/>
-  </w:num>
-  <w:num w:numId="1017">
     <w:abstractNumId w:val="991"/>
   </w:num>
 </w:numbering>

</xml_diff>

<commit_message>
Smelt assessment code updates and data for 1/5
</commit_message>
<xml_diff>
--- a/smt-assessment-v1.docx
+++ b/smt-assessment-v1.docx
@@ -2,7 +2,7 @@
 <file path=word/document.xml><?xml version="1.0" encoding="utf-8"?>
 <w:document xmlns:w="http://schemas.openxmlformats.org/wordprocessingml/2006/main" xmlns:m="http://schemas.openxmlformats.org/officeDocument/2006/math" xmlns:r="http://schemas.openxmlformats.org/officeDocument/2006/relationships" xmlns:o="urn:schemas-microsoft-com:office:office" xmlns:v="urn:schemas-microsoft-com:vml" xmlns:w10="urn:schemas-microsoft-com:office:word" xmlns:a="http://schemas.openxmlformats.org/drawingml/2006/main" xmlns:pic="http://schemas.openxmlformats.org/drawingml/2006/picture" xmlns:wp="http://schemas.openxmlformats.org/drawingml/2006/wordprocessingDrawing">
   <w:body>
-    <w:bookmarkStart w:id="70" w:name="X6826eb71b2e7ccf0cae7c428170c7924ae60314"/>
+    <w:bookmarkStart w:id="73" w:name="X6826eb71b2e7ccf0cae7c428170c7924ae60314"/>
     <w:p>
       <w:pPr>
         <w:pStyle w:val="Heading2"/>
@@ -26,7 +26,7 @@
           <w:i/>
           <w:iCs/>
         </w:rPr>
-        <w:t xml:space="preserve">December 29, 2025</w:t>
+        <w:t xml:space="preserve">January 05, 2026</w:t>
       </w:r>
     </w:p>
     <w:bookmarkStart w:id="20" w:name="executive-summary"/>
@@ -47,7 +47,7 @@
         </w:numPr>
       </w:pPr>
       <w:r>
-        <w:t xml:space="preserve">Sacramento River turbidity and flows (Freeport) will likely exceed First Flush criteria this week, which will start the entrainment management season</w:t>
+        <w:t xml:space="preserve">First flush conditions were met on 12/23/25, and the action was implemented on 12/26/25.</w:t>
       </w:r>
     </w:p>
     <w:p>
@@ -59,7 +59,43 @@
         </w:numPr>
       </w:pPr>
       <w:r>
+        <w:t xml:space="preserve">The First flush action implementation period will end on 1/7/26, then other entrainment management actions will become active.</w:t>
+      </w:r>
+    </w:p>
+    <w:p>
+      <w:pPr>
+        <w:pStyle w:val="Compact"/>
+        <w:numPr>
+          <w:ilvl w:val="0"/>
+          <w:numId w:val="1001"/>
+        </w:numPr>
+      </w:pPr>
+      <w:r>
+        <w:t xml:space="preserve">Delta smelt are primarily distributed west of the confluence, in Suisun Marsh</w:t>
+      </w:r>
+    </w:p>
+    <w:p>
+      <w:pPr>
+        <w:pStyle w:val="Compact"/>
+        <w:numPr>
+          <w:ilvl w:val="0"/>
+          <w:numId w:val="1001"/>
+        </w:numPr>
+      </w:pPr>
+      <w:r>
         <w:t xml:space="preserve">No Delta smelt or longfin smelt salvage has been observed this water year</w:t>
+      </w:r>
+    </w:p>
+    <w:p>
+      <w:pPr>
+        <w:pStyle w:val="Compact"/>
+        <w:numPr>
+          <w:ilvl w:val="0"/>
+          <w:numId w:val="1001"/>
+        </w:numPr>
+      </w:pPr>
+      <w:r>
+        <w:t xml:space="preserve">Turbidity in the central/south Delta is high</w:t>
       </w:r>
     </w:p>
     <w:bookmarkEnd w:id="20"/>
@@ -111,7 +147,7 @@
       </w:r>
     </w:p>
     <w:bookmarkEnd w:id="22"/>
-    <w:bookmarkStart w:id="50" w:name="delta-smelt"/>
+    <w:bookmarkStart w:id="53" w:name="delta-smelt"/>
     <w:p>
       <w:pPr>
         <w:pStyle w:val="Heading3"/>
@@ -147,7 +183,7 @@
         <w:t xml:space="preserve"> </w:t>
       </w:r>
       <w:r>
-        <w:t xml:space="preserve">Juvenile, Adult</w:t>
+        <w:t xml:space="preserve">Adult, Juvenile</w:t>
       </w:r>
     </w:p>
     <w:p>
@@ -168,7 +204,7 @@
         <w:t xml:space="preserve"> </w:t>
       </w:r>
       <w:r>
-        <w:t xml:space="preserve">3081 (95% CL: 359 to 11,902) as of the week of December 21–26, 2025</w:t>
+        <w:t xml:space="preserve">6821 (95% CL: 1,477 to 20,185) as of the week of December 29, 2025–January 2, 2026</w:t>
       </w:r>
     </w:p>
     <w:p>
@@ -189,7 +225,7 @@
         <w:t xml:space="preserve"> </w:t>
       </w:r>
       <w:r>
-        <w:t xml:space="preserve">A total of 163,349 hatchery Delta Smelt have been released for WY 2026. The most recent releases of 24,606 fish occurred in Sacramento River at Rio Vista on Dec 16, 2025.</w:t>
+        <w:t xml:space="preserve">A total of 163,349 cultured Delta Smelt have been released for WY 2026. The most recent release of 24,606 fish occurred in Sacramento River at Rio Vista on Dec 16, 2025.</w:t>
       </w:r>
     </w:p>
     <w:p>
@@ -210,7 +246,7 @@
         <w:t xml:space="preserve"> </w:t>
       </w:r>
       <w:r>
-        <w:t xml:space="preserve">26 adult Delta Smelt and 21 juvenile Delta smelt have been detected this water year. See</w:t>
+        <w:t xml:space="preserve">29 adult Delta Smelt and 22 juvenile Delta smelt have been detected this water year. See</w:t>
       </w:r>
       <w:r>
         <w:t xml:space="preserve"> </w:t>
@@ -307,6 +343,35 @@
       </w:pPr>
       <w:r>
         <w:t xml:space="preserve">Since there are few recent detections of Delta Smelt, estimation of distribution within the Delta is limited.</w:t>
+      </w:r>
+    </w:p>
+    <w:p>
+      <w:pPr>
+        <w:pStyle w:val="Compact"/>
+        <w:numPr>
+          <w:ilvl w:val="0"/>
+          <w:numId w:val="1004"/>
+        </w:numPr>
+      </w:pPr>
+      <w:r>
+        <w:t xml:space="preserve">As mentioned in EDSM reporting, fork length ranges reported for Delta Smelt and Longfin Smelt life stages are defined by the Interagency Ecological Program for permit reporting purposes and are not intended to delineate cohorts or distinguish from hatchery or wild origin. See</w:t>
+      </w:r>
+      <w:r>
+        <w:t xml:space="preserve"> </w:t>
+      </w:r>
+      <w:hyperlink w:anchor="tbl-ds-recent-catch">
+        <w:r>
+          <w:rPr>
+            <w:rStyle w:val="Hyperlink"/>
+          </w:rPr>
+          <w:t xml:space="preserve">Table 1</w:t>
+        </w:r>
+      </w:hyperlink>
+      <w:r>
+        <w:t xml:space="preserve"> </w:t>
+      </w:r>
+      <w:r>
+        <w:t xml:space="preserve">caption for fork-length ranges for age groups of Delta smelt.</w:t>
       </w:r>
     </w:p>
     <w:p>
@@ -495,59 +560,59 @@
                     <w:jc w:val="center"/>
                   </w:pPr>
                   <w:r>
-                    <w:t xml:space="preserve">DJFMP</w:t>
-                  </w:r>
-                </w:p>
-              </w:tc>
-              <w:tc>
-                <w:tcPr/>
-                <w:p>
-                  <w:pPr>
-                    <w:pStyle w:val="Compact"/>
-                    <w:jc w:val="left"/>
-                    <w:jc w:val="center"/>
-                  </w:pPr>
-                  <w:r>
-                    <w:t xml:space="preserve">2025-12-18</w:t>
-                  </w:r>
-                </w:p>
-              </w:tc>
-              <w:tc>
-                <w:tcPr/>
-                <w:p>
-                  <w:pPr>
-                    <w:pStyle w:val="Compact"/>
-                    <w:jc w:val="left"/>
-                    <w:jc w:val="center"/>
-                  </w:pPr>
-                  <w:r>
-                    <w:t xml:space="preserve">North</w:t>
-                  </w:r>
-                </w:p>
-              </w:tc>
-              <w:tc>
-                <w:tcPr/>
-                <w:p>
-                  <w:pPr>
-                    <w:pStyle w:val="Compact"/>
-                    <w:jc w:val="left"/>
-                    <w:jc w:val="center"/>
-                  </w:pPr>
-                  <w:r>
-                    <w:t xml:space="preserve">NA</w:t>
-                  </w:r>
-                </w:p>
-              </w:tc>
-              <w:tc>
-                <w:tcPr/>
-                <w:p>
-                  <w:pPr>
-                    <w:pStyle w:val="Compact"/>
-                    <w:jc w:val="left"/>
-                    <w:jc w:val="center"/>
-                  </w:pPr>
-                  <w:r>
-                    <w:t xml:space="preserve">Juvenile</w:t>
+                    <w:t xml:space="preserve">EDSM</w:t>
+                  </w:r>
+                </w:p>
+              </w:tc>
+              <w:tc>
+                <w:tcPr/>
+                <w:p>
+                  <w:pPr>
+                    <w:pStyle w:val="Compact"/>
+                    <w:jc w:val="left"/>
+                    <w:jc w:val="center"/>
+                  </w:pPr>
+                  <w:r>
+                    <w:t xml:space="preserve">2025-12-29</w:t>
+                  </w:r>
+                </w:p>
+              </w:tc>
+              <w:tc>
+                <w:tcPr/>
+                <w:p>
+                  <w:pPr>
+                    <w:pStyle w:val="Compact"/>
+                    <w:jc w:val="left"/>
+                    <w:jc w:val="center"/>
+                  </w:pPr>
+                  <w:r>
+                    <w:t xml:space="preserve">West</w:t>
+                  </w:r>
+                </w:p>
+              </w:tc>
+              <w:tc>
+                <w:tcPr/>
+                <w:p>
+                  <w:pPr>
+                    <w:pStyle w:val="Compact"/>
+                    <w:jc w:val="left"/>
+                    <w:jc w:val="center"/>
+                  </w:pPr>
+                  <w:r>
+                    <w:t xml:space="preserve">Suisun Marsh</w:t>
+                  </w:r>
+                </w:p>
+              </w:tc>
+              <w:tc>
+                <w:tcPr/>
+                <w:p>
+                  <w:pPr>
+                    <w:pStyle w:val="Compact"/>
+                    <w:jc w:val="left"/>
+                    <w:jc w:val="center"/>
+                  </w:pPr>
+                  <w:r>
+                    <w:t xml:space="preserve">Adult</w:t>
                   </w:r>
                 </w:p>
               </w:tc>
@@ -560,7 +625,7 @@
                     <w:jc w:val="center"/>
                   </w:pPr>
                   <w:r>
-                    <w:t xml:space="preserve">1</w:t>
+                    <w:t xml:space="preserve">2</w:t>
                   </w:r>
                 </w:p>
               </w:tc>
@@ -588,7 +653,7 @@
                     <w:jc w:val="center"/>
                   </w:pPr>
                   <w:r>
-                    <w:t xml:space="preserve">2025-12-16</w:t>
+                    <w:t xml:space="preserve">2026-01-02</w:t>
                   </w:r>
                 </w:p>
               </w:tc>
@@ -627,7 +692,7 @@
                     <w:jc w:val="center"/>
                   </w:pPr>
                   <w:r>
-                    <w:t xml:space="preserve">Juvenile</w:t>
+                    <w:t xml:space="preserve">Adult</w:t>
                   </w:r>
                 </w:p>
               </w:tc>
@@ -668,7 +733,7 @@
                     <w:jc w:val="center"/>
                   </w:pPr>
                   <w:r>
-                    <w:t xml:space="preserve">2025-12-21</w:t>
+                    <w:t xml:space="preserve">2026-01-02</w:t>
                   </w:r>
                 </w:p>
               </w:tc>
@@ -708,86 +773,6 @@
                   </w:pPr>
                   <w:r>
                     <w:t xml:space="preserve">Juvenile</w:t>
-                  </w:r>
-                </w:p>
-              </w:tc>
-              <w:tc>
-                <w:tcPr/>
-                <w:p>
-                  <w:pPr>
-                    <w:pStyle w:val="Compact"/>
-                    <w:jc w:val="right"/>
-                    <w:jc w:val="center"/>
-                  </w:pPr>
-                  <w:r>
-                    <w:t xml:space="preserve">2</w:t>
-                  </w:r>
-                </w:p>
-              </w:tc>
-            </w:tr>
-            <w:tr>
-              <w:tc>
-                <w:tcPr/>
-                <w:p>
-                  <w:pPr>
-                    <w:pStyle w:val="Compact"/>
-                    <w:jc w:val="left"/>
-                    <w:jc w:val="center"/>
-                  </w:pPr>
-                  <w:r>
-                    <w:t xml:space="preserve">EDSM</w:t>
-                  </w:r>
-                </w:p>
-              </w:tc>
-              <w:tc>
-                <w:tcPr/>
-                <w:p>
-                  <w:pPr>
-                    <w:pStyle w:val="Compact"/>
-                    <w:jc w:val="left"/>
-                    <w:jc w:val="center"/>
-                  </w:pPr>
-                  <w:r>
-                    <w:t xml:space="preserve">2025-12-29</w:t>
-                  </w:r>
-                </w:p>
-              </w:tc>
-              <w:tc>
-                <w:tcPr/>
-                <w:p>
-                  <w:pPr>
-                    <w:pStyle w:val="Compact"/>
-                    <w:jc w:val="left"/>
-                    <w:jc w:val="center"/>
-                  </w:pPr>
-                  <w:r>
-                    <w:t xml:space="preserve">West</w:t>
-                  </w:r>
-                </w:p>
-              </w:tc>
-              <w:tc>
-                <w:tcPr/>
-                <w:p>
-                  <w:pPr>
-                    <w:pStyle w:val="Compact"/>
-                    <w:jc w:val="left"/>
-                    <w:jc w:val="center"/>
-                  </w:pPr>
-                  <w:r>
-                    <w:t xml:space="preserve">Suisun Marsh</w:t>
-                  </w:r>
-                </w:p>
-              </w:tc>
-              <w:tc>
-                <w:tcPr/>
-                <w:p>
-                  <w:pPr>
-                    <w:pStyle w:val="Compact"/>
-                    <w:jc w:val="left"/>
-                    <w:jc w:val="center"/>
-                  </w:pPr>
-                  <w:r>
-                    <w:t xml:space="preserve">Adult</w:t>
                   </w:r>
                 </w:p>
               </w:tc>
@@ -1143,7 +1128,7 @@
                     <w:jc w:val="center"/>
                   </w:pPr>
                   <w:r>
-                    <w:t xml:space="preserve">25</w:t>
+                    <w:t xml:space="preserve">28</w:t>
                   </w:r>
                 </w:p>
               </w:tc>
@@ -1197,7 +1182,7 @@
                     <w:jc w:val="center"/>
                   </w:pPr>
                   <w:r>
-                    <w:t xml:space="preserve">20</w:t>
+                    <w:t xml:space="preserve">21</w:t>
                   </w:r>
                 </w:p>
               </w:tc>
@@ -1337,7 +1322,7 @@
         <w:t xml:space="preserve">FPT Flow (3-day average)</w:t>
       </w:r>
       <w:r>
-        <w:t xml:space="preserve">: 68156 cfs as of Dec 28, 2025</w:t>
+        <w:t xml:space="preserve">: 58900 cfs as of Jan 04, 2026</w:t>
       </w:r>
     </w:p>
     <w:p>
@@ -1356,7 +1341,7 @@
         <w:t xml:space="preserve">FPT Turbidity (3-day average)</w:t>
       </w:r>
       <w:r>
-        <w:t xml:space="preserve">: 104.38 FNU as of Dec 28, 2025</w:t>
+        <w:t xml:space="preserve">: 41.88 FNU as of Jan 04, 2026</w:t>
       </w:r>
     </w:p>
     <w:p>
@@ -1475,7 +1460,7 @@
       </w:r>
     </w:p>
     <w:bookmarkEnd w:id="44"/>
-    <w:bookmarkStart w:id="48" w:name="real-time-assessment-thresholds"/>
+    <w:bookmarkStart w:id="51" w:name="real-time-assessment-thresholds"/>
     <w:p>
       <w:pPr>
         <w:pStyle w:val="Heading4"/>
@@ -1484,13 +1469,28 @@
         <w:t xml:space="preserve">Real-time Assessment Thresholds</w:t>
       </w:r>
     </w:p>
-    <w:bookmarkStart w:id="46" w:name="adult-delta-smelt"/>
+    <w:bookmarkStart w:id="49" w:name="adult-delta-smelt"/>
     <w:p>
       <w:pPr>
         <w:pStyle w:val="Heading5"/>
       </w:pPr>
       <w:r>
         <w:t xml:space="preserve">Adult Delta Smelt</w:t>
+      </w:r>
+    </w:p>
+    <w:p>
+      <w:pPr>
+        <w:pStyle w:val="FirstParagraph"/>
+      </w:pPr>
+      <w:r>
+        <w:rPr>
+          <w:b/>
+          <w:bCs/>
+        </w:rPr>
+        <w:t xml:space="preserve">Threshold</w:t>
+      </w:r>
+      <w:r>
+        <w:t xml:space="preserve">: If daily average JPF &lt; 0 AND turbidity ≥ 12 FNU at OBI, HOL and OSJ</w:t>
       </w:r>
     </w:p>
     <w:p>
@@ -1502,7 +1502,89 @@
         </w:numPr>
       </w:pPr>
       <w:r>
-        <w:t xml:space="preserve">Not relevant</w:t>
+        <w:rPr>
+          <w:b/>
+          <w:bCs/>
+        </w:rPr>
+        <w:t xml:space="preserve">JPF</w:t>
+      </w:r>
+      <w:r>
+        <w:t xml:space="preserve">: 7866 cfs as of Jan 01, 2026</w:t>
+      </w:r>
+    </w:p>
+    <w:p>
+      <w:pPr>
+        <w:pStyle w:val="Compact"/>
+        <w:numPr>
+          <w:ilvl w:val="0"/>
+          <w:numId w:val="1006"/>
+        </w:numPr>
+      </w:pPr>
+      <w:r>
+        <w:rPr>
+          <w:b/>
+          <w:bCs/>
+        </w:rPr>
+        <w:t xml:space="preserve">OBI Turbidity</w:t>
+      </w:r>
+      <w:r>
+        <w:t xml:space="preserve">: 15.7, 5.48, 5.88 FNU as of Jan 04, 2026</w:t>
+      </w:r>
+    </w:p>
+    <w:p>
+      <w:pPr>
+        <w:pStyle w:val="Compact"/>
+        <w:numPr>
+          <w:ilvl w:val="0"/>
+          <w:numId w:val="1006"/>
+        </w:numPr>
+      </w:pPr>
+      <w:r>
+        <w:rPr>
+          <w:b/>
+          <w:bCs/>
+        </w:rPr>
+        <w:t xml:space="preserve">HOL Turbidity</w:t>
+      </w:r>
+      <w:r>
+        <w:t xml:space="preserve">: 5.61, 6.12, 6.43 FNU as of Jan 04, 2026</w:t>
+      </w:r>
+    </w:p>
+    <w:p>
+      <w:pPr>
+        <w:pStyle w:val="Compact"/>
+        <w:numPr>
+          <w:ilvl w:val="0"/>
+          <w:numId w:val="1006"/>
+        </w:numPr>
+      </w:pPr>
+      <w:r>
+        <w:rPr>
+          <w:b/>
+          <w:bCs/>
+        </w:rPr>
+        <w:t xml:space="preserve">OSJ Turbidity</w:t>
+      </w:r>
+      <w:r>
+        <w:t xml:space="preserve">: 25.34, 24.47, 21.84 FNU as of Jan 04, 2026</w:t>
+      </w:r>
+    </w:p>
+    <w:p>
+      <w:pPr>
+        <w:pStyle w:val="FirstParagraph"/>
+      </w:pPr>
+      <w:r>
+        <w:rPr>
+          <w:b/>
+          <w:bCs/>
+        </w:rPr>
+        <w:t xml:space="preserve">Offramp Adult/Onramp Larval and Juvenile Protections</w:t>
+      </w:r>
+      <w:r>
+        <w:t xml:space="preserve"> </w:t>
+      </w:r>
+      <w:r>
+        <w:t xml:space="preserve">when RVB or SJJ &gt; 12°C</w:t>
       </w:r>
     </w:p>
     <w:p>
@@ -1514,12 +1596,78 @@
         </w:numPr>
       </w:pPr>
       <w:r>
+        <w:rPr>
+          <w:b/>
+          <w:bCs/>
+        </w:rPr>
+        <w:t xml:space="preserve">RVB temperature (3-day average)</w:t>
+      </w:r>
+      <w:r>
+        <w:t xml:space="preserve">: 10.37°C as of Jan 04, 2026</w:t>
+      </w:r>
+    </w:p>
+    <w:p>
+      <w:pPr>
+        <w:pStyle w:val="FirstParagraph"/>
+      </w:pPr>
+      <w:r>
+        <w:drawing>
+          <wp:inline>
+            <wp:extent cx="4533900" cy="3238500"/>
+            <wp:effectExtent b="0" l="0" r="0" t="0"/>
+            <wp:docPr descr="" title="" id="46" name="Picture"/>
+            <a:graphic>
+              <a:graphicData uri="http://schemas.openxmlformats.org/drawingml/2006/picture">
+                <pic:pic>
+                  <pic:nvPicPr>
+                    <pic:cNvPr descr="smelt_figures/freeport_turbidity.png" id="47" name="Picture"/>
+                    <pic:cNvPicPr>
+                      <a:picLocks noChangeArrowheads="1" noChangeAspect="1"/>
+                    </pic:cNvPicPr>
+                  </pic:nvPicPr>
+                  <pic:blipFill>
+                    <a:blip r:embed="rId45"/>
+                    <a:stretch>
+                      <a:fillRect/>
+                    </a:stretch>
+                  </pic:blipFill>
+                  <pic:spPr bwMode="auto">
+                    <a:xfrm>
+                      <a:off x="0" y="0"/>
+                      <a:ext cx="4533900" cy="3238500"/>
+                    </a:xfrm>
+                    <a:prstGeom prst="rect">
+                      <a:avLst/>
+                    </a:prstGeom>
+                    <a:noFill/>
+                    <a:ln w="9525">
+                      <a:noFill/>
+                      <a:headEnd/>
+                      <a:tailEnd/>
+                    </a:ln>
+                  </pic:spPr>
+                </pic:pic>
+              </a:graphicData>
+            </a:graphic>
+          </wp:inline>
+        </w:drawing>
+      </w:r>
+    </w:p>
+    <w:p>
+      <w:pPr>
+        <w:pStyle w:val="Compact"/>
+        <w:numPr>
+          <w:ilvl w:val="0"/>
+          <w:numId w:val="1008"/>
+        </w:numPr>
+      </w:pPr>
+      <w:r>
         <w:t xml:space="preserve">See</w:t>
       </w:r>
       <w:r>
         <w:t xml:space="preserve"> </w:t>
       </w:r>
-      <w:hyperlink r:id="rId45">
+      <w:hyperlink r:id="rId48">
         <w:r>
           <w:rPr>
             <w:rStyle w:val="Hyperlink"/>
@@ -1537,14 +1685,29 @@
         <w:t xml:space="preserve"> </w:t>
       </w:r>
     </w:p>
-    <w:bookmarkEnd w:id="46"/>
-    <w:bookmarkStart w:id="47" w:name="larvaljuvenile-delta-smelt"/>
+    <w:bookmarkEnd w:id="49"/>
+    <w:bookmarkStart w:id="50" w:name="larvaljuvenile-delta-smelt"/>
     <w:p>
       <w:pPr>
         <w:pStyle w:val="Heading5"/>
       </w:pPr>
       <w:r>
         <w:t xml:space="preserve">Larval/Juvenile Delta Smelt</w:t>
+      </w:r>
+    </w:p>
+    <w:p>
+      <w:pPr>
+        <w:pStyle w:val="FirstParagraph"/>
+      </w:pPr>
+      <w:r>
+        <w:rPr>
+          <w:b/>
+          <w:bCs/>
+        </w:rPr>
+        <w:t xml:space="preserve">Threshold</w:t>
+      </w:r>
+      <w:r>
+        <w:t xml:space="preserve">: After the onset of spawning, if JPF &lt; 0 cfs AND turbidity is ≥ 12 FNU in the south Delta AND PTM modeling indicates the action would avoid ≥ 5% entrainment of Delta smelt population after 30 days</w:t>
       </w:r>
     </w:p>
     <w:p>
@@ -1552,16 +1715,23 @@
         <w:pStyle w:val="Compact"/>
         <w:numPr>
           <w:ilvl w:val="0"/>
-          <w:numId w:val="1008"/>
+          <w:numId w:val="1009"/>
         </w:numPr>
       </w:pPr>
       <w:r>
-        <w:t xml:space="preserve">Not relevant</w:t>
-      </w:r>
-    </w:p>
-    <w:bookmarkEnd w:id="47"/>
-    <w:bookmarkEnd w:id="48"/>
-    <w:bookmarkStart w:id="49" w:name="evalutation"/>
+        <w:rPr>
+          <w:b/>
+          <w:bCs/>
+        </w:rPr>
+        <w:t xml:space="preserve">12-station South Delta Turbidity</w:t>
+      </w:r>
+      <w:r>
+        <w:t xml:space="preserve">: The most recent average turbidity was 19.1 FNU as of Dec 30, 2025</w:t>
+      </w:r>
+    </w:p>
+    <w:bookmarkEnd w:id="50"/>
+    <w:bookmarkEnd w:id="51"/>
+    <w:bookmarkStart w:id="52" w:name="evalutation"/>
     <w:p>
       <w:pPr>
         <w:pStyle w:val="Heading4"/>
@@ -1570,9 +1740,9 @@
         <w:t xml:space="preserve">Evalutation</w:t>
       </w:r>
     </w:p>
-    <w:bookmarkEnd w:id="49"/>
-    <w:bookmarkEnd w:id="50"/>
-    <w:bookmarkStart w:id="67" w:name="longfin-smelt"/>
+    <w:bookmarkEnd w:id="52"/>
+    <w:bookmarkEnd w:id="53"/>
+    <w:bookmarkStart w:id="70" w:name="longfin-smelt"/>
     <w:p>
       <w:pPr>
         <w:pStyle w:val="Heading3"/>
@@ -1581,7 +1751,7 @@
         <w:t xml:space="preserve">Longfin Smelt</w:t>
       </w:r>
     </w:p>
-    <w:bookmarkStart w:id="61" w:name="biological-1"/>
+    <w:bookmarkStart w:id="64" w:name="biological-1"/>
     <w:p>
       <w:pPr>
         <w:pStyle w:val="Heading4"/>
@@ -1594,7 +1764,7 @@
       <w:pPr>
         <w:numPr>
           <w:ilvl w:val="0"/>
-          <w:numId w:val="1009"/>
+          <w:numId w:val="1010"/>
         </w:numPr>
       </w:pPr>
       <w:r>
@@ -1615,7 +1785,7 @@
       <w:pPr>
         <w:numPr>
           <w:ilvl w:val="0"/>
-          <w:numId w:val="1009"/>
+          <w:numId w:val="1010"/>
         </w:numPr>
       </w:pPr>
       <w:r>
@@ -1629,7 +1799,7 @@
         <w:t xml:space="preserve"> </w:t>
       </w:r>
       <w:r>
-        <w:t xml:space="preserve">152 adult Longfin Smelt and 430 juvenile Longfin smelt have been detected this water year. See</w:t>
+        <w:t xml:space="preserve">270 adult, 435 juvenile, and 3 larval Longfin smelt have been detected this water year. See</w:t>
       </w:r>
       <w:r>
         <w:t xml:space="preserve"> </w:t>
@@ -1687,7 +1857,7 @@
       <w:pPr>
         <w:numPr>
           <w:ilvl w:val="0"/>
-          <w:numId w:val="1009"/>
+          <w:numId w:val="1010"/>
         </w:numPr>
       </w:pPr>
       <w:r>
@@ -1720,7 +1890,7 @@
       <w:tr>
         <w:tc>
           <w:tcPr/>
-          <w:bookmarkStart w:id="51" w:name="tbl-lfs-recent-catch"/>
+          <w:bookmarkStart w:id="54" w:name="tbl-lfs-recent-catch"/>
           <w:p>
             <w:pPr>
               <w:jc w:val="center"/>
@@ -1854,7 +2024,7 @@
                     <w:jc w:val="center"/>
                   </w:pPr>
                   <w:r>
-                    <w:t xml:space="preserve">2025-12-17</w:t>
+                    <w:t xml:space="preserve">2025-12-29</w:t>
                   </w:r>
                 </w:p>
               </w:tc>
@@ -1906,7 +2076,7 @@
                     <w:jc w:val="center"/>
                   </w:pPr>
                   <w:r>
-                    <w:t xml:space="preserve">47</w:t>
+                    <w:t xml:space="preserve">21</w:t>
                   </w:r>
                 </w:p>
               </w:tc>
@@ -1934,7 +2104,7 @@
                     <w:jc w:val="center"/>
                   </w:pPr>
                   <w:r>
-                    <w:t xml:space="preserve">2025-12-22</w:t>
+                    <w:t xml:space="preserve">2025-12-30</w:t>
                   </w:r>
                 </w:p>
               </w:tc>
@@ -1986,7 +2156,7 @@
                     <w:jc w:val="center"/>
                   </w:pPr>
                   <w:r>
-                    <w:t xml:space="preserve">2</w:t>
+                    <w:t xml:space="preserve">54</w:t>
                   </w:r>
                 </w:p>
               </w:tc>
@@ -2014,7 +2184,7 @@
                     <w:jc w:val="center"/>
                   </w:pPr>
                   <w:r>
-                    <w:t xml:space="preserve">2025-12-29</w:t>
+                    <w:t xml:space="preserve">2025-12-30</w:t>
                   </w:r>
                 </w:p>
               </w:tc>
@@ -2053,7 +2223,7 @@
                     <w:jc w:val="center"/>
                   </w:pPr>
                   <w:r>
-                    <w:t xml:space="preserve">Adult</w:t>
+                    <w:t xml:space="preserve">Juvenile</w:t>
                   </w:r>
                 </w:p>
               </w:tc>
@@ -2066,7 +2236,7 @@
                     <w:jc w:val="center"/>
                   </w:pPr>
                   <w:r>
-                    <w:t xml:space="preserve">5</w:t>
+                    <w:t xml:space="preserve">1</w:t>
                   </w:r>
                 </w:p>
               </w:tc>
@@ -2081,46 +2251,46 @@
                     <w:jc w:val="center"/>
                   </w:pPr>
                   <w:r>
-                    <w:t xml:space="preserve">EDSM</w:t>
-                  </w:r>
-                </w:p>
-              </w:tc>
-              <w:tc>
-                <w:tcPr/>
-                <w:p>
-                  <w:pPr>
-                    <w:pStyle w:val="Compact"/>
-                    <w:jc w:val="left"/>
-                    <w:jc w:val="center"/>
-                  </w:pPr>
-                  <w:r>
-                    <w:t xml:space="preserve">2025-12-17</w:t>
-                  </w:r>
-                </w:p>
-              </w:tc>
-              <w:tc>
-                <w:tcPr/>
-                <w:p>
-                  <w:pPr>
-                    <w:pStyle w:val="Compact"/>
-                    <w:jc w:val="left"/>
-                    <w:jc w:val="center"/>
-                  </w:pPr>
-                  <w:r>
-                    <w:t xml:space="preserve">West</w:t>
-                  </w:r>
-                </w:p>
-              </w:tc>
-              <w:tc>
-                <w:tcPr/>
-                <w:p>
-                  <w:pPr>
-                    <w:pStyle w:val="Compact"/>
-                    <w:jc w:val="left"/>
-                    <w:jc w:val="center"/>
-                  </w:pPr>
-                  <w:r>
-                    <w:t xml:space="preserve">Suisun Marsh</w:t>
+                    <w:t xml:space="preserve">DJFMP</w:t>
+                  </w:r>
+                </w:p>
+              </w:tc>
+              <w:tc>
+                <w:tcPr/>
+                <w:p>
+                  <w:pPr>
+                    <w:pStyle w:val="Compact"/>
+                    <w:jc w:val="left"/>
+                    <w:jc w:val="center"/>
+                  </w:pPr>
+                  <w:r>
+                    <w:t xml:space="preserve">2025-12-31</w:t>
+                  </w:r>
+                </w:p>
+              </w:tc>
+              <w:tc>
+                <w:tcPr/>
+                <w:p>
+                  <w:pPr>
+                    <w:pStyle w:val="Compact"/>
+                    <w:jc w:val="left"/>
+                    <w:jc w:val="center"/>
+                  </w:pPr>
+                  <w:r>
+                    <w:t xml:space="preserve">N/A</w:t>
+                  </w:r>
+                </w:p>
+              </w:tc>
+              <w:tc>
+                <w:tcPr/>
+                <w:p>
+                  <w:pPr>
+                    <w:pStyle w:val="Compact"/>
+                    <w:jc w:val="left"/>
+                    <w:jc w:val="center"/>
+                  </w:pPr>
+                  <w:r>
+                    <w:t xml:space="preserve">Chipps Island</w:t>
                   </w:r>
                 </w:p>
               </w:tc>
@@ -2146,7 +2316,7 @@
                     <w:jc w:val="center"/>
                   </w:pPr>
                   <w:r>
-                    <w:t xml:space="preserve">1</w:t>
+                    <w:t xml:space="preserve">44</w:t>
                   </w:r>
                 </w:p>
               </w:tc>
@@ -2161,46 +2331,46 @@
                     <w:jc w:val="center"/>
                   </w:pPr>
                   <w:r>
-                    <w:t xml:space="preserve">EDSM</w:t>
-                  </w:r>
-                </w:p>
-              </w:tc>
-              <w:tc>
-                <w:tcPr/>
-                <w:p>
-                  <w:pPr>
-                    <w:pStyle w:val="Compact"/>
-                    <w:jc w:val="left"/>
-                    <w:jc w:val="center"/>
-                  </w:pPr>
-                  <w:r>
-                    <w:t xml:space="preserve">2025-12-17</w:t>
-                  </w:r>
-                </w:p>
-              </w:tc>
-              <w:tc>
-                <w:tcPr/>
-                <w:p>
-                  <w:pPr>
-                    <w:pStyle w:val="Compact"/>
-                    <w:jc w:val="left"/>
-                    <w:jc w:val="center"/>
-                  </w:pPr>
-                  <w:r>
-                    <w:t xml:space="preserve">West</w:t>
-                  </w:r>
-                </w:p>
-              </w:tc>
-              <w:tc>
-                <w:tcPr/>
-                <w:p>
-                  <w:pPr>
-                    <w:pStyle w:val="Compact"/>
-                    <w:jc w:val="left"/>
-                    <w:jc w:val="center"/>
-                  </w:pPr>
-                  <w:r>
-                    <w:t xml:space="preserve">Suisun Marsh</w:t>
+                    <w:t xml:space="preserve">DJFMP</w:t>
+                  </w:r>
+                </w:p>
+              </w:tc>
+              <w:tc>
+                <w:tcPr/>
+                <w:p>
+                  <w:pPr>
+                    <w:pStyle w:val="Compact"/>
+                    <w:jc w:val="left"/>
+                    <w:jc w:val="center"/>
+                  </w:pPr>
+                  <w:r>
+                    <w:t xml:space="preserve">2025-12-31</w:t>
+                  </w:r>
+                </w:p>
+              </w:tc>
+              <w:tc>
+                <w:tcPr/>
+                <w:p>
+                  <w:pPr>
+                    <w:pStyle w:val="Compact"/>
+                    <w:jc w:val="left"/>
+                    <w:jc w:val="center"/>
+                  </w:pPr>
+                  <w:r>
+                    <w:t xml:space="preserve">N/A</w:t>
+                  </w:r>
+                </w:p>
+              </w:tc>
+              <w:tc>
+                <w:tcPr/>
+                <w:p>
+                  <w:pPr>
+                    <w:pStyle w:val="Compact"/>
+                    <w:jc w:val="left"/>
+                    <w:jc w:val="center"/>
+                  </w:pPr>
+                  <w:r>
+                    <w:t xml:space="preserve">Chipps Island</w:t>
                   </w:r>
                 </w:p>
               </w:tc>
@@ -2226,7 +2396,7 @@
                     <w:jc w:val="center"/>
                   </w:pPr>
                   <w:r>
-                    <w:t xml:space="preserve">9</w:t>
+                    <w:t xml:space="preserve">2</w:t>
                   </w:r>
                 </w:p>
               </w:tc>
@@ -2280,20 +2450,20 @@
                     <w:jc w:val="center"/>
                   </w:pPr>
                   <w:r>
-                    <w:t xml:space="preserve">Suisun Bay</w:t>
-                  </w:r>
-                </w:p>
-              </w:tc>
-              <w:tc>
-                <w:tcPr/>
-                <w:p>
-                  <w:pPr>
-                    <w:pStyle w:val="Compact"/>
-                    <w:jc w:val="left"/>
-                    <w:jc w:val="center"/>
-                  </w:pPr>
-                  <w:r>
-                    <w:t xml:space="preserve">Juvenile</w:t>
+                    <w:t xml:space="preserve">Suisun Marsh</w:t>
+                  </w:r>
+                </w:p>
+              </w:tc>
+              <w:tc>
+                <w:tcPr/>
+                <w:p>
+                  <w:pPr>
+                    <w:pStyle w:val="Compact"/>
+                    <w:jc w:val="left"/>
+                    <w:jc w:val="center"/>
+                  </w:pPr>
+                  <w:r>
+                    <w:t xml:space="preserve">Adult</w:t>
                   </w:r>
                 </w:p>
               </w:tc>
@@ -2373,7 +2543,7 @@
                     <w:jc w:val="center"/>
                   </w:pPr>
                   <w:r>
-                    <w:t xml:space="preserve">Adult</w:t>
+                    <w:t xml:space="preserve">Juvenile</w:t>
                   </w:r>
                 </w:p>
               </w:tc>
@@ -2386,7 +2556,7 @@
                     <w:jc w:val="center"/>
                   </w:pPr>
                   <w:r>
-                    <w:t xml:space="preserve">2</w:t>
+                    <w:t xml:space="preserve">3</w:t>
                   </w:r>
                 </w:p>
               </w:tc>
@@ -2414,7 +2584,7 @@
                     <w:jc w:val="center"/>
                   </w:pPr>
                   <w:r>
-                    <w:t xml:space="preserve">2025-12-29</w:t>
+                    <w:t xml:space="preserve">2025-12-30</w:t>
                   </w:r>
                 </w:p>
               </w:tc>
@@ -2440,7 +2610,247 @@
                     <w:jc w:val="center"/>
                   </w:pPr>
                   <w:r>
-                    <w:t xml:space="preserve">Suisun Marsh</w:t>
+                    <w:t xml:space="preserve">Suisun Bay</w:t>
+                  </w:r>
+                </w:p>
+              </w:tc>
+              <w:tc>
+                <w:tcPr/>
+                <w:p>
+                  <w:pPr>
+                    <w:pStyle w:val="Compact"/>
+                    <w:jc w:val="left"/>
+                    <w:jc w:val="center"/>
+                  </w:pPr>
+                  <w:r>
+                    <w:t xml:space="preserve">Adult</w:t>
+                  </w:r>
+                </w:p>
+              </w:tc>
+              <w:tc>
+                <w:tcPr/>
+                <w:p>
+                  <w:pPr>
+                    <w:pStyle w:val="Compact"/>
+                    <w:jc w:val="right"/>
+                    <w:jc w:val="center"/>
+                  </w:pPr>
+                  <w:r>
+                    <w:t xml:space="preserve">2</w:t>
+                  </w:r>
+                </w:p>
+              </w:tc>
+            </w:tr>
+            <w:tr>
+              <w:tc>
+                <w:tcPr/>
+                <w:p>
+                  <w:pPr>
+                    <w:pStyle w:val="Compact"/>
+                    <w:jc w:val="left"/>
+                    <w:jc w:val="center"/>
+                  </w:pPr>
+                  <w:r>
+                    <w:t xml:space="preserve">EDSM</w:t>
+                  </w:r>
+                </w:p>
+              </w:tc>
+              <w:tc>
+                <w:tcPr/>
+                <w:p>
+                  <w:pPr>
+                    <w:pStyle w:val="Compact"/>
+                    <w:jc w:val="left"/>
+                    <w:jc w:val="center"/>
+                  </w:pPr>
+                  <w:r>
+                    <w:t xml:space="preserve">2025-12-30</w:t>
+                  </w:r>
+                </w:p>
+              </w:tc>
+              <w:tc>
+                <w:tcPr/>
+                <w:p>
+                  <w:pPr>
+                    <w:pStyle w:val="Compact"/>
+                    <w:jc w:val="left"/>
+                    <w:jc w:val="center"/>
+                  </w:pPr>
+                  <w:r>
+                    <w:t xml:space="preserve">West</w:t>
+                  </w:r>
+                </w:p>
+              </w:tc>
+              <w:tc>
+                <w:tcPr/>
+                <w:p>
+                  <w:pPr>
+                    <w:pStyle w:val="Compact"/>
+                    <w:jc w:val="left"/>
+                    <w:jc w:val="center"/>
+                  </w:pPr>
+                  <w:r>
+                    <w:t xml:space="preserve">Suisun Bay</w:t>
+                  </w:r>
+                </w:p>
+              </w:tc>
+              <w:tc>
+                <w:tcPr/>
+                <w:p>
+                  <w:pPr>
+                    <w:pStyle w:val="Compact"/>
+                    <w:jc w:val="left"/>
+                    <w:jc w:val="center"/>
+                  </w:pPr>
+                  <w:r>
+                    <w:t xml:space="preserve">Juvenile</w:t>
+                  </w:r>
+                </w:p>
+              </w:tc>
+              <w:tc>
+                <w:tcPr/>
+                <w:p>
+                  <w:pPr>
+                    <w:pStyle w:val="Compact"/>
+                    <w:jc w:val="right"/>
+                    <w:jc w:val="center"/>
+                  </w:pPr>
+                  <w:r>
+                    <w:t xml:space="preserve">1</w:t>
+                  </w:r>
+                </w:p>
+              </w:tc>
+            </w:tr>
+            <w:tr>
+              <w:tc>
+                <w:tcPr/>
+                <w:p>
+                  <w:pPr>
+                    <w:pStyle w:val="Compact"/>
+                    <w:jc w:val="left"/>
+                    <w:jc w:val="center"/>
+                  </w:pPr>
+                  <w:r>
+                    <w:t xml:space="preserve">EDSM</w:t>
+                  </w:r>
+                </w:p>
+              </w:tc>
+              <w:tc>
+                <w:tcPr/>
+                <w:p>
+                  <w:pPr>
+                    <w:pStyle w:val="Compact"/>
+                    <w:jc w:val="left"/>
+                    <w:jc w:val="center"/>
+                  </w:pPr>
+                  <w:r>
+                    <w:t xml:space="preserve">2025-12-31</w:t>
+                  </w:r>
+                </w:p>
+              </w:tc>
+              <w:tc>
+                <w:tcPr/>
+                <w:p>
+                  <w:pPr>
+                    <w:pStyle w:val="Compact"/>
+                    <w:jc w:val="left"/>
+                    <w:jc w:val="center"/>
+                  </w:pPr>
+                  <w:r>
+                    <w:t xml:space="preserve">Far West</w:t>
+                  </w:r>
+                </w:p>
+              </w:tc>
+              <w:tc>
+                <w:tcPr/>
+                <w:p>
+                  <w:pPr>
+                    <w:pStyle w:val="Compact"/>
+                    <w:jc w:val="left"/>
+                    <w:jc w:val="center"/>
+                  </w:pPr>
+                  <w:r>
+                    <w:t xml:space="preserve">Suisun Bay</w:t>
+                  </w:r>
+                </w:p>
+              </w:tc>
+              <w:tc>
+                <w:tcPr/>
+                <w:p>
+                  <w:pPr>
+                    <w:pStyle w:val="Compact"/>
+                    <w:jc w:val="left"/>
+                    <w:jc w:val="center"/>
+                  </w:pPr>
+                  <w:r>
+                    <w:t xml:space="preserve">Adult</w:t>
+                  </w:r>
+                </w:p>
+              </w:tc>
+              <w:tc>
+                <w:tcPr/>
+                <w:p>
+                  <w:pPr>
+                    <w:pStyle w:val="Compact"/>
+                    <w:jc w:val="right"/>
+                    <w:jc w:val="center"/>
+                  </w:pPr>
+                  <w:r>
+                    <w:t xml:space="preserve">2</w:t>
+                  </w:r>
+                </w:p>
+              </w:tc>
+            </w:tr>
+            <w:tr>
+              <w:tc>
+                <w:tcPr/>
+                <w:p>
+                  <w:pPr>
+                    <w:pStyle w:val="Compact"/>
+                    <w:jc w:val="left"/>
+                    <w:jc w:val="center"/>
+                  </w:pPr>
+                  <w:r>
+                    <w:t xml:space="preserve">EDSM</w:t>
+                  </w:r>
+                </w:p>
+              </w:tc>
+              <w:tc>
+                <w:tcPr/>
+                <w:p>
+                  <w:pPr>
+                    <w:pStyle w:val="Compact"/>
+                    <w:jc w:val="left"/>
+                    <w:jc w:val="center"/>
+                  </w:pPr>
+                  <w:r>
+                    <w:t xml:space="preserve">2025-12-31</w:t>
+                  </w:r>
+                </w:p>
+              </w:tc>
+              <w:tc>
+                <w:tcPr/>
+                <w:p>
+                  <w:pPr>
+                    <w:pStyle w:val="Compact"/>
+                    <w:jc w:val="left"/>
+                    <w:jc w:val="center"/>
+                  </w:pPr>
+                  <w:r>
+                    <w:t xml:space="preserve">Far West</w:t>
+                  </w:r>
+                </w:p>
+              </w:tc>
+              <w:tc>
+                <w:tcPr/>
+                <w:p>
+                  <w:pPr>
+                    <w:pStyle w:val="Compact"/>
+                    <w:jc w:val="left"/>
+                    <w:jc w:val="center"/>
+                  </w:pPr>
+                  <w:r>
+                    <w:t xml:space="preserve">Suisun Bay</w:t>
                   </w:r>
                 </w:p>
               </w:tc>
@@ -2472,7 +2882,7 @@
               </w:tc>
             </w:tr>
           </w:tbl>
-          <w:bookmarkEnd w:id="51"/>
+          <w:bookmarkEnd w:id="54"/>
           <w:p/>
         </w:tc>
       </w:tr>
@@ -2490,7 +2900,7 @@
       <w:tr>
         <w:tc>
           <w:tcPr/>
-          <w:bookmarkStart w:id="55" w:name="fig-lfs-map"/>
+          <w:bookmarkStart w:id="58" w:name="fig-lfs-map"/>
           <w:p>
             <w:pPr>
               <w:pStyle w:val="Compact"/>
@@ -2501,18 +2911,18 @@
                 <wp:inline>
                   <wp:extent cx="5334000" cy="4667249"/>
                   <wp:effectExtent b="0" l="0" r="0" t="0"/>
-                  <wp:docPr descr="" title="" id="53" name="Picture"/>
+                  <wp:docPr descr="" title="" id="56" name="Picture"/>
                   <a:graphic>
                     <a:graphicData uri="http://schemas.openxmlformats.org/drawingml/2006/picture">
                       <pic:pic>
                         <pic:nvPicPr>
-                          <pic:cNvPr descr="smt-assessment-v1_files/figure-docx/fig-lfs-map-1.png" id="54" name="Picture"/>
+                          <pic:cNvPr descr="smt-assessment-v1_files/figure-docx/fig-lfs-map-1.png" id="57" name="Picture"/>
                           <pic:cNvPicPr>
                             <a:picLocks noChangeArrowheads="1" noChangeAspect="1"/>
                           </pic:cNvPicPr>
                         </pic:nvPicPr>
                         <pic:blipFill>
-                          <a:blip r:embed="rId52"/>
+                          <a:blip r:embed="rId55"/>
                           <a:stretch>
                             <a:fillRect/>
                           </a:stretch>
@@ -2552,7 +2962,7 @@
               <w:t xml:space="preserve">Figure 3: Longfin Smelt Distribution for WY 2026</w:t>
             </w:r>
           </w:p>
-          <w:bookmarkEnd w:id="55"/>
+          <w:bookmarkEnd w:id="58"/>
         </w:tc>
       </w:tr>
     </w:tbl>
@@ -2569,7 +2979,7 @@
       <w:tr>
         <w:tc>
           <w:tcPr/>
-          <w:bookmarkStart w:id="56" w:name="tbl-lfs-catch-all"/>
+          <w:bookmarkStart w:id="59" w:name="tbl-lfs-catch-all"/>
           <w:p>
             <w:pPr>
               <w:jc w:val="center"/>
@@ -2701,7 +3111,7 @@
                     <w:jc w:val="center"/>
                   </w:pPr>
                   <w:r>
-                    <w:t xml:space="preserve">54</w:t>
+                    <w:t xml:space="preserve">235</w:t>
                   </w:r>
                 </w:p>
               </w:tc>
@@ -2716,33 +3126,33 @@
                     <w:jc w:val="center"/>
                   </w:pPr>
                   <w:r>
-                    <w:t xml:space="preserve">EDSM</w:t>
-                  </w:r>
-                </w:p>
-              </w:tc>
-              <w:tc>
-                <w:tcPr/>
-                <w:p>
-                  <w:pPr>
-                    <w:pStyle w:val="Compact"/>
-                    <w:jc w:val="left"/>
-                    <w:jc w:val="center"/>
-                  </w:pPr>
-                  <w:r>
-                    <w:t xml:space="preserve">West</w:t>
-                  </w:r>
-                </w:p>
-              </w:tc>
-              <w:tc>
-                <w:tcPr/>
-                <w:p>
-                  <w:pPr>
-                    <w:pStyle w:val="Compact"/>
-                    <w:jc w:val="left"/>
-                    <w:jc w:val="center"/>
-                  </w:pPr>
-                  <w:r>
-                    <w:t xml:space="preserve">Adult</w:t>
+                    <w:t xml:space="preserve">DJFMP</w:t>
+                  </w:r>
+                </w:p>
+              </w:tc>
+              <w:tc>
+                <w:tcPr/>
+                <w:p>
+                  <w:pPr>
+                    <w:pStyle w:val="Compact"/>
+                    <w:jc w:val="left"/>
+                    <w:jc w:val="center"/>
+                  </w:pPr>
+                  <w:r>
+                    <w:t xml:space="preserve">N/A</w:t>
+                  </w:r>
+                </w:p>
+              </w:tc>
+              <w:tc>
+                <w:tcPr/>
+                <w:p>
+                  <w:pPr>
+                    <w:pStyle w:val="Compact"/>
+                    <w:jc w:val="left"/>
+                    <w:jc w:val="center"/>
+                  </w:pPr>
+                  <w:r>
+                    <w:t xml:space="preserve">Juvenile</w:t>
                   </w:r>
                 </w:p>
               </w:tc>
@@ -2755,7 +3165,7 @@
                     <w:jc w:val="center"/>
                   </w:pPr>
                   <w:r>
-                    <w:t xml:space="preserve">3</w:t>
+                    <w:t xml:space="preserve">14</w:t>
                   </w:r>
                 </w:p>
               </w:tc>
@@ -2783,6 +3193,114 @@
                     <w:jc w:val="center"/>
                   </w:pPr>
                   <w:r>
+                    <w:t xml:space="preserve">Far West</w:t>
+                  </w:r>
+                </w:p>
+              </w:tc>
+              <w:tc>
+                <w:tcPr/>
+                <w:p>
+                  <w:pPr>
+                    <w:pStyle w:val="Compact"/>
+                    <w:jc w:val="left"/>
+                    <w:jc w:val="center"/>
+                  </w:pPr>
+                  <w:r>
+                    <w:t xml:space="preserve">Adult</w:t>
+                  </w:r>
+                </w:p>
+              </w:tc>
+              <w:tc>
+                <w:tcPr/>
+                <w:p>
+                  <w:pPr>
+                    <w:pStyle w:val="Compact"/>
+                    <w:jc w:val="right"/>
+                    <w:jc w:val="center"/>
+                  </w:pPr>
+                  <w:r>
+                    <w:t xml:space="preserve">5</w:t>
+                  </w:r>
+                </w:p>
+              </w:tc>
+            </w:tr>
+            <w:tr>
+              <w:tc>
+                <w:tcPr/>
+                <w:p>
+                  <w:pPr>
+                    <w:pStyle w:val="Compact"/>
+                    <w:jc w:val="left"/>
+                    <w:jc w:val="center"/>
+                  </w:pPr>
+                  <w:r>
+                    <w:t xml:space="preserve">EDSM</w:t>
+                  </w:r>
+                </w:p>
+              </w:tc>
+              <w:tc>
+                <w:tcPr/>
+                <w:p>
+                  <w:pPr>
+                    <w:pStyle w:val="Compact"/>
+                    <w:jc w:val="left"/>
+                    <w:jc w:val="center"/>
+                  </w:pPr>
+                  <w:r>
+                    <w:t xml:space="preserve">Far West</w:t>
+                  </w:r>
+                </w:p>
+              </w:tc>
+              <w:tc>
+                <w:tcPr/>
+                <w:p>
+                  <w:pPr>
+                    <w:pStyle w:val="Compact"/>
+                    <w:jc w:val="left"/>
+                    <w:jc w:val="center"/>
+                  </w:pPr>
+                  <w:r>
+                    <w:t xml:space="preserve">Juvenile</w:t>
+                  </w:r>
+                </w:p>
+              </w:tc>
+              <w:tc>
+                <w:tcPr/>
+                <w:p>
+                  <w:pPr>
+                    <w:pStyle w:val="Compact"/>
+                    <w:jc w:val="right"/>
+                    <w:jc w:val="center"/>
+                  </w:pPr>
+                  <w:r>
+                    <w:t xml:space="preserve">11</w:t>
+                  </w:r>
+                </w:p>
+              </w:tc>
+            </w:tr>
+            <w:tr>
+              <w:tc>
+                <w:tcPr/>
+                <w:p>
+                  <w:pPr>
+                    <w:pStyle w:val="Compact"/>
+                    <w:jc w:val="left"/>
+                    <w:jc w:val="center"/>
+                  </w:pPr>
+                  <w:r>
+                    <w:t xml:space="preserve">EDSM</w:t>
+                  </w:r>
+                </w:p>
+              </w:tc>
+              <w:tc>
+                <w:tcPr/>
+                <w:p>
+                  <w:pPr>
+                    <w:pStyle w:val="Compact"/>
+                    <w:jc w:val="left"/>
+                    <w:jc w:val="center"/>
+                  </w:pPr>
+                  <w:r>
                     <w:t xml:space="preserve">West</w:t>
                   </w:r>
                 </w:p>
@@ -2796,6 +3314,60 @@
                     <w:jc w:val="center"/>
                   </w:pPr>
                   <w:r>
+                    <w:t xml:space="preserve">Adult</w:t>
+                  </w:r>
+                </w:p>
+              </w:tc>
+              <w:tc>
+                <w:tcPr/>
+                <w:p>
+                  <w:pPr>
+                    <w:pStyle w:val="Compact"/>
+                    <w:jc w:val="right"/>
+                    <w:jc w:val="center"/>
+                  </w:pPr>
+                  <w:r>
+                    <w:t xml:space="preserve">22</w:t>
+                  </w:r>
+                </w:p>
+              </w:tc>
+            </w:tr>
+            <w:tr>
+              <w:tc>
+                <w:tcPr/>
+                <w:p>
+                  <w:pPr>
+                    <w:pStyle w:val="Compact"/>
+                    <w:jc w:val="left"/>
+                    <w:jc w:val="center"/>
+                  </w:pPr>
+                  <w:r>
+                    <w:t xml:space="preserve">EDSM</w:t>
+                  </w:r>
+                </w:p>
+              </w:tc>
+              <w:tc>
+                <w:tcPr/>
+                <w:p>
+                  <w:pPr>
+                    <w:pStyle w:val="Compact"/>
+                    <w:jc w:val="left"/>
+                    <w:jc w:val="center"/>
+                  </w:pPr>
+                  <w:r>
+                    <w:t xml:space="preserve">West</w:t>
+                  </w:r>
+                </w:p>
+              </w:tc>
+              <w:tc>
+                <w:tcPr/>
+                <w:p>
+                  <w:pPr>
+                    <w:pStyle w:val="Compact"/>
+                    <w:jc w:val="left"/>
+                    <w:jc w:val="center"/>
+                  </w:pPr>
+                  <w:r>
                     <w:t xml:space="preserve">Juvenile</w:t>
                   </w:r>
                 </w:p>
@@ -2809,13 +3381,391 @@
                     <w:jc w:val="center"/>
                   </w:pPr>
                   <w:r>
-                    <w:t xml:space="preserve">12</w:t>
+                    <w:t xml:space="preserve">73</w:t>
+                  </w:r>
+                </w:p>
+              </w:tc>
+            </w:tr>
+            <w:tr>
+              <w:tc>
+                <w:tcPr/>
+                <w:p>
+                  <w:pPr>
+                    <w:pStyle w:val="Compact"/>
+                    <w:jc w:val="left"/>
+                    <w:jc w:val="center"/>
+                  </w:pPr>
+                  <w:r>
+                    <w:t xml:space="preserve">baystudy</w:t>
+                  </w:r>
+                </w:p>
+              </w:tc>
+              <w:tc>
+                <w:tcPr/>
+                <w:p>
+                  <w:pPr>
+                    <w:pStyle w:val="Compact"/>
+                    <w:jc w:val="left"/>
+                    <w:jc w:val="center"/>
+                  </w:pPr>
+                  <w:r>
+                    <w:t xml:space="preserve">Bay</w:t>
+                  </w:r>
+                </w:p>
+              </w:tc>
+              <w:tc>
+                <w:tcPr/>
+                <w:p>
+                  <w:pPr>
+                    <w:pStyle w:val="Compact"/>
+                    <w:jc w:val="left"/>
+                    <w:jc w:val="center"/>
+                  </w:pPr>
+                  <w:r>
+                    <w:t xml:space="preserve">Adult</w:t>
+                  </w:r>
+                </w:p>
+              </w:tc>
+              <w:tc>
+                <w:tcPr/>
+                <w:p>
+                  <w:pPr>
+                    <w:pStyle w:val="Compact"/>
+                    <w:jc w:val="right"/>
+                    <w:jc w:val="center"/>
+                  </w:pPr>
+                  <w:r>
+                    <w:t xml:space="preserve">6</w:t>
+                  </w:r>
+                </w:p>
+              </w:tc>
+            </w:tr>
+            <w:tr>
+              <w:tc>
+                <w:tcPr/>
+                <w:p>
+                  <w:pPr>
+                    <w:pStyle w:val="Compact"/>
+                    <w:jc w:val="left"/>
+                    <w:jc w:val="center"/>
+                  </w:pPr>
+                  <w:r>
+                    <w:t xml:space="preserve">baystudy</w:t>
+                  </w:r>
+                </w:p>
+              </w:tc>
+              <w:tc>
+                <w:tcPr/>
+                <w:p>
+                  <w:pPr>
+                    <w:pStyle w:val="Compact"/>
+                    <w:jc w:val="left"/>
+                    <w:jc w:val="center"/>
+                  </w:pPr>
+                  <w:r>
+                    <w:t xml:space="preserve">Bay</w:t>
+                  </w:r>
+                </w:p>
+              </w:tc>
+              <w:tc>
+                <w:tcPr/>
+                <w:p>
+                  <w:pPr>
+                    <w:pStyle w:val="Compact"/>
+                    <w:jc w:val="left"/>
+                    <w:jc w:val="center"/>
+                  </w:pPr>
+                  <w:r>
+                    <w:t xml:space="preserve">Juvenile</w:t>
+                  </w:r>
+                </w:p>
+              </w:tc>
+              <w:tc>
+                <w:tcPr/>
+                <w:p>
+                  <w:pPr>
+                    <w:pStyle w:val="Compact"/>
+                    <w:jc w:val="right"/>
+                    <w:jc w:val="center"/>
+                  </w:pPr>
+                  <w:r>
+                    <w:t xml:space="preserve">320</w:t>
+                  </w:r>
+                </w:p>
+              </w:tc>
+            </w:tr>
+            <w:tr>
+              <w:tc>
+                <w:tcPr/>
+                <w:p>
+                  <w:pPr>
+                    <w:pStyle w:val="Compact"/>
+                    <w:jc w:val="left"/>
+                    <w:jc w:val="center"/>
+                  </w:pPr>
+                  <w:r>
+                    <w:t xml:space="preserve">baystudy</w:t>
+                  </w:r>
+                </w:p>
+              </w:tc>
+              <w:tc>
+                <w:tcPr/>
+                <w:p>
+                  <w:pPr>
+                    <w:pStyle w:val="Compact"/>
+                    <w:jc w:val="left"/>
+                    <w:jc w:val="center"/>
+                  </w:pPr>
+                  <w:r>
+                    <w:t xml:space="preserve">Far West</w:t>
+                  </w:r>
+                </w:p>
+              </w:tc>
+              <w:tc>
+                <w:tcPr/>
+                <w:p>
+                  <w:pPr>
+                    <w:pStyle w:val="Compact"/>
+                    <w:jc w:val="left"/>
+                    <w:jc w:val="center"/>
+                  </w:pPr>
+                  <w:r>
+                    <w:t xml:space="preserve">Adult</w:t>
+                  </w:r>
+                </w:p>
+              </w:tc>
+              <w:tc>
+                <w:tcPr/>
+                <w:p>
+                  <w:pPr>
+                    <w:pStyle w:val="Compact"/>
+                    <w:jc w:val="right"/>
+                    <w:jc w:val="center"/>
+                  </w:pPr>
+                  <w:r>
+                    <w:t xml:space="preserve">2</w:t>
+                  </w:r>
+                </w:p>
+              </w:tc>
+            </w:tr>
+            <w:tr>
+              <w:tc>
+                <w:tcPr/>
+                <w:p>
+                  <w:pPr>
+                    <w:pStyle w:val="Compact"/>
+                    <w:jc w:val="left"/>
+                    <w:jc w:val="center"/>
+                  </w:pPr>
+                  <w:r>
+                    <w:t xml:space="preserve">baystudy</w:t>
+                  </w:r>
+                </w:p>
+              </w:tc>
+              <w:tc>
+                <w:tcPr/>
+                <w:p>
+                  <w:pPr>
+                    <w:pStyle w:val="Compact"/>
+                    <w:jc w:val="left"/>
+                    <w:jc w:val="center"/>
+                  </w:pPr>
+                  <w:r>
+                    <w:t xml:space="preserve">Far West</w:t>
+                  </w:r>
+                </w:p>
+              </w:tc>
+              <w:tc>
+                <w:tcPr/>
+                <w:p>
+                  <w:pPr>
+                    <w:pStyle w:val="Compact"/>
+                    <w:jc w:val="left"/>
+                    <w:jc w:val="center"/>
+                  </w:pPr>
+                  <w:r>
+                    <w:t xml:space="preserve">Juvenile</w:t>
+                  </w:r>
+                </w:p>
+              </w:tc>
+              <w:tc>
+                <w:tcPr/>
+                <w:p>
+                  <w:pPr>
+                    <w:pStyle w:val="Compact"/>
+                    <w:jc w:val="right"/>
+                    <w:jc w:val="center"/>
+                  </w:pPr>
+                  <w:r>
+                    <w:t xml:space="preserve">11</w:t>
+                  </w:r>
+                </w:p>
+              </w:tc>
+            </w:tr>
+            <w:tr>
+              <w:tc>
+                <w:tcPr/>
+                <w:p>
+                  <w:pPr>
+                    <w:pStyle w:val="Compact"/>
+                    <w:jc w:val="left"/>
+                    <w:jc w:val="center"/>
+                  </w:pPr>
+                  <w:r>
+                    <w:t xml:space="preserve">baystudy</w:t>
+                  </w:r>
+                </w:p>
+              </w:tc>
+              <w:tc>
+                <w:tcPr/>
+                <w:p>
+                  <w:pPr>
+                    <w:pStyle w:val="Compact"/>
+                    <w:jc w:val="left"/>
+                    <w:jc w:val="center"/>
+                  </w:pPr>
+                  <w:r>
+                    <w:t xml:space="preserve">West</w:t>
+                  </w:r>
+                </w:p>
+              </w:tc>
+              <w:tc>
+                <w:tcPr/>
+                <w:p>
+                  <w:pPr>
+                    <w:pStyle w:val="Compact"/>
+                    <w:jc w:val="left"/>
+                    <w:jc w:val="center"/>
+                  </w:pPr>
+                  <w:r>
+                    <w:t xml:space="preserve">Juvenile</w:t>
+                  </w:r>
+                </w:p>
+              </w:tc>
+              <w:tc>
+                <w:tcPr/>
+                <w:p>
+                  <w:pPr>
+                    <w:pStyle w:val="Compact"/>
+                    <w:jc w:val="right"/>
+                    <w:jc w:val="center"/>
+                  </w:pPr>
+                  <w:r>
+                    <w:t xml:space="preserve">6</w:t>
+                  </w:r>
+                </w:p>
+              </w:tc>
+            </w:tr>
+            <w:tr>
+              <w:tc>
+                <w:tcPr/>
+                <w:p>
+                  <w:pPr>
+                    <w:pStyle w:val="Compact"/>
+                    <w:jc w:val="left"/>
+                    <w:jc w:val="center"/>
+                  </w:pPr>
+                  <w:r>
+                    <w:t xml:space="preserve">sls</w:t>
+                  </w:r>
+                </w:p>
+              </w:tc>
+              <w:tc>
+                <w:tcPr/>
+                <w:p>
+                  <w:pPr>
+                    <w:pStyle w:val="Compact"/>
+                    <w:jc w:val="left"/>
+                    <w:jc w:val="center"/>
+                  </w:pPr>
+                  <w:r>
+                    <w:t xml:space="preserve">North</w:t>
+                  </w:r>
+                </w:p>
+              </w:tc>
+              <w:tc>
+                <w:tcPr/>
+                <w:p>
+                  <w:pPr>
+                    <w:pStyle w:val="Compact"/>
+                    <w:jc w:val="left"/>
+                    <w:jc w:val="center"/>
+                  </w:pPr>
+                  <w:r>
+                    <w:t xml:space="preserve">Larva</w:t>
+                  </w:r>
+                </w:p>
+              </w:tc>
+              <w:tc>
+                <w:tcPr/>
+                <w:p>
+                  <w:pPr>
+                    <w:pStyle w:val="Compact"/>
+                    <w:jc w:val="right"/>
+                    <w:jc w:val="center"/>
+                  </w:pPr>
+                  <w:r>
+                    <w:t xml:space="preserve">1</w:t>
+                  </w:r>
+                </w:p>
+              </w:tc>
+            </w:tr>
+            <w:tr>
+              <w:tc>
+                <w:tcPr/>
+                <w:p>
+                  <w:pPr>
+                    <w:pStyle w:val="Compact"/>
+                    <w:jc w:val="left"/>
+                    <w:jc w:val="center"/>
+                  </w:pPr>
+                  <w:r>
+                    <w:t xml:space="preserve">sls</w:t>
+                  </w:r>
+                </w:p>
+              </w:tc>
+              <w:tc>
+                <w:tcPr/>
+                <w:p>
+                  <w:pPr>
+                    <w:pStyle w:val="Compact"/>
+                    <w:jc w:val="left"/>
+                    <w:jc w:val="center"/>
+                  </w:pPr>
+                  <w:r>
+                    <w:t xml:space="preserve">West</w:t>
+                  </w:r>
+                </w:p>
+              </w:tc>
+              <w:tc>
+                <w:tcPr/>
+                <w:p>
+                  <w:pPr>
+                    <w:pStyle w:val="Compact"/>
+                    <w:jc w:val="left"/>
+                    <w:jc w:val="center"/>
+                  </w:pPr>
+                  <w:r>
+                    <w:t xml:space="preserve">Larva</w:t>
+                  </w:r>
+                </w:p>
+              </w:tc>
+              <w:tc>
+                <w:tcPr/>
+                <w:p>
+                  <w:pPr>
+                    <w:pStyle w:val="Compact"/>
+                    <w:jc w:val="right"/>
+                    <w:jc w:val="center"/>
+                  </w:pPr>
+                  <w:r>
+                    <w:t xml:space="preserve">2</w:t>
                   </w:r>
                 </w:p>
               </w:tc>
             </w:tr>
           </w:tbl>
-          <w:bookmarkEnd w:id="56"/>
+          <w:bookmarkEnd w:id="59"/>
           <w:p/>
         </w:tc>
       </w:tr>
@@ -2833,7 +3783,7 @@
       <w:tr>
         <w:tc>
           <w:tcPr/>
-          <w:bookmarkStart w:id="60" w:name="fig-lfs-catch"/>
+          <w:bookmarkStart w:id="63" w:name="fig-lfs-catch"/>
           <w:p>
             <w:pPr>
               <w:pStyle w:val="Compact"/>
@@ -2844,18 +3794,18 @@
                 <wp:inline>
                   <wp:extent cx="4576576" cy="3661261"/>
                   <wp:effectExtent b="0" l="0" r="0" t="0"/>
-                  <wp:docPr descr="" title="" id="58" name="Picture"/>
+                  <wp:docPr descr="" title="" id="61" name="Picture"/>
                   <a:graphic>
                     <a:graphicData uri="http://schemas.openxmlformats.org/drawingml/2006/picture">
                       <pic:pic>
                         <pic:nvPicPr>
-                          <pic:cNvPr descr="smt-assessment-v1_files/figure-docx/fig-lfs-catch-1.png" id="59" name="Picture"/>
+                          <pic:cNvPr descr="smt-assessment-v1_files/figure-docx/fig-lfs-catch-1.png" id="62" name="Picture"/>
                           <pic:cNvPicPr>
                             <a:picLocks noChangeArrowheads="1" noChangeAspect="1"/>
                           </pic:cNvPicPr>
                         </pic:nvPicPr>
                         <pic:blipFill>
-                          <a:blip r:embed="rId57"/>
+                          <a:blip r:embed="rId60"/>
                           <a:stretch>
                             <a:fillRect/>
                           </a:stretch>
@@ -2895,12 +3845,12 @@
               <w:t xml:space="preserve">Figure 4: Time Series of Longfin Smelt Catch, WY 2026</w:t>
             </w:r>
           </w:p>
-          <w:bookmarkEnd w:id="60"/>
+          <w:bookmarkEnd w:id="63"/>
         </w:tc>
       </w:tr>
     </w:tbl>
-    <w:bookmarkEnd w:id="61"/>
-    <w:bookmarkStart w:id="65" w:name="real-time-assessment-thresholds-1"/>
+    <w:bookmarkEnd w:id="64"/>
+    <w:bookmarkStart w:id="68" w:name="real-time-assessment-thresholds-1"/>
     <w:p>
       <w:pPr>
         <w:pStyle w:val="Heading4"/>
@@ -2909,7 +3859,7 @@
         <w:t xml:space="preserve">Real-time Assessment Thresholds</w:t>
       </w:r>
     </w:p>
-    <w:bookmarkStart w:id="62" w:name="X20cb4fe57c6f57bc33c1a6af910e71e88796402"/>
+    <w:bookmarkStart w:id="65" w:name="X20cb4fe57c6f57bc33c1a6af910e71e88796402"/>
     <w:p>
       <w:pPr>
         <w:pStyle w:val="Heading5"/>
@@ -2923,39 +3873,15 @@
         <w:pStyle w:val="Compact"/>
         <w:numPr>
           <w:ilvl w:val="0"/>
-          <w:numId w:val="1010"/>
-        </w:numPr>
-      </w:pPr>
-      <w:r>
-        <w:t xml:space="preserve">Threshold: JPF &lt; 0 cfs AND salvage of adult longfin exceeds 26.8 fish (5% of FMWT Index + 1)</w:t>
-      </w:r>
-    </w:p>
-    <w:p>
-      <w:pPr>
-        <w:pStyle w:val="Compact"/>
-        <w:numPr>
-          <w:ilvl w:val="1"/>
           <w:numId w:val="1011"/>
         </w:numPr>
       </w:pPr>
       <w:r>
-        <w:t xml:space="preserve">7-day average JPF: 7801 cfs as of Dec 28, 2025</w:t>
-      </w:r>
-    </w:p>
-    <w:p>
-      <w:pPr>
-        <w:pStyle w:val="Compact"/>
-        <w:numPr>
-          <w:ilvl w:val="1"/>
-          <w:numId w:val="1011"/>
-        </w:numPr>
-      </w:pPr>
-      <w:r>
-        <w:t xml:space="preserve">Water year total Age 1+ longfin smelt salvage = 0</w:t>
-      </w:r>
-    </w:p>
-    <w:bookmarkEnd w:id="62"/>
-    <w:bookmarkStart w:id="63" w:name="adult-longfin-smelt"/>
+        <w:t xml:space="preserve">Not relevant</w:t>
+      </w:r>
+    </w:p>
+    <w:bookmarkEnd w:id="65"/>
+    <w:bookmarkStart w:id="66" w:name="adult-longfin-smelt"/>
     <w:p>
       <w:pPr>
         <w:pStyle w:val="Heading5"/>
@@ -2973,7 +3899,17 @@
         </w:numPr>
       </w:pPr>
       <w:r>
-        <w:t xml:space="preserve">Threshold: JPF &lt; 0 cfs AND annual loss is on a trajectory to exceed 5% of the adult population abundance</w:t>
+        <w:rPr>
+          <w:b/>
+          <w:bCs/>
+        </w:rPr>
+        <w:t xml:space="preserve">Threshold:</w:t>
+      </w:r>
+      <w:r>
+        <w:t xml:space="preserve"> </w:t>
+      </w:r>
+      <w:r>
+        <w:t xml:space="preserve">JPF &lt; 0 cfs, annual loss is on a trajectory to exceed 5% of the adult population abundance, and reduced exports will reduce entrainment in the south Delta</w:t>
       </w:r>
     </w:p>
     <w:p>
@@ -2985,7 +3921,7 @@
         </w:numPr>
       </w:pPr>
       <w:r>
-        <w:t xml:space="preserve">7-day average JPF: 7801 cfs as of Dec 28, 2025</w:t>
+        <w:t xml:space="preserve">Daily average JPF: 7866 cfs as of Jan 01, 2026</w:t>
       </w:r>
     </w:p>
     <w:p>
@@ -3000,8 +3936,8 @@
         <w:t xml:space="preserve">Water year total adult longfin smelt salvage = 0</w:t>
       </w:r>
     </w:p>
-    <w:bookmarkEnd w:id="63"/>
-    <w:bookmarkStart w:id="64" w:name="larvaljuvenile-longfin-smelt"/>
+    <w:bookmarkEnd w:id="66"/>
+    <w:bookmarkStart w:id="67" w:name="larvaljuvenile-longfin-smelt"/>
     <w:p>
       <w:pPr>
         <w:pStyle w:val="Heading5"/>
@@ -3019,7 +3955,17 @@
         </w:numPr>
       </w:pPr>
       <w:r>
-        <w:t xml:space="preserve">Threshold: JPF &lt; 0 cfs AND population model demonstrates need to reduce entrainment to avoid population decline</w:t>
+        <w:rPr>
+          <w:b/>
+          <w:bCs/>
+        </w:rPr>
+        <w:t xml:space="preserve">Threshold:</w:t>
+      </w:r>
+      <w:r>
+        <w:t xml:space="preserve"> </w:t>
+      </w:r>
+      <w:r>
+        <w:t xml:space="preserve">JPF &lt; 0 cfs AND population model demonstrates need to reduce entrainment to avoid population decline</w:t>
       </w:r>
     </w:p>
     <w:p>
@@ -3031,12 +3977,12 @@
         </w:numPr>
       </w:pPr>
       <w:r>
-        <w:t xml:space="preserve">7-day average JPF: 7801 cfs as of Dec 28, 2025</w:t>
-      </w:r>
-    </w:p>
-    <w:bookmarkEnd w:id="64"/>
-    <w:bookmarkEnd w:id="65"/>
-    <w:bookmarkStart w:id="66" w:name="evaluation"/>
+        <w:t xml:space="preserve">Daily average JPF: 7866 cfs as of Jan 01, 2026</w:t>
+      </w:r>
+    </w:p>
+    <w:bookmarkEnd w:id="67"/>
+    <w:bookmarkEnd w:id="68"/>
+    <w:bookmarkStart w:id="69" w:name="evaluation"/>
     <w:p>
       <w:pPr>
         <w:pStyle w:val="Heading4"/>
@@ -3045,9 +3991,9 @@
         <w:t xml:space="preserve">Evaluation</w:t>
       </w:r>
     </w:p>
-    <w:bookmarkEnd w:id="66"/>
-    <w:bookmarkEnd w:id="67"/>
-    <w:bookmarkStart w:id="68" w:name="end-of-smelt-omr-management"/>
+    <w:bookmarkEnd w:id="69"/>
+    <w:bookmarkEnd w:id="70"/>
+    <w:bookmarkStart w:id="71" w:name="end-of-smelt-omr-management"/>
     <w:p>
       <w:pPr>
         <w:pStyle w:val="Heading3"/>
@@ -3068,8 +4014,8 @@
         <w:t xml:space="preserve">Not relevant</w:t>
       </w:r>
     </w:p>
-    <w:bookmarkEnd w:id="68"/>
-    <w:bookmarkStart w:id="69" w:name="references"/>
+    <w:bookmarkEnd w:id="71"/>
+    <w:bookmarkStart w:id="72" w:name="references"/>
     <w:p>
       <w:pPr>
         <w:pStyle w:val="Heading3"/>
@@ -3078,8 +4024,8 @@
         <w:t xml:space="preserve">References</w:t>
       </w:r>
     </w:p>
-    <w:bookmarkEnd w:id="69"/>
-    <w:bookmarkEnd w:id="70"/>
+    <w:bookmarkEnd w:id="72"/>
+    <w:bookmarkEnd w:id="73"/>
     <w:sectPr>
       <w:footnotePr>
         <w:numRestart w:val="eachSect"/>

</xml_diff>

<commit_message>
Updated to include eval questions, code to remove warning errors with SP, updated JPF format 1/9
</commit_message>
<xml_diff>
--- a/smt-assessment-v1.docx
+++ b/smt-assessment-v1.docx
@@ -26,7 +26,7 @@
           <w:i/>
           <w:iCs/>
         </w:rPr>
-        <w:t xml:space="preserve">January 05, 2026</w:t>
+        <w:t xml:space="preserve">January 09, 2026</w:t>
       </w:r>
     </w:p>
     <w:bookmarkStart w:id="20" w:name="executive-summary"/>
@@ -47,7 +47,7 @@
         </w:numPr>
       </w:pPr>
       <w:r>
-        <w:t xml:space="preserve">First flush conditions were met on 12/23/25, and the action was implemented on 12/26/25.</w:t>
+        <w:t xml:space="preserve">First flush conditions were met on 12/23/25, and the action was implemented on 12/25/25.</w:t>
       </w:r>
     </w:p>
     <w:p>
@@ -153,7 +153,7 @@
         <w:pStyle w:val="Heading3"/>
       </w:pPr>
       <w:r>
-        <w:t xml:space="preserve">Delta Smelt</w:t>
+        <w:t xml:space="preserve">Delta smelt</w:t>
       </w:r>
     </w:p>
     <w:bookmarkStart w:id="34" w:name="biological"/>
@@ -177,7 +177,7 @@
           <w:b/>
           <w:bCs/>
         </w:rPr>
-        <w:t xml:space="preserve">Delta Smelt Life Stages:</w:t>
+        <w:t xml:space="preserve">Delta smelt life stages:</w:t>
       </w:r>
       <w:r>
         <w:t xml:space="preserve"> </w:t>
@@ -225,7 +225,7 @@
         <w:t xml:space="preserve"> </w:t>
       </w:r>
       <w:r>
-        <w:t xml:space="preserve">A total of 163,349 cultured Delta Smelt have been released for WY 2026. The most recent release of 24,606 fish occurred in Sacramento River at Rio Vista on Dec 16, 2025.</w:t>
+        <w:t xml:space="preserve">A total of 163,349 cultured Delta smelt have been released for WY 2026. The most recent release of 24,606 fish occurred in Sacramento River at Rio Vista on Dec 16, 2025.</w:t>
       </w:r>
     </w:p>
     <w:p>
@@ -240,13 +240,13 @@
           <w:b/>
           <w:bCs/>
         </w:rPr>
-        <w:t xml:space="preserve">Delta Smelt count:</w:t>
+        <w:t xml:space="preserve">Delta smelt count:</w:t>
       </w:r>
       <w:r>
         <w:t xml:space="preserve"> </w:t>
       </w:r>
       <w:r>
-        <w:t xml:space="preserve">29 adult Delta Smelt and 22 juvenile Delta smelt have been detected this water year. See</w:t>
+        <w:t xml:space="preserve">33 adult Delta smelt and 24 juvenile Delta smelt have been detected this water year. See</w:t>
       </w:r>
       <w:r>
         <w:t xml:space="preserve"> </w:t>
@@ -312,13 +312,13 @@
           <w:b/>
           <w:bCs/>
         </w:rPr>
-        <w:t xml:space="preserve">Delta Smelt salvage:</w:t>
+        <w:t xml:space="preserve">Delta smelt salvage:</w:t>
       </w:r>
       <w:r>
         <w:t xml:space="preserve"> </w:t>
       </w:r>
       <w:r>
-        <w:t xml:space="preserve">0 Delta Smelt have been salvaged, and the cumulative seasonal salvage is 0.</w:t>
+        <w:t xml:space="preserve">0 Delta smelt have been salvaged, and the cumulative seasonal salvage is 0.</w:t>
       </w:r>
     </w:p>
     <w:p>
@@ -342,7 +342,7 @@
         </w:numPr>
       </w:pPr>
       <w:r>
-        <w:t xml:space="preserve">Since there are few recent detections of Delta Smelt, estimation of distribution within the Delta is limited.</w:t>
+        <w:t xml:space="preserve">Since there are few recent detections of Delta smelt, estimation of distribution within the Delta is limited.</w:t>
       </w:r>
     </w:p>
     <w:p>
@@ -354,7 +354,7 @@
         </w:numPr>
       </w:pPr>
       <w:r>
-        <w:t xml:space="preserve">As mentioned in EDSM reporting, fork length ranges reported for Delta Smelt and Longfin Smelt life stages are defined by the Interagency Ecological Program for permit reporting purposes and are not intended to delineate cohorts or distinguish from hatchery or wild origin. See</w:t>
+        <w:t xml:space="preserve">As mentioned in EDSM reporting, fork length ranges reported for Delta smelt and longfin smelt life stages are defined by permit reporting purposes and are not intended to delineate cohorts or distinguish from hatchery or wild origin. See</w:t>
       </w:r>
       <w:r>
         <w:t xml:space="preserve"> </w:t>
@@ -450,7 +450,7 @@
               <w:pStyle w:val="ImageCaption"/>
             </w:pPr>
             <w:r>
-              <w:t xml:space="preserve">Table 1: Delta Smelt Detections in the last 2 weeks. Fork Length &gt; 58mm = Adult, Fork Length 20-58mm = Juvenile, Fork Length &lt; 20mm = Larva.</w:t>
+              <w:t xml:space="preserve">Table 1: Delta smelt detections in the last 2 weeks. Fork Length &gt; 58mm = Adult, Fork Length 20-58mm = Juvenile, Fork Length &lt; 20mm = Larva.</w:t>
             </w:r>
           </w:p>
           <w:tbl>
@@ -734,6 +734,326 @@
                   </w:pPr>
                   <w:r>
                     <w:t xml:space="preserve">2026-01-02</w:t>
+                  </w:r>
+                </w:p>
+              </w:tc>
+              <w:tc>
+                <w:tcPr/>
+                <w:p>
+                  <w:pPr>
+                    <w:pStyle w:val="Compact"/>
+                    <w:jc w:val="left"/>
+                    <w:jc w:val="center"/>
+                  </w:pPr>
+                  <w:r>
+                    <w:t xml:space="preserve">West</w:t>
+                  </w:r>
+                </w:p>
+              </w:tc>
+              <w:tc>
+                <w:tcPr/>
+                <w:p>
+                  <w:pPr>
+                    <w:pStyle w:val="Compact"/>
+                    <w:jc w:val="left"/>
+                    <w:jc w:val="center"/>
+                  </w:pPr>
+                  <w:r>
+                    <w:t xml:space="preserve">Suisun Marsh</w:t>
+                  </w:r>
+                </w:p>
+              </w:tc>
+              <w:tc>
+                <w:tcPr/>
+                <w:p>
+                  <w:pPr>
+                    <w:pStyle w:val="Compact"/>
+                    <w:jc w:val="left"/>
+                    <w:jc w:val="center"/>
+                  </w:pPr>
+                  <w:r>
+                    <w:t xml:space="preserve">Juvenile</w:t>
+                  </w:r>
+                </w:p>
+              </w:tc>
+              <w:tc>
+                <w:tcPr/>
+                <w:p>
+                  <w:pPr>
+                    <w:pStyle w:val="Compact"/>
+                    <w:jc w:val="right"/>
+                    <w:jc w:val="center"/>
+                  </w:pPr>
+                  <w:r>
+                    <w:t xml:space="preserve">1</w:t>
+                  </w:r>
+                </w:p>
+              </w:tc>
+            </w:tr>
+            <w:tr>
+              <w:tc>
+                <w:tcPr/>
+                <w:p>
+                  <w:pPr>
+                    <w:pStyle w:val="Compact"/>
+                    <w:jc w:val="left"/>
+                    <w:jc w:val="center"/>
+                  </w:pPr>
+                  <w:r>
+                    <w:t xml:space="preserve">EDSM</w:t>
+                  </w:r>
+                </w:p>
+              </w:tc>
+              <w:tc>
+                <w:tcPr/>
+                <w:p>
+                  <w:pPr>
+                    <w:pStyle w:val="Compact"/>
+                    <w:jc w:val="left"/>
+                    <w:jc w:val="center"/>
+                  </w:pPr>
+                  <w:r>
+                    <w:t xml:space="preserve">2026-01-07</w:t>
+                  </w:r>
+                </w:p>
+              </w:tc>
+              <w:tc>
+                <w:tcPr/>
+                <w:p>
+                  <w:pPr>
+                    <w:pStyle w:val="Compact"/>
+                    <w:jc w:val="left"/>
+                    <w:jc w:val="center"/>
+                  </w:pPr>
+                  <w:r>
+                    <w:t xml:space="preserve">West</w:t>
+                  </w:r>
+                </w:p>
+              </w:tc>
+              <w:tc>
+                <w:tcPr/>
+                <w:p>
+                  <w:pPr>
+                    <w:pStyle w:val="Compact"/>
+                    <w:jc w:val="left"/>
+                    <w:jc w:val="center"/>
+                  </w:pPr>
+                  <w:r>
+                    <w:t xml:space="preserve">Suisun Marsh</w:t>
+                  </w:r>
+                </w:p>
+              </w:tc>
+              <w:tc>
+                <w:tcPr/>
+                <w:p>
+                  <w:pPr>
+                    <w:pStyle w:val="Compact"/>
+                    <w:jc w:val="left"/>
+                    <w:jc w:val="center"/>
+                  </w:pPr>
+                  <w:r>
+                    <w:t xml:space="preserve">Adult</w:t>
+                  </w:r>
+                </w:p>
+              </w:tc>
+              <w:tc>
+                <w:tcPr/>
+                <w:p>
+                  <w:pPr>
+                    <w:pStyle w:val="Compact"/>
+                    <w:jc w:val="right"/>
+                    <w:jc w:val="center"/>
+                  </w:pPr>
+                  <w:r>
+                    <w:t xml:space="preserve">1</w:t>
+                  </w:r>
+                </w:p>
+              </w:tc>
+            </w:tr>
+            <w:tr>
+              <w:tc>
+                <w:tcPr/>
+                <w:p>
+                  <w:pPr>
+                    <w:pStyle w:val="Compact"/>
+                    <w:jc w:val="left"/>
+                    <w:jc w:val="center"/>
+                  </w:pPr>
+                  <w:r>
+                    <w:t xml:space="preserve">EDSM</w:t>
+                  </w:r>
+                </w:p>
+              </w:tc>
+              <w:tc>
+                <w:tcPr/>
+                <w:p>
+                  <w:pPr>
+                    <w:pStyle w:val="Compact"/>
+                    <w:jc w:val="left"/>
+                    <w:jc w:val="center"/>
+                  </w:pPr>
+                  <w:r>
+                    <w:t xml:space="preserve">2026-01-07</w:t>
+                  </w:r>
+                </w:p>
+              </w:tc>
+              <w:tc>
+                <w:tcPr/>
+                <w:p>
+                  <w:pPr>
+                    <w:pStyle w:val="Compact"/>
+                    <w:jc w:val="left"/>
+                    <w:jc w:val="center"/>
+                  </w:pPr>
+                  <w:r>
+                    <w:t xml:space="preserve">West</w:t>
+                  </w:r>
+                </w:p>
+              </w:tc>
+              <w:tc>
+                <w:tcPr/>
+                <w:p>
+                  <w:pPr>
+                    <w:pStyle w:val="Compact"/>
+                    <w:jc w:val="left"/>
+                    <w:jc w:val="center"/>
+                  </w:pPr>
+                  <w:r>
+                    <w:t xml:space="preserve">Suisun Marsh</w:t>
+                  </w:r>
+                </w:p>
+              </w:tc>
+              <w:tc>
+                <w:tcPr/>
+                <w:p>
+                  <w:pPr>
+                    <w:pStyle w:val="Compact"/>
+                    <w:jc w:val="left"/>
+                    <w:jc w:val="center"/>
+                  </w:pPr>
+                  <w:r>
+                    <w:t xml:space="preserve">Juvenile</w:t>
+                  </w:r>
+                </w:p>
+              </w:tc>
+              <w:tc>
+                <w:tcPr/>
+                <w:p>
+                  <w:pPr>
+                    <w:pStyle w:val="Compact"/>
+                    <w:jc w:val="right"/>
+                    <w:jc w:val="center"/>
+                  </w:pPr>
+                  <w:r>
+                    <w:t xml:space="preserve">1</w:t>
+                  </w:r>
+                </w:p>
+              </w:tc>
+            </w:tr>
+            <w:tr>
+              <w:tc>
+                <w:tcPr/>
+                <w:p>
+                  <w:pPr>
+                    <w:pStyle w:val="Compact"/>
+                    <w:jc w:val="left"/>
+                    <w:jc w:val="center"/>
+                  </w:pPr>
+                  <w:r>
+                    <w:t xml:space="preserve">EDSM</w:t>
+                  </w:r>
+                </w:p>
+              </w:tc>
+              <w:tc>
+                <w:tcPr/>
+                <w:p>
+                  <w:pPr>
+                    <w:pStyle w:val="Compact"/>
+                    <w:jc w:val="left"/>
+                    <w:jc w:val="center"/>
+                  </w:pPr>
+                  <w:r>
+                    <w:t xml:space="preserve">2026-01-08</w:t>
+                  </w:r>
+                </w:p>
+              </w:tc>
+              <w:tc>
+                <w:tcPr/>
+                <w:p>
+                  <w:pPr>
+                    <w:pStyle w:val="Compact"/>
+                    <w:jc w:val="left"/>
+                    <w:jc w:val="center"/>
+                  </w:pPr>
+                  <w:r>
+                    <w:t xml:space="preserve">West</w:t>
+                  </w:r>
+                </w:p>
+              </w:tc>
+              <w:tc>
+                <w:tcPr/>
+                <w:p>
+                  <w:pPr>
+                    <w:pStyle w:val="Compact"/>
+                    <w:jc w:val="left"/>
+                    <w:jc w:val="center"/>
+                  </w:pPr>
+                  <w:r>
+                    <w:t xml:space="preserve">Suisun Marsh</w:t>
+                  </w:r>
+                </w:p>
+              </w:tc>
+              <w:tc>
+                <w:tcPr/>
+                <w:p>
+                  <w:pPr>
+                    <w:pStyle w:val="Compact"/>
+                    <w:jc w:val="left"/>
+                    <w:jc w:val="center"/>
+                  </w:pPr>
+                  <w:r>
+                    <w:t xml:space="preserve">Adult</w:t>
+                  </w:r>
+                </w:p>
+              </w:tc>
+              <w:tc>
+                <w:tcPr/>
+                <w:p>
+                  <w:pPr>
+                    <w:pStyle w:val="Compact"/>
+                    <w:jc w:val="right"/>
+                    <w:jc w:val="center"/>
+                  </w:pPr>
+                  <w:r>
+                    <w:t xml:space="preserve">3</w:t>
+                  </w:r>
+                </w:p>
+              </w:tc>
+            </w:tr>
+            <w:tr>
+              <w:tc>
+                <w:tcPr/>
+                <w:p>
+                  <w:pPr>
+                    <w:pStyle w:val="Compact"/>
+                    <w:jc w:val="left"/>
+                    <w:jc w:val="center"/>
+                  </w:pPr>
+                  <w:r>
+                    <w:t xml:space="preserve">EDSM</w:t>
+                  </w:r>
+                </w:p>
+              </w:tc>
+              <w:tc>
+                <w:tcPr/>
+                <w:p>
+                  <w:pPr>
+                    <w:pStyle w:val="Compact"/>
+                    <w:jc w:val="left"/>
+                    <w:jc w:val="center"/>
+                  </w:pPr>
+                  <w:r>
+                    <w:t xml:space="preserve">2026-01-08</w:t>
                   </w:r>
                 </w:p>
               </w:tc>
@@ -868,7 +1188,7 @@
               <w:pStyle w:val="ImageCaption"/>
             </w:pPr>
             <w:r>
-              <w:t xml:space="preserve">Figure 1: Delta Smelt Distribution for WY 2026</w:t>
+              <w:t xml:space="preserve">Figure 1: Delta smelt distribution for WY 2026</w:t>
             </w:r>
           </w:p>
           <w:bookmarkEnd w:id="28"/>
@@ -899,7 +1219,7 @@
               <w:pStyle w:val="ImageCaption"/>
             </w:pPr>
             <w:r>
-              <w:t xml:space="preserve">Table 2: Delta Smelt Water Year Totals by Life Stage</w:t>
+              <w:t xml:space="preserve">Table 2: Delta smelt water year totals by life stage</w:t>
             </w:r>
           </w:p>
           <w:tbl>
@@ -1128,7 +1448,7 @@
                     <w:jc w:val="center"/>
                   </w:pPr>
                   <w:r>
-                    <w:t xml:space="preserve">28</w:t>
+                    <w:t xml:space="preserve">32</w:t>
                   </w:r>
                 </w:p>
               </w:tc>
@@ -1182,7 +1502,7 @@
                     <w:jc w:val="center"/>
                   </w:pPr>
                   <w:r>
-                    <w:t xml:space="preserve">21</w:t>
+                    <w:t xml:space="preserve">23</w:t>
                   </w:r>
                 </w:p>
               </w:tc>
@@ -1265,7 +1585,7 @@
               <w:pStyle w:val="ImageCaption"/>
             </w:pPr>
             <w:r>
-              <w:t xml:space="preserve">Figure 2: Time Series of Delta Smelt Catch, WY 2026</w:t>
+              <w:t xml:space="preserve">Figure 2: Time series of Delta smelt catch, WY 2026</w:t>
             </w:r>
           </w:p>
           <w:bookmarkEnd w:id="33"/>
@@ -1322,7 +1642,7 @@
         <w:t xml:space="preserve">FPT Flow (3-day average)</w:t>
       </w:r>
       <w:r>
-        <w:t xml:space="preserve">: 58900 cfs as of Jan 04, 2026</w:t>
+        <w:t xml:space="preserve">: 74893 cfs as of Jan 08, 2026</w:t>
       </w:r>
     </w:p>
     <w:p>
@@ -1341,7 +1661,7 @@
         <w:t xml:space="preserve">FPT Turbidity (3-day average)</w:t>
       </w:r>
       <w:r>
-        <w:t xml:space="preserve">: 41.88 FNU as of Jan 04, 2026</w:t>
+        <w:t xml:space="preserve">: 34.86 FNU as of Jan 08, 2026</w:t>
       </w:r>
     </w:p>
     <w:p>
@@ -1475,7 +1795,7 @@
         <w:pStyle w:val="Heading5"/>
       </w:pPr>
       <w:r>
-        <w:t xml:space="preserve">Adult Delta Smelt</w:t>
+        <w:t xml:space="preserve">Adult Delta smelt</w:t>
       </w:r>
     </w:p>
     <w:p>
@@ -1509,7 +1829,7 @@
         <w:t xml:space="preserve">JPF</w:t>
       </w:r>
       <w:r>
-        <w:t xml:space="preserve">: 7866 cfs as of Jan 01, 2026</w:t>
+        <w:t xml:space="preserve">: 19766 cfs as of Jan 07, 2026</w:t>
       </w:r>
     </w:p>
     <w:p>
@@ -1528,7 +1848,7 @@
         <w:t xml:space="preserve">OBI Turbidity</w:t>
       </w:r>
       <w:r>
-        <w:t xml:space="preserve">: 15.7, 5.48, 5.88 FNU as of Jan 04, 2026</w:t>
+        <w:t xml:space="preserve">: 6.27, 6.38, 6.26 FNU as of Jan 08, 2026</w:t>
       </w:r>
     </w:p>
     <w:p>
@@ -1547,7 +1867,7 @@
         <w:t xml:space="preserve">HOL Turbidity</w:t>
       </w:r>
       <w:r>
-        <w:t xml:space="preserve">: 5.61, 6.12, 6.43 FNU as of Jan 04, 2026</w:t>
+        <w:t xml:space="preserve">: 6.8, 6.85, 10.08 FNU as of Jan 08, 2026</w:t>
       </w:r>
     </w:p>
     <w:p>
@@ -1566,7 +1886,7 @@
         <w:t xml:space="preserve">OSJ Turbidity</w:t>
       </w:r>
       <w:r>
-        <w:t xml:space="preserve">: 25.34, 24.47, 21.84 FNU as of Jan 04, 2026</w:t>
+        <w:t xml:space="preserve">: 17.4, 15.36, 16.5 FNU as of Jan 08, 2026</w:t>
       </w:r>
     </w:p>
     <w:p>
@@ -1603,7 +1923,7 @@
         <w:t xml:space="preserve">RVB temperature (3-day average)</w:t>
       </w:r>
       <w:r>
-        <w:t xml:space="preserve">: 10.37°C as of Jan 04, 2026</w:t>
+        <w:t xml:space="preserve">: 11.24°C as of Jan 08, 2026</w:t>
       </w:r>
     </w:p>
     <w:p>
@@ -1692,7 +2012,7 @@
         <w:pStyle w:val="Heading5"/>
       </w:pPr>
       <w:r>
-        <w:t xml:space="preserve">Larval/Juvenile Delta Smelt</w:t>
+        <w:t xml:space="preserve">Larval/juvenile Delta smelt</w:t>
       </w:r>
     </w:p>
     <w:p>
@@ -1731,13 +2051,13 @@
     </w:p>
     <w:bookmarkEnd w:id="50"/>
     <w:bookmarkEnd w:id="51"/>
-    <w:bookmarkStart w:id="52" w:name="evalutation"/>
+    <w:bookmarkStart w:id="52" w:name="evaluation"/>
     <w:p>
       <w:pPr>
         <w:pStyle w:val="Heading4"/>
       </w:pPr>
       <w:r>
-        <w:t xml:space="preserve">Evalutation</w:t>
+        <w:t xml:space="preserve">Evaluation</w:t>
       </w:r>
     </w:p>
     <w:bookmarkEnd w:id="52"/>
@@ -1748,7 +2068,7 @@
         <w:pStyle w:val="Heading3"/>
       </w:pPr>
       <w:r>
-        <w:t xml:space="preserve">Longfin Smelt</w:t>
+        <w:t xml:space="preserve">Longfin smelt</w:t>
       </w:r>
     </w:p>
     <w:bookmarkStart w:id="64" w:name="biological-1"/>
@@ -1772,13 +2092,13 @@
           <w:b/>
           <w:bCs/>
         </w:rPr>
-        <w:t xml:space="preserve">Longfin Smelt Life Stages:</w:t>
+        <w:t xml:space="preserve">Longfin smelt life stages:</w:t>
       </w:r>
       <w:r>
         <w:t xml:space="preserve"> </w:t>
       </w:r>
       <w:r>
-        <w:t xml:space="preserve">Juvenile, Adult</w:t>
+        <w:t xml:space="preserve">Juvenile, Adult, NA, Larva</w:t>
       </w:r>
     </w:p>
     <w:p>
@@ -1793,13 +2113,13 @@
           <w:b/>
           <w:bCs/>
         </w:rPr>
-        <w:t xml:space="preserve">Longfin Smelt count:</w:t>
+        <w:t xml:space="preserve">Longfin smelt count:</w:t>
       </w:r>
       <w:r>
         <w:t xml:space="preserve"> </w:t>
       </w:r>
       <w:r>
-        <w:t xml:space="preserve">270 adult, 435 juvenile, and 3 larval Longfin smelt have been detected this water year. See</w:t>
+        <w:t xml:space="preserve">277 adult, 439 juvenile, and 10 larval longfin smelt have been detected this water year. See</w:t>
       </w:r>
       <w:r>
         <w:t xml:space="preserve"> </w:t>
@@ -1865,13 +2185,13 @@
           <w:b/>
           <w:bCs/>
         </w:rPr>
-        <w:t xml:space="preserve">Longfin Smelt salvage:</w:t>
+        <w:t xml:space="preserve">Longfin smelt salvage:</w:t>
       </w:r>
       <w:r>
         <w:t xml:space="preserve"> </w:t>
       </w:r>
       <w:r>
-        <w:t xml:space="preserve">0 Longfin Smelt have been salvaged, and the cumulative seasonal salvage is 0.</w:t>
+        <w:t xml:space="preserve">0 longfin smelt have been salvaged, and the cumulative seasonal salvage is 0.</w:t>
       </w:r>
       <w:r>
         <w:t xml:space="preserve"> </w:t>
@@ -1901,7 +2221,7 @@
               <w:pStyle w:val="ImageCaption"/>
             </w:pPr>
             <w:r>
-              <w:t xml:space="preserve">Table 3: Longfin Smelt Detections in the last 2 weeks. Fork Length &gt; 84mm = Adult, Fork Length 20-84mm = Juvenile, Fork Length &lt; 20mm = Larva.</w:t>
+              <w:t xml:space="preserve">Table 3: Longfin smelt detections in the last 2 weeks. Fork Length &gt; 84mm = Adult, Fork Length 20-84mm = Juvenile, Fork Length &lt; 20mm = Larva.</w:t>
             </w:r>
           </w:p>
           <w:tbl>
@@ -2411,46 +2731,46 @@
                     <w:jc w:val="center"/>
                   </w:pPr>
                   <w:r>
-                    <w:t xml:space="preserve">EDSM</w:t>
-                  </w:r>
-                </w:p>
-              </w:tc>
-              <w:tc>
-                <w:tcPr/>
-                <w:p>
-                  <w:pPr>
-                    <w:pStyle w:val="Compact"/>
-                    <w:jc w:val="left"/>
-                    <w:jc w:val="center"/>
-                  </w:pPr>
-                  <w:r>
-                    <w:t xml:space="preserve">2025-12-29</w:t>
-                  </w:r>
-                </w:p>
-              </w:tc>
-              <w:tc>
-                <w:tcPr/>
-                <w:p>
-                  <w:pPr>
-                    <w:pStyle w:val="Compact"/>
-                    <w:jc w:val="left"/>
-                    <w:jc w:val="center"/>
-                  </w:pPr>
-                  <w:r>
-                    <w:t xml:space="preserve">West</w:t>
-                  </w:r>
-                </w:p>
-              </w:tc>
-              <w:tc>
-                <w:tcPr/>
-                <w:p>
-                  <w:pPr>
-                    <w:pStyle w:val="Compact"/>
-                    <w:jc w:val="left"/>
-                    <w:jc w:val="center"/>
-                  </w:pPr>
-                  <w:r>
-                    <w:t xml:space="preserve">Suisun Marsh</w:t>
+                    <w:t xml:space="preserve">DJFMP</w:t>
+                  </w:r>
+                </w:p>
+              </w:tc>
+              <w:tc>
+                <w:tcPr/>
+                <w:p>
+                  <w:pPr>
+                    <w:pStyle w:val="Compact"/>
+                    <w:jc w:val="left"/>
+                    <w:jc w:val="center"/>
+                  </w:pPr>
+                  <w:r>
+                    <w:t xml:space="preserve">2026-01-05</w:t>
+                  </w:r>
+                </w:p>
+              </w:tc>
+              <w:tc>
+                <w:tcPr/>
+                <w:p>
+                  <w:pPr>
+                    <w:pStyle w:val="Compact"/>
+                    <w:jc w:val="left"/>
+                    <w:jc w:val="center"/>
+                  </w:pPr>
+                  <w:r>
+                    <w:t xml:space="preserve">N/A</w:t>
+                  </w:r>
+                </w:p>
+              </w:tc>
+              <w:tc>
+                <w:tcPr/>
+                <w:p>
+                  <w:pPr>
+                    <w:pStyle w:val="Compact"/>
+                    <w:jc w:val="left"/>
+                    <w:jc w:val="center"/>
+                  </w:pPr>
+                  <w:r>
+                    <w:t xml:space="preserve">Chipps Island</w:t>
                   </w:r>
                 </w:p>
               </w:tc>
@@ -2476,7 +2796,7 @@
                     <w:jc w:val="center"/>
                   </w:pPr>
                   <w:r>
-                    <w:t xml:space="preserve">2</w:t>
+                    <w:t xml:space="preserve">1</w:t>
                   </w:r>
                 </w:p>
               </w:tc>
@@ -2491,59 +2811,59 @@
                     <w:jc w:val="center"/>
                   </w:pPr>
                   <w:r>
-                    <w:t xml:space="preserve">EDSM</w:t>
-                  </w:r>
-                </w:p>
-              </w:tc>
-              <w:tc>
-                <w:tcPr/>
-                <w:p>
-                  <w:pPr>
-                    <w:pStyle w:val="Compact"/>
-                    <w:jc w:val="left"/>
-                    <w:jc w:val="center"/>
-                  </w:pPr>
-                  <w:r>
-                    <w:t xml:space="preserve">2025-12-29</w:t>
-                  </w:r>
-                </w:p>
-              </w:tc>
-              <w:tc>
-                <w:tcPr/>
-                <w:p>
-                  <w:pPr>
-                    <w:pStyle w:val="Compact"/>
-                    <w:jc w:val="left"/>
-                    <w:jc w:val="center"/>
-                  </w:pPr>
-                  <w:r>
-                    <w:t xml:space="preserve">West</w:t>
-                  </w:r>
-                </w:p>
-              </w:tc>
-              <w:tc>
-                <w:tcPr/>
-                <w:p>
-                  <w:pPr>
-                    <w:pStyle w:val="Compact"/>
-                    <w:jc w:val="left"/>
-                    <w:jc w:val="center"/>
-                  </w:pPr>
-                  <w:r>
-                    <w:t xml:space="preserve">Suisun Marsh</w:t>
-                  </w:r>
-                </w:p>
-              </w:tc>
-              <w:tc>
-                <w:tcPr/>
-                <w:p>
-                  <w:pPr>
-                    <w:pStyle w:val="Compact"/>
-                    <w:jc w:val="left"/>
-                    <w:jc w:val="center"/>
-                  </w:pPr>
-                  <w:r>
-                    <w:t xml:space="preserve">Juvenile</w:t>
+                    <w:t xml:space="preserve">DJFMP</w:t>
+                  </w:r>
+                </w:p>
+              </w:tc>
+              <w:tc>
+                <w:tcPr/>
+                <w:p>
+                  <w:pPr>
+                    <w:pStyle w:val="Compact"/>
+                    <w:jc w:val="left"/>
+                    <w:jc w:val="center"/>
+                  </w:pPr>
+                  <w:r>
+                    <w:t xml:space="preserve">2026-01-06</w:t>
+                  </w:r>
+                </w:p>
+              </w:tc>
+              <w:tc>
+                <w:tcPr/>
+                <w:p>
+                  <w:pPr>
+                    <w:pStyle w:val="Compact"/>
+                    <w:jc w:val="left"/>
+                    <w:jc w:val="center"/>
+                  </w:pPr>
+                  <w:r>
+                    <w:t xml:space="preserve">N/A</w:t>
+                  </w:r>
+                </w:p>
+              </w:tc>
+              <w:tc>
+                <w:tcPr/>
+                <w:p>
+                  <w:pPr>
+                    <w:pStyle w:val="Compact"/>
+                    <w:jc w:val="left"/>
+                    <w:jc w:val="center"/>
+                  </w:pPr>
+                  <w:r>
+                    <w:t xml:space="preserve">Chipps Island</w:t>
+                  </w:r>
+                </w:p>
+              </w:tc>
+              <w:tc>
+                <w:tcPr/>
+                <w:p>
+                  <w:pPr>
+                    <w:pStyle w:val="Compact"/>
+                    <w:jc w:val="left"/>
+                    <w:jc w:val="center"/>
+                  </w:pPr>
+                  <w:r>
+                    <w:t xml:space="preserve">Adult</w:t>
                   </w:r>
                 </w:p>
               </w:tc>
@@ -2556,7 +2876,7 @@
                     <w:jc w:val="center"/>
                   </w:pPr>
                   <w:r>
-                    <w:t xml:space="preserve">3</w:t>
+                    <w:t xml:space="preserve">1</w:t>
                   </w:r>
                 </w:p>
               </w:tc>
@@ -2571,46 +2891,46 @@
                     <w:jc w:val="center"/>
                   </w:pPr>
                   <w:r>
-                    <w:t xml:space="preserve">EDSM</w:t>
-                  </w:r>
-                </w:p>
-              </w:tc>
-              <w:tc>
-                <w:tcPr/>
-                <w:p>
-                  <w:pPr>
-                    <w:pStyle w:val="Compact"/>
-                    <w:jc w:val="left"/>
-                    <w:jc w:val="center"/>
-                  </w:pPr>
-                  <w:r>
-                    <w:t xml:space="preserve">2025-12-30</w:t>
-                  </w:r>
-                </w:p>
-              </w:tc>
-              <w:tc>
-                <w:tcPr/>
-                <w:p>
-                  <w:pPr>
-                    <w:pStyle w:val="Compact"/>
-                    <w:jc w:val="left"/>
-                    <w:jc w:val="center"/>
-                  </w:pPr>
-                  <w:r>
-                    <w:t xml:space="preserve">West</w:t>
-                  </w:r>
-                </w:p>
-              </w:tc>
-              <w:tc>
-                <w:tcPr/>
-                <w:p>
-                  <w:pPr>
-                    <w:pStyle w:val="Compact"/>
-                    <w:jc w:val="left"/>
-                    <w:jc w:val="center"/>
-                  </w:pPr>
-                  <w:r>
-                    <w:t xml:space="preserve">Suisun Bay</w:t>
+                    <w:t xml:space="preserve">DJFMP</w:t>
+                  </w:r>
+                </w:p>
+              </w:tc>
+              <w:tc>
+                <w:tcPr/>
+                <w:p>
+                  <w:pPr>
+                    <w:pStyle w:val="Compact"/>
+                    <w:jc w:val="left"/>
+                    <w:jc w:val="center"/>
+                  </w:pPr>
+                  <w:r>
+                    <w:t xml:space="preserve">2026-01-08</w:t>
+                  </w:r>
+                </w:p>
+              </w:tc>
+              <w:tc>
+                <w:tcPr/>
+                <w:p>
+                  <w:pPr>
+                    <w:pStyle w:val="Compact"/>
+                    <w:jc w:val="left"/>
+                    <w:jc w:val="center"/>
+                  </w:pPr>
+                  <w:r>
+                    <w:t xml:space="preserve">N/A</w:t>
+                  </w:r>
+                </w:p>
+              </w:tc>
+              <w:tc>
+                <w:tcPr/>
+                <w:p>
+                  <w:pPr>
+                    <w:pStyle w:val="Compact"/>
+                    <w:jc w:val="left"/>
+                    <w:jc w:val="center"/>
+                  </w:pPr>
+                  <w:r>
+                    <w:t xml:space="preserve">Chipps Island</w:t>
                   </w:r>
                 </w:p>
               </w:tc>
@@ -2636,7 +2956,7 @@
                     <w:jc w:val="center"/>
                   </w:pPr>
                   <w:r>
-                    <w:t xml:space="preserve">2</w:t>
+                    <w:t xml:space="preserve">3</w:t>
                   </w:r>
                 </w:p>
               </w:tc>
@@ -2664,7 +2984,7 @@
                     <w:jc w:val="center"/>
                   </w:pPr>
                   <w:r>
-                    <w:t xml:space="preserve">2025-12-30</w:t>
+                    <w:t xml:space="preserve">2025-12-29</w:t>
                   </w:r>
                 </w:p>
               </w:tc>
@@ -2690,20 +3010,20 @@
                     <w:jc w:val="center"/>
                   </w:pPr>
                   <w:r>
-                    <w:t xml:space="preserve">Suisun Bay</w:t>
-                  </w:r>
-                </w:p>
-              </w:tc>
-              <w:tc>
-                <w:tcPr/>
-                <w:p>
-                  <w:pPr>
-                    <w:pStyle w:val="Compact"/>
-                    <w:jc w:val="left"/>
-                    <w:jc w:val="center"/>
-                  </w:pPr>
-                  <w:r>
-                    <w:t xml:space="preserve">Juvenile</w:t>
+                    <w:t xml:space="preserve">Suisun Marsh</w:t>
+                  </w:r>
+                </w:p>
+              </w:tc>
+              <w:tc>
+                <w:tcPr/>
+                <w:p>
+                  <w:pPr>
+                    <w:pStyle w:val="Compact"/>
+                    <w:jc w:val="left"/>
+                    <w:jc w:val="center"/>
+                  </w:pPr>
+                  <w:r>
+                    <w:t xml:space="preserve">Adult</w:t>
                   </w:r>
                 </w:p>
               </w:tc>
@@ -2716,7 +3036,7 @@
                     <w:jc w:val="center"/>
                   </w:pPr>
                   <w:r>
-                    <w:t xml:space="preserve">1</w:t>
+                    <w:t xml:space="preserve">2</w:t>
                   </w:r>
                 </w:p>
               </w:tc>
@@ -2744,46 +3064,46 @@
                     <w:jc w:val="center"/>
                   </w:pPr>
                   <w:r>
-                    <w:t xml:space="preserve">2025-12-31</w:t>
-                  </w:r>
-                </w:p>
-              </w:tc>
-              <w:tc>
-                <w:tcPr/>
-                <w:p>
-                  <w:pPr>
-                    <w:pStyle w:val="Compact"/>
-                    <w:jc w:val="left"/>
-                    <w:jc w:val="center"/>
-                  </w:pPr>
-                  <w:r>
-                    <w:t xml:space="preserve">Far West</w:t>
-                  </w:r>
-                </w:p>
-              </w:tc>
-              <w:tc>
-                <w:tcPr/>
-                <w:p>
-                  <w:pPr>
-                    <w:pStyle w:val="Compact"/>
-                    <w:jc w:val="left"/>
-                    <w:jc w:val="center"/>
-                  </w:pPr>
-                  <w:r>
-                    <w:t xml:space="preserve">Suisun Bay</w:t>
-                  </w:r>
-                </w:p>
-              </w:tc>
-              <w:tc>
-                <w:tcPr/>
-                <w:p>
-                  <w:pPr>
-                    <w:pStyle w:val="Compact"/>
-                    <w:jc w:val="left"/>
-                    <w:jc w:val="center"/>
-                  </w:pPr>
-                  <w:r>
-                    <w:t xml:space="preserve">Adult</w:t>
+                    <w:t xml:space="preserve">2025-12-29</w:t>
+                  </w:r>
+                </w:p>
+              </w:tc>
+              <w:tc>
+                <w:tcPr/>
+                <w:p>
+                  <w:pPr>
+                    <w:pStyle w:val="Compact"/>
+                    <w:jc w:val="left"/>
+                    <w:jc w:val="center"/>
+                  </w:pPr>
+                  <w:r>
+                    <w:t xml:space="preserve">West</w:t>
+                  </w:r>
+                </w:p>
+              </w:tc>
+              <w:tc>
+                <w:tcPr/>
+                <w:p>
+                  <w:pPr>
+                    <w:pStyle w:val="Compact"/>
+                    <w:jc w:val="left"/>
+                    <w:jc w:val="center"/>
+                  </w:pPr>
+                  <w:r>
+                    <w:t xml:space="preserve">Suisun Marsh</w:t>
+                  </w:r>
+                </w:p>
+              </w:tc>
+              <w:tc>
+                <w:tcPr/>
+                <w:p>
+                  <w:pPr>
+                    <w:pStyle w:val="Compact"/>
+                    <w:jc w:val="left"/>
+                    <w:jc w:val="center"/>
+                  </w:pPr>
+                  <w:r>
+                    <w:t xml:space="preserve">Juvenile</w:t>
                   </w:r>
                 </w:p>
               </w:tc>
@@ -2796,7 +3116,7 @@
                     <w:jc w:val="center"/>
                   </w:pPr>
                   <w:r>
-                    <w:t xml:space="preserve">2</w:t>
+                    <w:t xml:space="preserve">3</w:t>
                   </w:r>
                 </w:p>
               </w:tc>
@@ -2824,6 +3144,166 @@
                     <w:jc w:val="center"/>
                   </w:pPr>
                   <w:r>
+                    <w:t xml:space="preserve">2025-12-30</w:t>
+                  </w:r>
+                </w:p>
+              </w:tc>
+              <w:tc>
+                <w:tcPr/>
+                <w:p>
+                  <w:pPr>
+                    <w:pStyle w:val="Compact"/>
+                    <w:jc w:val="left"/>
+                    <w:jc w:val="center"/>
+                  </w:pPr>
+                  <w:r>
+                    <w:t xml:space="preserve">West</w:t>
+                  </w:r>
+                </w:p>
+              </w:tc>
+              <w:tc>
+                <w:tcPr/>
+                <w:p>
+                  <w:pPr>
+                    <w:pStyle w:val="Compact"/>
+                    <w:jc w:val="left"/>
+                    <w:jc w:val="center"/>
+                  </w:pPr>
+                  <w:r>
+                    <w:t xml:space="preserve">Suisun Bay</w:t>
+                  </w:r>
+                </w:p>
+              </w:tc>
+              <w:tc>
+                <w:tcPr/>
+                <w:p>
+                  <w:pPr>
+                    <w:pStyle w:val="Compact"/>
+                    <w:jc w:val="left"/>
+                    <w:jc w:val="center"/>
+                  </w:pPr>
+                  <w:r>
+                    <w:t xml:space="preserve">Adult</w:t>
+                  </w:r>
+                </w:p>
+              </w:tc>
+              <w:tc>
+                <w:tcPr/>
+                <w:p>
+                  <w:pPr>
+                    <w:pStyle w:val="Compact"/>
+                    <w:jc w:val="right"/>
+                    <w:jc w:val="center"/>
+                  </w:pPr>
+                  <w:r>
+                    <w:t xml:space="preserve">2</w:t>
+                  </w:r>
+                </w:p>
+              </w:tc>
+            </w:tr>
+            <w:tr>
+              <w:tc>
+                <w:tcPr/>
+                <w:p>
+                  <w:pPr>
+                    <w:pStyle w:val="Compact"/>
+                    <w:jc w:val="left"/>
+                    <w:jc w:val="center"/>
+                  </w:pPr>
+                  <w:r>
+                    <w:t xml:space="preserve">EDSM</w:t>
+                  </w:r>
+                </w:p>
+              </w:tc>
+              <w:tc>
+                <w:tcPr/>
+                <w:p>
+                  <w:pPr>
+                    <w:pStyle w:val="Compact"/>
+                    <w:jc w:val="left"/>
+                    <w:jc w:val="center"/>
+                  </w:pPr>
+                  <w:r>
+                    <w:t xml:space="preserve">2025-12-30</w:t>
+                  </w:r>
+                </w:p>
+              </w:tc>
+              <w:tc>
+                <w:tcPr/>
+                <w:p>
+                  <w:pPr>
+                    <w:pStyle w:val="Compact"/>
+                    <w:jc w:val="left"/>
+                    <w:jc w:val="center"/>
+                  </w:pPr>
+                  <w:r>
+                    <w:t xml:space="preserve">West</w:t>
+                  </w:r>
+                </w:p>
+              </w:tc>
+              <w:tc>
+                <w:tcPr/>
+                <w:p>
+                  <w:pPr>
+                    <w:pStyle w:val="Compact"/>
+                    <w:jc w:val="left"/>
+                    <w:jc w:val="center"/>
+                  </w:pPr>
+                  <w:r>
+                    <w:t xml:space="preserve">Suisun Bay</w:t>
+                  </w:r>
+                </w:p>
+              </w:tc>
+              <w:tc>
+                <w:tcPr/>
+                <w:p>
+                  <w:pPr>
+                    <w:pStyle w:val="Compact"/>
+                    <w:jc w:val="left"/>
+                    <w:jc w:val="center"/>
+                  </w:pPr>
+                  <w:r>
+                    <w:t xml:space="preserve">Juvenile</w:t>
+                  </w:r>
+                </w:p>
+              </w:tc>
+              <w:tc>
+                <w:tcPr/>
+                <w:p>
+                  <w:pPr>
+                    <w:pStyle w:val="Compact"/>
+                    <w:jc w:val="right"/>
+                    <w:jc w:val="center"/>
+                  </w:pPr>
+                  <w:r>
+                    <w:t xml:space="preserve">1</w:t>
+                  </w:r>
+                </w:p>
+              </w:tc>
+            </w:tr>
+            <w:tr>
+              <w:tc>
+                <w:tcPr/>
+                <w:p>
+                  <w:pPr>
+                    <w:pStyle w:val="Compact"/>
+                    <w:jc w:val="left"/>
+                    <w:jc w:val="center"/>
+                  </w:pPr>
+                  <w:r>
+                    <w:t xml:space="preserve">EDSM</w:t>
+                  </w:r>
+                </w:p>
+              </w:tc>
+              <w:tc>
+                <w:tcPr/>
+                <w:p>
+                  <w:pPr>
+                    <w:pStyle w:val="Compact"/>
+                    <w:jc w:val="left"/>
+                    <w:jc w:val="center"/>
+                  </w:pPr>
+                  <w:r>
                     <w:t xml:space="preserve">2025-12-31</w:t>
                   </w:r>
                 </w:p>
@@ -2863,6 +3343,86 @@
                     <w:jc w:val="center"/>
                   </w:pPr>
                   <w:r>
+                    <w:t xml:space="preserve">Adult</w:t>
+                  </w:r>
+                </w:p>
+              </w:tc>
+              <w:tc>
+                <w:tcPr/>
+                <w:p>
+                  <w:pPr>
+                    <w:pStyle w:val="Compact"/>
+                    <w:jc w:val="right"/>
+                    <w:jc w:val="center"/>
+                  </w:pPr>
+                  <w:r>
+                    <w:t xml:space="preserve">2</w:t>
+                  </w:r>
+                </w:p>
+              </w:tc>
+            </w:tr>
+            <w:tr>
+              <w:tc>
+                <w:tcPr/>
+                <w:p>
+                  <w:pPr>
+                    <w:pStyle w:val="Compact"/>
+                    <w:jc w:val="left"/>
+                    <w:jc w:val="center"/>
+                  </w:pPr>
+                  <w:r>
+                    <w:t xml:space="preserve">EDSM</w:t>
+                  </w:r>
+                </w:p>
+              </w:tc>
+              <w:tc>
+                <w:tcPr/>
+                <w:p>
+                  <w:pPr>
+                    <w:pStyle w:val="Compact"/>
+                    <w:jc w:val="left"/>
+                    <w:jc w:val="center"/>
+                  </w:pPr>
+                  <w:r>
+                    <w:t xml:space="preserve">2025-12-31</w:t>
+                  </w:r>
+                </w:p>
+              </w:tc>
+              <w:tc>
+                <w:tcPr/>
+                <w:p>
+                  <w:pPr>
+                    <w:pStyle w:val="Compact"/>
+                    <w:jc w:val="left"/>
+                    <w:jc w:val="center"/>
+                  </w:pPr>
+                  <w:r>
+                    <w:t xml:space="preserve">Far West</w:t>
+                  </w:r>
+                </w:p>
+              </w:tc>
+              <w:tc>
+                <w:tcPr/>
+                <w:p>
+                  <w:pPr>
+                    <w:pStyle w:val="Compact"/>
+                    <w:jc w:val="left"/>
+                    <w:jc w:val="center"/>
+                  </w:pPr>
+                  <w:r>
+                    <w:t xml:space="preserve">Suisun Bay</w:t>
+                  </w:r>
+                </w:p>
+              </w:tc>
+              <w:tc>
+                <w:tcPr/>
+                <w:p>
+                  <w:pPr>
+                    <w:pStyle w:val="Compact"/>
+                    <w:jc w:val="left"/>
+                    <w:jc w:val="center"/>
+                  </w:pPr>
+                  <w:r>
                     <w:t xml:space="preserve">Juvenile</w:t>
                   </w:r>
                 </w:p>
@@ -2877,6 +3437,646 @@
                   </w:pPr>
                   <w:r>
                     <w:t xml:space="preserve">1</w:t>
+                  </w:r>
+                </w:p>
+              </w:tc>
+            </w:tr>
+            <w:tr>
+              <w:tc>
+                <w:tcPr/>
+                <w:p>
+                  <w:pPr>
+                    <w:pStyle w:val="Compact"/>
+                    <w:jc w:val="left"/>
+                    <w:jc w:val="center"/>
+                  </w:pPr>
+                  <w:r>
+                    <w:t xml:space="preserve">EDSM</w:t>
+                  </w:r>
+                </w:p>
+              </w:tc>
+              <w:tc>
+                <w:tcPr/>
+                <w:p>
+                  <w:pPr>
+                    <w:pStyle w:val="Compact"/>
+                    <w:jc w:val="left"/>
+                    <w:jc w:val="center"/>
+                  </w:pPr>
+                  <w:r>
+                    <w:t xml:space="preserve">2026-01-05</w:t>
+                  </w:r>
+                </w:p>
+              </w:tc>
+              <w:tc>
+                <w:tcPr/>
+                <w:p>
+                  <w:pPr>
+                    <w:pStyle w:val="Compact"/>
+                    <w:jc w:val="left"/>
+                    <w:jc w:val="center"/>
+                  </w:pPr>
+                  <w:r>
+                    <w:t xml:space="preserve">Far West</w:t>
+                  </w:r>
+                </w:p>
+              </w:tc>
+              <w:tc>
+                <w:tcPr/>
+                <w:p>
+                  <w:pPr>
+                    <w:pStyle w:val="Compact"/>
+                    <w:jc w:val="left"/>
+                    <w:jc w:val="center"/>
+                  </w:pPr>
+                  <w:r>
+                    <w:t xml:space="preserve">Suisun Bay</w:t>
+                  </w:r>
+                </w:p>
+              </w:tc>
+              <w:tc>
+                <w:tcPr/>
+                <w:p>
+                  <w:pPr>
+                    <w:pStyle w:val="Compact"/>
+                    <w:jc w:val="left"/>
+                    <w:jc w:val="center"/>
+                  </w:pPr>
+                  <w:r>
+                    <w:t xml:space="preserve">Adult</w:t>
+                  </w:r>
+                </w:p>
+              </w:tc>
+              <w:tc>
+                <w:tcPr/>
+                <w:p>
+                  <w:pPr>
+                    <w:pStyle w:val="Compact"/>
+                    <w:jc w:val="right"/>
+                    <w:jc w:val="center"/>
+                  </w:pPr>
+                  <w:r>
+                    <w:t xml:space="preserve">2</w:t>
+                  </w:r>
+                </w:p>
+              </w:tc>
+            </w:tr>
+            <w:tr>
+              <w:tc>
+                <w:tcPr/>
+                <w:p>
+                  <w:pPr>
+                    <w:pStyle w:val="Compact"/>
+                    <w:jc w:val="left"/>
+                    <w:jc w:val="center"/>
+                  </w:pPr>
+                  <w:r>
+                    <w:t xml:space="preserve">EDSM</w:t>
+                  </w:r>
+                </w:p>
+              </w:tc>
+              <w:tc>
+                <w:tcPr/>
+                <w:p>
+                  <w:pPr>
+                    <w:pStyle w:val="Compact"/>
+                    <w:jc w:val="left"/>
+                    <w:jc w:val="center"/>
+                  </w:pPr>
+                  <w:r>
+                    <w:t xml:space="preserve">2026-01-05</w:t>
+                  </w:r>
+                </w:p>
+              </w:tc>
+              <w:tc>
+                <w:tcPr/>
+                <w:p>
+                  <w:pPr>
+                    <w:pStyle w:val="Compact"/>
+                    <w:jc w:val="left"/>
+                    <w:jc w:val="center"/>
+                  </w:pPr>
+                  <w:r>
+                    <w:t xml:space="preserve">Far West</w:t>
+                  </w:r>
+                </w:p>
+              </w:tc>
+              <w:tc>
+                <w:tcPr/>
+                <w:p>
+                  <w:pPr>
+                    <w:pStyle w:val="Compact"/>
+                    <w:jc w:val="left"/>
+                    <w:jc w:val="center"/>
+                  </w:pPr>
+                  <w:r>
+                    <w:t xml:space="preserve">Suisun Bay</w:t>
+                  </w:r>
+                </w:p>
+              </w:tc>
+              <w:tc>
+                <w:tcPr/>
+                <w:p>
+                  <w:pPr>
+                    <w:pStyle w:val="Compact"/>
+                    <w:jc w:val="left"/>
+                    <w:jc w:val="center"/>
+                  </w:pPr>
+                  <w:r>
+                    <w:t xml:space="preserve">Juvenile</w:t>
+                  </w:r>
+                </w:p>
+              </w:tc>
+              <w:tc>
+                <w:tcPr/>
+                <w:p>
+                  <w:pPr>
+                    <w:pStyle w:val="Compact"/>
+                    <w:jc w:val="right"/>
+                    <w:jc w:val="center"/>
+                  </w:pPr>
+                  <w:r>
+                    <w:t xml:space="preserve">2</w:t>
+                  </w:r>
+                </w:p>
+              </w:tc>
+            </w:tr>
+            <w:tr>
+              <w:tc>
+                <w:tcPr/>
+                <w:p>
+                  <w:pPr>
+                    <w:pStyle w:val="Compact"/>
+                    <w:jc w:val="left"/>
+                    <w:jc w:val="center"/>
+                  </w:pPr>
+                  <w:r>
+                    <w:t xml:space="preserve">EDSM</w:t>
+                  </w:r>
+                </w:p>
+              </w:tc>
+              <w:tc>
+                <w:tcPr/>
+                <w:p>
+                  <w:pPr>
+                    <w:pStyle w:val="Compact"/>
+                    <w:jc w:val="left"/>
+                    <w:jc w:val="center"/>
+                  </w:pPr>
+                  <w:r>
+                    <w:t xml:space="preserve">2026-01-06</w:t>
+                  </w:r>
+                </w:p>
+              </w:tc>
+              <w:tc>
+                <w:tcPr/>
+                <w:p>
+                  <w:pPr>
+                    <w:pStyle w:val="Compact"/>
+                    <w:jc w:val="left"/>
+                    <w:jc w:val="center"/>
+                  </w:pPr>
+                  <w:r>
+                    <w:t xml:space="preserve">West</w:t>
+                  </w:r>
+                </w:p>
+              </w:tc>
+              <w:tc>
+                <w:tcPr/>
+                <w:p>
+                  <w:pPr>
+                    <w:pStyle w:val="Compact"/>
+                    <w:jc w:val="left"/>
+                    <w:jc w:val="center"/>
+                  </w:pPr>
+                  <w:r>
+                    <w:t xml:space="preserve">Suisun Bay</w:t>
+                  </w:r>
+                </w:p>
+              </w:tc>
+              <w:tc>
+                <w:tcPr/>
+                <w:p>
+                  <w:pPr>
+                    <w:pStyle w:val="Compact"/>
+                    <w:jc w:val="left"/>
+                    <w:jc w:val="center"/>
+                  </w:pPr>
+                  <w:r>
+                    <w:t xml:space="preserve">Juvenile</w:t>
+                  </w:r>
+                </w:p>
+              </w:tc>
+              <w:tc>
+                <w:tcPr/>
+                <w:p>
+                  <w:pPr>
+                    <w:pStyle w:val="Compact"/>
+                    <w:jc w:val="right"/>
+                    <w:jc w:val="center"/>
+                  </w:pPr>
+                  <w:r>
+                    <w:t xml:space="preserve">1</w:t>
+                  </w:r>
+                </w:p>
+              </w:tc>
+            </w:tr>
+            <w:tr>
+              <w:tc>
+                <w:tcPr/>
+                <w:p>
+                  <w:pPr>
+                    <w:pStyle w:val="Compact"/>
+                    <w:jc w:val="left"/>
+                    <w:jc w:val="center"/>
+                  </w:pPr>
+                  <w:r>
+                    <w:t xml:space="preserve">EDSM</w:t>
+                  </w:r>
+                </w:p>
+              </w:tc>
+              <w:tc>
+                <w:tcPr/>
+                <w:p>
+                  <w:pPr>
+                    <w:pStyle w:val="Compact"/>
+                    <w:jc w:val="left"/>
+                    <w:jc w:val="center"/>
+                  </w:pPr>
+                  <w:r>
+                    <w:t xml:space="preserve">2026-01-07</w:t>
+                  </w:r>
+                </w:p>
+              </w:tc>
+              <w:tc>
+                <w:tcPr/>
+                <w:p>
+                  <w:pPr>
+                    <w:pStyle w:val="Compact"/>
+                    <w:jc w:val="left"/>
+                    <w:jc w:val="center"/>
+                  </w:pPr>
+                  <w:r>
+                    <w:t xml:space="preserve">West</w:t>
+                  </w:r>
+                </w:p>
+              </w:tc>
+              <w:tc>
+                <w:tcPr/>
+                <w:p>
+                  <w:pPr>
+                    <w:pStyle w:val="Compact"/>
+                    <w:jc w:val="left"/>
+                    <w:jc w:val="center"/>
+                  </w:pPr>
+                  <w:r>
+                    <w:t xml:space="preserve">Suisun Marsh</w:t>
+                  </w:r>
+                </w:p>
+              </w:tc>
+              <w:tc>
+                <w:tcPr/>
+                <w:p>
+                  <w:pPr>
+                    <w:pStyle w:val="Compact"/>
+                    <w:jc w:val="left"/>
+                    <w:jc w:val="center"/>
+                  </w:pPr>
+                  <w:r>
+                    <w:t xml:space="preserve">Juvenile</w:t>
+                  </w:r>
+                </w:p>
+              </w:tc>
+              <w:tc>
+                <w:tcPr/>
+                <w:p>
+                  <w:pPr>
+                    <w:pStyle w:val="Compact"/>
+                    <w:jc w:val="right"/>
+                    <w:jc w:val="center"/>
+                  </w:pPr>
+                  <w:r>
+                    <w:t xml:space="preserve">1</w:t>
+                  </w:r>
+                </w:p>
+              </w:tc>
+            </w:tr>
+            <w:tr>
+              <w:tc>
+                <w:tcPr/>
+                <w:p>
+                  <w:pPr>
+                    <w:pStyle w:val="Compact"/>
+                    <w:jc w:val="left"/>
+                    <w:jc w:val="center"/>
+                  </w:pPr>
+                  <w:r>
+                    <w:t xml:space="preserve">sls</w:t>
+                  </w:r>
+                </w:p>
+              </w:tc>
+              <w:tc>
+                <w:tcPr/>
+                <w:p>
+                  <w:pPr>
+                    <w:pStyle w:val="Compact"/>
+                    <w:jc w:val="left"/>
+                    <w:jc w:val="center"/>
+                  </w:pPr>
+                  <w:r>
+                    <w:t xml:space="preserve">2025-12-29</w:t>
+                  </w:r>
+                </w:p>
+              </w:tc>
+              <w:tc>
+                <w:tcPr/>
+                <w:p>
+                  <w:pPr>
+                    <w:pStyle w:val="Compact"/>
+                    <w:jc w:val="left"/>
+                    <w:jc w:val="center"/>
+                  </w:pPr>
+                  <w:r>
+                    <w:t xml:space="preserve">Far West</w:t>
+                  </w:r>
+                </w:p>
+              </w:tc>
+              <w:tc>
+                <w:tcPr/>
+                <w:p>
+                  <w:pPr>
+                    <w:pStyle w:val="Compact"/>
+                    <w:jc w:val="left"/>
+                    <w:jc w:val="center"/>
+                  </w:pPr>
+                  <w:r>
+                    <w:t xml:space="preserve">Western Delta</w:t>
+                  </w:r>
+                </w:p>
+              </w:tc>
+              <w:tc>
+                <w:tcPr/>
+                <w:p>
+                  <w:pPr>
+                    <w:pStyle w:val="Compact"/>
+                    <w:jc w:val="left"/>
+                    <w:jc w:val="center"/>
+                  </w:pPr>
+                  <w:r>
+                    <w:t xml:space="preserve">NA</w:t>
+                  </w:r>
+                </w:p>
+              </w:tc>
+              <w:tc>
+                <w:tcPr/>
+                <w:p>
+                  <w:pPr>
+                    <w:pStyle w:val="Compact"/>
+                    <w:jc w:val="right"/>
+                    <w:jc w:val="center"/>
+                  </w:pPr>
+                  <w:r>
+                    <w:t xml:space="preserve">9</w:t>
+                  </w:r>
+                </w:p>
+              </w:tc>
+            </w:tr>
+            <w:tr>
+              <w:tc>
+                <w:tcPr/>
+                <w:p>
+                  <w:pPr>
+                    <w:pStyle w:val="Compact"/>
+                    <w:jc w:val="left"/>
+                    <w:jc w:val="center"/>
+                  </w:pPr>
+                  <w:r>
+                    <w:t xml:space="preserve">sls</w:t>
+                  </w:r>
+                </w:p>
+              </w:tc>
+              <w:tc>
+                <w:tcPr/>
+                <w:p>
+                  <w:pPr>
+                    <w:pStyle w:val="Compact"/>
+                    <w:jc w:val="left"/>
+                    <w:jc w:val="center"/>
+                  </w:pPr>
+                  <w:r>
+                    <w:t xml:space="preserve">2025-12-30</w:t>
+                  </w:r>
+                </w:p>
+              </w:tc>
+              <w:tc>
+                <w:tcPr/>
+                <w:p>
+                  <w:pPr>
+                    <w:pStyle w:val="Compact"/>
+                    <w:jc w:val="left"/>
+                    <w:jc w:val="center"/>
+                  </w:pPr>
+                  <w:r>
+                    <w:t xml:space="preserve">Far West</w:t>
+                  </w:r>
+                </w:p>
+              </w:tc>
+              <w:tc>
+                <w:tcPr/>
+                <w:p>
+                  <w:pPr>
+                    <w:pStyle w:val="Compact"/>
+                    <w:jc w:val="left"/>
+                    <w:jc w:val="center"/>
+                  </w:pPr>
+                  <w:r>
+                    <w:t xml:space="preserve">Western Delta</w:t>
+                  </w:r>
+                </w:p>
+              </w:tc>
+              <w:tc>
+                <w:tcPr/>
+                <w:p>
+                  <w:pPr>
+                    <w:pStyle w:val="Compact"/>
+                    <w:jc w:val="left"/>
+                    <w:jc w:val="center"/>
+                  </w:pPr>
+                  <w:r>
+                    <w:t xml:space="preserve">Larva</w:t>
+                  </w:r>
+                </w:p>
+              </w:tc>
+              <w:tc>
+                <w:tcPr/>
+                <w:p>
+                  <w:pPr>
+                    <w:pStyle w:val="Compact"/>
+                    <w:jc w:val="right"/>
+                    <w:jc w:val="center"/>
+                  </w:pPr>
+                  <w:r>
+                    <w:t xml:space="preserve">3</w:t>
+                  </w:r>
+                </w:p>
+              </w:tc>
+            </w:tr>
+            <w:tr>
+              <w:tc>
+                <w:tcPr/>
+                <w:p>
+                  <w:pPr>
+                    <w:pStyle w:val="Compact"/>
+                    <w:jc w:val="left"/>
+                    <w:jc w:val="center"/>
+                  </w:pPr>
+                  <w:r>
+                    <w:t xml:space="preserve">sls</w:t>
+                  </w:r>
+                </w:p>
+              </w:tc>
+              <w:tc>
+                <w:tcPr/>
+                <w:p>
+                  <w:pPr>
+                    <w:pStyle w:val="Compact"/>
+                    <w:jc w:val="left"/>
+                    <w:jc w:val="center"/>
+                  </w:pPr>
+                  <w:r>
+                    <w:t xml:space="preserve">2025-12-30</w:t>
+                  </w:r>
+                </w:p>
+              </w:tc>
+              <w:tc>
+                <w:tcPr/>
+                <w:p>
+                  <w:pPr>
+                    <w:pStyle w:val="Compact"/>
+                    <w:jc w:val="left"/>
+                    <w:jc w:val="center"/>
+                  </w:pPr>
+                  <w:r>
+                    <w:t xml:space="preserve">Far West</w:t>
+                  </w:r>
+                </w:p>
+              </w:tc>
+              <w:tc>
+                <w:tcPr/>
+                <w:p>
+                  <w:pPr>
+                    <w:pStyle w:val="Compact"/>
+                    <w:jc w:val="left"/>
+                    <w:jc w:val="center"/>
+                  </w:pPr>
+                  <w:r>
+                    <w:t xml:space="preserve">Western Delta</w:t>
+                  </w:r>
+                </w:p>
+              </w:tc>
+              <w:tc>
+                <w:tcPr/>
+                <w:p>
+                  <w:pPr>
+                    <w:pStyle w:val="Compact"/>
+                    <w:jc w:val="left"/>
+                    <w:jc w:val="center"/>
+                  </w:pPr>
+                  <w:r>
+                    <w:t xml:space="preserve">NA</w:t>
+                  </w:r>
+                </w:p>
+              </w:tc>
+              <w:tc>
+                <w:tcPr/>
+                <w:p>
+                  <w:pPr>
+                    <w:pStyle w:val="Compact"/>
+                    <w:jc w:val="right"/>
+                    <w:jc w:val="center"/>
+                  </w:pPr>
+                  <w:r>
+                    <w:t xml:space="preserve">4</w:t>
+                  </w:r>
+                </w:p>
+              </w:tc>
+            </w:tr>
+            <w:tr>
+              <w:tc>
+                <w:tcPr/>
+                <w:p>
+                  <w:pPr>
+                    <w:pStyle w:val="Compact"/>
+                    <w:jc w:val="left"/>
+                    <w:jc w:val="center"/>
+                  </w:pPr>
+                  <w:r>
+                    <w:t xml:space="preserve">sls</w:t>
+                  </w:r>
+                </w:p>
+              </w:tc>
+              <w:tc>
+                <w:tcPr/>
+                <w:p>
+                  <w:pPr>
+                    <w:pStyle w:val="Compact"/>
+                    <w:jc w:val="left"/>
+                    <w:jc w:val="center"/>
+                  </w:pPr>
+                  <w:r>
+                    <w:t xml:space="preserve">2025-12-30</w:t>
+                  </w:r>
+                </w:p>
+              </w:tc>
+              <w:tc>
+                <w:tcPr/>
+                <w:p>
+                  <w:pPr>
+                    <w:pStyle w:val="Compact"/>
+                    <w:jc w:val="left"/>
+                    <w:jc w:val="center"/>
+                  </w:pPr>
+                  <w:r>
+                    <w:t xml:space="preserve">West</w:t>
+                  </w:r>
+                </w:p>
+              </w:tc>
+              <w:tc>
+                <w:tcPr/>
+                <w:p>
+                  <w:pPr>
+                    <w:pStyle w:val="Compact"/>
+                    <w:jc w:val="left"/>
+                    <w:jc w:val="center"/>
+                  </w:pPr>
+                  <w:r>
+                    <w:t xml:space="preserve">Lower San Joaquin</w:t>
+                  </w:r>
+                </w:p>
+              </w:tc>
+              <w:tc>
+                <w:tcPr/>
+                <w:p>
+                  <w:pPr>
+                    <w:pStyle w:val="Compact"/>
+                    <w:jc w:val="left"/>
+                    <w:jc w:val="center"/>
+                  </w:pPr>
+                  <w:r>
+                    <w:t xml:space="preserve">Larva</w:t>
+                  </w:r>
+                </w:p>
+              </w:tc>
+              <w:tc>
+                <w:tcPr/>
+                <w:p>
+                  <w:pPr>
+                    <w:pStyle w:val="Compact"/>
+                    <w:jc w:val="right"/>
+                    <w:jc w:val="center"/>
+                  </w:pPr>
+                  <w:r>
+                    <w:t xml:space="preserve">4</w:t>
                   </w:r>
                 </w:p>
               </w:tc>
@@ -2990,7 +4190,7 @@
               <w:pStyle w:val="ImageCaption"/>
             </w:pPr>
             <w:r>
-              <w:t xml:space="preserve">Table 4: Longfin Smelt Water Year Totals by Life Stage</w:t>
+              <w:t xml:space="preserve">Table 4: Longfin smelt water year totals by life stage</w:t>
             </w:r>
           </w:p>
           <w:tbl>
@@ -3111,7 +4311,7 @@
                     <w:jc w:val="center"/>
                   </w:pPr>
                   <w:r>
-                    <w:t xml:space="preserve">235</w:t>
+                    <w:t xml:space="preserve">240</w:t>
                   </w:r>
                 </w:p>
               </w:tc>
@@ -3219,7 +4419,7 @@
                     <w:jc w:val="center"/>
                   </w:pPr>
                   <w:r>
-                    <w:t xml:space="preserve">5</w:t>
+                    <w:t xml:space="preserve">7</w:t>
                   </w:r>
                 </w:p>
               </w:tc>
@@ -3273,7 +4473,7 @@
                     <w:jc w:val="center"/>
                   </w:pPr>
                   <w:r>
-                    <w:t xml:space="preserve">11</w:t>
+                    <w:t xml:space="preserve">13</w:t>
                   </w:r>
                 </w:p>
               </w:tc>
@@ -3381,7 +4581,7 @@
                     <w:jc w:val="center"/>
                   </w:pPr>
                   <w:r>
-                    <w:t xml:space="preserve">73</w:t>
+                    <w:t xml:space="preserve">75</w:t>
                   </w:r>
                 </w:p>
               </w:tc>
@@ -3679,7 +4879,7 @@
                     <w:jc w:val="center"/>
                   </w:pPr>
                   <w:r>
-                    <w:t xml:space="preserve">North</w:t>
+                    <w:t xml:space="preserve">Far West</w:t>
                   </w:r>
                 </w:p>
               </w:tc>
@@ -3705,7 +4905,7 @@
                     <w:jc w:val="center"/>
                   </w:pPr>
                   <w:r>
-                    <w:t xml:space="preserve">1</w:t>
+                    <w:t xml:space="preserve">3</w:t>
                   </w:r>
                 </w:p>
               </w:tc>
@@ -3733,6 +4933,60 @@
                     <w:jc w:val="center"/>
                   </w:pPr>
                   <w:r>
+                    <w:t xml:space="preserve">North</w:t>
+                  </w:r>
+                </w:p>
+              </w:tc>
+              <w:tc>
+                <w:tcPr/>
+                <w:p>
+                  <w:pPr>
+                    <w:pStyle w:val="Compact"/>
+                    <w:jc w:val="left"/>
+                    <w:jc w:val="center"/>
+                  </w:pPr>
+                  <w:r>
+                    <w:t xml:space="preserve">Larva</w:t>
+                  </w:r>
+                </w:p>
+              </w:tc>
+              <w:tc>
+                <w:tcPr/>
+                <w:p>
+                  <w:pPr>
+                    <w:pStyle w:val="Compact"/>
+                    <w:jc w:val="right"/>
+                    <w:jc w:val="center"/>
+                  </w:pPr>
+                  <w:r>
+                    <w:t xml:space="preserve">1</w:t>
+                  </w:r>
+                </w:p>
+              </w:tc>
+            </w:tr>
+            <w:tr>
+              <w:tc>
+                <w:tcPr/>
+                <w:p>
+                  <w:pPr>
+                    <w:pStyle w:val="Compact"/>
+                    <w:jc w:val="left"/>
+                    <w:jc w:val="center"/>
+                  </w:pPr>
+                  <w:r>
+                    <w:t xml:space="preserve">sls</w:t>
+                  </w:r>
+                </w:p>
+              </w:tc>
+              <w:tc>
+                <w:tcPr/>
+                <w:p>
+                  <w:pPr>
+                    <w:pStyle w:val="Compact"/>
+                    <w:jc w:val="left"/>
+                    <w:jc w:val="center"/>
+                  </w:pPr>
+                  <w:r>
                     <w:t xml:space="preserve">West</w:t>
                   </w:r>
                 </w:p>
@@ -3759,7 +5013,7 @@
                     <w:jc w:val="center"/>
                   </w:pPr>
                   <w:r>
-                    <w:t xml:space="preserve">2</w:t>
+                    <w:t xml:space="preserve">6</w:t>
                   </w:r>
                 </w:p>
               </w:tc>
@@ -3842,7 +5096,7 @@
               <w:pStyle w:val="ImageCaption"/>
             </w:pPr>
             <w:r>
-              <w:t xml:space="preserve">Figure 4: Time Series of Longfin Smelt Catch, WY 2026</w:t>
+              <w:t xml:space="preserve">Figure 4: Time series of longfin smelt catch, WY 2026</w:t>
             </w:r>
           </w:p>
           <w:bookmarkEnd w:id="63"/>
@@ -3887,7 +5141,7 @@
         <w:pStyle w:val="Heading5"/>
       </w:pPr>
       <w:r>
-        <w:t xml:space="preserve">Adult Longfin Smelt</w:t>
+        <w:t xml:space="preserve">Adult longfin smelt</w:t>
       </w:r>
     </w:p>
     <w:p>
@@ -3921,7 +5175,10 @@
         </w:numPr>
       </w:pPr>
       <w:r>
-        <w:t xml:space="preserve">Daily average JPF: 7866 cfs as of Jan 01, 2026</w:t>
+        <w:t xml:space="preserve">Daily average JPF: 1.9766</w:t>
+      </w:r>
+      <w:r>
+        <w:t xml:space="preserve">^{4} cfs as of Jan 07, 2026</w:t>
       </w:r>
     </w:p>
     <w:p>
@@ -3943,7 +5200,7 @@
         <w:pStyle w:val="Heading5"/>
       </w:pPr>
       <w:r>
-        <w:t xml:space="preserve">Larval/Juvenile Longfin Smelt</w:t>
+        <w:t xml:space="preserve">Larval/juvenile longfin smelt</w:t>
       </w:r>
     </w:p>
     <w:p>
@@ -3977,12 +5234,15 @@
         </w:numPr>
       </w:pPr>
       <w:r>
-        <w:t xml:space="preserve">Daily average JPF: 7866 cfs as of Jan 01, 2026</w:t>
+        <w:t xml:space="preserve">Daily average JPF: 1.9766</w:t>
+      </w:r>
+      <w:r>
+        <w:t xml:space="preserve">^{4} cfs as of Jan 07, 2026</w:t>
       </w:r>
     </w:p>
     <w:bookmarkEnd w:id="67"/>
     <w:bookmarkEnd w:id="68"/>
-    <w:bookmarkStart w:id="69" w:name="evaluation"/>
+    <w:bookmarkStart w:id="69" w:name="evaluation-1"/>
     <w:p>
       <w:pPr>
         <w:pStyle w:val="Heading4"/>
@@ -3993,13 +5253,13 @@
     </w:p>
     <w:bookmarkEnd w:id="69"/>
     <w:bookmarkEnd w:id="70"/>
-    <w:bookmarkStart w:id="71" w:name="end-of-smelt-omr-management"/>
+    <w:bookmarkStart w:id="71" w:name="end-of-smelt-entrainment-management"/>
     <w:p>
       <w:pPr>
         <w:pStyle w:val="Heading3"/>
       </w:pPr>
       <w:r>
-        <w:t xml:space="preserve">End of Smelt OMR Management</w:t>
+        <w:t xml:space="preserve">End of smelt Entrainment Management</w:t>
       </w:r>
     </w:p>
     <w:p>

</xml_diff>

<commit_message>
updated smelt_vars evaluation questions and abundance estimates
</commit_message>
<xml_diff>
--- a/smt-assessment-v1.docx
+++ b/smt-assessment-v1.docx
@@ -26,7 +26,7 @@
           <w:i/>
           <w:iCs/>
         </w:rPr>
-        <w:t xml:space="preserve">January 13, 2026</w:t>
+        <w:t xml:space="preserve">January 26, 2026</w:t>
       </w:r>
     </w:p>
     <w:bookmarkStart w:id="20" w:name="executive-summary"/>
@@ -47,7 +47,7 @@
         </w:numPr>
       </w:pPr>
       <w:r>
-        <w:t xml:space="preserve">The First flush action implementation period ended on 1/7/26. Entrainment management is currently active.</w:t>
+        <w:t xml:space="preserve">Entrainment management is currently active.</w:t>
       </w:r>
     </w:p>
     <w:p>
@@ -59,7 +59,7 @@
         </w:numPr>
       </w:pPr>
       <w:r>
-        <w:t xml:space="preserve">Delta smelt are primarily distributed west of the confluence, in Suisun Marsh</w:t>
+        <w:t xml:space="preserve">Delta smelt were detected at Chipps Island and the Sacramento Deep Water Ship Channel.</w:t>
       </w:r>
     </w:p>
     <w:p>
@@ -71,7 +71,7 @@
         </w:numPr>
       </w:pPr>
       <w:r>
-        <w:t xml:space="preserve">No Delta smelt or longfin smelt salvage has been observed this water year</w:t>
+        <w:t xml:space="preserve">No Delta smelt or longfin smelt salvage has been observed this water year.</w:t>
       </w:r>
     </w:p>
     <w:p>
@@ -171,7 +171,7 @@
         <w:t xml:space="preserve"> </w:t>
       </w:r>
       <w:r>
-        <w:t xml:space="preserve">Adult, Juvenile</w:t>
+        <w:t xml:space="preserve">Adult</w:t>
       </w:r>
     </w:p>
     <w:p>
@@ -192,7 +192,7 @@
         <w:t xml:space="preserve"> </w:t>
       </w:r>
       <w:r>
-        <w:t xml:space="preserve">8963 (95% CL: 1,984 to 26,236) as of the week of January 5–9, 2026</w:t>
+        <w:t xml:space="preserve">258 (95% CL: 16 to 1,219) as of the week of January 19–23, 2026</w:t>
       </w:r>
     </w:p>
     <w:p>
@@ -234,7 +234,7 @@
         <w:t xml:space="preserve"> </w:t>
       </w:r>
       <w:r>
-        <w:t xml:space="preserve">33 adult Delta smelt and 24 juvenile Delta smelt have been detected this water year. See</w:t>
+        <w:t xml:space="preserve">34 adult Delta smelt and 24 juvenile Delta smelt have been detected this water year. See</w:t>
       </w:r>
       <w:r>
         <w:t xml:space="preserve"> </w:t>
@@ -561,33 +561,33 @@
                     <w:jc w:val="center"/>
                   </w:pPr>
                   <w:r>
-                    <w:t xml:space="preserve">2026-01-02</w:t>
-                  </w:r>
-                </w:p>
-              </w:tc>
-              <w:tc>
-                <w:tcPr/>
-                <w:p>
-                  <w:pPr>
-                    <w:pStyle w:val="Compact"/>
-                    <w:jc w:val="left"/>
-                    <w:jc w:val="center"/>
-                  </w:pPr>
-                  <w:r>
-                    <w:t xml:space="preserve">West</w:t>
-                  </w:r>
-                </w:p>
-              </w:tc>
-              <w:tc>
-                <w:tcPr/>
-                <w:p>
-                  <w:pPr>
-                    <w:pStyle w:val="Compact"/>
-                    <w:jc w:val="left"/>
-                    <w:jc w:val="center"/>
-                  </w:pPr>
-                  <w:r>
-                    <w:t xml:space="preserve">Suisun Marsh</w:t>
+                    <w:t xml:space="preserve">2026-01-22</w:t>
+                  </w:r>
+                </w:p>
+              </w:tc>
+              <w:tc>
+                <w:tcPr/>
+                <w:p>
+                  <w:pPr>
+                    <w:pStyle w:val="Compact"/>
+                    <w:jc w:val="left"/>
+                    <w:jc w:val="center"/>
+                  </w:pPr>
+                  <w:r>
+                    <w:t xml:space="preserve">North</w:t>
+                  </w:r>
+                </w:p>
+              </w:tc>
+              <w:tc>
+                <w:tcPr/>
+                <w:p>
+                  <w:pPr>
+                    <w:pStyle w:val="Compact"/>
+                    <w:jc w:val="left"/>
+                    <w:jc w:val="center"/>
+                  </w:pPr>
+                  <w:r>
+                    <w:t xml:space="preserve">Sac Deep Water</w:t>
                   </w:r>
                 </w:p>
               </w:tc>
@@ -601,406 +601,6 @@
                   </w:pPr>
                   <w:r>
                     <w:t xml:space="preserve">Adult</w:t>
-                  </w:r>
-                </w:p>
-              </w:tc>
-              <w:tc>
-                <w:tcPr/>
-                <w:p>
-                  <w:pPr>
-                    <w:pStyle w:val="Compact"/>
-                    <w:jc w:val="right"/>
-                    <w:jc w:val="center"/>
-                  </w:pPr>
-                  <w:r>
-                    <w:t xml:space="preserve">2</w:t>
-                  </w:r>
-                </w:p>
-              </w:tc>
-            </w:tr>
-            <w:tr>
-              <w:tc>
-                <w:tcPr/>
-                <w:p>
-                  <w:pPr>
-                    <w:pStyle w:val="Compact"/>
-                    <w:jc w:val="left"/>
-                    <w:jc w:val="center"/>
-                  </w:pPr>
-                  <w:r>
-                    <w:t xml:space="preserve">EDSM</w:t>
-                  </w:r>
-                </w:p>
-              </w:tc>
-              <w:tc>
-                <w:tcPr/>
-                <w:p>
-                  <w:pPr>
-                    <w:pStyle w:val="Compact"/>
-                    <w:jc w:val="left"/>
-                    <w:jc w:val="center"/>
-                  </w:pPr>
-                  <w:r>
-                    <w:t xml:space="preserve">2026-01-02</w:t>
-                  </w:r>
-                </w:p>
-              </w:tc>
-              <w:tc>
-                <w:tcPr/>
-                <w:p>
-                  <w:pPr>
-                    <w:pStyle w:val="Compact"/>
-                    <w:jc w:val="left"/>
-                    <w:jc w:val="center"/>
-                  </w:pPr>
-                  <w:r>
-                    <w:t xml:space="preserve">West</w:t>
-                  </w:r>
-                </w:p>
-              </w:tc>
-              <w:tc>
-                <w:tcPr/>
-                <w:p>
-                  <w:pPr>
-                    <w:pStyle w:val="Compact"/>
-                    <w:jc w:val="left"/>
-                    <w:jc w:val="center"/>
-                  </w:pPr>
-                  <w:r>
-                    <w:t xml:space="preserve">Suisun Marsh</w:t>
-                  </w:r>
-                </w:p>
-              </w:tc>
-              <w:tc>
-                <w:tcPr/>
-                <w:p>
-                  <w:pPr>
-                    <w:pStyle w:val="Compact"/>
-                    <w:jc w:val="left"/>
-                    <w:jc w:val="center"/>
-                  </w:pPr>
-                  <w:r>
-                    <w:t xml:space="preserve">Juvenile</w:t>
-                  </w:r>
-                </w:p>
-              </w:tc>
-              <w:tc>
-                <w:tcPr/>
-                <w:p>
-                  <w:pPr>
-                    <w:pStyle w:val="Compact"/>
-                    <w:jc w:val="right"/>
-                    <w:jc w:val="center"/>
-                  </w:pPr>
-                  <w:r>
-                    <w:t xml:space="preserve">1</w:t>
-                  </w:r>
-                </w:p>
-              </w:tc>
-            </w:tr>
-            <w:tr>
-              <w:tc>
-                <w:tcPr/>
-                <w:p>
-                  <w:pPr>
-                    <w:pStyle w:val="Compact"/>
-                    <w:jc w:val="left"/>
-                    <w:jc w:val="center"/>
-                  </w:pPr>
-                  <w:r>
-                    <w:t xml:space="preserve">EDSM</w:t>
-                  </w:r>
-                </w:p>
-              </w:tc>
-              <w:tc>
-                <w:tcPr/>
-                <w:p>
-                  <w:pPr>
-                    <w:pStyle w:val="Compact"/>
-                    <w:jc w:val="left"/>
-                    <w:jc w:val="center"/>
-                  </w:pPr>
-                  <w:r>
-                    <w:t xml:space="preserve">2026-01-07</w:t>
-                  </w:r>
-                </w:p>
-              </w:tc>
-              <w:tc>
-                <w:tcPr/>
-                <w:p>
-                  <w:pPr>
-                    <w:pStyle w:val="Compact"/>
-                    <w:jc w:val="left"/>
-                    <w:jc w:val="center"/>
-                  </w:pPr>
-                  <w:r>
-                    <w:t xml:space="preserve">West</w:t>
-                  </w:r>
-                </w:p>
-              </w:tc>
-              <w:tc>
-                <w:tcPr/>
-                <w:p>
-                  <w:pPr>
-                    <w:pStyle w:val="Compact"/>
-                    <w:jc w:val="left"/>
-                    <w:jc w:val="center"/>
-                  </w:pPr>
-                  <w:r>
-                    <w:t xml:space="preserve">Suisun Marsh</w:t>
-                  </w:r>
-                </w:p>
-              </w:tc>
-              <w:tc>
-                <w:tcPr/>
-                <w:p>
-                  <w:pPr>
-                    <w:pStyle w:val="Compact"/>
-                    <w:jc w:val="left"/>
-                    <w:jc w:val="center"/>
-                  </w:pPr>
-                  <w:r>
-                    <w:t xml:space="preserve">Adult</w:t>
-                  </w:r>
-                </w:p>
-              </w:tc>
-              <w:tc>
-                <w:tcPr/>
-                <w:p>
-                  <w:pPr>
-                    <w:pStyle w:val="Compact"/>
-                    <w:jc w:val="right"/>
-                    <w:jc w:val="center"/>
-                  </w:pPr>
-                  <w:r>
-                    <w:t xml:space="preserve">1</w:t>
-                  </w:r>
-                </w:p>
-              </w:tc>
-            </w:tr>
-            <w:tr>
-              <w:tc>
-                <w:tcPr/>
-                <w:p>
-                  <w:pPr>
-                    <w:pStyle w:val="Compact"/>
-                    <w:jc w:val="left"/>
-                    <w:jc w:val="center"/>
-                  </w:pPr>
-                  <w:r>
-                    <w:t xml:space="preserve">EDSM</w:t>
-                  </w:r>
-                </w:p>
-              </w:tc>
-              <w:tc>
-                <w:tcPr/>
-                <w:p>
-                  <w:pPr>
-                    <w:pStyle w:val="Compact"/>
-                    <w:jc w:val="left"/>
-                    <w:jc w:val="center"/>
-                  </w:pPr>
-                  <w:r>
-                    <w:t xml:space="preserve">2026-01-07</w:t>
-                  </w:r>
-                </w:p>
-              </w:tc>
-              <w:tc>
-                <w:tcPr/>
-                <w:p>
-                  <w:pPr>
-                    <w:pStyle w:val="Compact"/>
-                    <w:jc w:val="left"/>
-                    <w:jc w:val="center"/>
-                  </w:pPr>
-                  <w:r>
-                    <w:t xml:space="preserve">West</w:t>
-                  </w:r>
-                </w:p>
-              </w:tc>
-              <w:tc>
-                <w:tcPr/>
-                <w:p>
-                  <w:pPr>
-                    <w:pStyle w:val="Compact"/>
-                    <w:jc w:val="left"/>
-                    <w:jc w:val="center"/>
-                  </w:pPr>
-                  <w:r>
-                    <w:t xml:space="preserve">Suisun Marsh</w:t>
-                  </w:r>
-                </w:p>
-              </w:tc>
-              <w:tc>
-                <w:tcPr/>
-                <w:p>
-                  <w:pPr>
-                    <w:pStyle w:val="Compact"/>
-                    <w:jc w:val="left"/>
-                    <w:jc w:val="center"/>
-                  </w:pPr>
-                  <w:r>
-                    <w:t xml:space="preserve">Juvenile</w:t>
-                  </w:r>
-                </w:p>
-              </w:tc>
-              <w:tc>
-                <w:tcPr/>
-                <w:p>
-                  <w:pPr>
-                    <w:pStyle w:val="Compact"/>
-                    <w:jc w:val="right"/>
-                    <w:jc w:val="center"/>
-                  </w:pPr>
-                  <w:r>
-                    <w:t xml:space="preserve">1</w:t>
-                  </w:r>
-                </w:p>
-              </w:tc>
-            </w:tr>
-            <w:tr>
-              <w:tc>
-                <w:tcPr/>
-                <w:p>
-                  <w:pPr>
-                    <w:pStyle w:val="Compact"/>
-                    <w:jc w:val="left"/>
-                    <w:jc w:val="center"/>
-                  </w:pPr>
-                  <w:r>
-                    <w:t xml:space="preserve">EDSM</w:t>
-                  </w:r>
-                </w:p>
-              </w:tc>
-              <w:tc>
-                <w:tcPr/>
-                <w:p>
-                  <w:pPr>
-                    <w:pStyle w:val="Compact"/>
-                    <w:jc w:val="left"/>
-                    <w:jc w:val="center"/>
-                  </w:pPr>
-                  <w:r>
-                    <w:t xml:space="preserve">2026-01-08</w:t>
-                  </w:r>
-                </w:p>
-              </w:tc>
-              <w:tc>
-                <w:tcPr/>
-                <w:p>
-                  <w:pPr>
-                    <w:pStyle w:val="Compact"/>
-                    <w:jc w:val="left"/>
-                    <w:jc w:val="center"/>
-                  </w:pPr>
-                  <w:r>
-                    <w:t xml:space="preserve">West</w:t>
-                  </w:r>
-                </w:p>
-              </w:tc>
-              <w:tc>
-                <w:tcPr/>
-                <w:p>
-                  <w:pPr>
-                    <w:pStyle w:val="Compact"/>
-                    <w:jc w:val="left"/>
-                    <w:jc w:val="center"/>
-                  </w:pPr>
-                  <w:r>
-                    <w:t xml:space="preserve">Suisun Marsh</w:t>
-                  </w:r>
-                </w:p>
-              </w:tc>
-              <w:tc>
-                <w:tcPr/>
-                <w:p>
-                  <w:pPr>
-                    <w:pStyle w:val="Compact"/>
-                    <w:jc w:val="left"/>
-                    <w:jc w:val="center"/>
-                  </w:pPr>
-                  <w:r>
-                    <w:t xml:space="preserve">Adult</w:t>
-                  </w:r>
-                </w:p>
-              </w:tc>
-              <w:tc>
-                <w:tcPr/>
-                <w:p>
-                  <w:pPr>
-                    <w:pStyle w:val="Compact"/>
-                    <w:jc w:val="right"/>
-                    <w:jc w:val="center"/>
-                  </w:pPr>
-                  <w:r>
-                    <w:t xml:space="preserve">3</w:t>
-                  </w:r>
-                </w:p>
-              </w:tc>
-            </w:tr>
-            <w:tr>
-              <w:tc>
-                <w:tcPr/>
-                <w:p>
-                  <w:pPr>
-                    <w:pStyle w:val="Compact"/>
-                    <w:jc w:val="left"/>
-                    <w:jc w:val="center"/>
-                  </w:pPr>
-                  <w:r>
-                    <w:t xml:space="preserve">EDSM</w:t>
-                  </w:r>
-                </w:p>
-              </w:tc>
-              <w:tc>
-                <w:tcPr/>
-                <w:p>
-                  <w:pPr>
-                    <w:pStyle w:val="Compact"/>
-                    <w:jc w:val="left"/>
-                    <w:jc w:val="center"/>
-                  </w:pPr>
-                  <w:r>
-                    <w:t xml:space="preserve">2026-01-08</w:t>
-                  </w:r>
-                </w:p>
-              </w:tc>
-              <w:tc>
-                <w:tcPr/>
-                <w:p>
-                  <w:pPr>
-                    <w:pStyle w:val="Compact"/>
-                    <w:jc w:val="left"/>
-                    <w:jc w:val="center"/>
-                  </w:pPr>
-                  <w:r>
-                    <w:t xml:space="preserve">West</w:t>
-                  </w:r>
-                </w:p>
-              </w:tc>
-              <w:tc>
-                <w:tcPr/>
-                <w:p>
-                  <w:pPr>
-                    <w:pStyle w:val="Compact"/>
-                    <w:jc w:val="left"/>
-                    <w:jc w:val="center"/>
-                  </w:pPr>
-                  <w:r>
-                    <w:t xml:space="preserve">Suisun Marsh</w:t>
-                  </w:r>
-                </w:p>
-              </w:tc>
-              <w:tc>
-                <w:tcPr/>
-                <w:p>
-                  <w:pPr>
-                    <w:pStyle w:val="Compact"/>
-                    <w:jc w:val="left"/>
-                    <w:jc w:val="center"/>
-                  </w:pPr>
-                  <w:r>
-                    <w:t xml:space="preserve">Juvenile</w:t>
                   </w:r>
                 </w:p>
               </w:tc>
@@ -1302,7 +902,7 @@
                     <w:jc w:val="center"/>
                   </w:pPr>
                   <w:r>
-                    <w:t xml:space="preserve">1</w:t>
+                    <w:t xml:space="preserve">2</w:t>
                   </w:r>
                 </w:p>
               </w:tc>
@@ -1599,7 +1199,7 @@
         <w:t xml:space="preserve">JPF</w:t>
       </w:r>
       <w:r>
-        <w:t xml:space="preserve">: 9,041 cfs as of Jan 12, 2026</w:t>
+        <w:t xml:space="preserve">: 2,148 cfs as of Jan 25, 2026</w:t>
       </w:r>
     </w:p>
     <w:p>
@@ -1618,7 +1218,7 @@
         <w:t xml:space="preserve">OBI Turbidity</w:t>
       </w:r>
       <w:r>
-        <w:t xml:space="preserve">: 6.76, 6.66, 6.46 FNU as of Jan 12, 2026</w:t>
+        <w:t xml:space="preserve">: 6.49, 6.35, 5.97 FNU as of Jan 25, 2026</w:t>
       </w:r>
     </w:p>
     <w:p>
@@ -1637,7 +1237,7 @@
         <w:t xml:space="preserve">HOL Turbidity</w:t>
       </w:r>
       <w:r>
-        <w:t xml:space="preserve">: 8.52, 7.39, 7.01 FNU as of Jan 12, 2026</w:t>
+        <w:t xml:space="preserve">: 6.13, 6.19, 6.02 FNU as of Jan 25, 2026</w:t>
       </w:r>
     </w:p>
     <w:p>
@@ -1656,7 +1256,7 @@
         <w:t xml:space="preserve">OSJ Turbidity</w:t>
       </w:r>
       <w:r>
-        <w:t xml:space="preserve">: 15.31, 18.22, 18.8 FNU as of Jan 12, 2026</w:t>
+        <w:t xml:space="preserve">: 10.3, 9.74, 8.43 FNU as of Jan 25, 2026</w:t>
       </w:r>
     </w:p>
     <w:p>
@@ -1716,7 +1316,7 @@
         <w:t xml:space="preserve">RVB temperature (3-day average)</w:t>
       </w:r>
       <w:r>
-        <w:t xml:space="preserve">: 9.98</w:t>
+        <w:t xml:space="preserve">: 10.44</w:t>
       </w:r>
       <m:oMath>
         <m:sSup>
@@ -1736,7 +1336,7 @@
         </m:sSup>
       </m:oMath>
       <w:r>
-        <w:t xml:space="preserve">C as of Jan 12, 2026</w:t>
+        <w:t xml:space="preserve">C as of Jan 25, 2026</w:t>
       </w:r>
     </w:p>
     <w:p>
@@ -1746,7 +1346,7 @@
       <w:r>
         <w:drawing>
           <wp:inline>
-            <wp:extent cx="4533900" cy="3238500"/>
+            <wp:extent cx="4533900" cy="3022600"/>
             <wp:effectExtent b="0" l="0" r="0" t="0"/>
             <wp:docPr descr="" title="" id="38" name="Picture"/>
             <a:graphic>
@@ -1767,7 +1367,7 @@
                   <pic:spPr bwMode="auto">
                     <a:xfrm>
                       <a:off x="0" y="0"/>
-                      <a:ext cx="4533900" cy="3238500"/>
+                      <a:ext cx="4533900" cy="3022600"/>
                     </a:xfrm>
                     <a:prstGeom prst="rect">
                       <a:avLst/>
@@ -1893,7 +1493,7 @@
         <w:t xml:space="preserve">12-station South Delta Turbidity</w:t>
       </w:r>
       <w:r>
-        <w:t xml:space="preserve">: The most recent average turbidity was 19.1 FNU as of Dec 30, 2025</w:t>
+        <w:t xml:space="preserve">: The most recent average turbidity was 12.5 FNU as of Jan 13, 2025</w:t>
       </w:r>
     </w:p>
     <w:bookmarkEnd w:id="42"/>
@@ -2116,7 +1716,7 @@
         <w:t xml:space="preserve"> </w:t>
       </w:r>
       <w:r>
-        <w:t xml:space="preserve">Because first flush conditions were met on December 23, spawning-related behaviors may begin occurring during the</w:t>
+        <w:t xml:space="preserve">Because first flush conditions were met on December 23, 2025, spawning may begin occurring during the</w:t>
       </w:r>
       <w:r>
         <w:t xml:space="preserve"> </w:t>
@@ -2128,7 +1728,13 @@
         <w:t xml:space="preserve"> </w:t>
       </w:r>
       <w:r>
-        <w:t xml:space="preserve">flow and turbidity.</w:t>
+        <w:t xml:space="preserve">flow and turbidity.Recent captures at Chipps Island and the Sacramento Deep Water Ship Channel are consistent</w:t>
+      </w:r>
+      <w:r>
+        <w:t xml:space="preserve"> </w:t>
+      </w:r>
+      <w:r>
+        <w:t xml:space="preserve">with an upstream spawning migration into tidal freshwater habitats.</w:t>
       </w:r>
     </w:p>
     <w:p>
@@ -2214,7 +1820,7 @@
         <w:t xml:space="preserve"> </w:t>
       </w:r>
       <w:r>
-        <w:t xml:space="preserve">Juvenile, Adult, Larva</w:t>
+        <w:t xml:space="preserve">Juvenile, Adult, NA</w:t>
       </w:r>
     </w:p>
     <w:p>
@@ -2235,7 +1841,7 @@
         <w:t xml:space="preserve"> </w:t>
       </w:r>
       <w:r>
-        <w:t xml:space="preserve">296 adult, 445 juvenile, and 122 larval longfin smelt have been detected this water year. See</w:t>
+        <w:t xml:space="preserve">301 adult, 478 juvenile, and 122 larval longfin smelt have been detected this water year. See</w:t>
       </w:r>
       <w:r>
         <w:t xml:space="preserve"> </w:t>
@@ -2447,59 +2053,59 @@
                     <w:jc w:val="center"/>
                   </w:pPr>
                   <w:r>
-                    <w:t xml:space="preserve">DJFMP</w:t>
-                  </w:r>
-                </w:p>
-              </w:tc>
-              <w:tc>
-                <w:tcPr/>
-                <w:p>
-                  <w:pPr>
-                    <w:pStyle w:val="Compact"/>
-                    <w:jc w:val="left"/>
-                    <w:jc w:val="center"/>
-                  </w:pPr>
-                  <w:r>
-                    <w:t xml:space="preserve">2025-12-31</w:t>
-                  </w:r>
-                </w:p>
-              </w:tc>
-              <w:tc>
-                <w:tcPr/>
-                <w:p>
-                  <w:pPr>
-                    <w:pStyle w:val="Compact"/>
-                    <w:jc w:val="left"/>
-                    <w:jc w:val="center"/>
-                  </w:pPr>
-                  <w:r>
-                    <w:t xml:space="preserve">N/A</w:t>
-                  </w:r>
-                </w:p>
-              </w:tc>
-              <w:tc>
-                <w:tcPr/>
-                <w:p>
-                  <w:pPr>
-                    <w:pStyle w:val="Compact"/>
-                    <w:jc w:val="left"/>
-                    <w:jc w:val="center"/>
-                  </w:pPr>
-                  <w:r>
-                    <w:t xml:space="preserve">Chipps Island</w:t>
-                  </w:r>
-                </w:p>
-              </w:tc>
-              <w:tc>
-                <w:tcPr/>
-                <w:p>
-                  <w:pPr>
-                    <w:pStyle w:val="Compact"/>
-                    <w:jc w:val="left"/>
-                    <w:jc w:val="center"/>
-                  </w:pPr>
-                  <w:r>
-                    <w:t xml:space="preserve">Adult</w:t>
+                    <w:t xml:space="preserve">EDSM</w:t>
+                  </w:r>
+                </w:p>
+              </w:tc>
+              <w:tc>
+                <w:tcPr/>
+                <w:p>
+                  <w:pPr>
+                    <w:pStyle w:val="Compact"/>
+                    <w:jc w:val="left"/>
+                    <w:jc w:val="center"/>
+                  </w:pPr>
+                  <w:r>
+                    <w:t xml:space="preserve">2026-01-13</w:t>
+                  </w:r>
+                </w:p>
+              </w:tc>
+              <w:tc>
+                <w:tcPr/>
+                <w:p>
+                  <w:pPr>
+                    <w:pStyle w:val="Compact"/>
+                    <w:jc w:val="left"/>
+                    <w:jc w:val="center"/>
+                  </w:pPr>
+                  <w:r>
+                    <w:t xml:space="preserve">Far West</w:t>
+                  </w:r>
+                </w:p>
+              </w:tc>
+              <w:tc>
+                <w:tcPr/>
+                <w:p>
+                  <w:pPr>
+                    <w:pStyle w:val="Compact"/>
+                    <w:jc w:val="left"/>
+                    <w:jc w:val="center"/>
+                  </w:pPr>
+                  <w:r>
+                    <w:t xml:space="preserve">Western Delta</w:t>
+                  </w:r>
+                </w:p>
+              </w:tc>
+              <w:tc>
+                <w:tcPr/>
+                <w:p>
+                  <w:pPr>
+                    <w:pStyle w:val="Compact"/>
+                    <w:jc w:val="left"/>
+                    <w:jc w:val="center"/>
+                  </w:pPr>
+                  <w:r>
+                    <w:t xml:space="preserve">Juvenile</w:t>
                   </w:r>
                 </w:p>
               </w:tc>
@@ -2512,7 +2118,7 @@
                     <w:jc w:val="center"/>
                   </w:pPr>
                   <w:r>
-                    <w:t xml:space="preserve">44</w:t>
+                    <w:t xml:space="preserve">2</w:t>
                   </w:r>
                 </w:p>
               </w:tc>
@@ -2527,59 +2133,59 @@
                     <w:jc w:val="center"/>
                   </w:pPr>
                   <w:r>
-                    <w:t xml:space="preserve">DJFMP</w:t>
-                  </w:r>
-                </w:p>
-              </w:tc>
-              <w:tc>
-                <w:tcPr/>
-                <w:p>
-                  <w:pPr>
-                    <w:pStyle w:val="Compact"/>
-                    <w:jc w:val="left"/>
-                    <w:jc w:val="center"/>
-                  </w:pPr>
-                  <w:r>
-                    <w:t xml:space="preserve">2025-12-31</w:t>
-                  </w:r>
-                </w:p>
-              </w:tc>
-              <w:tc>
-                <w:tcPr/>
-                <w:p>
-                  <w:pPr>
-                    <w:pStyle w:val="Compact"/>
-                    <w:jc w:val="left"/>
-                    <w:jc w:val="center"/>
-                  </w:pPr>
-                  <w:r>
-                    <w:t xml:space="preserve">N/A</w:t>
-                  </w:r>
-                </w:p>
-              </w:tc>
-              <w:tc>
-                <w:tcPr/>
-                <w:p>
-                  <w:pPr>
-                    <w:pStyle w:val="Compact"/>
-                    <w:jc w:val="left"/>
-                    <w:jc w:val="center"/>
-                  </w:pPr>
-                  <w:r>
-                    <w:t xml:space="preserve">Chipps Island</w:t>
-                  </w:r>
-                </w:p>
-              </w:tc>
-              <w:tc>
-                <w:tcPr/>
-                <w:p>
-                  <w:pPr>
-                    <w:pStyle w:val="Compact"/>
-                    <w:jc w:val="left"/>
-                    <w:jc w:val="center"/>
-                  </w:pPr>
-                  <w:r>
-                    <w:t xml:space="preserve">Juvenile</w:t>
+                    <w:t xml:space="preserve">EDSM</w:t>
+                  </w:r>
+                </w:p>
+              </w:tc>
+              <w:tc>
+                <w:tcPr/>
+                <w:p>
+                  <w:pPr>
+                    <w:pStyle w:val="Compact"/>
+                    <w:jc w:val="left"/>
+                    <w:jc w:val="center"/>
+                  </w:pPr>
+                  <w:r>
+                    <w:t xml:space="preserve">2026-01-20</w:t>
+                  </w:r>
+                </w:p>
+              </w:tc>
+              <w:tc>
+                <w:tcPr/>
+                <w:p>
+                  <w:pPr>
+                    <w:pStyle w:val="Compact"/>
+                    <w:jc w:val="left"/>
+                    <w:jc w:val="center"/>
+                  </w:pPr>
+                  <w:r>
+                    <w:t xml:space="preserve">Far West</w:t>
+                  </w:r>
+                </w:p>
+              </w:tc>
+              <w:tc>
+                <w:tcPr/>
+                <w:p>
+                  <w:pPr>
+                    <w:pStyle w:val="Compact"/>
+                    <w:jc w:val="left"/>
+                    <w:jc w:val="center"/>
+                  </w:pPr>
+                  <w:r>
+                    <w:t xml:space="preserve">Suisun Bay</w:t>
+                  </w:r>
+                </w:p>
+              </w:tc>
+              <w:tc>
+                <w:tcPr/>
+                <w:p>
+                  <w:pPr>
+                    <w:pStyle w:val="Compact"/>
+                    <w:jc w:val="left"/>
+                    <w:jc w:val="center"/>
+                  </w:pPr>
+                  <w:r>
+                    <w:t xml:space="preserve">Adult</w:t>
                   </w:r>
                 </w:p>
               </w:tc>
@@ -2592,7 +2198,7 @@
                     <w:jc w:val="center"/>
                   </w:pPr>
                   <w:r>
-                    <w:t xml:space="preserve">2</w:t>
+                    <w:t xml:space="preserve">4</w:t>
                   </w:r>
                 </w:p>
               </w:tc>
@@ -2607,46 +2213,46 @@
                     <w:jc w:val="center"/>
                   </w:pPr>
                   <w:r>
-                    <w:t xml:space="preserve">DJFMP</w:t>
-                  </w:r>
-                </w:p>
-              </w:tc>
-              <w:tc>
-                <w:tcPr/>
-                <w:p>
-                  <w:pPr>
-                    <w:pStyle w:val="Compact"/>
-                    <w:jc w:val="left"/>
-                    <w:jc w:val="center"/>
-                  </w:pPr>
-                  <w:r>
-                    <w:t xml:space="preserve">2026-01-05</w:t>
-                  </w:r>
-                </w:p>
-              </w:tc>
-              <w:tc>
-                <w:tcPr/>
-                <w:p>
-                  <w:pPr>
-                    <w:pStyle w:val="Compact"/>
-                    <w:jc w:val="left"/>
-                    <w:jc w:val="center"/>
-                  </w:pPr>
-                  <w:r>
-                    <w:t xml:space="preserve">Bay</w:t>
-                  </w:r>
-                </w:p>
-              </w:tc>
-              <w:tc>
-                <w:tcPr/>
-                <w:p>
-                  <w:pPr>
-                    <w:pStyle w:val="Compact"/>
-                    <w:jc w:val="left"/>
-                    <w:jc w:val="center"/>
-                  </w:pPr>
-                  <w:r>
-                    <w:t xml:space="preserve">Bay</w:t>
+                    <w:t xml:space="preserve">EDSM</w:t>
+                  </w:r>
+                </w:p>
+              </w:tc>
+              <w:tc>
+                <w:tcPr/>
+                <w:p>
+                  <w:pPr>
+                    <w:pStyle w:val="Compact"/>
+                    <w:jc w:val="left"/>
+                    <w:jc w:val="center"/>
+                  </w:pPr>
+                  <w:r>
+                    <w:t xml:space="preserve">2026-01-20</w:t>
+                  </w:r>
+                </w:p>
+              </w:tc>
+              <w:tc>
+                <w:tcPr/>
+                <w:p>
+                  <w:pPr>
+                    <w:pStyle w:val="Compact"/>
+                    <w:jc w:val="left"/>
+                    <w:jc w:val="center"/>
+                  </w:pPr>
+                  <w:r>
+                    <w:t xml:space="preserve">Far West</w:t>
+                  </w:r>
+                </w:p>
+              </w:tc>
+              <w:tc>
+                <w:tcPr/>
+                <w:p>
+                  <w:pPr>
+                    <w:pStyle w:val="Compact"/>
+                    <w:jc w:val="left"/>
+                    <w:jc w:val="center"/>
+                  </w:pPr>
+                  <w:r>
+                    <w:t xml:space="preserve">Suisun Bay</w:t>
                   </w:r>
                 </w:p>
               </w:tc>
@@ -2672,7 +2278,7 @@
                     <w:jc w:val="center"/>
                   </w:pPr>
                   <w:r>
-                    <w:t xml:space="preserve">1</w:t>
+                    <w:t xml:space="preserve">29</w:t>
                   </w:r>
                 </w:p>
               </w:tc>
@@ -2687,59 +2293,59 @@
                     <w:jc w:val="center"/>
                   </w:pPr>
                   <w:r>
-                    <w:t xml:space="preserve">DJFMP</w:t>
-                  </w:r>
-                </w:p>
-              </w:tc>
-              <w:tc>
-                <w:tcPr/>
-                <w:p>
-                  <w:pPr>
-                    <w:pStyle w:val="Compact"/>
-                    <w:jc w:val="left"/>
-                    <w:jc w:val="center"/>
-                  </w:pPr>
-                  <w:r>
-                    <w:t xml:space="preserve">2026-01-05</w:t>
-                  </w:r>
-                </w:p>
-              </w:tc>
-              <w:tc>
-                <w:tcPr/>
-                <w:p>
-                  <w:pPr>
-                    <w:pStyle w:val="Compact"/>
-                    <w:jc w:val="left"/>
-                    <w:jc w:val="center"/>
-                  </w:pPr>
-                  <w:r>
-                    <w:t xml:space="preserve">N/A</w:t>
-                  </w:r>
-                </w:p>
-              </w:tc>
-              <w:tc>
-                <w:tcPr/>
-                <w:p>
-                  <w:pPr>
-                    <w:pStyle w:val="Compact"/>
-                    <w:jc w:val="left"/>
-                    <w:jc w:val="center"/>
-                  </w:pPr>
-                  <w:r>
-                    <w:t xml:space="preserve">Chipps Island</w:t>
-                  </w:r>
-                </w:p>
-              </w:tc>
-              <w:tc>
-                <w:tcPr/>
-                <w:p>
-                  <w:pPr>
-                    <w:pStyle w:val="Compact"/>
-                    <w:jc w:val="left"/>
-                    <w:jc w:val="center"/>
-                  </w:pPr>
-                  <w:r>
-                    <w:t xml:space="preserve">Adult</w:t>
+                    <w:t xml:space="preserve">EDSM</w:t>
+                  </w:r>
+                </w:p>
+              </w:tc>
+              <w:tc>
+                <w:tcPr/>
+                <w:p>
+                  <w:pPr>
+                    <w:pStyle w:val="Compact"/>
+                    <w:jc w:val="left"/>
+                    <w:jc w:val="center"/>
+                  </w:pPr>
+                  <w:r>
+                    <w:t xml:space="preserve">2026-01-20</w:t>
+                  </w:r>
+                </w:p>
+              </w:tc>
+              <w:tc>
+                <w:tcPr/>
+                <w:p>
+                  <w:pPr>
+                    <w:pStyle w:val="Compact"/>
+                    <w:jc w:val="left"/>
+                    <w:jc w:val="center"/>
+                  </w:pPr>
+                  <w:r>
+                    <w:t xml:space="preserve">Far West</w:t>
+                  </w:r>
+                </w:p>
+              </w:tc>
+              <w:tc>
+                <w:tcPr/>
+                <w:p>
+                  <w:pPr>
+                    <w:pStyle w:val="Compact"/>
+                    <w:jc w:val="left"/>
+                    <w:jc w:val="center"/>
+                  </w:pPr>
+                  <w:r>
+                    <w:t xml:space="preserve">Suisun Bay</w:t>
+                  </w:r>
+                </w:p>
+              </w:tc>
+              <w:tc>
+                <w:tcPr/>
+                <w:p>
+                  <w:pPr>
+                    <w:pStyle w:val="Compact"/>
+                    <w:jc w:val="left"/>
+                    <w:jc w:val="center"/>
+                  </w:pPr>
+                  <w:r>
+                    <w:t xml:space="preserve">NA</w:t>
                   </w:r>
                 </w:p>
               </w:tc>
@@ -2767,46 +2373,46 @@
                     <w:jc w:val="center"/>
                   </w:pPr>
                   <w:r>
-                    <w:t xml:space="preserve">DJFMP</w:t>
-                  </w:r>
-                </w:p>
-              </w:tc>
-              <w:tc>
-                <w:tcPr/>
-                <w:p>
-                  <w:pPr>
-                    <w:pStyle w:val="Compact"/>
-                    <w:jc w:val="left"/>
-                    <w:jc w:val="center"/>
-                  </w:pPr>
-                  <w:r>
-                    <w:t xml:space="preserve">2026-01-06</w:t>
-                  </w:r>
-                </w:p>
-              </w:tc>
-              <w:tc>
-                <w:tcPr/>
-                <w:p>
-                  <w:pPr>
-                    <w:pStyle w:val="Compact"/>
-                    <w:jc w:val="left"/>
-                    <w:jc w:val="center"/>
-                  </w:pPr>
-                  <w:r>
-                    <w:t xml:space="preserve">N/A</w:t>
-                  </w:r>
-                </w:p>
-              </w:tc>
-              <w:tc>
-                <w:tcPr/>
-                <w:p>
-                  <w:pPr>
-                    <w:pStyle w:val="Compact"/>
-                    <w:jc w:val="left"/>
-                    <w:jc w:val="center"/>
-                  </w:pPr>
-                  <w:r>
-                    <w:t xml:space="preserve">Chipps Island</w:t>
+                    <w:t xml:space="preserve">EDSM</w:t>
+                  </w:r>
+                </w:p>
+              </w:tc>
+              <w:tc>
+                <w:tcPr/>
+                <w:p>
+                  <w:pPr>
+                    <w:pStyle w:val="Compact"/>
+                    <w:jc w:val="left"/>
+                    <w:jc w:val="center"/>
+                  </w:pPr>
+                  <w:r>
+                    <w:t xml:space="preserve">2026-01-20</w:t>
+                  </w:r>
+                </w:p>
+              </w:tc>
+              <w:tc>
+                <w:tcPr/>
+                <w:p>
+                  <w:pPr>
+                    <w:pStyle w:val="Compact"/>
+                    <w:jc w:val="left"/>
+                    <w:jc w:val="center"/>
+                  </w:pPr>
+                  <w:r>
+                    <w:t xml:space="preserve">West</w:t>
+                  </w:r>
+                </w:p>
+              </w:tc>
+              <w:tc>
+                <w:tcPr/>
+                <w:p>
+                  <w:pPr>
+                    <w:pStyle w:val="Compact"/>
+                    <w:jc w:val="left"/>
+                    <w:jc w:val="center"/>
+                  </w:pPr>
+                  <w:r>
+                    <w:t xml:space="preserve">Lower Sacramento</w:t>
                   </w:r>
                 </w:p>
               </w:tc>
@@ -2847,59 +2453,59 @@
                     <w:jc w:val="center"/>
                   </w:pPr>
                   <w:r>
-                    <w:t xml:space="preserve">DJFMP</w:t>
-                  </w:r>
-                </w:p>
-              </w:tc>
-              <w:tc>
-                <w:tcPr/>
-                <w:p>
-                  <w:pPr>
-                    <w:pStyle w:val="Compact"/>
-                    <w:jc w:val="left"/>
-                    <w:jc w:val="center"/>
-                  </w:pPr>
-                  <w:r>
-                    <w:t xml:space="preserve">2026-01-08</w:t>
-                  </w:r>
-                </w:p>
-              </w:tc>
-              <w:tc>
-                <w:tcPr/>
-                <w:p>
-                  <w:pPr>
-                    <w:pStyle w:val="Compact"/>
-                    <w:jc w:val="left"/>
-                    <w:jc w:val="center"/>
-                  </w:pPr>
-                  <w:r>
-                    <w:t xml:space="preserve">N/A</w:t>
-                  </w:r>
-                </w:p>
-              </w:tc>
-              <w:tc>
-                <w:tcPr/>
-                <w:p>
-                  <w:pPr>
-                    <w:pStyle w:val="Compact"/>
-                    <w:jc w:val="left"/>
-                    <w:jc w:val="center"/>
-                  </w:pPr>
-                  <w:r>
-                    <w:t xml:space="preserve">Chipps Island</w:t>
-                  </w:r>
-                </w:p>
-              </w:tc>
-              <w:tc>
-                <w:tcPr/>
-                <w:p>
-                  <w:pPr>
-                    <w:pStyle w:val="Compact"/>
-                    <w:jc w:val="left"/>
-                    <w:jc w:val="center"/>
-                  </w:pPr>
-                  <w:r>
-                    <w:t xml:space="preserve">Adult</w:t>
+                    <w:t xml:space="preserve">EDSM</w:t>
+                  </w:r>
+                </w:p>
+              </w:tc>
+              <w:tc>
+                <w:tcPr/>
+                <w:p>
+                  <w:pPr>
+                    <w:pStyle w:val="Compact"/>
+                    <w:jc w:val="left"/>
+                    <w:jc w:val="center"/>
+                  </w:pPr>
+                  <w:r>
+                    <w:t xml:space="preserve">2026-01-22</w:t>
+                  </w:r>
+                </w:p>
+              </w:tc>
+              <w:tc>
+                <w:tcPr/>
+                <w:p>
+                  <w:pPr>
+                    <w:pStyle w:val="Compact"/>
+                    <w:jc w:val="left"/>
+                    <w:jc w:val="center"/>
+                  </w:pPr>
+                  <w:r>
+                    <w:t xml:space="preserve">Far West</w:t>
+                  </w:r>
+                </w:p>
+              </w:tc>
+              <w:tc>
+                <w:tcPr/>
+                <w:p>
+                  <w:pPr>
+                    <w:pStyle w:val="Compact"/>
+                    <w:jc w:val="left"/>
+                    <w:jc w:val="center"/>
+                  </w:pPr>
+                  <w:r>
+                    <w:t xml:space="preserve">Western Delta</w:t>
+                  </w:r>
+                </w:p>
+              </w:tc>
+              <w:tc>
+                <w:tcPr/>
+                <w:p>
+                  <w:pPr>
+                    <w:pStyle w:val="Compact"/>
+                    <w:jc w:val="left"/>
+                    <w:jc w:val="center"/>
+                  </w:pPr>
+                  <w:r>
+                    <w:t xml:space="preserve">Juvenile</w:t>
                   </w:r>
                 </w:p>
               </w:tc>
@@ -2912,887 +2518,7 @@
                     <w:jc w:val="center"/>
                   </w:pPr>
                   <w:r>
-                    <w:t xml:space="preserve">3</w:t>
-                  </w:r>
-                </w:p>
-              </w:tc>
-            </w:tr>
-            <w:tr>
-              <w:tc>
-                <w:tcPr/>
-                <w:p>
-                  <w:pPr>
-                    <w:pStyle w:val="Compact"/>
-                    <w:jc w:val="left"/>
-                    <w:jc w:val="center"/>
-                  </w:pPr>
-                  <w:r>
-                    <w:t xml:space="preserve">EDSM</w:t>
-                  </w:r>
-                </w:p>
-              </w:tc>
-              <w:tc>
-                <w:tcPr/>
-                <w:p>
-                  <w:pPr>
-                    <w:pStyle w:val="Compact"/>
-                    <w:jc w:val="left"/>
-                    <w:jc w:val="center"/>
-                  </w:pPr>
-                  <w:r>
-                    <w:t xml:space="preserve">2025-12-31</w:t>
-                  </w:r>
-                </w:p>
-              </w:tc>
-              <w:tc>
-                <w:tcPr/>
-                <w:p>
-                  <w:pPr>
-                    <w:pStyle w:val="Compact"/>
-                    <w:jc w:val="left"/>
-                    <w:jc w:val="center"/>
-                  </w:pPr>
-                  <w:r>
-                    <w:t xml:space="preserve">Far West</w:t>
-                  </w:r>
-                </w:p>
-              </w:tc>
-              <w:tc>
-                <w:tcPr/>
-                <w:p>
-                  <w:pPr>
-                    <w:pStyle w:val="Compact"/>
-                    <w:jc w:val="left"/>
-                    <w:jc w:val="center"/>
-                  </w:pPr>
-                  <w:r>
-                    <w:t xml:space="preserve">Suisun Bay</w:t>
-                  </w:r>
-                </w:p>
-              </w:tc>
-              <w:tc>
-                <w:tcPr/>
-                <w:p>
-                  <w:pPr>
-                    <w:pStyle w:val="Compact"/>
-                    <w:jc w:val="left"/>
-                    <w:jc w:val="center"/>
-                  </w:pPr>
-                  <w:r>
-                    <w:t xml:space="preserve">Adult</w:t>
-                  </w:r>
-                </w:p>
-              </w:tc>
-              <w:tc>
-                <w:tcPr/>
-                <w:p>
-                  <w:pPr>
-                    <w:pStyle w:val="Compact"/>
-                    <w:jc w:val="right"/>
-                    <w:jc w:val="center"/>
-                  </w:pPr>
-                  <w:r>
-                    <w:t xml:space="preserve">2</w:t>
-                  </w:r>
-                </w:p>
-              </w:tc>
-            </w:tr>
-            <w:tr>
-              <w:tc>
-                <w:tcPr/>
-                <w:p>
-                  <w:pPr>
-                    <w:pStyle w:val="Compact"/>
-                    <w:jc w:val="left"/>
-                    <w:jc w:val="center"/>
-                  </w:pPr>
-                  <w:r>
-                    <w:t xml:space="preserve">EDSM</w:t>
-                  </w:r>
-                </w:p>
-              </w:tc>
-              <w:tc>
-                <w:tcPr/>
-                <w:p>
-                  <w:pPr>
-                    <w:pStyle w:val="Compact"/>
-                    <w:jc w:val="left"/>
-                    <w:jc w:val="center"/>
-                  </w:pPr>
-                  <w:r>
-                    <w:t xml:space="preserve">2025-12-31</w:t>
-                  </w:r>
-                </w:p>
-              </w:tc>
-              <w:tc>
-                <w:tcPr/>
-                <w:p>
-                  <w:pPr>
-                    <w:pStyle w:val="Compact"/>
-                    <w:jc w:val="left"/>
-                    <w:jc w:val="center"/>
-                  </w:pPr>
-                  <w:r>
-                    <w:t xml:space="preserve">Far West</w:t>
-                  </w:r>
-                </w:p>
-              </w:tc>
-              <w:tc>
-                <w:tcPr/>
-                <w:p>
-                  <w:pPr>
-                    <w:pStyle w:val="Compact"/>
-                    <w:jc w:val="left"/>
-                    <w:jc w:val="center"/>
-                  </w:pPr>
-                  <w:r>
-                    <w:t xml:space="preserve">Suisun Bay</w:t>
-                  </w:r>
-                </w:p>
-              </w:tc>
-              <w:tc>
-                <w:tcPr/>
-                <w:p>
-                  <w:pPr>
-                    <w:pStyle w:val="Compact"/>
-                    <w:jc w:val="left"/>
-                    <w:jc w:val="center"/>
-                  </w:pPr>
-                  <w:r>
-                    <w:t xml:space="preserve">Juvenile</w:t>
-                  </w:r>
-                </w:p>
-              </w:tc>
-              <w:tc>
-                <w:tcPr/>
-                <w:p>
-                  <w:pPr>
-                    <w:pStyle w:val="Compact"/>
-                    <w:jc w:val="right"/>
-                    <w:jc w:val="center"/>
-                  </w:pPr>
-                  <w:r>
                     <w:t xml:space="preserve">1</w:t>
-                  </w:r>
-                </w:p>
-              </w:tc>
-            </w:tr>
-            <w:tr>
-              <w:tc>
-                <w:tcPr/>
-                <w:p>
-                  <w:pPr>
-                    <w:pStyle w:val="Compact"/>
-                    <w:jc w:val="left"/>
-                    <w:jc w:val="center"/>
-                  </w:pPr>
-                  <w:r>
-                    <w:t xml:space="preserve">EDSM</w:t>
-                  </w:r>
-                </w:p>
-              </w:tc>
-              <w:tc>
-                <w:tcPr/>
-                <w:p>
-                  <w:pPr>
-                    <w:pStyle w:val="Compact"/>
-                    <w:jc w:val="left"/>
-                    <w:jc w:val="center"/>
-                  </w:pPr>
-                  <w:r>
-                    <w:t xml:space="preserve">2026-01-05</w:t>
-                  </w:r>
-                </w:p>
-              </w:tc>
-              <w:tc>
-                <w:tcPr/>
-                <w:p>
-                  <w:pPr>
-                    <w:pStyle w:val="Compact"/>
-                    <w:jc w:val="left"/>
-                    <w:jc w:val="center"/>
-                  </w:pPr>
-                  <w:r>
-                    <w:t xml:space="preserve">Far West</w:t>
-                  </w:r>
-                </w:p>
-              </w:tc>
-              <w:tc>
-                <w:tcPr/>
-                <w:p>
-                  <w:pPr>
-                    <w:pStyle w:val="Compact"/>
-                    <w:jc w:val="left"/>
-                    <w:jc w:val="center"/>
-                  </w:pPr>
-                  <w:r>
-                    <w:t xml:space="preserve">Suisun Bay</w:t>
-                  </w:r>
-                </w:p>
-              </w:tc>
-              <w:tc>
-                <w:tcPr/>
-                <w:p>
-                  <w:pPr>
-                    <w:pStyle w:val="Compact"/>
-                    <w:jc w:val="left"/>
-                    <w:jc w:val="center"/>
-                  </w:pPr>
-                  <w:r>
-                    <w:t xml:space="preserve">Adult</w:t>
-                  </w:r>
-                </w:p>
-              </w:tc>
-              <w:tc>
-                <w:tcPr/>
-                <w:p>
-                  <w:pPr>
-                    <w:pStyle w:val="Compact"/>
-                    <w:jc w:val="right"/>
-                    <w:jc w:val="center"/>
-                  </w:pPr>
-                  <w:r>
-                    <w:t xml:space="preserve">2</w:t>
-                  </w:r>
-                </w:p>
-              </w:tc>
-            </w:tr>
-            <w:tr>
-              <w:tc>
-                <w:tcPr/>
-                <w:p>
-                  <w:pPr>
-                    <w:pStyle w:val="Compact"/>
-                    <w:jc w:val="left"/>
-                    <w:jc w:val="center"/>
-                  </w:pPr>
-                  <w:r>
-                    <w:t xml:space="preserve">EDSM</w:t>
-                  </w:r>
-                </w:p>
-              </w:tc>
-              <w:tc>
-                <w:tcPr/>
-                <w:p>
-                  <w:pPr>
-                    <w:pStyle w:val="Compact"/>
-                    <w:jc w:val="left"/>
-                    <w:jc w:val="center"/>
-                  </w:pPr>
-                  <w:r>
-                    <w:t xml:space="preserve">2026-01-05</w:t>
-                  </w:r>
-                </w:p>
-              </w:tc>
-              <w:tc>
-                <w:tcPr/>
-                <w:p>
-                  <w:pPr>
-                    <w:pStyle w:val="Compact"/>
-                    <w:jc w:val="left"/>
-                    <w:jc w:val="center"/>
-                  </w:pPr>
-                  <w:r>
-                    <w:t xml:space="preserve">Far West</w:t>
-                  </w:r>
-                </w:p>
-              </w:tc>
-              <w:tc>
-                <w:tcPr/>
-                <w:p>
-                  <w:pPr>
-                    <w:pStyle w:val="Compact"/>
-                    <w:jc w:val="left"/>
-                    <w:jc w:val="center"/>
-                  </w:pPr>
-                  <w:r>
-                    <w:t xml:space="preserve">Suisun Bay</w:t>
-                  </w:r>
-                </w:p>
-              </w:tc>
-              <w:tc>
-                <w:tcPr/>
-                <w:p>
-                  <w:pPr>
-                    <w:pStyle w:val="Compact"/>
-                    <w:jc w:val="left"/>
-                    <w:jc w:val="center"/>
-                  </w:pPr>
-                  <w:r>
-                    <w:t xml:space="preserve">Juvenile</w:t>
-                  </w:r>
-                </w:p>
-              </w:tc>
-              <w:tc>
-                <w:tcPr/>
-                <w:p>
-                  <w:pPr>
-                    <w:pStyle w:val="Compact"/>
-                    <w:jc w:val="right"/>
-                    <w:jc w:val="center"/>
-                  </w:pPr>
-                  <w:r>
-                    <w:t xml:space="preserve">2</w:t>
-                  </w:r>
-                </w:p>
-              </w:tc>
-            </w:tr>
-            <w:tr>
-              <w:tc>
-                <w:tcPr/>
-                <w:p>
-                  <w:pPr>
-                    <w:pStyle w:val="Compact"/>
-                    <w:jc w:val="left"/>
-                    <w:jc w:val="center"/>
-                  </w:pPr>
-                  <w:r>
-                    <w:t xml:space="preserve">EDSM</w:t>
-                  </w:r>
-                </w:p>
-              </w:tc>
-              <w:tc>
-                <w:tcPr/>
-                <w:p>
-                  <w:pPr>
-                    <w:pStyle w:val="Compact"/>
-                    <w:jc w:val="left"/>
-                    <w:jc w:val="center"/>
-                  </w:pPr>
-                  <w:r>
-                    <w:t xml:space="preserve">2026-01-06</w:t>
-                  </w:r>
-                </w:p>
-              </w:tc>
-              <w:tc>
-                <w:tcPr/>
-                <w:p>
-                  <w:pPr>
-                    <w:pStyle w:val="Compact"/>
-                    <w:jc w:val="left"/>
-                    <w:jc w:val="center"/>
-                  </w:pPr>
-                  <w:r>
-                    <w:t xml:space="preserve">West</w:t>
-                  </w:r>
-                </w:p>
-              </w:tc>
-              <w:tc>
-                <w:tcPr/>
-                <w:p>
-                  <w:pPr>
-                    <w:pStyle w:val="Compact"/>
-                    <w:jc w:val="left"/>
-                    <w:jc w:val="center"/>
-                  </w:pPr>
-                  <w:r>
-                    <w:t xml:space="preserve">Suisun Bay</w:t>
-                  </w:r>
-                </w:p>
-              </w:tc>
-              <w:tc>
-                <w:tcPr/>
-                <w:p>
-                  <w:pPr>
-                    <w:pStyle w:val="Compact"/>
-                    <w:jc w:val="left"/>
-                    <w:jc w:val="center"/>
-                  </w:pPr>
-                  <w:r>
-                    <w:t xml:space="preserve">Juvenile</w:t>
-                  </w:r>
-                </w:p>
-              </w:tc>
-              <w:tc>
-                <w:tcPr/>
-                <w:p>
-                  <w:pPr>
-                    <w:pStyle w:val="Compact"/>
-                    <w:jc w:val="right"/>
-                    <w:jc w:val="center"/>
-                  </w:pPr>
-                  <w:r>
-                    <w:t xml:space="preserve">1</w:t>
-                  </w:r>
-                </w:p>
-              </w:tc>
-            </w:tr>
-            <w:tr>
-              <w:tc>
-                <w:tcPr/>
-                <w:p>
-                  <w:pPr>
-                    <w:pStyle w:val="Compact"/>
-                    <w:jc w:val="left"/>
-                    <w:jc w:val="center"/>
-                  </w:pPr>
-                  <w:r>
-                    <w:t xml:space="preserve">EDSM</w:t>
-                  </w:r>
-                </w:p>
-              </w:tc>
-              <w:tc>
-                <w:tcPr/>
-                <w:p>
-                  <w:pPr>
-                    <w:pStyle w:val="Compact"/>
-                    <w:jc w:val="left"/>
-                    <w:jc w:val="center"/>
-                  </w:pPr>
-                  <w:r>
-                    <w:t xml:space="preserve">2026-01-07</w:t>
-                  </w:r>
-                </w:p>
-              </w:tc>
-              <w:tc>
-                <w:tcPr/>
-                <w:p>
-                  <w:pPr>
-                    <w:pStyle w:val="Compact"/>
-                    <w:jc w:val="left"/>
-                    <w:jc w:val="center"/>
-                  </w:pPr>
-                  <w:r>
-                    <w:t xml:space="preserve">West</w:t>
-                  </w:r>
-                </w:p>
-              </w:tc>
-              <w:tc>
-                <w:tcPr/>
-                <w:p>
-                  <w:pPr>
-                    <w:pStyle w:val="Compact"/>
-                    <w:jc w:val="left"/>
-                    <w:jc w:val="center"/>
-                  </w:pPr>
-                  <w:r>
-                    <w:t xml:space="preserve">Suisun Marsh</w:t>
-                  </w:r>
-                </w:p>
-              </w:tc>
-              <w:tc>
-                <w:tcPr/>
-                <w:p>
-                  <w:pPr>
-                    <w:pStyle w:val="Compact"/>
-                    <w:jc w:val="left"/>
-                    <w:jc w:val="center"/>
-                  </w:pPr>
-                  <w:r>
-                    <w:t xml:space="preserve">Juvenile</w:t>
-                  </w:r>
-                </w:p>
-              </w:tc>
-              <w:tc>
-                <w:tcPr/>
-                <w:p>
-                  <w:pPr>
-                    <w:pStyle w:val="Compact"/>
-                    <w:jc w:val="right"/>
-                    <w:jc w:val="center"/>
-                  </w:pPr>
-                  <w:r>
-                    <w:t xml:space="preserve">1</w:t>
-                  </w:r>
-                </w:p>
-              </w:tc>
-            </w:tr>
-            <w:tr>
-              <w:tc>
-                <w:tcPr/>
-                <w:p>
-                  <w:pPr>
-                    <w:pStyle w:val="Compact"/>
-                    <w:jc w:val="left"/>
-                    <w:jc w:val="center"/>
-                  </w:pPr>
-                  <w:r>
-                    <w:t xml:space="preserve">EDSM</w:t>
-                  </w:r>
-                </w:p>
-              </w:tc>
-              <w:tc>
-                <w:tcPr/>
-                <w:p>
-                  <w:pPr>
-                    <w:pStyle w:val="Compact"/>
-                    <w:jc w:val="left"/>
-                    <w:jc w:val="center"/>
-                  </w:pPr>
-                  <w:r>
-                    <w:t xml:space="preserve">2026-01-12</w:t>
-                  </w:r>
-                </w:p>
-              </w:tc>
-              <w:tc>
-                <w:tcPr/>
-                <w:p>
-                  <w:pPr>
-                    <w:pStyle w:val="Compact"/>
-                    <w:jc w:val="left"/>
-                    <w:jc w:val="center"/>
-                  </w:pPr>
-                  <w:r>
-                    <w:t xml:space="preserve">West</w:t>
-                  </w:r>
-                </w:p>
-              </w:tc>
-              <w:tc>
-                <w:tcPr/>
-                <w:p>
-                  <w:pPr>
-                    <w:pStyle w:val="Compact"/>
-                    <w:jc w:val="left"/>
-                    <w:jc w:val="center"/>
-                  </w:pPr>
-                  <w:r>
-                    <w:t xml:space="preserve">Lower Sacramento</w:t>
-                  </w:r>
-                </w:p>
-              </w:tc>
-              <w:tc>
-                <w:tcPr/>
-                <w:p>
-                  <w:pPr>
-                    <w:pStyle w:val="Compact"/>
-                    <w:jc w:val="left"/>
-                    <w:jc w:val="center"/>
-                  </w:pPr>
-                  <w:r>
-                    <w:t xml:space="preserve">Adult</w:t>
-                  </w:r>
-                </w:p>
-              </w:tc>
-              <w:tc>
-                <w:tcPr/>
-                <w:p>
-                  <w:pPr>
-                    <w:pStyle w:val="Compact"/>
-                    <w:jc w:val="right"/>
-                    <w:jc w:val="center"/>
-                  </w:pPr>
-                  <w:r>
-                    <w:t xml:space="preserve">19</w:t>
-                  </w:r>
-                </w:p>
-              </w:tc>
-            </w:tr>
-            <w:tr>
-              <w:tc>
-                <w:tcPr/>
-                <w:p>
-                  <w:pPr>
-                    <w:pStyle w:val="Compact"/>
-                    <w:jc w:val="left"/>
-                    <w:jc w:val="center"/>
-                  </w:pPr>
-                  <w:r>
-                    <w:t xml:space="preserve">EDSM</w:t>
-                  </w:r>
-                </w:p>
-              </w:tc>
-              <w:tc>
-                <w:tcPr/>
-                <w:p>
-                  <w:pPr>
-                    <w:pStyle w:val="Compact"/>
-                    <w:jc w:val="left"/>
-                    <w:jc w:val="center"/>
-                  </w:pPr>
-                  <w:r>
-                    <w:t xml:space="preserve">2026-01-12</w:t>
-                  </w:r>
-                </w:p>
-              </w:tc>
-              <w:tc>
-                <w:tcPr/>
-                <w:p>
-                  <w:pPr>
-                    <w:pStyle w:val="Compact"/>
-                    <w:jc w:val="left"/>
-                    <w:jc w:val="center"/>
-                  </w:pPr>
-                  <w:r>
-                    <w:t xml:space="preserve">West</w:t>
-                  </w:r>
-                </w:p>
-              </w:tc>
-              <w:tc>
-                <w:tcPr/>
-                <w:p>
-                  <w:pPr>
-                    <w:pStyle w:val="Compact"/>
-                    <w:jc w:val="left"/>
-                    <w:jc w:val="center"/>
-                  </w:pPr>
-                  <w:r>
-                    <w:t xml:space="preserve">Lower Sacramento</w:t>
-                  </w:r>
-                </w:p>
-              </w:tc>
-              <w:tc>
-                <w:tcPr/>
-                <w:p>
-                  <w:pPr>
-                    <w:pStyle w:val="Compact"/>
-                    <w:jc w:val="left"/>
-                    <w:jc w:val="center"/>
-                  </w:pPr>
-                  <w:r>
-                    <w:t xml:space="preserve">Juvenile</w:t>
-                  </w:r>
-                </w:p>
-              </w:tc>
-              <w:tc>
-                <w:tcPr/>
-                <w:p>
-                  <w:pPr>
-                    <w:pStyle w:val="Compact"/>
-                    <w:jc w:val="right"/>
-                    <w:jc w:val="center"/>
-                  </w:pPr>
-                  <w:r>
-                    <w:t xml:space="preserve">5</w:t>
-                  </w:r>
-                </w:p>
-              </w:tc>
-            </w:tr>
-            <w:tr>
-              <w:tc>
-                <w:tcPr/>
-                <w:p>
-                  <w:pPr>
-                    <w:pStyle w:val="Compact"/>
-                    <w:jc w:val="left"/>
-                    <w:jc w:val="center"/>
-                  </w:pPr>
-                  <w:r>
-                    <w:t xml:space="preserve">sls</w:t>
-                  </w:r>
-                </w:p>
-              </w:tc>
-              <w:tc>
-                <w:tcPr/>
-                <w:p>
-                  <w:pPr>
-                    <w:pStyle w:val="Compact"/>
-                    <w:jc w:val="left"/>
-                    <w:jc w:val="center"/>
-                  </w:pPr>
-                  <w:r>
-                    <w:t xml:space="preserve">2025-12-31</w:t>
-                  </w:r>
-                </w:p>
-              </w:tc>
-              <w:tc>
-                <w:tcPr/>
-                <w:p>
-                  <w:pPr>
-                    <w:pStyle w:val="Compact"/>
-                    <w:jc w:val="left"/>
-                    <w:jc w:val="center"/>
-                  </w:pPr>
-                  <w:r>
-                    <w:t xml:space="preserve">Far West</w:t>
-                  </w:r>
-                </w:p>
-              </w:tc>
-              <w:tc>
-                <w:tcPr/>
-                <w:p>
-                  <w:pPr>
-                    <w:pStyle w:val="Compact"/>
-                    <w:jc w:val="left"/>
-                    <w:jc w:val="center"/>
-                  </w:pPr>
-                  <w:r>
-                    <w:t xml:space="preserve">Suisun Bay</w:t>
-                  </w:r>
-                </w:p>
-              </w:tc>
-              <w:tc>
-                <w:tcPr/>
-                <w:p>
-                  <w:pPr>
-                    <w:pStyle w:val="Compact"/>
-                    <w:jc w:val="left"/>
-                    <w:jc w:val="center"/>
-                  </w:pPr>
-                  <w:r>
-                    <w:t xml:space="preserve">Larva</w:t>
-                  </w:r>
-                </w:p>
-              </w:tc>
-              <w:tc>
-                <w:tcPr/>
-                <w:p>
-                  <w:pPr>
-                    <w:pStyle w:val="Compact"/>
-                    <w:jc w:val="right"/>
-                    <w:jc w:val="center"/>
-                  </w:pPr>
-                  <w:r>
-                    <w:t xml:space="preserve">34</w:t>
-                  </w:r>
-                </w:p>
-              </w:tc>
-            </w:tr>
-            <w:tr>
-              <w:tc>
-                <w:tcPr/>
-                <w:p>
-                  <w:pPr>
-                    <w:pStyle w:val="Compact"/>
-                    <w:jc w:val="left"/>
-                    <w:jc w:val="center"/>
-                  </w:pPr>
-                  <w:r>
-                    <w:t xml:space="preserve">sls</w:t>
-                  </w:r>
-                </w:p>
-              </w:tc>
-              <w:tc>
-                <w:tcPr/>
-                <w:p>
-                  <w:pPr>
-                    <w:pStyle w:val="Compact"/>
-                    <w:jc w:val="left"/>
-                    <w:jc w:val="center"/>
-                  </w:pPr>
-                  <w:r>
-                    <w:t xml:space="preserve">2025-12-31</w:t>
-                  </w:r>
-                </w:p>
-              </w:tc>
-              <w:tc>
-                <w:tcPr/>
-                <w:p>
-                  <w:pPr>
-                    <w:pStyle w:val="Compact"/>
-                    <w:jc w:val="left"/>
-                    <w:jc w:val="center"/>
-                  </w:pPr>
-                  <w:r>
-                    <w:t xml:space="preserve">West</w:t>
-                  </w:r>
-                </w:p>
-              </w:tc>
-              <w:tc>
-                <w:tcPr/>
-                <w:p>
-                  <w:pPr>
-                    <w:pStyle w:val="Compact"/>
-                    <w:jc w:val="left"/>
-                    <w:jc w:val="center"/>
-                  </w:pPr>
-                  <w:r>
-                    <w:t xml:space="preserve">Suisun Bay</w:t>
-                  </w:r>
-                </w:p>
-              </w:tc>
-              <w:tc>
-                <w:tcPr/>
-                <w:p>
-                  <w:pPr>
-                    <w:pStyle w:val="Compact"/>
-                    <w:jc w:val="left"/>
-                    <w:jc w:val="center"/>
-                  </w:pPr>
-                  <w:r>
-                    <w:t xml:space="preserve">Larva</w:t>
-                  </w:r>
-                </w:p>
-              </w:tc>
-              <w:tc>
-                <w:tcPr/>
-                <w:p>
-                  <w:pPr>
-                    <w:pStyle w:val="Compact"/>
-                    <w:jc w:val="right"/>
-                    <w:jc w:val="center"/>
-                  </w:pPr>
-                  <w:r>
-                    <w:t xml:space="preserve">15</w:t>
-                  </w:r>
-                </w:p>
-              </w:tc>
-            </w:tr>
-            <w:tr>
-              <w:tc>
-                <w:tcPr/>
-                <w:p>
-                  <w:pPr>
-                    <w:pStyle w:val="Compact"/>
-                    <w:jc w:val="left"/>
-                    <w:jc w:val="center"/>
-                  </w:pPr>
-                  <w:r>
-                    <w:t xml:space="preserve">sls</w:t>
-                  </w:r>
-                </w:p>
-              </w:tc>
-              <w:tc>
-                <w:tcPr/>
-                <w:p>
-                  <w:pPr>
-                    <w:pStyle w:val="Compact"/>
-                    <w:jc w:val="left"/>
-                    <w:jc w:val="center"/>
-                  </w:pPr>
-                  <w:r>
-                    <w:t xml:space="preserve">2026-01-12</w:t>
-                  </w:r>
-                </w:p>
-              </w:tc>
-              <w:tc>
-                <w:tcPr/>
-                <w:p>
-                  <w:pPr>
-                    <w:pStyle w:val="Compact"/>
-                    <w:jc w:val="left"/>
-                    <w:jc w:val="center"/>
-                  </w:pPr>
-                  <w:r>
-                    <w:t xml:space="preserve">South</w:t>
-                  </w:r>
-                </w:p>
-              </w:tc>
-              <w:tc>
-                <w:tcPr/>
-                <w:p>
-                  <w:pPr>
-                    <w:pStyle w:val="Compact"/>
-                    <w:jc w:val="left"/>
-                    <w:jc w:val="center"/>
-                  </w:pPr>
-                  <w:r>
-                    <w:t xml:space="preserve">Lower San Joaquin</w:t>
-                  </w:r>
-                </w:p>
-              </w:tc>
-              <w:tc>
-                <w:tcPr/>
-                <w:p>
-                  <w:pPr>
-                    <w:pStyle w:val="Compact"/>
-                    <w:jc w:val="left"/>
-                    <w:jc w:val="center"/>
-                  </w:pPr>
-                  <w:r>
-                    <w:t xml:space="preserve">Larva</w:t>
-                  </w:r>
-                </w:p>
-              </w:tc>
-              <w:tc>
-                <w:tcPr/>
-                <w:p>
-                  <w:pPr>
-                    <w:pStyle w:val="Compact"/>
-                    <w:jc w:val="right"/>
-                    <w:jc w:val="center"/>
-                  </w:pPr>
-                  <w:r>
-                    <w:t xml:space="preserve">2</w:t>
                   </w:r>
                 </w:p>
               </w:tc>
@@ -4189,7 +2915,7 @@
                     <w:jc w:val="center"/>
                   </w:pPr>
                   <w:r>
-                    <w:t xml:space="preserve">7</w:t>
+                    <w:t xml:space="preserve">11</w:t>
                   </w:r>
                 </w:p>
               </w:tc>
@@ -4243,7 +2969,7 @@
                     <w:jc w:val="center"/>
                   </w:pPr>
                   <w:r>
-                    <w:t xml:space="preserve">13</w:t>
+                    <w:t xml:space="preserve">45</w:t>
                   </w:r>
                 </w:p>
               </w:tc>
@@ -4271,6 +2997,60 @@
                     <w:jc w:val="center"/>
                   </w:pPr>
                   <w:r>
+                    <w:t xml:space="preserve">North</w:t>
+                  </w:r>
+                </w:p>
+              </w:tc>
+              <w:tc>
+                <w:tcPr/>
+                <w:p>
+                  <w:pPr>
+                    <w:pStyle w:val="Compact"/>
+                    <w:jc w:val="left"/>
+                    <w:jc w:val="center"/>
+                  </w:pPr>
+                  <w:r>
+                    <w:t xml:space="preserve">Juvenile</w:t>
+                  </w:r>
+                </w:p>
+              </w:tc>
+              <w:tc>
+                <w:tcPr/>
+                <w:p>
+                  <w:pPr>
+                    <w:pStyle w:val="Compact"/>
+                    <w:jc w:val="right"/>
+                    <w:jc w:val="center"/>
+                  </w:pPr>
+                  <w:r>
+                    <w:t xml:space="preserve">1</w:t>
+                  </w:r>
+                </w:p>
+              </w:tc>
+            </w:tr>
+            <w:tr>
+              <w:tc>
+                <w:tcPr/>
+                <w:p>
+                  <w:pPr>
+                    <w:pStyle w:val="Compact"/>
+                    <w:jc w:val="left"/>
+                    <w:jc w:val="center"/>
+                  </w:pPr>
+                  <w:r>
+                    <w:t xml:space="preserve">EDSM</w:t>
+                  </w:r>
+                </w:p>
+              </w:tc>
+              <w:tc>
+                <w:tcPr/>
+                <w:p>
+                  <w:pPr>
+                    <w:pStyle w:val="Compact"/>
+                    <w:jc w:val="left"/>
+                    <w:jc w:val="center"/>
+                  </w:pPr>
+                  <w:r>
                     <w:t xml:space="preserve">West</w:t>
                   </w:r>
                 </w:p>
@@ -4297,7 +3077,7 @@
                     <w:jc w:val="center"/>
                   </w:pPr>
                   <w:r>
-                    <w:t xml:space="preserve">41</w:t>
+                    <w:t xml:space="preserve">42</w:t>
                   </w:r>
                 </w:p>
               </w:tc>
@@ -4999,7 +3779,7 @@
         </w:numPr>
       </w:pPr>
       <w:r>
-        <w:t xml:space="preserve">Daily average JPF: 9,041 cfs as of Jan 12, 2026</w:t>
+        <w:t xml:space="preserve">Daily average JPF: 2,148 cfs as of Jan 25, 2026</w:t>
       </w:r>
     </w:p>
     <w:p>
@@ -5079,7 +3859,7 @@
         </w:numPr>
       </w:pPr>
       <w:r>
-        <w:t xml:space="preserve">Daily average JPF: 9,041 cfs as of Jan 12, 2026</w:t>
+        <w:t xml:space="preserve">Daily average JPF: 2,148 cfs as of Jan 25, 2026</w:t>
       </w:r>
     </w:p>
     <w:bookmarkEnd w:id="60"/>
@@ -5146,13 +3926,13 @@
         </w:numPr>
       </w:pPr>
       <w:r>
-        <w:t xml:space="preserve">JPF is not less than zero. ZOI modeling shows moderate change in the hydrodynamic footprint</w:t>
-      </w:r>
-      <w:r>
-        <w:t xml:space="preserve"> </w:t>
-      </w:r>
-      <w:r>
-        <w:t xml:space="preserve">between OMRI scenarios.</w:t>
+        <w:t xml:space="preserve">JPF is not &lt; 0 cfs. ZOI modeling shows moderate change in the hydrodynamic footprint</w:t>
+      </w:r>
+      <w:r>
+        <w:t xml:space="preserve"> </w:t>
+      </w:r>
+      <w:r>
+        <w:t xml:space="preserve">between OMRI scenarios, but no change between current and forecasted conditions.</w:t>
       </w:r>
     </w:p>
     <w:p>

</xml_diff>

<commit_message>
added chipps to ds_detail
</commit_message>
<xml_diff>
--- a/smt-assessment-v1.docx
+++ b/smt-assessment-v1.docx
@@ -26,7 +26,7 @@
           <w:i/>
           <w:iCs/>
         </w:rPr>
-        <w:t xml:space="preserve">January 26, 2026</w:t>
+        <w:t xml:space="preserve">January 27, 2026</w:t>
       </w:r>
     </w:p>
     <w:bookmarkStart w:id="20" w:name="executive-summary"/>
@@ -234,7 +234,7 @@
         <w:t xml:space="preserve"> </w:t>
       </w:r>
       <w:r>
-        <w:t xml:space="preserve">34 adult Delta smelt and 24 juvenile Delta smelt have been detected this water year. See</w:t>
+        <w:t xml:space="preserve">35 adult Delta smelt and 24 juvenile Delta smelt have been detected this water year. See</w:t>
       </w:r>
       <w:r>
         <w:t xml:space="preserve"> </w:t>
@@ -534,6 +534,86 @@
                   </w:pPr>
                   <w:r>
                     <w:t xml:space="preserve">Catch</w:t>
+                  </w:r>
+                </w:p>
+              </w:tc>
+            </w:tr>
+            <w:tr>
+              <w:tc>
+                <w:tcPr/>
+                <w:p>
+                  <w:pPr>
+                    <w:pStyle w:val="Compact"/>
+                    <w:jc w:val="left"/>
+                    <w:jc w:val="center"/>
+                  </w:pPr>
+                  <w:r>
+                    <w:t xml:space="preserve">DJFMP</w:t>
+                  </w:r>
+                </w:p>
+              </w:tc>
+              <w:tc>
+                <w:tcPr/>
+                <w:p>
+                  <w:pPr>
+                    <w:pStyle w:val="Compact"/>
+                    <w:jc w:val="left"/>
+                    <w:jc w:val="center"/>
+                  </w:pPr>
+                  <w:r>
+                    <w:t xml:space="preserve">2026-01-22</w:t>
+                  </w:r>
+                </w:p>
+              </w:tc>
+              <w:tc>
+                <w:tcPr/>
+                <w:p>
+                  <w:pPr>
+                    <w:pStyle w:val="Compact"/>
+                    <w:jc w:val="left"/>
+                    <w:jc w:val="center"/>
+                  </w:pPr>
+                  <w:r>
+                    <w:t xml:space="preserve">N/A</w:t>
+                  </w:r>
+                </w:p>
+              </w:tc>
+              <w:tc>
+                <w:tcPr/>
+                <w:p>
+                  <w:pPr>
+                    <w:pStyle w:val="Compact"/>
+                    <w:jc w:val="left"/>
+                    <w:jc w:val="center"/>
+                  </w:pPr>
+                  <w:r>
+                    <w:t xml:space="preserve">NA</w:t>
+                  </w:r>
+                </w:p>
+              </w:tc>
+              <w:tc>
+                <w:tcPr/>
+                <w:p>
+                  <w:pPr>
+                    <w:pStyle w:val="Compact"/>
+                    <w:jc w:val="left"/>
+                    <w:jc w:val="center"/>
+                  </w:pPr>
+                  <w:r>
+                    <w:t xml:space="preserve">Adult</w:t>
+                  </w:r>
+                </w:p>
+              </w:tc>
+              <w:tc>
+                <w:tcPr/>
+                <w:p>
+                  <w:pPr>
+                    <w:pStyle w:val="Compact"/>
+                    <w:jc w:val="right"/>
+                    <w:jc w:val="center"/>
+                  </w:pPr>
+                  <w:r>
+                    <w:t xml:space="preserve">1</w:t>
                   </w:r>
                 </w:p>
               </w:tc>
@@ -822,6 +902,60 @@
                     <w:jc w:val="center"/>
                   </w:pPr>
                   <w:r>
+                    <w:t xml:space="preserve">N/A</w:t>
+                  </w:r>
+                </w:p>
+              </w:tc>
+              <w:tc>
+                <w:tcPr/>
+                <w:p>
+                  <w:pPr>
+                    <w:pStyle w:val="Compact"/>
+                    <w:jc w:val="left"/>
+                    <w:jc w:val="center"/>
+                  </w:pPr>
+                  <w:r>
+                    <w:t xml:space="preserve">Adult</w:t>
+                  </w:r>
+                </w:p>
+              </w:tc>
+              <w:tc>
+                <w:tcPr/>
+                <w:p>
+                  <w:pPr>
+                    <w:pStyle w:val="Compact"/>
+                    <w:jc w:val="right"/>
+                    <w:jc w:val="center"/>
+                  </w:pPr>
+                  <w:r>
+                    <w:t xml:space="preserve">1</w:t>
+                  </w:r>
+                </w:p>
+              </w:tc>
+            </w:tr>
+            <w:tr>
+              <w:tc>
+                <w:tcPr/>
+                <w:p>
+                  <w:pPr>
+                    <w:pStyle w:val="Compact"/>
+                    <w:jc w:val="left"/>
+                    <w:jc w:val="center"/>
+                  </w:pPr>
+                  <w:r>
+                    <w:t xml:space="preserve">DJFMP</w:t>
+                  </w:r>
+                </w:p>
+              </w:tc>
+              <w:tc>
+                <w:tcPr/>
+                <w:p>
+                  <w:pPr>
+                    <w:pStyle w:val="Compact"/>
+                    <w:jc w:val="left"/>
+                    <w:jc w:val="center"/>
+                  </w:pPr>
+                  <w:r>
                     <w:t xml:space="preserve">North</w:t>
                   </w:r>
                 </w:p>
@@ -1493,7 +1627,7 @@
         <w:t xml:space="preserve">12-station South Delta Turbidity</w:t>
       </w:r>
       <w:r>
-        <w:t xml:space="preserve">: The most recent average turbidity was 12.5 FNU as of Jan 13, 2025</w:t>
+        <w:t xml:space="preserve">: The most recent average turbidity was 12.2 FNU as of Jan 13, 2025</w:t>
       </w:r>
     </w:p>
     <w:bookmarkEnd w:id="42"/>
@@ -1773,7 +1907,7 @@
         </w:numPr>
       </w:pPr>
       <w:r>
-        <w:t xml:space="preserve">Although spawning may begin during the current assessment period, JPF is above 0 cfs;</w:t>
+        <w:t xml:space="preserve">Although spawning may occur during the current assessment period, JPF is above 0 cfs;</w:t>
       </w:r>
       <w:r>
         <w:t xml:space="preserve"> </w:t>
@@ -1820,7 +1954,7 @@
         <w:t xml:space="preserve"> </w:t>
       </w:r>
       <w:r>
-        <w:t xml:space="preserve">Juvenile, Adult, NA</w:t>
+        <w:t xml:space="preserve">Larva, Juvenile, Adult, NA</w:t>
       </w:r>
     </w:p>
     <w:p>
@@ -1841,7 +1975,7 @@
         <w:t xml:space="preserve"> </w:t>
       </w:r>
       <w:r>
-        <w:t xml:space="preserve">301 adult, 478 juvenile, and 122 larval longfin smelt have been detected this water year. See</w:t>
+        <w:t xml:space="preserve">305 adult, 489 juvenile, and 446 larval longfin smelt have been detected this water year. See</w:t>
       </w:r>
       <w:r>
         <w:t xml:space="preserve"> </w:t>
@@ -2066,7 +2200,7 @@
                     <w:jc w:val="center"/>
                   </w:pPr>
                   <w:r>
-                    <w:t xml:space="preserve">2026-01-13</w:t>
+                    <w:t xml:space="preserve">2026-01-20</w:t>
                   </w:r>
                 </w:p>
               </w:tc>
@@ -2092,20 +2226,20 @@
                     <w:jc w:val="center"/>
                   </w:pPr>
                   <w:r>
-                    <w:t xml:space="preserve">Western Delta</w:t>
-                  </w:r>
-                </w:p>
-              </w:tc>
-              <w:tc>
-                <w:tcPr/>
-                <w:p>
-                  <w:pPr>
-                    <w:pStyle w:val="Compact"/>
-                    <w:jc w:val="left"/>
-                    <w:jc w:val="center"/>
-                  </w:pPr>
-                  <w:r>
-                    <w:t xml:space="preserve">Juvenile</w:t>
+                    <w:t xml:space="preserve">Suisun Bay</w:t>
+                  </w:r>
+                </w:p>
+              </w:tc>
+              <w:tc>
+                <w:tcPr/>
+                <w:p>
+                  <w:pPr>
+                    <w:pStyle w:val="Compact"/>
+                    <w:jc w:val="left"/>
+                    <w:jc w:val="center"/>
+                  </w:pPr>
+                  <w:r>
+                    <w:t xml:space="preserve">Adult</w:t>
                   </w:r>
                 </w:p>
               </w:tc>
@@ -2118,7 +2252,7 @@
                     <w:jc w:val="center"/>
                   </w:pPr>
                   <w:r>
-                    <w:t xml:space="preserve">2</w:t>
+                    <w:t xml:space="preserve">4</w:t>
                   </w:r>
                 </w:p>
               </w:tc>
@@ -2185,7 +2319,7 @@
                     <w:jc w:val="center"/>
                   </w:pPr>
                   <w:r>
-                    <w:t xml:space="preserve">Adult</w:t>
+                    <w:t xml:space="preserve">Juvenile</w:t>
                   </w:r>
                 </w:p>
               </w:tc>
@@ -2198,7 +2332,7 @@
                     <w:jc w:val="center"/>
                   </w:pPr>
                   <w:r>
-                    <w:t xml:space="preserve">4</w:t>
+                    <w:t xml:space="preserve">29</w:t>
                   </w:r>
                 </w:p>
               </w:tc>
@@ -2265,7 +2399,7 @@
                     <w:jc w:val="center"/>
                   </w:pPr>
                   <w:r>
-                    <w:t xml:space="preserve">Juvenile</w:t>
+                    <w:t xml:space="preserve">NA</w:t>
                   </w:r>
                 </w:p>
               </w:tc>
@@ -2278,7 +2412,7 @@
                     <w:jc w:val="center"/>
                   </w:pPr>
                   <w:r>
-                    <w:t xml:space="preserve">29</w:t>
+                    <w:t xml:space="preserve">1</w:t>
                   </w:r>
                 </w:p>
               </w:tc>
@@ -2319,33 +2453,33 @@
                     <w:jc w:val="center"/>
                   </w:pPr>
                   <w:r>
-                    <w:t xml:space="preserve">Far West</w:t>
-                  </w:r>
-                </w:p>
-              </w:tc>
-              <w:tc>
-                <w:tcPr/>
-                <w:p>
-                  <w:pPr>
-                    <w:pStyle w:val="Compact"/>
-                    <w:jc w:val="left"/>
-                    <w:jc w:val="center"/>
-                  </w:pPr>
-                  <w:r>
-                    <w:t xml:space="preserve">Suisun Bay</w:t>
-                  </w:r>
-                </w:p>
-              </w:tc>
-              <w:tc>
-                <w:tcPr/>
-                <w:p>
-                  <w:pPr>
-                    <w:pStyle w:val="Compact"/>
-                    <w:jc w:val="left"/>
-                    <w:jc w:val="center"/>
-                  </w:pPr>
-                  <w:r>
-                    <w:t xml:space="preserve">NA</w:t>
+                    <w:t xml:space="preserve">West</w:t>
+                  </w:r>
+                </w:p>
+              </w:tc>
+              <w:tc>
+                <w:tcPr/>
+                <w:p>
+                  <w:pPr>
+                    <w:pStyle w:val="Compact"/>
+                    <w:jc w:val="left"/>
+                    <w:jc w:val="center"/>
+                  </w:pPr>
+                  <w:r>
+                    <w:t xml:space="preserve">Lower Sacramento</w:t>
+                  </w:r>
+                </w:p>
+              </w:tc>
+              <w:tc>
+                <w:tcPr/>
+                <w:p>
+                  <w:pPr>
+                    <w:pStyle w:val="Compact"/>
+                    <w:jc w:val="left"/>
+                    <w:jc w:val="center"/>
+                  </w:pPr>
+                  <w:r>
+                    <w:t xml:space="preserve">Adult</w:t>
                   </w:r>
                 </w:p>
               </w:tc>
@@ -2386,46 +2520,46 @@
                     <w:jc w:val="center"/>
                   </w:pPr>
                   <w:r>
-                    <w:t xml:space="preserve">2026-01-20</w:t>
-                  </w:r>
-                </w:p>
-              </w:tc>
-              <w:tc>
-                <w:tcPr/>
-                <w:p>
-                  <w:pPr>
-                    <w:pStyle w:val="Compact"/>
-                    <w:jc w:val="left"/>
-                    <w:jc w:val="center"/>
-                  </w:pPr>
-                  <w:r>
-                    <w:t xml:space="preserve">West</w:t>
-                  </w:r>
-                </w:p>
-              </w:tc>
-              <w:tc>
-                <w:tcPr/>
-                <w:p>
-                  <w:pPr>
-                    <w:pStyle w:val="Compact"/>
-                    <w:jc w:val="left"/>
-                    <w:jc w:val="center"/>
-                  </w:pPr>
-                  <w:r>
-                    <w:t xml:space="preserve">Lower Sacramento</w:t>
-                  </w:r>
-                </w:p>
-              </w:tc>
-              <w:tc>
-                <w:tcPr/>
-                <w:p>
-                  <w:pPr>
-                    <w:pStyle w:val="Compact"/>
-                    <w:jc w:val="left"/>
-                    <w:jc w:val="center"/>
-                  </w:pPr>
-                  <w:r>
-                    <w:t xml:space="preserve">Adult</w:t>
+                    <w:t xml:space="preserve">2026-01-22</w:t>
+                  </w:r>
+                </w:p>
+              </w:tc>
+              <w:tc>
+                <w:tcPr/>
+                <w:p>
+                  <w:pPr>
+                    <w:pStyle w:val="Compact"/>
+                    <w:jc w:val="left"/>
+                    <w:jc w:val="center"/>
+                  </w:pPr>
+                  <w:r>
+                    <w:t xml:space="preserve">Far West</w:t>
+                  </w:r>
+                </w:p>
+              </w:tc>
+              <w:tc>
+                <w:tcPr/>
+                <w:p>
+                  <w:pPr>
+                    <w:pStyle w:val="Compact"/>
+                    <w:jc w:val="left"/>
+                    <w:jc w:val="center"/>
+                  </w:pPr>
+                  <w:r>
+                    <w:t xml:space="preserve">Western Delta</w:t>
+                  </w:r>
+                </w:p>
+              </w:tc>
+              <w:tc>
+                <w:tcPr/>
+                <w:p>
+                  <w:pPr>
+                    <w:pStyle w:val="Compact"/>
+                    <w:jc w:val="left"/>
+                    <w:jc w:val="center"/>
+                  </w:pPr>
+                  <w:r>
+                    <w:t xml:space="preserve">Juvenile</w:t>
                   </w:r>
                 </w:p>
               </w:tc>
@@ -2466,7 +2600,7 @@
                     <w:jc w:val="center"/>
                   </w:pPr>
                   <w:r>
-                    <w:t xml:space="preserve">2026-01-22</w:t>
+                    <w:t xml:space="preserve">2026-01-26</w:t>
                   </w:r>
                 </w:p>
               </w:tc>
@@ -2492,7 +2626,87 @@
                     <w:jc w:val="center"/>
                   </w:pPr>
                   <w:r>
-                    <w:t xml:space="preserve">Western Delta</w:t>
+                    <w:t xml:space="preserve">Suisun Bay</w:t>
+                  </w:r>
+                </w:p>
+              </w:tc>
+              <w:tc>
+                <w:tcPr/>
+                <w:p>
+                  <w:pPr>
+                    <w:pStyle w:val="Compact"/>
+                    <w:jc w:val="left"/>
+                    <w:jc w:val="center"/>
+                  </w:pPr>
+                  <w:r>
+                    <w:t xml:space="preserve">Adult</w:t>
+                  </w:r>
+                </w:p>
+              </w:tc>
+              <w:tc>
+                <w:tcPr/>
+                <w:p>
+                  <w:pPr>
+                    <w:pStyle w:val="Compact"/>
+                    <w:jc w:val="right"/>
+                    <w:jc w:val="center"/>
+                  </w:pPr>
+                  <w:r>
+                    <w:t xml:space="preserve">4</w:t>
+                  </w:r>
+                </w:p>
+              </w:tc>
+            </w:tr>
+            <w:tr>
+              <w:tc>
+                <w:tcPr/>
+                <w:p>
+                  <w:pPr>
+                    <w:pStyle w:val="Compact"/>
+                    <w:jc w:val="left"/>
+                    <w:jc w:val="center"/>
+                  </w:pPr>
+                  <w:r>
+                    <w:t xml:space="preserve">EDSM</w:t>
+                  </w:r>
+                </w:p>
+              </w:tc>
+              <w:tc>
+                <w:tcPr/>
+                <w:p>
+                  <w:pPr>
+                    <w:pStyle w:val="Compact"/>
+                    <w:jc w:val="left"/>
+                    <w:jc w:val="center"/>
+                  </w:pPr>
+                  <w:r>
+                    <w:t xml:space="preserve">2026-01-26</w:t>
+                  </w:r>
+                </w:p>
+              </w:tc>
+              <w:tc>
+                <w:tcPr/>
+                <w:p>
+                  <w:pPr>
+                    <w:pStyle w:val="Compact"/>
+                    <w:jc w:val="left"/>
+                    <w:jc w:val="center"/>
+                  </w:pPr>
+                  <w:r>
+                    <w:t xml:space="preserve">Far West</w:t>
+                  </w:r>
+                </w:p>
+              </w:tc>
+              <w:tc>
+                <w:tcPr/>
+                <w:p>
+                  <w:pPr>
+                    <w:pStyle w:val="Compact"/>
+                    <w:jc w:val="left"/>
+                    <w:jc w:val="center"/>
+                  </w:pPr>
+                  <w:r>
+                    <w:t xml:space="preserve">Suisun Bay</w:t>
                   </w:r>
                 </w:p>
               </w:tc>
@@ -2518,7 +2732,167 @@
                     <w:jc w:val="center"/>
                   </w:pPr>
                   <w:r>
-                    <w:t xml:space="preserve">1</w:t>
+                    <w:t xml:space="preserve">11</w:t>
+                  </w:r>
+                </w:p>
+              </w:tc>
+            </w:tr>
+            <w:tr>
+              <w:tc>
+                <w:tcPr/>
+                <w:p>
+                  <w:pPr>
+                    <w:pStyle w:val="Compact"/>
+                    <w:jc w:val="left"/>
+                    <w:jc w:val="center"/>
+                  </w:pPr>
+                  <w:r>
+                    <w:t xml:space="preserve">sls</w:t>
+                  </w:r>
+                </w:p>
+              </w:tc>
+              <w:tc>
+                <w:tcPr/>
+                <w:p>
+                  <w:pPr>
+                    <w:pStyle w:val="Compact"/>
+                    <w:jc w:val="left"/>
+                    <w:jc w:val="center"/>
+                  </w:pPr>
+                  <w:r>
+                    <w:t xml:space="preserve">2026-01-14</w:t>
+                  </w:r>
+                </w:p>
+              </w:tc>
+              <w:tc>
+                <w:tcPr/>
+                <w:p>
+                  <w:pPr>
+                    <w:pStyle w:val="Compact"/>
+                    <w:jc w:val="left"/>
+                    <w:jc w:val="center"/>
+                  </w:pPr>
+                  <w:r>
+                    <w:t xml:space="preserve">West</w:t>
+                  </w:r>
+                </w:p>
+              </w:tc>
+              <w:tc>
+                <w:tcPr/>
+                <w:p>
+                  <w:pPr>
+                    <w:pStyle w:val="Compact"/>
+                    <w:jc w:val="left"/>
+                    <w:jc w:val="center"/>
+                  </w:pPr>
+                  <w:r>
+                    <w:t xml:space="preserve">Lower San Joaquin</w:t>
+                  </w:r>
+                </w:p>
+              </w:tc>
+              <w:tc>
+                <w:tcPr/>
+                <w:p>
+                  <w:pPr>
+                    <w:pStyle w:val="Compact"/>
+                    <w:jc w:val="left"/>
+                    <w:jc w:val="center"/>
+                  </w:pPr>
+                  <w:r>
+                    <w:t xml:space="preserve">Larva</w:t>
+                  </w:r>
+                </w:p>
+              </w:tc>
+              <w:tc>
+                <w:tcPr/>
+                <w:p>
+                  <w:pPr>
+                    <w:pStyle w:val="Compact"/>
+                    <w:jc w:val="right"/>
+                    <w:jc w:val="center"/>
+                  </w:pPr>
+                  <w:r>
+                    <w:t xml:space="preserve">2</w:t>
+                  </w:r>
+                </w:p>
+              </w:tc>
+            </w:tr>
+            <w:tr>
+              <w:tc>
+                <w:tcPr/>
+                <w:p>
+                  <w:pPr>
+                    <w:pStyle w:val="Compact"/>
+                    <w:jc w:val="left"/>
+                    <w:jc w:val="center"/>
+                  </w:pPr>
+                  <w:r>
+                    <w:t xml:space="preserve">sls</w:t>
+                  </w:r>
+                </w:p>
+              </w:tc>
+              <w:tc>
+                <w:tcPr/>
+                <w:p>
+                  <w:pPr>
+                    <w:pStyle w:val="Compact"/>
+                    <w:jc w:val="left"/>
+                    <w:jc w:val="center"/>
+                  </w:pPr>
+                  <w:r>
+                    <w:t xml:space="preserve">2026-01-14</w:t>
+                  </w:r>
+                </w:p>
+              </w:tc>
+              <w:tc>
+                <w:tcPr/>
+                <w:p>
+                  <w:pPr>
+                    <w:pStyle w:val="Compact"/>
+                    <w:jc w:val="left"/>
+                    <w:jc w:val="center"/>
+                  </w:pPr>
+                  <w:r>
+                    <w:t xml:space="preserve">West</w:t>
+                  </w:r>
+                </w:p>
+              </w:tc>
+              <w:tc>
+                <w:tcPr/>
+                <w:p>
+                  <w:pPr>
+                    <w:pStyle w:val="Compact"/>
+                    <w:jc w:val="left"/>
+                    <w:jc w:val="center"/>
+                  </w:pPr>
+                  <w:r>
+                    <w:t xml:space="preserve">Suisun Bay</w:t>
+                  </w:r>
+                </w:p>
+              </w:tc>
+              <w:tc>
+                <w:tcPr/>
+                <w:p>
+                  <w:pPr>
+                    <w:pStyle w:val="Compact"/>
+                    <w:jc w:val="left"/>
+                    <w:jc w:val="center"/>
+                  </w:pPr>
+                  <w:r>
+                    <w:t xml:space="preserve">Larva</w:t>
+                  </w:r>
+                </w:p>
+              </w:tc>
+              <w:tc>
+                <w:tcPr/>
+                <w:p>
+                  <w:pPr>
+                    <w:pStyle w:val="Compact"/>
+                    <w:jc w:val="right"/>
+                    <w:jc w:val="center"/>
+                  </w:pPr>
+                  <w:r>
+                    <w:t xml:space="preserve">5</w:t>
                   </w:r>
                 </w:p>
               </w:tc>
@@ -2915,7 +3289,7 @@
                     <w:jc w:val="center"/>
                   </w:pPr>
                   <w:r>
-                    <w:t xml:space="preserve">11</w:t>
+                    <w:t xml:space="preserve">15</w:t>
                   </w:r>
                 </w:p>
               </w:tc>
@@ -2969,7 +3343,7 @@
                     <w:jc w:val="center"/>
                   </w:pPr>
                   <w:r>
-                    <w:t xml:space="preserve">45</w:t>
+                    <w:t xml:space="preserve">56</w:t>
                   </w:r>
                 </w:p>
               </w:tc>
@@ -3429,7 +3803,7 @@
                     <w:jc w:val="center"/>
                   </w:pPr>
                   <w:r>
-                    <w:t xml:space="preserve">Far West</w:t>
+                    <w:t xml:space="preserve">Bay</w:t>
                   </w:r>
                 </w:p>
               </w:tc>
@@ -3455,7 +3829,7 @@
                     <w:jc w:val="center"/>
                   </w:pPr>
                   <w:r>
-                    <w:t xml:space="preserve">82</w:t>
+                    <w:t xml:space="preserve">9</w:t>
                   </w:r>
                 </w:p>
               </w:tc>
@@ -3483,7 +3857,7 @@
                     <w:jc w:val="center"/>
                   </w:pPr>
                   <w:r>
-                    <w:t xml:space="preserve">North</w:t>
+                    <w:t xml:space="preserve">Far West</w:t>
                   </w:r>
                 </w:p>
               </w:tc>
@@ -3509,7 +3883,7 @@
                     <w:jc w:val="center"/>
                   </w:pPr>
                   <w:r>
-                    <w:t xml:space="preserve">2</w:t>
+                    <w:t xml:space="preserve">349</w:t>
                   </w:r>
                 </w:p>
               </w:tc>
@@ -3537,7 +3911,7 @@
                     <w:jc w:val="center"/>
                   </w:pPr>
                   <w:r>
-                    <w:t xml:space="preserve">South</w:t>
+                    <w:t xml:space="preserve">North</w:t>
                   </w:r>
                 </w:p>
               </w:tc>
@@ -3591,6 +3965,60 @@
                     <w:jc w:val="center"/>
                   </w:pPr>
                   <w:r>
+                    <w:t xml:space="preserve">South</w:t>
+                  </w:r>
+                </w:p>
+              </w:tc>
+              <w:tc>
+                <w:tcPr/>
+                <w:p>
+                  <w:pPr>
+                    <w:pStyle w:val="Compact"/>
+                    <w:jc w:val="left"/>
+                    <w:jc w:val="center"/>
+                  </w:pPr>
+                  <w:r>
+                    <w:t xml:space="preserve">Larva</w:t>
+                  </w:r>
+                </w:p>
+              </w:tc>
+              <w:tc>
+                <w:tcPr/>
+                <w:p>
+                  <w:pPr>
+                    <w:pStyle w:val="Compact"/>
+                    <w:jc w:val="right"/>
+                    <w:jc w:val="center"/>
+                  </w:pPr>
+                  <w:r>
+                    <w:t xml:space="preserve">2</w:t>
+                  </w:r>
+                </w:p>
+              </w:tc>
+            </w:tr>
+            <w:tr>
+              <w:tc>
+                <w:tcPr/>
+                <w:p>
+                  <w:pPr>
+                    <w:pStyle w:val="Compact"/>
+                    <w:jc w:val="left"/>
+                    <w:jc w:val="center"/>
+                  </w:pPr>
+                  <w:r>
+                    <w:t xml:space="preserve">sls</w:t>
+                  </w:r>
+                </w:p>
+              </w:tc>
+              <w:tc>
+                <w:tcPr/>
+                <w:p>
+                  <w:pPr>
+                    <w:pStyle w:val="Compact"/>
+                    <w:jc w:val="left"/>
+                    <w:jc w:val="center"/>
+                  </w:pPr>
+                  <w:r>
                     <w:t xml:space="preserve">West</w:t>
                   </w:r>
                 </w:p>
@@ -3617,7 +4045,61 @@
                     <w:jc w:val="center"/>
                   </w:pPr>
                   <w:r>
-                    <w:t xml:space="preserve">36</w:t>
+                    <w:t xml:space="preserve">62</w:t>
+                  </w:r>
+                </w:p>
+              </w:tc>
+            </w:tr>
+            <w:tr>
+              <w:tc>
+                <w:tcPr/>
+                <w:p>
+                  <w:pPr>
+                    <w:pStyle w:val="Compact"/>
+                    <w:jc w:val="left"/>
+                    <w:jc w:val="center"/>
+                  </w:pPr>
+                  <w:r>
+                    <w:t xml:space="preserve">sls</w:t>
+                  </w:r>
+                </w:p>
+              </w:tc>
+              <w:tc>
+                <w:tcPr/>
+                <w:p>
+                  <w:pPr>
+                    <w:pStyle w:val="Compact"/>
+                    <w:jc w:val="left"/>
+                    <w:jc w:val="center"/>
+                  </w:pPr>
+                  <w:r>
+                    <w:t xml:space="preserve">NA</w:t>
+                  </w:r>
+                </w:p>
+              </w:tc>
+              <w:tc>
+                <w:tcPr/>
+                <w:p>
+                  <w:pPr>
+                    <w:pStyle w:val="Compact"/>
+                    <w:jc w:val="left"/>
+                    <w:jc w:val="center"/>
+                  </w:pPr>
+                  <w:r>
+                    <w:t xml:space="preserve">Larva</w:t>
+                  </w:r>
+                </w:p>
+              </w:tc>
+              <w:tc>
+                <w:tcPr/>
+                <w:p>
+                  <w:pPr>
+                    <w:pStyle w:val="Compact"/>
+                    <w:jc w:val="right"/>
+                    <w:jc w:val="center"/>
+                  </w:pPr>
+                  <w:r>
+                    <w:t xml:space="preserve">22</w:t>
                   </w:r>
                 </w:p>
               </w:tc>

</xml_diff>

<commit_message>
LFS juvenile/larval evaluation question updated
</commit_message>
<xml_diff>
--- a/smt-assessment-v1.docx
+++ b/smt-assessment-v1.docx
@@ -83,7 +83,7 @@
         </w:numPr>
       </w:pPr>
       <w:r>
-        <w:t xml:space="preserve">Turbidity in the central/south Delta is moderate.</w:t>
+        <w:t xml:space="preserve">Turbidity in the central/south Delta is low-moderate.</w:t>
       </w:r>
     </w:p>
     <w:bookmarkEnd w:id="20"/>
@@ -4408,13 +4408,37 @@
         </w:numPr>
       </w:pPr>
       <w:r>
-        <w:t xml:space="preserve">JPF is not &lt; 0 cfs. ZOI modeling shows moderate change in the hydrodynamic footprint</w:t>
-      </w:r>
-      <w:r>
-        <w:t xml:space="preserve"> </w:t>
-      </w:r>
-      <w:r>
-        <w:t xml:space="preserve">between OMRI scenarios, but no change between current and forecasted conditions.</w:t>
+        <w:t xml:space="preserve">JPF is not currently less than 0 cfs; however, it may drop below 0 cfs this</w:t>
+      </w:r>
+      <w:r>
+        <w:t xml:space="preserve"> </w:t>
+      </w:r>
+      <w:r>
+        <w:t xml:space="preserve">weekend, although the likelihood is low. Even if JPF becomes negative, Zone of Influence</w:t>
+      </w:r>
+      <w:r>
+        <w:t xml:space="preserve"> </w:t>
+      </w:r>
+      <w:r>
+        <w:t xml:space="preserve">modeling indicates only moderate differences in hydrodynamic footprint across OMRI scenarios,</w:t>
+      </w:r>
+      <w:r>
+        <w:t xml:space="preserve"> </w:t>
+      </w:r>
+      <w:r>
+        <w:t xml:space="preserve">with no change between current and forecasted conditions. Consistent with this, Table 5</w:t>
+      </w:r>
+      <w:r>
+        <w:t xml:space="preserve"> </w:t>
+      </w:r>
+      <w:r>
+        <w:t xml:space="preserve">shows very low larval longfin smelt entrainment across all OMRI levels (less than 0.1%),</w:t>
+      </w:r>
+      <w:r>
+        <w:t xml:space="preserve"> </w:t>
+      </w:r>
+      <w:r>
+        <w:t xml:space="preserve">so a population-level decline is not expected.</w:t>
       </w:r>
     </w:p>
     <w:p>

</xml_diff>

<commit_message>
updated  evaluation questions 3/2
updated  evaluation questions 3/2
</commit_message>
<xml_diff>
--- a/smt-assessment-v1.docx
+++ b/smt-assessment-v1.docx
@@ -2,7 +2,7 @@
 <file path=word/document.xml><?xml version="1.0" encoding="utf-8"?>
 <w:document xmlns:w="http://schemas.openxmlformats.org/wordprocessingml/2006/main" xmlns:m="http://schemas.openxmlformats.org/officeDocument/2006/math" xmlns:r="http://schemas.openxmlformats.org/officeDocument/2006/relationships" xmlns:o="urn:schemas-microsoft-com:office:office" xmlns:v="urn:schemas-microsoft-com:vml" xmlns:w10="urn:schemas-microsoft-com:office:word" xmlns:a="http://schemas.openxmlformats.org/drawingml/2006/main" xmlns:pic="http://schemas.openxmlformats.org/drawingml/2006/picture" xmlns:wp="http://schemas.openxmlformats.org/drawingml/2006/wordprocessingDrawing">
   <w:body>
-    <w:bookmarkStart w:id="67" w:name="X6826eb71b2e7ccf0cae7c428170c7924ae60314"/>
+    <w:bookmarkStart w:id="68" w:name="X6826eb71b2e7ccf0cae7c428170c7924ae60314"/>
     <w:p>
       <w:pPr>
         <w:pStyle w:val="Heading2"/>
@@ -26,7 +26,7 @@
           <w:i/>
           <w:iCs/>
         </w:rPr>
-        <w:t xml:space="preserve">February 17, 2026</w:t>
+        <w:t xml:space="preserve">March 02, 2026</w:t>
       </w:r>
     </w:p>
     <w:bookmarkStart w:id="20" w:name="executive-summary"/>
@@ -59,7 +59,7 @@
         </w:numPr>
       </w:pPr>
       <w:r>
-        <w:t xml:space="preserve">Delta smelt were recently detected at Suisun Marsh.</w:t>
+        <w:t xml:space="preserve">Adult Delta smelt action is no longer active.</w:t>
       </w:r>
     </w:p>
     <w:p>
@@ -71,7 +71,7 @@
         </w:numPr>
       </w:pPr>
       <w:r>
-        <w:t xml:space="preserve">No Delta smelt or longfin smelt salvage has been observed this water year.</w:t>
+        <w:t xml:space="preserve">Delta smelt were most recently detected at Suisun Marsh.</w:t>
       </w:r>
     </w:p>
     <w:p>
@@ -83,7 +83,19 @@
         </w:numPr>
       </w:pPr>
       <w:r>
-        <w:t xml:space="preserve">Turbidity in the central/south Delta is low.</w:t>
+        <w:t xml:space="preserve">No Delta smelt or longfin smelt salvage has been observed this water year.</w:t>
+      </w:r>
+    </w:p>
+    <w:p>
+      <w:pPr>
+        <w:pStyle w:val="Compact"/>
+        <w:numPr>
+          <w:ilvl w:val="0"/>
+          <w:numId w:val="1001"/>
+        </w:numPr>
+      </w:pPr>
+      <w:r>
+        <w:t xml:space="preserve">Turbidity in the central/south Delta is low to moderate.</w:t>
       </w:r>
     </w:p>
     <w:bookmarkEnd w:id="20"/>
@@ -167,12 +179,6 @@
         </w:rPr>
         <w:t xml:space="preserve">Delta smelt life stages:</w:t>
       </w:r>
-      <w:r>
-        <w:t xml:space="preserve"> </w:t>
-      </w:r>
-      <w:r>
-        <w:t xml:space="preserve">Adult, Juvenile</w:t>
-      </w:r>
     </w:p>
     <w:p>
       <w:pPr>
@@ -192,7 +198,7 @@
         <w:t xml:space="preserve"> </w:t>
       </w:r>
       <w:r>
-        <w:t xml:space="preserve">1769 (95% CL: 155 to 7,562) as of the week of February 2–6, 2026</w:t>
+        <w:t xml:space="preserve">9901 (95% CL: 1,407 to 35,401) as of the week of February 23–27, 2026</w:t>
       </w:r>
     </w:p>
     <w:p>
@@ -534,166 +540,6 @@
                   </w:pPr>
                   <w:r>
                     <w:t xml:space="preserve">Catch</w:t>
-                  </w:r>
-                </w:p>
-              </w:tc>
-            </w:tr>
-            <w:tr>
-              <w:tc>
-                <w:tcPr/>
-                <w:p>
-                  <w:pPr>
-                    <w:pStyle w:val="Compact"/>
-                    <w:jc w:val="left"/>
-                    <w:jc w:val="center"/>
-                  </w:pPr>
-                  <w:r>
-                    <w:t xml:space="preserve">EDSM</w:t>
-                  </w:r>
-                </w:p>
-              </w:tc>
-              <w:tc>
-                <w:tcPr/>
-                <w:p>
-                  <w:pPr>
-                    <w:pStyle w:val="Compact"/>
-                    <w:jc w:val="left"/>
-                    <w:jc w:val="center"/>
-                  </w:pPr>
-                  <w:r>
-                    <w:t xml:space="preserve">2026-02-06</w:t>
-                  </w:r>
-                </w:p>
-              </w:tc>
-              <w:tc>
-                <w:tcPr/>
-                <w:p>
-                  <w:pPr>
-                    <w:pStyle w:val="Compact"/>
-                    <w:jc w:val="left"/>
-                    <w:jc w:val="center"/>
-                  </w:pPr>
-                  <w:r>
-                    <w:t xml:space="preserve">West</w:t>
-                  </w:r>
-                </w:p>
-              </w:tc>
-              <w:tc>
-                <w:tcPr/>
-                <w:p>
-                  <w:pPr>
-                    <w:pStyle w:val="Compact"/>
-                    <w:jc w:val="left"/>
-                    <w:jc w:val="center"/>
-                  </w:pPr>
-                  <w:r>
-                    <w:t xml:space="preserve">Suisun Marsh</w:t>
-                  </w:r>
-                </w:p>
-              </w:tc>
-              <w:tc>
-                <w:tcPr/>
-                <w:p>
-                  <w:pPr>
-                    <w:pStyle w:val="Compact"/>
-                    <w:jc w:val="left"/>
-                    <w:jc w:val="center"/>
-                  </w:pPr>
-                  <w:r>
-                    <w:t xml:space="preserve">Adult</w:t>
-                  </w:r>
-                </w:p>
-              </w:tc>
-              <w:tc>
-                <w:tcPr/>
-                <w:p>
-                  <w:pPr>
-                    <w:pStyle w:val="Compact"/>
-                    <w:jc w:val="right"/>
-                    <w:jc w:val="center"/>
-                  </w:pPr>
-                  <w:r>
-                    <w:t xml:space="preserve">1</w:t>
-                  </w:r>
-                </w:p>
-              </w:tc>
-            </w:tr>
-            <w:tr>
-              <w:tc>
-                <w:tcPr/>
-                <w:p>
-                  <w:pPr>
-                    <w:pStyle w:val="Compact"/>
-                    <w:jc w:val="left"/>
-                    <w:jc w:val="center"/>
-                  </w:pPr>
-                  <w:r>
-                    <w:t xml:space="preserve">EDSM</w:t>
-                  </w:r>
-                </w:p>
-              </w:tc>
-              <w:tc>
-                <w:tcPr/>
-                <w:p>
-                  <w:pPr>
-                    <w:pStyle w:val="Compact"/>
-                    <w:jc w:val="left"/>
-                    <w:jc w:val="center"/>
-                  </w:pPr>
-                  <w:r>
-                    <w:t xml:space="preserve">2026-02-10</w:t>
-                  </w:r>
-                </w:p>
-              </w:tc>
-              <w:tc>
-                <w:tcPr/>
-                <w:p>
-                  <w:pPr>
-                    <w:pStyle w:val="Compact"/>
-                    <w:jc w:val="left"/>
-                    <w:jc w:val="center"/>
-                  </w:pPr>
-                  <w:r>
-                    <w:t xml:space="preserve">West</w:t>
-                  </w:r>
-                </w:p>
-              </w:tc>
-              <w:tc>
-                <w:tcPr/>
-                <w:p>
-                  <w:pPr>
-                    <w:pStyle w:val="Compact"/>
-                    <w:jc w:val="left"/>
-                    <w:jc w:val="center"/>
-                  </w:pPr>
-                  <w:r>
-                    <w:t xml:space="preserve">Suisun Marsh</w:t>
-                  </w:r>
-                </w:p>
-              </w:tc>
-              <w:tc>
-                <w:tcPr/>
-                <w:p>
-                  <w:pPr>
-                    <w:pStyle w:val="Compact"/>
-                    <w:jc w:val="left"/>
-                    <w:jc w:val="center"/>
-                  </w:pPr>
-                  <w:r>
-                    <w:t xml:space="preserve">Juvenile</w:t>
-                  </w:r>
-                </w:p>
-              </w:tc>
-              <w:tc>
-                <w:tcPr/>
-                <w:p>
-                  <w:pPr>
-                    <w:pStyle w:val="Compact"/>
-                    <w:jc w:val="right"/>
-                    <w:jc w:val="center"/>
-                  </w:pPr>
-                  <w:r>
-                    <w:t xml:space="preserve">4</w:t>
                   </w:r>
                 </w:p>
               </w:tc>
@@ -1262,7 +1108,7 @@
         </w:numPr>
       </w:pPr>
       <w:r>
-        <w:t xml:space="preserve">Not relevant</w:t>
+        <w:t xml:space="preserve">Implemented 12/25/25-01/7/26</w:t>
       </w:r>
     </w:p>
     <w:bookmarkEnd w:id="35"/>
@@ -1287,14 +1133,24 @@
     </w:p>
     <w:p>
       <w:pPr>
-        <w:pStyle w:val="Compact"/>
         <w:numPr>
           <w:ilvl w:val="0"/>
           <w:numId w:val="1006"/>
         </w:numPr>
       </w:pPr>
       <w:r>
-        <w:t xml:space="preserve">Not relevant</w:t>
+        <w:t xml:space="preserve">Adult Delta smelt action offramped on 02/12/2026</w:t>
+      </w:r>
+    </w:p>
+    <w:p>
+      <w:pPr>
+        <w:numPr>
+          <w:ilvl w:val="0"/>
+          <w:numId w:val="1006"/>
+        </w:numPr>
+      </w:pPr>
+      <w:r>
+        <w:t xml:space="preserve">No adult Delta smelt action was taken in WY26</w:t>
       </w:r>
     </w:p>
     <w:p>
@@ -1438,52 +1294,7 @@
         </w:numPr>
       </w:pPr>
       <w:r>
-        <w:t xml:space="preserve">After the start of entrainment management, is JPF &lt; 0 and is daily average turbidity</w:t>
-      </w:r>
-      <w:r>
-        <w:t xml:space="preserve"> </w:t>
-      </w:r>
-      <m:oMath>
-        <m:r>
-          <m:rPr>
-            <m:sty m:val="p"/>
-          </m:rPr>
-          <m:t>≥</m:t>
-        </m:r>
-      </m:oMath>
-      <w:r>
-        <w:t xml:space="preserve"> </w:t>
-      </w:r>
-      <w:r>
-        <w:t xml:space="preserve">12 FNU in the OMR corridor (stations OBI, HOL, and OSJ)?</w:t>
-      </w:r>
-    </w:p>
-    <w:p>
-      <w:pPr>
-        <w:numPr>
-          <w:ilvl w:val="0"/>
-          <w:numId w:val="1000"/>
-        </w:numPr>
-      </w:pPr>
-      <w:r>
-        <w:t xml:space="preserve">The turbidity in the OMR corridor is not likely to be exceeded this week,</w:t>
-      </w:r>
-      <w:r>
-        <w:t xml:space="preserve"> </w:t>
-      </w:r>
-      <w:r>
-        <w:t xml:space="preserve">and JPF is predicted to stay above 0 cfs.</w:t>
-      </w:r>
-    </w:p>
-    <w:p>
-      <w:pPr>
-        <w:numPr>
-          <w:ilvl w:val="0"/>
-          <w:numId w:val="1009"/>
-        </w:numPr>
-      </w:pPr>
-      <w:r>
-        <w:t xml:space="preserve">Has the average water temperature at Jersey Point or Rio Vista not exceeded 53.6</w:t>
+        <w:t xml:space="preserve">After the start of entrainment management, is JPF &lt; 0, is daily average turbidity ≥ 12 FNU in the OMR corridor (stations OBI, HOL, and OSJ)? Has the average water temperature at Jersey Point or Rio Vista not exceeded 53.6</w:t>
       </w:r>
       <m:oMath>
         <m:sSup>
@@ -1534,19 +1345,25 @@
         </w:numPr>
       </w:pPr>
       <w:r>
+        <w:t xml:space="preserve">The adult Delta smelt entrainment action is not active and no action was taken in WY26.</w:t>
+      </w:r>
+      <w:r>
+        <w:t xml:space="preserve"> </w:t>
+      </w:r>
+      <w:r>
         <w:t xml:space="preserve">Temperature at Jersey Point exceeded the threshold on February 12th, 2025. Jersey</w:t>
       </w:r>
       <w:r>
         <w:t xml:space="preserve"> </w:t>
       </w:r>
       <w:r>
-        <w:t xml:space="preserve">Point 3 day average temperature was (12.05°C) on February 10th, (12.09°C) on February 11th</w:t>
-      </w:r>
-      <w:r>
-        <w:t xml:space="preserve"> </w:t>
-      </w:r>
-      <w:r>
-        <w:t xml:space="preserve">and (12.13°C) on February 12th.</w:t>
+        <w:t xml:space="preserve">Point 3-day average temperature was 12.05°C on February 10th, 12.09°C on February 11th,</w:t>
+      </w:r>
+      <w:r>
+        <w:t xml:space="preserve"> </w:t>
+      </w:r>
+      <w:r>
+        <w:t xml:space="preserve">and 12.13°C on February 12th.</w:t>
       </w:r>
     </w:p>
     <w:p>
@@ -1568,7 +1385,7 @@
         </w:numPr>
       </w:pPr>
       <w:r>
-        <w:t xml:space="preserve">Upstream migration for Delta smelt occurs between September and December and in response</w:t>
+        <w:t xml:space="preserve">Upstream migration for Delta smelt occurs between December and March and in response</w:t>
       </w:r>
       <w:r>
         <w:t xml:space="preserve"> </w:t>
@@ -1586,25 +1403,19 @@
         <w:t xml:space="preserve"> </w:t>
       </w:r>
       <w:r>
-        <w:t xml:space="preserve">conditions (Sommer et al. 2011, Grimaldo et al. 2009). Migration typically ranges one</w:t>
-      </w:r>
-      <w:r>
-        <w:t xml:space="preserve"> </w:t>
-      </w:r>
-      <w:r>
-        <w:t xml:space="preserve">to four weeks after flow and turbidity increases, based on salvage data (Sommer et al. 2011).</w:t>
-      </w:r>
-      <w:r>
-        <w:t xml:space="preserve"> </w:t>
-      </w:r>
-      <w:r>
-        <w:t xml:space="preserve">Historically, detections of ripe Delta smelt began in January and peaked in February and March and</w:t>
-      </w:r>
-      <w:r>
-        <w:t xml:space="preserve"> </w:t>
-      </w:r>
-      <w:r>
-        <w:t xml:space="preserve">the majority of Delta Smelt spawning occurs within a temperature range of 9-18˚C (Damon et al. 2016).</w:t>
+        <w:t xml:space="preserve">conditions (Sommer et al., 2011; Grimaldo et al. 2009; 2021). Historically, detections</w:t>
+      </w:r>
+      <w:r>
+        <w:t xml:space="preserve"> </w:t>
+      </w:r>
+      <w:r>
+        <w:t xml:space="preserve">of ripe Delta smelt began in January and peaked in February and March and</w:t>
+      </w:r>
+      <w:r>
+        <w:t xml:space="preserve"> </w:t>
+      </w:r>
+      <w:r>
+        <w:t xml:space="preserve">the majority of Delta Smelt spawning occurs at 11-15˚C (but can occur from 8-18˚C) (Damon et al. 2016).</w:t>
       </w:r>
       <w:r>
         <w:t xml:space="preserve"> </w:t>
@@ -1639,25 +1450,13 @@
         <w:t xml:space="preserve"> </w:t>
       </w:r>
       <w:r>
-        <w:t xml:space="preserve">Because first flush conditions were met on December 23, 2025, spawning is likely occurring,</w:t>
-      </w:r>
-      <w:r>
-        <w:t xml:space="preserve"> </w:t>
-      </w:r>
-      <w:r>
-        <w:t xml:space="preserve">consistent with the typical one- to four-week response window following increased</w:t>
-      </w:r>
-      <w:r>
-        <w:t xml:space="preserve"> </w:t>
-      </w:r>
-      <w:r>
-        <w:t xml:space="preserve">flow and turbidity. Survey captures at Chipps Island and the Sacramento Deep Water Ship Channel are consistent</w:t>
-      </w:r>
-      <w:r>
-        <w:t xml:space="preserve"> </w:t>
-      </w:r>
-      <w:r>
-        <w:t xml:space="preserve">with an upstream spawning migration into tidal freshwater habitats.</w:t>
+        <w:t xml:space="preserve">The large majority of Delta smelt recaptures continue to be from Suisun Marsh, close to</w:t>
+      </w:r>
+      <w:r>
+        <w:t xml:space="preserve"> </w:t>
+      </w:r>
+      <w:r>
+        <w:t xml:space="preserve">where supplemental fish were released in the fall.</w:t>
       </w:r>
     </w:p>
     <w:p>
@@ -1668,7 +1467,7 @@
         </w:numPr>
       </w:pPr>
       <w:r>
-        <w:t xml:space="preserve">After the onset of spawning, have the following conditions occurred:</w:t>
+        <w:t xml:space="preserve">After the onset of spawning, have the following conditions occurred: JPF &lt; 0 cfs, average turbidity is</w:t>
       </w:r>
       <w:r>
         <w:t xml:space="preserve"> </w:t>
@@ -1685,6 +1484,23 @@
         <w:t xml:space="preserve"> </w:t>
       </w:r>
       <w:r>
+        <w:t xml:space="preserve">12 FNU in the south Delta, and PTM modeling indicates the action would avoid</w:t>
+      </w:r>
+      <w:r>
+        <w:t xml:space="preserve"> </w:t>
+      </w:r>
+      <m:oMath>
+        <m:r>
+          <m:rPr>
+            <m:sty m:val="p"/>
+          </m:rPr>
+          <m:t>≥</m:t>
+        </m:r>
+      </m:oMath>
+      <w:r>
+        <w:t xml:space="preserve"> </w:t>
+      </w:r>
+      <w:r>
         <w:t xml:space="preserve">5% entrainment of the Delta smelt population at facilities after 30 days?</w:t>
       </w:r>
     </w:p>
@@ -1696,19 +1512,55 @@
         </w:numPr>
       </w:pPr>
       <w:r>
-        <w:t xml:space="preserve">Although spawning may occur during the current assessment period, JPF is above 0 cfs</w:t>
-      </w:r>
-      <w:r>
-        <w:t xml:space="preserve"> </w:t>
-      </w:r>
-      <w:r>
-        <w:t xml:space="preserve">and average turbidity in the South Delta is low; therefore, the conditions required</w:t>
-      </w:r>
-      <w:r>
-        <w:t xml:space="preserve"> </w:t>
-      </w:r>
-      <w:r>
-        <w:t xml:space="preserve">to trigger larval and juvenile Delta smelt entrainment management are not met.</w:t>
+        <w:t xml:space="preserve">Although spawning may be occurring, JPF is above 0 cfs. SLS 5 is on the water this</w:t>
+      </w:r>
+      <w:r>
+        <w:t xml:space="preserve"> </w:t>
+      </w:r>
+      <w:r>
+        <w:t xml:space="preserve">week and will provide an updated average south Delta turbidity. Due to JPF &gt; 0 this week, the conditions required</w:t>
+      </w:r>
+      <w:r>
+        <w:t xml:space="preserve"> </w:t>
+      </w:r>
+      <w:r>
+        <w:t xml:space="preserve">to trigger larval and juvenile Delta smelt entrainment management will not be met. No Delta smelt larvae</w:t>
+      </w:r>
+      <w:r>
+        <w:t xml:space="preserve"> </w:t>
+      </w:r>
+      <w:r>
+        <w:t xml:space="preserve">have been captured in SLS surveys in WY26 to date. Therefore, if a Storm Flex were to be implemented this week, fates of particles</w:t>
+      </w:r>
+      <w:r>
+        <w:t xml:space="preserve"> </w:t>
+      </w:r>
+      <w:r>
+        <w:t xml:space="preserve">injected at Chipps Island or Cache Slough would be most relevant for larvae, as those locations are closest to recent adult distribution.</w:t>
+      </w:r>
+      <w:r>
+        <w:t xml:space="preserve"> </w:t>
+      </w:r>
+      <w:r>
+        <w:t xml:space="preserve">PTM with neutrally buoyant particles injected at Chipps Island and Cache Slough show 0% of particles entrained for the week ending 2/23/2026</w:t>
+      </w:r>
+      <w:r>
+        <w:t xml:space="preserve"> </w:t>
+      </w:r>
+      <w:r>
+        <w:t xml:space="preserve">for all OMR levels (-2,000, -3,500, -5,000, and -6,500 cfs). For week 2 (ending 3/02/2026), 0.1 and 0.3% of particles</w:t>
+      </w:r>
+      <w:r>
+        <w:t xml:space="preserve"> </w:t>
+      </w:r>
+      <w:r>
+        <w:t xml:space="preserve">were entrained at CVP and SWP, respectively, at OMRI of -6,500 cfs, and 0% for OMRI of -5,000 cfs (see Appendix A for details).</w:t>
+      </w:r>
+      <w:r>
+        <w:t xml:space="preserve"> </w:t>
+      </w:r>
+      <w:r>
+        <w:t xml:space="preserve">These results indicate that if Delta smelt larvae were present, the risk of entrainment under potential Stormflex operations would be low.</w:t>
       </w:r>
     </w:p>
     <w:bookmarkEnd w:id="42"/>
@@ -1749,7 +1601,7 @@
         <w:t xml:space="preserve"> </w:t>
       </w:r>
       <w:r>
-        <w:t xml:space="preserve">Juvenile, Adult</w:t>
+        <w:t xml:space="preserve">Adult, Juvenile</w:t>
       </w:r>
     </w:p>
     <w:p>
@@ -1770,7 +1622,7 @@
         <w:t xml:space="preserve"> </w:t>
       </w:r>
       <w:r>
-        <w:t xml:space="preserve">354 adult, 683 juvenile, and 1300 larval longfin smelt have been detected this water year. See</w:t>
+        <w:t xml:space="preserve">412 adult, 972 juvenile, and 1776 larval longfin smelt have been detected this water year. See</w:t>
       </w:r>
       <w:r>
         <w:t xml:space="preserve"> </w:t>
@@ -1982,59 +1834,59 @@
                     <w:jc w:val="center"/>
                   </w:pPr>
                   <w:r>
-                    <w:t xml:space="preserve">EDSM</w:t>
-                  </w:r>
-                </w:p>
-              </w:tc>
-              <w:tc>
-                <w:tcPr/>
-                <w:p>
-                  <w:pPr>
-                    <w:pStyle w:val="Compact"/>
-                    <w:jc w:val="left"/>
-                    <w:jc w:val="center"/>
-                  </w:pPr>
-                  <w:r>
-                    <w:t xml:space="preserve">2026-02-06</w:t>
-                  </w:r>
-                </w:p>
-              </w:tc>
-              <w:tc>
-                <w:tcPr/>
-                <w:p>
-                  <w:pPr>
-                    <w:pStyle w:val="Compact"/>
-                    <w:jc w:val="left"/>
-                    <w:jc w:val="center"/>
-                  </w:pPr>
-                  <w:r>
-                    <w:t xml:space="preserve">West</w:t>
-                  </w:r>
-                </w:p>
-              </w:tc>
-              <w:tc>
-                <w:tcPr/>
-                <w:p>
-                  <w:pPr>
-                    <w:pStyle w:val="Compact"/>
-                    <w:jc w:val="left"/>
-                    <w:jc w:val="center"/>
-                  </w:pPr>
-                  <w:r>
-                    <w:t xml:space="preserve">Suisun Marsh</w:t>
-                  </w:r>
-                </w:p>
-              </w:tc>
-              <w:tc>
-                <w:tcPr/>
-                <w:p>
-                  <w:pPr>
-                    <w:pStyle w:val="Compact"/>
-                    <w:jc w:val="left"/>
-                    <w:jc w:val="center"/>
-                  </w:pPr>
-                  <w:r>
-                    <w:t xml:space="preserve">Juvenile</w:t>
+                    <w:t xml:space="preserve">DJFMP</w:t>
+                  </w:r>
+                </w:p>
+              </w:tc>
+              <w:tc>
+                <w:tcPr/>
+                <w:p>
+                  <w:pPr>
+                    <w:pStyle w:val="Compact"/>
+                    <w:jc w:val="left"/>
+                    <w:jc w:val="center"/>
+                  </w:pPr>
+                  <w:r>
+                    <w:t xml:space="preserve">2026-02-17</w:t>
+                  </w:r>
+                </w:p>
+              </w:tc>
+              <w:tc>
+                <w:tcPr/>
+                <w:p>
+                  <w:pPr>
+                    <w:pStyle w:val="Compact"/>
+                    <w:jc w:val="left"/>
+                    <w:jc w:val="center"/>
+                  </w:pPr>
+                  <w:r>
+                    <w:t xml:space="preserve">N/A</w:t>
+                  </w:r>
+                </w:p>
+              </w:tc>
+              <w:tc>
+                <w:tcPr/>
+                <w:p>
+                  <w:pPr>
+                    <w:pStyle w:val="Compact"/>
+                    <w:jc w:val="left"/>
+                    <w:jc w:val="center"/>
+                  </w:pPr>
+                  <w:r>
+                    <w:t xml:space="preserve">Chipps Island</w:t>
+                  </w:r>
+                </w:p>
+              </w:tc>
+              <w:tc>
+                <w:tcPr/>
+                <w:p>
+                  <w:pPr>
+                    <w:pStyle w:val="Compact"/>
+                    <w:jc w:val="left"/>
+                    <w:jc w:val="center"/>
+                  </w:pPr>
+                  <w:r>
+                    <w:t xml:space="preserve">Adult</w:t>
                   </w:r>
                 </w:p>
               </w:tc>
@@ -2047,7 +1899,7 @@
                     <w:jc w:val="center"/>
                   </w:pPr>
                   <w:r>
-                    <w:t xml:space="preserve">3</w:t>
+                    <w:t xml:space="preserve">1</w:t>
                   </w:r>
                 </w:p>
               </w:tc>
@@ -2062,59 +1914,59 @@
                     <w:jc w:val="center"/>
                   </w:pPr>
                   <w:r>
-                    <w:t xml:space="preserve">EDSM</w:t>
-                  </w:r>
-                </w:p>
-              </w:tc>
-              <w:tc>
-                <w:tcPr/>
-                <w:p>
-                  <w:pPr>
-                    <w:pStyle w:val="Compact"/>
-                    <w:jc w:val="left"/>
-                    <w:jc w:val="center"/>
-                  </w:pPr>
-                  <w:r>
-                    <w:t xml:space="preserve">2026-02-09</w:t>
-                  </w:r>
-                </w:p>
-              </w:tc>
-              <w:tc>
-                <w:tcPr/>
-                <w:p>
-                  <w:pPr>
-                    <w:pStyle w:val="Compact"/>
-                    <w:jc w:val="left"/>
-                    <w:jc w:val="center"/>
-                  </w:pPr>
-                  <w:r>
-                    <w:t xml:space="preserve">Far West</w:t>
-                  </w:r>
-                </w:p>
-              </w:tc>
-              <w:tc>
-                <w:tcPr/>
-                <w:p>
-                  <w:pPr>
-                    <w:pStyle w:val="Compact"/>
-                    <w:jc w:val="left"/>
-                    <w:jc w:val="center"/>
-                  </w:pPr>
-                  <w:r>
-                    <w:t xml:space="preserve">Western Delta</w:t>
-                  </w:r>
-                </w:p>
-              </w:tc>
-              <w:tc>
-                <w:tcPr/>
-                <w:p>
-                  <w:pPr>
-                    <w:pStyle w:val="Compact"/>
-                    <w:jc w:val="left"/>
-                    <w:jc w:val="center"/>
-                  </w:pPr>
-                  <w:r>
-                    <w:t xml:space="preserve">Juvenile</w:t>
+                    <w:t xml:space="preserve">DJFMP</w:t>
+                  </w:r>
+                </w:p>
+              </w:tc>
+              <w:tc>
+                <w:tcPr/>
+                <w:p>
+                  <w:pPr>
+                    <w:pStyle w:val="Compact"/>
+                    <w:jc w:val="left"/>
+                    <w:jc w:val="center"/>
+                  </w:pPr>
+                  <w:r>
+                    <w:t xml:space="preserve">2026-02-25</w:t>
+                  </w:r>
+                </w:p>
+              </w:tc>
+              <w:tc>
+                <w:tcPr/>
+                <w:p>
+                  <w:pPr>
+                    <w:pStyle w:val="Compact"/>
+                    <w:jc w:val="left"/>
+                    <w:jc w:val="center"/>
+                  </w:pPr>
+                  <w:r>
+                    <w:t xml:space="preserve">N/A</w:t>
+                  </w:r>
+                </w:p>
+              </w:tc>
+              <w:tc>
+                <w:tcPr/>
+                <w:p>
+                  <w:pPr>
+                    <w:pStyle w:val="Compact"/>
+                    <w:jc w:val="left"/>
+                    <w:jc w:val="center"/>
+                  </w:pPr>
+                  <w:r>
+                    <w:t xml:space="preserve">Chipps Island</w:t>
+                  </w:r>
+                </w:p>
+              </w:tc>
+              <w:tc>
+                <w:tcPr/>
+                <w:p>
+                  <w:pPr>
+                    <w:pStyle w:val="Compact"/>
+                    <w:jc w:val="left"/>
+                    <w:jc w:val="center"/>
+                  </w:pPr>
+                  <w:r>
+                    <w:t xml:space="preserve">Adult</w:t>
                   </w:r>
                 </w:p>
               </w:tc>
@@ -2127,7 +1979,7 @@
                     <w:jc w:val="center"/>
                   </w:pPr>
                   <w:r>
-                    <w:t xml:space="preserve">1</w:t>
+                    <w:t xml:space="preserve">3</w:t>
                   </w:r>
                 </w:p>
               </w:tc>
@@ -2142,59 +1994,59 @@
                     <w:jc w:val="center"/>
                   </w:pPr>
                   <w:r>
-                    <w:t xml:space="preserve">EDSM</w:t>
-                  </w:r>
-                </w:p>
-              </w:tc>
-              <w:tc>
-                <w:tcPr/>
-                <w:p>
-                  <w:pPr>
-                    <w:pStyle w:val="Compact"/>
-                    <w:jc w:val="left"/>
-                    <w:jc w:val="center"/>
-                  </w:pPr>
-                  <w:r>
-                    <w:t xml:space="preserve">2026-02-10</w:t>
-                  </w:r>
-                </w:p>
-              </w:tc>
-              <w:tc>
-                <w:tcPr/>
-                <w:p>
-                  <w:pPr>
-                    <w:pStyle w:val="Compact"/>
-                    <w:jc w:val="left"/>
-                    <w:jc w:val="center"/>
-                  </w:pPr>
-                  <w:r>
-                    <w:t xml:space="preserve">West</w:t>
-                  </w:r>
-                </w:p>
-              </w:tc>
-              <w:tc>
-                <w:tcPr/>
-                <w:p>
-                  <w:pPr>
-                    <w:pStyle w:val="Compact"/>
-                    <w:jc w:val="left"/>
-                    <w:jc w:val="center"/>
-                  </w:pPr>
-                  <w:r>
-                    <w:t xml:space="preserve">Suisun Marsh</w:t>
-                  </w:r>
-                </w:p>
-              </w:tc>
-              <w:tc>
-                <w:tcPr/>
-                <w:p>
-                  <w:pPr>
-                    <w:pStyle w:val="Compact"/>
-                    <w:jc w:val="left"/>
-                    <w:jc w:val="center"/>
-                  </w:pPr>
-                  <w:r>
-                    <w:t xml:space="preserve">Adult</w:t>
+                    <w:t xml:space="preserve">DJFMP</w:t>
+                  </w:r>
+                </w:p>
+              </w:tc>
+              <w:tc>
+                <w:tcPr/>
+                <w:p>
+                  <w:pPr>
+                    <w:pStyle w:val="Compact"/>
+                    <w:jc w:val="left"/>
+                    <w:jc w:val="center"/>
+                  </w:pPr>
+                  <w:r>
+                    <w:t xml:space="preserve">2026-02-25</w:t>
+                  </w:r>
+                </w:p>
+              </w:tc>
+              <w:tc>
+                <w:tcPr/>
+                <w:p>
+                  <w:pPr>
+                    <w:pStyle w:val="Compact"/>
+                    <w:jc w:val="left"/>
+                    <w:jc w:val="center"/>
+                  </w:pPr>
+                  <w:r>
+                    <w:t xml:space="preserve">N/A</w:t>
+                  </w:r>
+                </w:p>
+              </w:tc>
+              <w:tc>
+                <w:tcPr/>
+                <w:p>
+                  <w:pPr>
+                    <w:pStyle w:val="Compact"/>
+                    <w:jc w:val="left"/>
+                    <w:jc w:val="center"/>
+                  </w:pPr>
+                  <w:r>
+                    <w:t xml:space="preserve">Chipps Island</w:t>
+                  </w:r>
+                </w:p>
+              </w:tc>
+              <w:tc>
+                <w:tcPr/>
+                <w:p>
+                  <w:pPr>
+                    <w:pStyle w:val="Compact"/>
+                    <w:jc w:val="left"/>
+                    <w:jc w:val="center"/>
+                  </w:pPr>
+                  <w:r>
+                    <w:t xml:space="preserve">Juvenile</w:t>
                   </w:r>
                 </w:p>
               </w:tc>
@@ -2207,7 +2059,7 @@
                     <w:jc w:val="center"/>
                   </w:pPr>
                   <w:r>
-                    <w:t xml:space="preserve">8</w:t>
+                    <w:t xml:space="preserve">1</w:t>
                   </w:r>
                 </w:p>
               </w:tc>
@@ -2222,46 +2074,126 @@
                     <w:jc w:val="center"/>
                   </w:pPr>
                   <w:r>
-                    <w:t xml:space="preserve">EDSM</w:t>
-                  </w:r>
-                </w:p>
-              </w:tc>
-              <w:tc>
-                <w:tcPr/>
-                <w:p>
-                  <w:pPr>
-                    <w:pStyle w:val="Compact"/>
-                    <w:jc w:val="left"/>
-                    <w:jc w:val="center"/>
-                  </w:pPr>
-                  <w:r>
-                    <w:t xml:space="preserve">2026-02-10</w:t>
-                  </w:r>
-                </w:p>
-              </w:tc>
-              <w:tc>
-                <w:tcPr/>
-                <w:p>
-                  <w:pPr>
-                    <w:pStyle w:val="Compact"/>
-                    <w:jc w:val="left"/>
-                    <w:jc w:val="center"/>
-                  </w:pPr>
-                  <w:r>
-                    <w:t xml:space="preserve">West</w:t>
-                  </w:r>
-                </w:p>
-              </w:tc>
-              <w:tc>
-                <w:tcPr/>
-                <w:p>
-                  <w:pPr>
-                    <w:pStyle w:val="Compact"/>
-                    <w:jc w:val="left"/>
-                    <w:jc w:val="center"/>
-                  </w:pPr>
-                  <w:r>
-                    <w:t xml:space="preserve">Suisun Marsh</w:t>
+                    <w:t xml:space="preserve">DJFMP</w:t>
+                  </w:r>
+                </w:p>
+              </w:tc>
+              <w:tc>
+                <w:tcPr/>
+                <w:p>
+                  <w:pPr>
+                    <w:pStyle w:val="Compact"/>
+                    <w:jc w:val="left"/>
+                    <w:jc w:val="center"/>
+                  </w:pPr>
+                  <w:r>
+                    <w:t xml:space="preserve">2026-02-26</w:t>
+                  </w:r>
+                </w:p>
+              </w:tc>
+              <w:tc>
+                <w:tcPr/>
+                <w:p>
+                  <w:pPr>
+                    <w:pStyle w:val="Compact"/>
+                    <w:jc w:val="left"/>
+                    <w:jc w:val="center"/>
+                  </w:pPr>
+                  <w:r>
+                    <w:t xml:space="preserve">N/A</w:t>
+                  </w:r>
+                </w:p>
+              </w:tc>
+              <w:tc>
+                <w:tcPr/>
+                <w:p>
+                  <w:pPr>
+                    <w:pStyle w:val="Compact"/>
+                    <w:jc w:val="left"/>
+                    <w:jc w:val="center"/>
+                  </w:pPr>
+                  <w:r>
+                    <w:t xml:space="preserve">Chipps Island</w:t>
+                  </w:r>
+                </w:p>
+              </w:tc>
+              <w:tc>
+                <w:tcPr/>
+                <w:p>
+                  <w:pPr>
+                    <w:pStyle w:val="Compact"/>
+                    <w:jc w:val="left"/>
+                    <w:jc w:val="center"/>
+                  </w:pPr>
+                  <w:r>
+                    <w:t xml:space="preserve">Adult</w:t>
+                  </w:r>
+                </w:p>
+              </w:tc>
+              <w:tc>
+                <w:tcPr/>
+                <w:p>
+                  <w:pPr>
+                    <w:pStyle w:val="Compact"/>
+                    <w:jc w:val="right"/>
+                    <w:jc w:val="center"/>
+                  </w:pPr>
+                  <w:r>
+                    <w:t xml:space="preserve">1</w:t>
+                  </w:r>
+                </w:p>
+              </w:tc>
+            </w:tr>
+            <w:tr>
+              <w:tc>
+                <w:tcPr/>
+                <w:p>
+                  <w:pPr>
+                    <w:pStyle w:val="Compact"/>
+                    <w:jc w:val="left"/>
+                    <w:jc w:val="center"/>
+                  </w:pPr>
+                  <w:r>
+                    <w:t xml:space="preserve">DJFMP</w:t>
+                  </w:r>
+                </w:p>
+              </w:tc>
+              <w:tc>
+                <w:tcPr/>
+                <w:p>
+                  <w:pPr>
+                    <w:pStyle w:val="Compact"/>
+                    <w:jc w:val="left"/>
+                    <w:jc w:val="center"/>
+                  </w:pPr>
+                  <w:r>
+                    <w:t xml:space="preserve">2026-02-26</w:t>
+                  </w:r>
+                </w:p>
+              </w:tc>
+              <w:tc>
+                <w:tcPr/>
+                <w:p>
+                  <w:pPr>
+                    <w:pStyle w:val="Compact"/>
+                    <w:jc w:val="left"/>
+                    <w:jc w:val="center"/>
+                  </w:pPr>
+                  <w:r>
+                    <w:t xml:space="preserve">N/A</w:t>
+                  </w:r>
+                </w:p>
+              </w:tc>
+              <w:tc>
+                <w:tcPr/>
+                <w:p>
+                  <w:pPr>
+                    <w:pStyle w:val="Compact"/>
+                    <w:jc w:val="left"/>
+                    <w:jc w:val="center"/>
+                  </w:pPr>
+                  <w:r>
+                    <w:t xml:space="preserve">Chipps Island</w:t>
                   </w:r>
                 </w:p>
               </w:tc>
@@ -2287,7 +2219,87 @@
                     <w:jc w:val="center"/>
                   </w:pPr>
                   <w:r>
-                    <w:t xml:space="preserve">21</w:t>
+                    <w:t xml:space="preserve">1</w:t>
+                  </w:r>
+                </w:p>
+              </w:tc>
+            </w:tr>
+            <w:tr>
+              <w:tc>
+                <w:tcPr/>
+                <w:p>
+                  <w:pPr>
+                    <w:pStyle w:val="Compact"/>
+                    <w:jc w:val="left"/>
+                    <w:jc w:val="center"/>
+                  </w:pPr>
+                  <w:r>
+                    <w:t xml:space="preserve">DJFMP</w:t>
+                  </w:r>
+                </w:p>
+              </w:tc>
+              <w:tc>
+                <w:tcPr/>
+                <w:p>
+                  <w:pPr>
+                    <w:pStyle w:val="Compact"/>
+                    <w:jc w:val="left"/>
+                    <w:jc w:val="center"/>
+                  </w:pPr>
+                  <w:r>
+                    <w:t xml:space="preserve">2026-02-27</w:t>
+                  </w:r>
+                </w:p>
+              </w:tc>
+              <w:tc>
+                <w:tcPr/>
+                <w:p>
+                  <w:pPr>
+                    <w:pStyle w:val="Compact"/>
+                    <w:jc w:val="left"/>
+                    <w:jc w:val="center"/>
+                  </w:pPr>
+                  <w:r>
+                    <w:t xml:space="preserve">N/A</w:t>
+                  </w:r>
+                </w:p>
+              </w:tc>
+              <w:tc>
+                <w:tcPr/>
+                <w:p>
+                  <w:pPr>
+                    <w:pStyle w:val="Compact"/>
+                    <w:jc w:val="left"/>
+                    <w:jc w:val="center"/>
+                  </w:pPr>
+                  <w:r>
+                    <w:t xml:space="preserve">Chipps Island</w:t>
+                  </w:r>
+                </w:p>
+              </w:tc>
+              <w:tc>
+                <w:tcPr/>
+                <w:p>
+                  <w:pPr>
+                    <w:pStyle w:val="Compact"/>
+                    <w:jc w:val="left"/>
+                    <w:jc w:val="center"/>
+                  </w:pPr>
+                  <w:r>
+                    <w:t xml:space="preserve">Adult</w:t>
+                  </w:r>
+                </w:p>
+              </w:tc>
+              <w:tc>
+                <w:tcPr/>
+                <w:p>
+                  <w:pPr>
+                    <w:pStyle w:val="Compact"/>
+                    <w:jc w:val="right"/>
+                    <w:jc w:val="center"/>
+                  </w:pPr>
+                  <w:r>
+                    <w:t xml:space="preserve">1</w:t>
                   </w:r>
                 </w:p>
               </w:tc>
@@ -2576,7 +2588,7 @@
                     <w:jc w:val="center"/>
                   </w:pPr>
                   <w:r>
-                    <w:t xml:space="preserve">242</w:t>
+                    <w:t xml:space="preserve">248</w:t>
                   </w:r>
                 </w:p>
               </w:tc>
@@ -2630,7 +2642,7 @@
                     <w:jc w:val="center"/>
                   </w:pPr>
                   <w:r>
-                    <w:t xml:space="preserve">18</w:t>
+                    <w:t xml:space="preserve">20</w:t>
                   </w:r>
                 </w:p>
               </w:tc>
@@ -2645,20 +2657,20 @@
                     <w:jc w:val="center"/>
                   </w:pPr>
                   <w:r>
-                    <w:t xml:space="preserve">EDSM</w:t>
-                  </w:r>
-                </w:p>
-              </w:tc>
-              <w:tc>
-                <w:tcPr/>
-                <w:p>
-                  <w:pPr>
-                    <w:pStyle w:val="Compact"/>
-                    <w:jc w:val="left"/>
-                    <w:jc w:val="center"/>
-                  </w:pPr>
-                  <w:r>
-                    <w:t xml:space="preserve">Far West</w:t>
+                    <w:t xml:space="preserve">DJFMP</w:t>
+                  </w:r>
+                </w:p>
+              </w:tc>
+              <w:tc>
+                <w:tcPr/>
+                <w:p>
+                  <w:pPr>
+                    <w:pStyle w:val="Compact"/>
+                    <w:jc w:val="left"/>
+                    <w:jc w:val="center"/>
+                  </w:pPr>
+                  <w:r>
+                    <w:t xml:space="preserve">NA</w:t>
                   </w:r>
                 </w:p>
               </w:tc>
@@ -2684,7 +2696,7 @@
                     <w:jc w:val="center"/>
                   </w:pPr>
                   <w:r>
-                    <w:t xml:space="preserve">15</w:t>
+                    <w:t xml:space="preserve">1</w:t>
                   </w:r>
                 </w:p>
               </w:tc>
@@ -2725,7 +2737,7 @@
                     <w:jc w:val="center"/>
                   </w:pPr>
                   <w:r>
-                    <w:t xml:space="preserve">Juvenile</w:t>
+                    <w:t xml:space="preserve">Adult</w:t>
                   </w:r>
                 </w:p>
               </w:tc>
@@ -2738,7 +2750,7 @@
                     <w:jc w:val="center"/>
                   </w:pPr>
                   <w:r>
-                    <w:t xml:space="preserve">61</w:t>
+                    <w:t xml:space="preserve">15</w:t>
                   </w:r>
                 </w:p>
               </w:tc>
@@ -2766,7 +2778,7 @@
                     <w:jc w:val="center"/>
                   </w:pPr>
                   <w:r>
-                    <w:t xml:space="preserve">North</w:t>
+                    <w:t xml:space="preserve">Far West</w:t>
                   </w:r>
                 </w:p>
               </w:tc>
@@ -2792,7 +2804,7 @@
                     <w:jc w:val="center"/>
                   </w:pPr>
                   <w:r>
-                    <w:t xml:space="preserve">1</w:t>
+                    <w:t xml:space="preserve">61</w:t>
                   </w:r>
                 </w:p>
               </w:tc>
@@ -2820,20 +2832,20 @@
                     <w:jc w:val="center"/>
                   </w:pPr>
                   <w:r>
-                    <w:t xml:space="preserve">West</w:t>
-                  </w:r>
-                </w:p>
-              </w:tc>
-              <w:tc>
-                <w:tcPr/>
-                <w:p>
-                  <w:pPr>
-                    <w:pStyle w:val="Compact"/>
-                    <w:jc w:val="left"/>
-                    <w:jc w:val="center"/>
-                  </w:pPr>
-                  <w:r>
-                    <w:t xml:space="preserve">Adult</w:t>
+                    <w:t xml:space="preserve">North</w:t>
+                  </w:r>
+                </w:p>
+              </w:tc>
+              <w:tc>
+                <w:tcPr/>
+                <w:p>
+                  <w:pPr>
+                    <w:pStyle w:val="Compact"/>
+                    <w:jc w:val="left"/>
+                    <w:jc w:val="center"/>
+                  </w:pPr>
+                  <w:r>
+                    <w:t xml:space="preserve">Juvenile</w:t>
                   </w:r>
                 </w:p>
               </w:tc>
@@ -2846,7 +2858,7 @@
                     <w:jc w:val="center"/>
                   </w:pPr>
                   <w:r>
-                    <w:t xml:space="preserve">80</w:t>
+                    <w:t xml:space="preserve">1</w:t>
                   </w:r>
                 </w:p>
               </w:tc>
@@ -2887,7 +2899,7 @@
                     <w:jc w:val="center"/>
                   </w:pPr>
                   <w:r>
-                    <w:t xml:space="preserve">Juvenile</w:t>
+                    <w:t xml:space="preserve">Adult</w:t>
                   </w:r>
                 </w:p>
               </w:tc>
@@ -2900,7 +2912,7 @@
                     <w:jc w:val="center"/>
                   </w:pPr>
                   <w:r>
-                    <w:t xml:space="preserve">191</w:t>
+                    <w:t xml:space="preserve">80</w:t>
                   </w:r>
                 </w:p>
               </w:tc>
@@ -2915,33 +2927,33 @@
                     <w:jc w:val="center"/>
                   </w:pPr>
                   <w:r>
-                    <w:t xml:space="preserve">FMWT</w:t>
-                  </w:r>
-                </w:p>
-              </w:tc>
-              <w:tc>
-                <w:tcPr/>
-                <w:p>
-                  <w:pPr>
-                    <w:pStyle w:val="Compact"/>
-                    <w:jc w:val="left"/>
-                    <w:jc w:val="center"/>
-                  </w:pPr>
-                  <w:r>
-                    <w:t xml:space="preserve">Bay</w:t>
-                  </w:r>
-                </w:p>
-              </w:tc>
-              <w:tc>
-                <w:tcPr/>
-                <w:p>
-                  <w:pPr>
-                    <w:pStyle w:val="Compact"/>
-                    <w:jc w:val="left"/>
-                    <w:jc w:val="center"/>
-                  </w:pPr>
-                  <w:r>
-                    <w:t xml:space="preserve">Adult</w:t>
+                    <w:t xml:space="preserve">EDSM</w:t>
+                  </w:r>
+                </w:p>
+              </w:tc>
+              <w:tc>
+                <w:tcPr/>
+                <w:p>
+                  <w:pPr>
+                    <w:pStyle w:val="Compact"/>
+                    <w:jc w:val="left"/>
+                    <w:jc w:val="center"/>
+                  </w:pPr>
+                  <w:r>
+                    <w:t xml:space="preserve">West</w:t>
+                  </w:r>
+                </w:p>
+              </w:tc>
+              <w:tc>
+                <w:tcPr/>
+                <w:p>
+                  <w:pPr>
+                    <w:pStyle w:val="Compact"/>
+                    <w:jc w:val="left"/>
+                    <w:jc w:val="center"/>
+                  </w:pPr>
+                  <w:r>
+                    <w:t xml:space="preserve">Juvenile</w:t>
                   </w:r>
                 </w:p>
               </w:tc>
@@ -2954,7 +2966,7 @@
                     <w:jc w:val="center"/>
                   </w:pPr>
                   <w:r>
-                    <w:t xml:space="preserve">1</w:t>
+                    <w:t xml:space="preserve">191</w:t>
                   </w:r>
                 </w:p>
               </w:tc>
@@ -2995,7 +3007,7 @@
                     <w:jc w:val="center"/>
                   </w:pPr>
                   <w:r>
-                    <w:t xml:space="preserve">Juvenile</w:t>
+                    <w:t xml:space="preserve">Adult</w:t>
                   </w:r>
                 </w:p>
               </w:tc>
@@ -3008,7 +3020,7 @@
                     <w:jc w:val="center"/>
                   </w:pPr>
                   <w:r>
-                    <w:t xml:space="preserve">14</w:t>
+                    <w:t xml:space="preserve">1</w:t>
                   </w:r>
                 </w:p>
               </w:tc>
@@ -3036,20 +3048,20 @@
                     <w:jc w:val="center"/>
                   </w:pPr>
                   <w:r>
-                    <w:t xml:space="preserve">Far West</w:t>
-                  </w:r>
-                </w:p>
-              </w:tc>
-              <w:tc>
-                <w:tcPr/>
-                <w:p>
-                  <w:pPr>
-                    <w:pStyle w:val="Compact"/>
-                    <w:jc w:val="left"/>
-                    <w:jc w:val="center"/>
-                  </w:pPr>
-                  <w:r>
-                    <w:t xml:space="preserve">Adult</w:t>
+                    <w:t xml:space="preserve">Bay</w:t>
+                  </w:r>
+                </w:p>
+              </w:tc>
+              <w:tc>
+                <w:tcPr/>
+                <w:p>
+                  <w:pPr>
+                    <w:pStyle w:val="Compact"/>
+                    <w:jc w:val="left"/>
+                    <w:jc w:val="center"/>
+                  </w:pPr>
+                  <w:r>
+                    <w:t xml:space="preserve">Juvenile</w:t>
                   </w:r>
                 </w:p>
               </w:tc>
@@ -3062,7 +3074,7 @@
                     <w:jc w:val="center"/>
                   </w:pPr>
                   <w:r>
-                    <w:t xml:space="preserve">2</w:t>
+                    <w:t xml:space="preserve">14</w:t>
                   </w:r>
                 </w:p>
               </w:tc>
@@ -3103,7 +3115,7 @@
                     <w:jc w:val="center"/>
                   </w:pPr>
                   <w:r>
-                    <w:t xml:space="preserve">Juvenile</w:t>
+                    <w:t xml:space="preserve">Adult</w:t>
                   </w:r>
                 </w:p>
               </w:tc>
@@ -3116,7 +3128,7 @@
                     <w:jc w:val="center"/>
                   </w:pPr>
                   <w:r>
-                    <w:t xml:space="preserve">14</w:t>
+                    <w:t xml:space="preserve">2</w:t>
                   </w:r>
                 </w:p>
               </w:tc>
@@ -3144,20 +3156,20 @@
                     <w:jc w:val="center"/>
                   </w:pPr>
                   <w:r>
-                    <w:t xml:space="preserve">West</w:t>
-                  </w:r>
-                </w:p>
-              </w:tc>
-              <w:tc>
-                <w:tcPr/>
-                <w:p>
-                  <w:pPr>
-                    <w:pStyle w:val="Compact"/>
-                    <w:jc w:val="left"/>
-                    <w:jc w:val="center"/>
-                  </w:pPr>
-                  <w:r>
-                    <w:t xml:space="preserve">Adult</w:t>
+                    <w:t xml:space="preserve">Far West</w:t>
+                  </w:r>
+                </w:p>
+              </w:tc>
+              <w:tc>
+                <w:tcPr/>
+                <w:p>
+                  <w:pPr>
+                    <w:pStyle w:val="Compact"/>
+                    <w:jc w:val="left"/>
+                    <w:jc w:val="center"/>
+                  </w:pPr>
+                  <w:r>
+                    <w:t xml:space="preserve">Juvenile</w:t>
                   </w:r>
                 </w:p>
               </w:tc>
@@ -3170,7 +3182,7 @@
                     <w:jc w:val="center"/>
                   </w:pPr>
                   <w:r>
-                    <w:t xml:space="preserve">4</w:t>
+                    <w:t xml:space="preserve">14</w:t>
                   </w:r>
                 </w:p>
               </w:tc>
@@ -3211,7 +3223,7 @@
                     <w:jc w:val="center"/>
                   </w:pPr>
                   <w:r>
-                    <w:t xml:space="preserve">Juvenile</w:t>
+                    <w:t xml:space="preserve">Adult</w:t>
                   </w:r>
                 </w:p>
               </w:tc>
@@ -3224,7 +3236,7 @@
                     <w:jc w:val="center"/>
                   </w:pPr>
                   <w:r>
-                    <w:t xml:space="preserve">18</w:t>
+                    <w:t xml:space="preserve">4</w:t>
                   </w:r>
                 </w:p>
               </w:tc>
@@ -3252,20 +3264,20 @@
                     <w:jc w:val="center"/>
                   </w:pPr>
                   <w:r>
-                    <w:t xml:space="preserve">NA</w:t>
-                  </w:r>
-                </w:p>
-              </w:tc>
-              <w:tc>
-                <w:tcPr/>
-                <w:p>
-                  <w:pPr>
-                    <w:pStyle w:val="Compact"/>
-                    <w:jc w:val="left"/>
-                    <w:jc w:val="center"/>
-                  </w:pPr>
-                  <w:r>
-                    <w:t xml:space="preserve">Adult</w:t>
+                    <w:t xml:space="preserve">West</w:t>
+                  </w:r>
+                </w:p>
+              </w:tc>
+              <w:tc>
+                <w:tcPr/>
+                <w:p>
+                  <w:pPr>
+                    <w:pStyle w:val="Compact"/>
+                    <w:jc w:val="left"/>
+                    <w:jc w:val="center"/>
+                  </w:pPr>
+                  <w:r>
+                    <w:t xml:space="preserve">Juvenile</w:t>
                   </w:r>
                 </w:p>
               </w:tc>
@@ -3278,7 +3290,7 @@
                     <w:jc w:val="center"/>
                   </w:pPr>
                   <w:r>
-                    <w:t xml:space="preserve">2</w:t>
+                    <w:t xml:space="preserve">18</w:t>
                   </w:r>
                 </w:p>
               </w:tc>
@@ -3319,7 +3331,7 @@
                     <w:jc w:val="center"/>
                   </w:pPr>
                   <w:r>
-                    <w:t xml:space="preserve">Juvenile</w:t>
+                    <w:t xml:space="preserve">Adult</w:t>
                   </w:r>
                 </w:p>
               </w:tc>
@@ -3332,7 +3344,7 @@
                     <w:jc w:val="center"/>
                   </w:pPr>
                   <w:r>
-                    <w:t xml:space="preserve">28</w:t>
+                    <w:t xml:space="preserve">2</w:t>
                   </w:r>
                 </w:p>
               </w:tc>
@@ -3347,33 +3359,33 @@
                     <w:jc w:val="center"/>
                   </w:pPr>
                   <w:r>
-                    <w:t xml:space="preserve">baystudy</w:t>
-                  </w:r>
-                </w:p>
-              </w:tc>
-              <w:tc>
-                <w:tcPr/>
-                <w:p>
-                  <w:pPr>
-                    <w:pStyle w:val="Compact"/>
-                    <w:jc w:val="left"/>
-                    <w:jc w:val="center"/>
-                  </w:pPr>
-                  <w:r>
-                    <w:t xml:space="preserve">Bay</w:t>
-                  </w:r>
-                </w:p>
-              </w:tc>
-              <w:tc>
-                <w:tcPr/>
-                <w:p>
-                  <w:pPr>
-                    <w:pStyle w:val="Compact"/>
-                    <w:jc w:val="left"/>
-                    <w:jc w:val="center"/>
-                  </w:pPr>
-                  <w:r>
-                    <w:t xml:space="preserve">Adult</w:t>
+                    <w:t xml:space="preserve">FMWT</w:t>
+                  </w:r>
+                </w:p>
+              </w:tc>
+              <w:tc>
+                <w:tcPr/>
+                <w:p>
+                  <w:pPr>
+                    <w:pStyle w:val="Compact"/>
+                    <w:jc w:val="left"/>
+                    <w:jc w:val="center"/>
+                  </w:pPr>
+                  <w:r>
+                    <w:t xml:space="preserve">NA</w:t>
+                  </w:r>
+                </w:p>
+              </w:tc>
+              <w:tc>
+                <w:tcPr/>
+                <w:p>
+                  <w:pPr>
+                    <w:pStyle w:val="Compact"/>
+                    <w:jc w:val="left"/>
+                    <w:jc w:val="center"/>
+                  </w:pPr>
+                  <w:r>
+                    <w:t xml:space="preserve">Juvenile</w:t>
                   </w:r>
                 </w:p>
               </w:tc>
@@ -3386,7 +3398,7 @@
                     <w:jc w:val="center"/>
                   </w:pPr>
                   <w:r>
-                    <w:t xml:space="preserve">6</w:t>
+                    <w:t xml:space="preserve">28</w:t>
                   </w:r>
                 </w:p>
               </w:tc>
@@ -3427,7 +3439,7 @@
                     <w:jc w:val="center"/>
                   </w:pPr>
                   <w:r>
-                    <w:t xml:space="preserve">Juvenile</w:t>
+                    <w:t xml:space="preserve">Adult</w:t>
                   </w:r>
                 </w:p>
               </w:tc>
@@ -3440,7 +3452,7 @@
                     <w:jc w:val="center"/>
                   </w:pPr>
                   <w:r>
-                    <w:t xml:space="preserve">320</w:t>
+                    <w:t xml:space="preserve">39</w:t>
                   </w:r>
                 </w:p>
               </w:tc>
@@ -3468,20 +3480,20 @@
                     <w:jc w:val="center"/>
                   </w:pPr>
                   <w:r>
-                    <w:t xml:space="preserve">Far West</w:t>
-                  </w:r>
-                </w:p>
-              </w:tc>
-              <w:tc>
-                <w:tcPr/>
-                <w:p>
-                  <w:pPr>
-                    <w:pStyle w:val="Compact"/>
-                    <w:jc w:val="left"/>
-                    <w:jc w:val="center"/>
-                  </w:pPr>
-                  <w:r>
-                    <w:t xml:space="preserve">Adult</w:t>
+                    <w:t xml:space="preserve">Bay</w:t>
+                  </w:r>
+                </w:p>
+              </w:tc>
+              <w:tc>
+                <w:tcPr/>
+                <w:p>
+                  <w:pPr>
+                    <w:pStyle w:val="Compact"/>
+                    <w:jc w:val="left"/>
+                    <w:jc w:val="center"/>
+                  </w:pPr>
+                  <w:r>
+                    <w:t xml:space="preserve">Juvenile</w:t>
                   </w:r>
                 </w:p>
               </w:tc>
@@ -3494,7 +3506,7 @@
                     <w:jc w:val="center"/>
                   </w:pPr>
                   <w:r>
-                    <w:t xml:space="preserve">2</w:t>
+                    <w:t xml:space="preserve">551</w:t>
                   </w:r>
                 </w:p>
               </w:tc>
@@ -3535,7 +3547,7 @@
                     <w:jc w:val="center"/>
                   </w:pPr>
                   <w:r>
-                    <w:t xml:space="preserve">Juvenile</w:t>
+                    <w:t xml:space="preserve">Adult</w:t>
                   </w:r>
                 </w:p>
               </w:tc>
@@ -3548,7 +3560,7 @@
                     <w:jc w:val="center"/>
                   </w:pPr>
                   <w:r>
-                    <w:t xml:space="preserve">11</w:t>
+                    <w:t xml:space="preserve">13</w:t>
                   </w:r>
                 </w:p>
               </w:tc>
@@ -3576,7 +3588,7 @@
                     <w:jc w:val="center"/>
                   </w:pPr>
                   <w:r>
-                    <w:t xml:space="preserve">West</w:t>
+                    <w:t xml:space="preserve">Far West</w:t>
                   </w:r>
                 </w:p>
               </w:tc>
@@ -3602,7 +3614,7 @@
                     <w:jc w:val="center"/>
                   </w:pPr>
                   <w:r>
-                    <w:t xml:space="preserve">6</w:t>
+                    <w:t xml:space="preserve">56</w:t>
                   </w:r>
                 </w:p>
               </w:tc>
@@ -3617,33 +3629,33 @@
                     <w:jc w:val="center"/>
                   </w:pPr>
                   <w:r>
-                    <w:t xml:space="preserve">sls</w:t>
-                  </w:r>
-                </w:p>
-              </w:tc>
-              <w:tc>
-                <w:tcPr/>
-                <w:p>
-                  <w:pPr>
-                    <w:pStyle w:val="Compact"/>
-                    <w:jc w:val="left"/>
-                    <w:jc w:val="center"/>
-                  </w:pPr>
-                  <w:r>
-                    <w:t xml:space="preserve">Bay</w:t>
-                  </w:r>
-                </w:p>
-              </w:tc>
-              <w:tc>
-                <w:tcPr/>
-                <w:p>
-                  <w:pPr>
-                    <w:pStyle w:val="Compact"/>
-                    <w:jc w:val="left"/>
-                    <w:jc w:val="center"/>
-                  </w:pPr>
-                  <w:r>
-                    <w:t xml:space="preserve">Larva</w:t>
+                    <w:t xml:space="preserve">baystudy</w:t>
+                  </w:r>
+                </w:p>
+              </w:tc>
+              <w:tc>
+                <w:tcPr/>
+                <w:p>
+                  <w:pPr>
+                    <w:pStyle w:val="Compact"/>
+                    <w:jc w:val="left"/>
+                    <w:jc w:val="center"/>
+                  </w:pPr>
+                  <w:r>
+                    <w:t xml:space="preserve">North</w:t>
+                  </w:r>
+                </w:p>
+              </w:tc>
+              <w:tc>
+                <w:tcPr/>
+                <w:p>
+                  <w:pPr>
+                    <w:pStyle w:val="Compact"/>
+                    <w:jc w:val="left"/>
+                    <w:jc w:val="center"/>
+                  </w:pPr>
+                  <w:r>
+                    <w:t xml:space="preserve">Adult</w:t>
                   </w:r>
                 </w:p>
               </w:tc>
@@ -3656,7 +3668,7 @@
                     <w:jc w:val="center"/>
                   </w:pPr>
                   <w:r>
-                    <w:t xml:space="preserve">11</w:t>
+                    <w:t xml:space="preserve">3</w:t>
                   </w:r>
                 </w:p>
               </w:tc>
@@ -3671,33 +3683,33 @@
                     <w:jc w:val="center"/>
                   </w:pPr>
                   <w:r>
-                    <w:t xml:space="preserve">sls</w:t>
-                  </w:r>
-                </w:p>
-              </w:tc>
-              <w:tc>
-                <w:tcPr/>
-                <w:p>
-                  <w:pPr>
-                    <w:pStyle w:val="Compact"/>
-                    <w:jc w:val="left"/>
-                    <w:jc w:val="center"/>
-                  </w:pPr>
-                  <w:r>
-                    <w:t xml:space="preserve">Far West</w:t>
-                  </w:r>
-                </w:p>
-              </w:tc>
-              <w:tc>
-                <w:tcPr/>
-                <w:p>
-                  <w:pPr>
-                    <w:pStyle w:val="Compact"/>
-                    <w:jc w:val="left"/>
-                    <w:jc w:val="center"/>
-                  </w:pPr>
-                  <w:r>
-                    <w:t xml:space="preserve">Larva</w:t>
+                    <w:t xml:space="preserve">baystudy</w:t>
+                  </w:r>
+                </w:p>
+              </w:tc>
+              <w:tc>
+                <w:tcPr/>
+                <w:p>
+                  <w:pPr>
+                    <w:pStyle w:val="Compact"/>
+                    <w:jc w:val="left"/>
+                    <w:jc w:val="center"/>
+                  </w:pPr>
+                  <w:r>
+                    <w:t xml:space="preserve">West</w:t>
+                  </w:r>
+                </w:p>
+              </w:tc>
+              <w:tc>
+                <w:tcPr/>
+                <w:p>
+                  <w:pPr>
+                    <w:pStyle w:val="Compact"/>
+                    <w:jc w:val="left"/>
+                    <w:jc w:val="center"/>
+                  </w:pPr>
+                  <w:r>
+                    <w:t xml:space="preserve">Adult</w:t>
                   </w:r>
                 </w:p>
               </w:tc>
@@ -3710,7 +3722,7 @@
                     <w:jc w:val="center"/>
                   </w:pPr>
                   <w:r>
-                    <w:t xml:space="preserve">906</w:t>
+                    <w:t xml:space="preserve">4</w:t>
                   </w:r>
                 </w:p>
               </w:tc>
@@ -3725,33 +3737,33 @@
                     <w:jc w:val="center"/>
                   </w:pPr>
                   <w:r>
-                    <w:t xml:space="preserve">sls</w:t>
-                  </w:r>
-                </w:p>
-              </w:tc>
-              <w:tc>
-                <w:tcPr/>
-                <w:p>
-                  <w:pPr>
-                    <w:pStyle w:val="Compact"/>
-                    <w:jc w:val="left"/>
-                    <w:jc w:val="center"/>
-                  </w:pPr>
-                  <w:r>
-                    <w:t xml:space="preserve">North</w:t>
-                  </w:r>
-                </w:p>
-              </w:tc>
-              <w:tc>
-                <w:tcPr/>
-                <w:p>
-                  <w:pPr>
-                    <w:pStyle w:val="Compact"/>
-                    <w:jc w:val="left"/>
-                    <w:jc w:val="center"/>
-                  </w:pPr>
-                  <w:r>
-                    <w:t xml:space="preserve">Larva</w:t>
+                    <w:t xml:space="preserve">baystudy</w:t>
+                  </w:r>
+                </w:p>
+              </w:tc>
+              <w:tc>
+                <w:tcPr/>
+                <w:p>
+                  <w:pPr>
+                    <w:pStyle w:val="Compact"/>
+                    <w:jc w:val="left"/>
+                    <w:jc w:val="center"/>
+                  </w:pPr>
+                  <w:r>
+                    <w:t xml:space="preserve">West</w:t>
+                  </w:r>
+                </w:p>
+              </w:tc>
+              <w:tc>
+                <w:tcPr/>
+                <w:p>
+                  <w:pPr>
+                    <w:pStyle w:val="Compact"/>
+                    <w:jc w:val="left"/>
+                    <w:jc w:val="center"/>
+                  </w:pPr>
+                  <w:r>
+                    <w:t xml:space="preserve">Juvenile</w:t>
                   </w:r>
                 </w:p>
               </w:tc>
@@ -3764,7 +3776,7 @@
                     <w:jc w:val="center"/>
                   </w:pPr>
                   <w:r>
-                    <w:t xml:space="preserve">12</w:t>
+                    <w:t xml:space="preserve">14</w:t>
                   </w:r>
                 </w:p>
               </w:tc>
@@ -3792,7 +3804,7 @@
                     <w:jc w:val="center"/>
                   </w:pPr>
                   <w:r>
-                    <w:t xml:space="preserve">South</w:t>
+                    <w:t xml:space="preserve">Bay</w:t>
                   </w:r>
                 </w:p>
               </w:tc>
@@ -3818,7 +3830,7 @@
                     <w:jc w:val="center"/>
                   </w:pPr>
                   <w:r>
-                    <w:t xml:space="preserve">18</w:t>
+                    <w:t xml:space="preserve">11</w:t>
                   </w:r>
                 </w:p>
               </w:tc>
@@ -3846,7 +3858,7 @@
                     <w:jc w:val="center"/>
                   </w:pPr>
                   <w:r>
-                    <w:t xml:space="preserve">West</w:t>
+                    <w:t xml:space="preserve">Far West</w:t>
                   </w:r>
                 </w:p>
               </w:tc>
@@ -3872,7 +3884,7 @@
                     <w:jc w:val="center"/>
                   </w:pPr>
                   <w:r>
-                    <w:t xml:space="preserve">331</w:t>
+                    <w:t xml:space="preserve">949</w:t>
                   </w:r>
                 </w:p>
               </w:tc>
@@ -3900,6 +3912,168 @@
                     <w:jc w:val="center"/>
                   </w:pPr>
                   <w:r>
+                    <w:t xml:space="preserve">North</w:t>
+                  </w:r>
+                </w:p>
+              </w:tc>
+              <w:tc>
+                <w:tcPr/>
+                <w:p>
+                  <w:pPr>
+                    <w:pStyle w:val="Compact"/>
+                    <w:jc w:val="left"/>
+                    <w:jc w:val="center"/>
+                  </w:pPr>
+                  <w:r>
+                    <w:t xml:space="preserve">Larva</w:t>
+                  </w:r>
+                </w:p>
+              </w:tc>
+              <w:tc>
+                <w:tcPr/>
+                <w:p>
+                  <w:pPr>
+                    <w:pStyle w:val="Compact"/>
+                    <w:jc w:val="right"/>
+                    <w:jc w:val="center"/>
+                  </w:pPr>
+                  <w:r>
+                    <w:t xml:space="preserve">77</w:t>
+                  </w:r>
+                </w:p>
+              </w:tc>
+            </w:tr>
+            <w:tr>
+              <w:tc>
+                <w:tcPr/>
+                <w:p>
+                  <w:pPr>
+                    <w:pStyle w:val="Compact"/>
+                    <w:jc w:val="left"/>
+                    <w:jc w:val="center"/>
+                  </w:pPr>
+                  <w:r>
+                    <w:t xml:space="preserve">sls</w:t>
+                  </w:r>
+                </w:p>
+              </w:tc>
+              <w:tc>
+                <w:tcPr/>
+                <w:p>
+                  <w:pPr>
+                    <w:pStyle w:val="Compact"/>
+                    <w:jc w:val="left"/>
+                    <w:jc w:val="center"/>
+                  </w:pPr>
+                  <w:r>
+                    <w:t xml:space="preserve">South</w:t>
+                  </w:r>
+                </w:p>
+              </w:tc>
+              <w:tc>
+                <w:tcPr/>
+                <w:p>
+                  <w:pPr>
+                    <w:pStyle w:val="Compact"/>
+                    <w:jc w:val="left"/>
+                    <w:jc w:val="center"/>
+                  </w:pPr>
+                  <w:r>
+                    <w:t xml:space="preserve">Larva</w:t>
+                  </w:r>
+                </w:p>
+              </w:tc>
+              <w:tc>
+                <w:tcPr/>
+                <w:p>
+                  <w:pPr>
+                    <w:pStyle w:val="Compact"/>
+                    <w:jc w:val="right"/>
+                    <w:jc w:val="center"/>
+                  </w:pPr>
+                  <w:r>
+                    <w:t xml:space="preserve">45</w:t>
+                  </w:r>
+                </w:p>
+              </w:tc>
+            </w:tr>
+            <w:tr>
+              <w:tc>
+                <w:tcPr/>
+                <w:p>
+                  <w:pPr>
+                    <w:pStyle w:val="Compact"/>
+                    <w:jc w:val="left"/>
+                    <w:jc w:val="center"/>
+                  </w:pPr>
+                  <w:r>
+                    <w:t xml:space="preserve">sls</w:t>
+                  </w:r>
+                </w:p>
+              </w:tc>
+              <w:tc>
+                <w:tcPr/>
+                <w:p>
+                  <w:pPr>
+                    <w:pStyle w:val="Compact"/>
+                    <w:jc w:val="left"/>
+                    <w:jc w:val="center"/>
+                  </w:pPr>
+                  <w:r>
+                    <w:t xml:space="preserve">West</w:t>
+                  </w:r>
+                </w:p>
+              </w:tc>
+              <w:tc>
+                <w:tcPr/>
+                <w:p>
+                  <w:pPr>
+                    <w:pStyle w:val="Compact"/>
+                    <w:jc w:val="left"/>
+                    <w:jc w:val="center"/>
+                  </w:pPr>
+                  <w:r>
+                    <w:t xml:space="preserve">Larva</w:t>
+                  </w:r>
+                </w:p>
+              </w:tc>
+              <w:tc>
+                <w:tcPr/>
+                <w:p>
+                  <w:pPr>
+                    <w:pStyle w:val="Compact"/>
+                    <w:jc w:val="right"/>
+                    <w:jc w:val="center"/>
+                  </w:pPr>
+                  <w:r>
+                    <w:t xml:space="preserve">671</w:t>
+                  </w:r>
+                </w:p>
+              </w:tc>
+            </w:tr>
+            <w:tr>
+              <w:tc>
+                <w:tcPr/>
+                <w:p>
+                  <w:pPr>
+                    <w:pStyle w:val="Compact"/>
+                    <w:jc w:val="left"/>
+                    <w:jc w:val="center"/>
+                  </w:pPr>
+                  <w:r>
+                    <w:t xml:space="preserve">sls</w:t>
+                  </w:r>
+                </w:p>
+              </w:tc>
+              <w:tc>
+                <w:tcPr/>
+                <w:p>
+                  <w:pPr>
+                    <w:pStyle w:val="Compact"/>
+                    <w:jc w:val="left"/>
+                    <w:jc w:val="center"/>
+                  </w:pPr>
+                  <w:r>
                     <w:t xml:space="preserve">NA</w:t>
                   </w:r>
                 </w:p>
@@ -3913,6 +4087,60 @@
                     <w:jc w:val="center"/>
                   </w:pPr>
                   <w:r>
+                    <w:t xml:space="preserve">Juvenile</w:t>
+                  </w:r>
+                </w:p>
+              </w:tc>
+              <w:tc>
+                <w:tcPr/>
+                <w:p>
+                  <w:pPr>
+                    <w:pStyle w:val="Compact"/>
+                    <w:jc w:val="right"/>
+                    <w:jc w:val="center"/>
+                  </w:pPr>
+                  <w:r>
+                    <w:t xml:space="preserve">3</w:t>
+                  </w:r>
+                </w:p>
+              </w:tc>
+            </w:tr>
+            <w:tr>
+              <w:tc>
+                <w:tcPr/>
+                <w:p>
+                  <w:pPr>
+                    <w:pStyle w:val="Compact"/>
+                    <w:jc w:val="left"/>
+                    <w:jc w:val="center"/>
+                  </w:pPr>
+                  <w:r>
+                    <w:t xml:space="preserve">sls</w:t>
+                  </w:r>
+                </w:p>
+              </w:tc>
+              <w:tc>
+                <w:tcPr/>
+                <w:p>
+                  <w:pPr>
+                    <w:pStyle w:val="Compact"/>
+                    <w:jc w:val="left"/>
+                    <w:jc w:val="center"/>
+                  </w:pPr>
+                  <w:r>
+                    <w:t xml:space="preserve">NA</w:t>
+                  </w:r>
+                </w:p>
+              </w:tc>
+              <w:tc>
+                <w:tcPr/>
+                <w:p>
+                  <w:pPr>
+                    <w:pStyle w:val="Compact"/>
+                    <w:jc w:val="left"/>
+                    <w:jc w:val="center"/>
+                  </w:pPr>
+                  <w:r>
                     <w:t xml:space="preserve">Larva</w:t>
                   </w:r>
                 </w:p>
@@ -3926,7 +4154,7 @@
                     <w:jc w:val="center"/>
                   </w:pPr>
                   <w:r>
-                    <w:t xml:space="preserve">22</w:t>
+                    <w:t xml:space="preserve">23</w:t>
                   </w:r>
                 </w:p>
               </w:tc>
@@ -4044,7 +4272,7 @@
         </w:numPr>
       </w:pPr>
       <w:r>
-        <w:t xml:space="preserve">Not relevant</w:t>
+        <w:t xml:space="preserve">This action was not taken in WY26</w:t>
       </w:r>
     </w:p>
     <w:bookmarkEnd w:id="55"/>
@@ -4088,7 +4316,7 @@
         </w:numPr>
       </w:pPr>
       <w:r>
-        <w:t xml:space="preserve">Daily average JPF: 2,451 cfs as of Feb 12, 2026</w:t>
+        <w:t xml:space="preserve">Daily average JPF: 9,820 cfs as of Mar 01, 2026</w:t>
       </w:r>
     </w:p>
     <w:p>
@@ -4168,7 +4396,7 @@
         </w:numPr>
       </w:pPr>
       <w:r>
-        <w:t xml:space="preserve">Daily average JPF: 2,451 cfs as of Feb 12, 2026</w:t>
+        <w:t xml:space="preserve">Daily average JPF: 9,820 cfs as of Mar 01, 2026</w:t>
       </w:r>
     </w:p>
     <w:bookmarkEnd w:id="57"/>
@@ -4213,7 +4441,13 @@
         </w:numPr>
       </w:pPr>
       <w:r>
-        <w:t xml:space="preserve">JPF is &gt; 0 cfs and no adult longfin smelt have been detected in salvage.</w:t>
+        <w:t xml:space="preserve">JPF is &gt; 0 cfs and no adult longfin smelt have been detected in</w:t>
+      </w:r>
+      <w:r>
+        <w:t xml:space="preserve"> </w:t>
+      </w:r>
+      <w:r>
+        <w:t xml:space="preserve">salvage, indicating annual loss has not begun to approach the 5% regulatory threshold.</w:t>
       </w:r>
     </w:p>
     <w:p>
@@ -4235,19 +4469,55 @@
         </w:numPr>
       </w:pPr>
       <w:r>
-        <w:t xml:space="preserve">JPF is not less than 0 cfs and is not predicted to go below 0 cfs this week.</w:t>
-      </w:r>
-      <w:r>
-        <w:t xml:space="preserve"> </w:t>
-      </w:r>
-      <w:r>
-        <w:t xml:space="preserve">The Zone of Influence modeling indicates moderate differences in hydrodynamic</w:t>
+        <w:t xml:space="preserve">JPF is currently not less than 0 cfs and is not predicted to drop below 0 cfs this week.</w:t>
+      </w:r>
+      <w:r>
+        <w:t xml:space="preserve"> </w:t>
+      </w:r>
+      <w:r>
+        <w:t xml:space="preserve">Zone of Influence modeling indicates low differences in the hydrodynamic</w:t>
       </w:r>
       <w:r>
         <w:t xml:space="preserve"> </w:t>
       </w:r>
       <w:r>
         <w:t xml:space="preserve">footprint across OMRI scenarios, with no change between current and forecasted conditions.</w:t>
+      </w:r>
+      <w:r>
+        <w:t xml:space="preserve"> </w:t>
+      </w:r>
+      <w:r>
+        <w:t xml:space="preserve">If a Stormflex action were implemented, population-based PTM results, summarized in</w:t>
+      </w:r>
+      <w:r>
+        <w:t xml:space="preserve"> </w:t>
+      </w:r>
+      <w:r>
+        <w:t xml:space="preserve">Appendix A, project low larval entrainment relative to estimated abundance.</w:t>
+      </w:r>
+      <w:r>
+        <w:t xml:space="preserve"> </w:t>
+      </w:r>
+      <w:r>
+        <w:t xml:space="preserve">Modeled losses are approximately &lt;0.1% under OMRI of both –5,000 and –6,500 cfs</w:t>
+      </w:r>
+      <w:r>
+        <w:t xml:space="preserve"> </w:t>
+      </w:r>
+      <w:r>
+        <w:t xml:space="preserve">this week. For the week ending in 3/02/2026, larval entrainment is projected to be 0.2% and 0.3% of the</w:t>
+      </w:r>
+      <w:r>
+        <w:t xml:space="preserve"> </w:t>
+      </w:r>
+      <w:r>
+        <w:t xml:space="preserve">larval LFS population at an OMRI of -5,000 and -6,500 cfs, respectively. These projected losses</w:t>
+      </w:r>
+      <w:r>
+        <w:t xml:space="preserve"> </w:t>
+      </w:r>
+      <w:r>
+        <w:t xml:space="preserve">remain below levels suggesting population decline.</w:t>
       </w:r>
     </w:p>
     <w:p>
@@ -4269,7 +4539,7 @@
         </w:numPr>
       </w:pPr>
       <w:r>
-        <w:t xml:space="preserve">Additional information may be discussed if needed at the DAT call.</w:t>
+        <w:t xml:space="preserve">Please see Appendix A for additional information.</w:t>
       </w:r>
     </w:p>
     <w:bookmarkEnd w:id="59"/>
@@ -4296,7 +4566,7 @@
       </w:r>
     </w:p>
     <w:bookmarkEnd w:id="61"/>
-    <w:bookmarkStart w:id="66" w:name="references"/>
+    <w:bookmarkStart w:id="67" w:name="references"/>
     <w:p>
       <w:pPr>
         <w:pStyle w:val="Heading3"/>
@@ -4305,7 +4575,7 @@
         <w:t xml:space="preserve">References</w:t>
       </w:r>
     </w:p>
-    <w:bookmarkStart w:id="65" w:name="refs"/>
+    <w:bookmarkStart w:id="66" w:name="refs"/>
     <w:bookmarkStart w:id="62" w:name="ref-damon2016"/>
     <w:p>
       <w:pPr>
@@ -4342,7 +4612,43 @@
       </w:r>
     </w:p>
     <w:bookmarkEnd w:id="62"/>
-    <w:bookmarkStart w:id="63" w:name="ref-grimaldo2009"/>
+    <w:bookmarkStart w:id="63" w:name="ref-grimaldo2021"/>
+    <w:p>
+      <w:pPr>
+        <w:pStyle w:val="Bibliography"/>
+      </w:pPr>
+      <w:r>
+        <w:t xml:space="preserve">Grimaldo, L. F., Smith, W. E., &amp; Nobriga, M. L. (2021). Re-examining factors that affect delta smelt (hypomesus transpacificus) entrainment at the state water project and central valley project in the sacramento–san joaquin delta.</w:t>
+      </w:r>
+      <w:r>
+        <w:t xml:space="preserve"> </w:t>
+      </w:r>
+      <w:r>
+        <w:rPr>
+          <w:i/>
+          <w:iCs/>
+        </w:rPr>
+        <w:t xml:space="preserve">San Francisco Estuary and Watershed Science</w:t>
+      </w:r>
+      <w:r>
+        <w:t xml:space="preserve">,</w:t>
+      </w:r>
+      <w:r>
+        <w:t xml:space="preserve"> </w:t>
+      </w:r>
+      <w:r>
+        <w:rPr>
+          <w:i/>
+          <w:iCs/>
+        </w:rPr>
+        <w:t xml:space="preserve">19</w:t>
+      </w:r>
+      <w:r>
+        <w:t xml:space="preserve">(1).</w:t>
+      </w:r>
+    </w:p>
+    <w:bookmarkEnd w:id="63"/>
+    <w:bookmarkStart w:id="64" w:name="ref-grimaldo2009"/>
     <w:p>
       <w:pPr>
         <w:pStyle w:val="Bibliography"/>
@@ -4377,8 +4683,8 @@
         <w:t xml:space="preserve">(5), 1253–1270.</w:t>
       </w:r>
     </w:p>
-    <w:bookmarkEnd w:id="63"/>
-    <w:bookmarkStart w:id="64" w:name="ref-sommer2011"/>
+    <w:bookmarkEnd w:id="64"/>
+    <w:bookmarkStart w:id="65" w:name="ref-sommer2011"/>
     <w:p>
       <w:pPr>
         <w:pStyle w:val="Bibliography"/>
@@ -4413,10 +4719,10 @@
         <w:t xml:space="preserve">(2).</w:t>
       </w:r>
     </w:p>
-    <w:bookmarkEnd w:id="64"/>
     <w:bookmarkEnd w:id="65"/>
     <w:bookmarkEnd w:id="66"/>
     <w:bookmarkEnd w:id="67"/>
+    <w:bookmarkEnd w:id="68"/>
     <w:sectPr>
       <w:headerReference r:id="rId9" w:type="even"/>
       <w:headerReference r:id="rId11" w:type="default"/>

</xml_diff>

<commit_message>
updated assessment with SLS 6 data
</commit_message>
<xml_diff>
--- a/smt-assessment-v1.docx
+++ b/smt-assessment-v1.docx
@@ -26,7 +26,7 @@
           <w:i/>
           <w:iCs/>
         </w:rPr>
-        <w:t xml:space="preserve">March 02, 2026</w:t>
+        <w:t xml:space="preserve">March 17, 2026</w:t>
       </w:r>
     </w:p>
     <w:bookmarkStart w:id="20" w:name="executive-summary"/>
@@ -47,7 +47,7 @@
         </w:numPr>
       </w:pPr>
       <w:r>
-        <w:t xml:space="preserve">Entrainment management is currently active.</w:t>
+        <w:t xml:space="preserve">Delta smelt were most recently detected at Suisun Marsh.</w:t>
       </w:r>
     </w:p>
     <w:p>
@@ -59,7 +59,7 @@
         </w:numPr>
       </w:pPr>
       <w:r>
-        <w:t xml:space="preserve">Adult Delta smelt action is no longer active.</w:t>
+        <w:t xml:space="preserve">One Delta smelt was salvaged on 3/6/26, expanded salvage is 4 for this water year.</w:t>
       </w:r>
     </w:p>
     <w:p>
@@ -71,19 +71,7 @@
         </w:numPr>
       </w:pPr>
       <w:r>
-        <w:t xml:space="preserve">Delta smelt were most recently detected at Suisun Marsh.</w:t>
-      </w:r>
-    </w:p>
-    <w:p>
-      <w:pPr>
-        <w:pStyle w:val="Compact"/>
-        <w:numPr>
-          <w:ilvl w:val="0"/>
-          <w:numId w:val="1001"/>
-        </w:numPr>
-      </w:pPr>
-      <w:r>
-        <w:t xml:space="preserve">No Delta smelt or longfin smelt salvage has been observed this water year.</w:t>
+        <w:t xml:space="preserve">No longfin smelt salvage has been observed this water year.</w:t>
       </w:r>
     </w:p>
     <w:p>
@@ -179,6 +167,12 @@
         </w:rPr>
         <w:t xml:space="preserve">Delta smelt life stages:</w:t>
       </w:r>
+      <w:r>
+        <w:t xml:space="preserve"> </w:t>
+      </w:r>
+      <w:r>
+        <w:t xml:space="preserve">Adult</w:t>
+      </w:r>
     </w:p>
     <w:p>
       <w:pPr>
@@ -198,7 +192,7 @@
         <w:t xml:space="preserve"> </w:t>
       </w:r>
       <w:r>
-        <w:t xml:space="preserve">9901 (95% CL: 1,407 to 35,401) as of the week of February 23–27, 2026</w:t>
+        <w:t xml:space="preserve">2004 (95% CL: 170 to 8,647) as of the week of March 9–13, 2026</w:t>
       </w:r>
     </w:p>
     <w:p>
@@ -240,7 +234,7 @@
         <w:t xml:space="preserve"> </w:t>
       </w:r>
       <w:r>
-        <w:t xml:space="preserve">36 adult Delta smelt and 29 juvenile Delta smelt have been detected this water year. See</w:t>
+        <w:t xml:space="preserve">42 adult Delta smelt and 30 juvenile Delta smelt have been detected this water year. See</w:t>
       </w:r>
       <w:r>
         <w:t xml:space="preserve"> </w:t>
@@ -312,7 +306,7 @@
         <w:t xml:space="preserve"> </w:t>
       </w:r>
       <w:r>
-        <w:t xml:space="preserve">0 Delta smelt have been salvaged, and the cumulative seasonal salvage is 0.</w:t>
+        <w:t xml:space="preserve">1 Delta smelt has been salvaged, and the cumulative seasonal salvage is 4.</w:t>
       </w:r>
     </w:p>
     <w:p>
@@ -540,6 +534,166 @@
                   </w:pPr>
                   <w:r>
                     <w:t xml:space="preserve">Catch</w:t>
+                  </w:r>
+                </w:p>
+              </w:tc>
+            </w:tr>
+            <w:tr>
+              <w:tc>
+                <w:tcPr/>
+                <w:p>
+                  <w:pPr>
+                    <w:pStyle w:val="Compact"/>
+                    <w:jc w:val="left"/>
+                    <w:jc w:val="center"/>
+                  </w:pPr>
+                  <w:r>
+                    <w:t xml:space="preserve">EDSM</w:t>
+                  </w:r>
+                </w:p>
+              </w:tc>
+              <w:tc>
+                <w:tcPr/>
+                <w:p>
+                  <w:pPr>
+                    <w:pStyle w:val="Compact"/>
+                    <w:jc w:val="left"/>
+                    <w:jc w:val="center"/>
+                  </w:pPr>
+                  <w:r>
+                    <w:t xml:space="preserve">2026-03-09</w:t>
+                  </w:r>
+                </w:p>
+              </w:tc>
+              <w:tc>
+                <w:tcPr/>
+                <w:p>
+                  <w:pPr>
+                    <w:pStyle w:val="Compact"/>
+                    <w:jc w:val="left"/>
+                    <w:jc w:val="center"/>
+                  </w:pPr>
+                  <w:r>
+                    <w:t xml:space="preserve">West</w:t>
+                  </w:r>
+                </w:p>
+              </w:tc>
+              <w:tc>
+                <w:tcPr/>
+                <w:p>
+                  <w:pPr>
+                    <w:pStyle w:val="Compact"/>
+                    <w:jc w:val="left"/>
+                    <w:jc w:val="center"/>
+                  </w:pPr>
+                  <w:r>
+                    <w:t xml:space="preserve">Suisun Marsh</w:t>
+                  </w:r>
+                </w:p>
+              </w:tc>
+              <w:tc>
+                <w:tcPr/>
+                <w:p>
+                  <w:pPr>
+                    <w:pStyle w:val="Compact"/>
+                    <w:jc w:val="left"/>
+                    <w:jc w:val="center"/>
+                  </w:pPr>
+                  <w:r>
+                    <w:t xml:space="preserve">Adult</w:t>
+                  </w:r>
+                </w:p>
+              </w:tc>
+              <w:tc>
+                <w:tcPr/>
+                <w:p>
+                  <w:pPr>
+                    <w:pStyle w:val="Compact"/>
+                    <w:jc w:val="right"/>
+                    <w:jc w:val="center"/>
+                  </w:pPr>
+                  <w:r>
+                    <w:t xml:space="preserve">1</w:t>
+                  </w:r>
+                </w:p>
+              </w:tc>
+            </w:tr>
+            <w:tr>
+              <w:tc>
+                <w:tcPr/>
+                <w:p>
+                  <w:pPr>
+                    <w:pStyle w:val="Compact"/>
+                    <w:jc w:val="left"/>
+                    <w:jc w:val="center"/>
+                  </w:pPr>
+                  <w:r>
+                    <w:t xml:space="preserve">salvage</w:t>
+                  </w:r>
+                </w:p>
+              </w:tc>
+              <w:tc>
+                <w:tcPr/>
+                <w:p>
+                  <w:pPr>
+                    <w:pStyle w:val="Compact"/>
+                    <w:jc w:val="left"/>
+                    <w:jc w:val="center"/>
+                  </w:pPr>
+                  <w:r>
+                    <w:t xml:space="preserve">2026-03-06</w:t>
+                  </w:r>
+                </w:p>
+              </w:tc>
+              <w:tc>
+                <w:tcPr/>
+                <w:p>
+                  <w:pPr>
+                    <w:pStyle w:val="Compact"/>
+                    <w:jc w:val="left"/>
+                    <w:jc w:val="center"/>
+                  </w:pPr>
+                  <w:r>
+                    <w:t xml:space="preserve">South</w:t>
+                  </w:r>
+                </w:p>
+              </w:tc>
+              <w:tc>
+                <w:tcPr/>
+                <w:p>
+                  <w:pPr>
+                    <w:pStyle w:val="Compact"/>
+                    <w:jc w:val="left"/>
+                    <w:jc w:val="center"/>
+                  </w:pPr>
+                  <w:r>
+                    <w:t xml:space="preserve">NA</w:t>
+                  </w:r>
+                </w:p>
+              </w:tc>
+              <w:tc>
+                <w:tcPr/>
+                <w:p>
+                  <w:pPr>
+                    <w:pStyle w:val="Compact"/>
+                    <w:jc w:val="left"/>
+                    <w:jc w:val="center"/>
+                  </w:pPr>
+                  <w:r>
+                    <w:t xml:space="preserve">Adult</w:t>
+                  </w:r>
+                </w:p>
+              </w:tc>
+              <w:tc>
+                <w:tcPr/>
+                <w:p>
+                  <w:pPr>
+                    <w:pStyle w:val="Compact"/>
+                    <w:jc w:val="right"/>
+                    <w:jc w:val="center"/>
+                  </w:pPr>
+                  <w:r>
+                    <w:t xml:space="preserve">1</w:t>
                   </w:r>
                 </w:p>
               </w:tc>
@@ -936,7 +1090,7 @@
                     <w:jc w:val="center"/>
                   </w:pPr>
                   <w:r>
-                    <w:t xml:space="preserve">33</w:t>
+                    <w:t xml:space="preserve">38</w:t>
                   </w:r>
                 </w:p>
               </w:tc>
@@ -990,7 +1144,61 @@
                     <w:jc w:val="center"/>
                   </w:pPr>
                   <w:r>
-                    <w:t xml:space="preserve">28</w:t>
+                    <w:t xml:space="preserve">29</w:t>
+                  </w:r>
+                </w:p>
+              </w:tc>
+            </w:tr>
+            <w:tr>
+              <w:tc>
+                <w:tcPr/>
+                <w:p>
+                  <w:pPr>
+                    <w:pStyle w:val="Compact"/>
+                    <w:jc w:val="left"/>
+                    <w:jc w:val="center"/>
+                  </w:pPr>
+                  <w:r>
+                    <w:t xml:space="preserve">salvage</w:t>
+                  </w:r>
+                </w:p>
+              </w:tc>
+              <w:tc>
+                <w:tcPr/>
+                <w:p>
+                  <w:pPr>
+                    <w:pStyle w:val="Compact"/>
+                    <w:jc w:val="left"/>
+                    <w:jc w:val="center"/>
+                  </w:pPr>
+                  <w:r>
+                    <w:t xml:space="preserve">South</w:t>
+                  </w:r>
+                </w:p>
+              </w:tc>
+              <w:tc>
+                <w:tcPr/>
+                <w:p>
+                  <w:pPr>
+                    <w:pStyle w:val="Compact"/>
+                    <w:jc w:val="left"/>
+                    <w:jc w:val="center"/>
+                  </w:pPr>
+                  <w:r>
+                    <w:t xml:space="preserve">Adult</w:t>
+                  </w:r>
+                </w:p>
+              </w:tc>
+              <w:tc>
+                <w:tcPr/>
+                <w:p>
+                  <w:pPr>
+                    <w:pStyle w:val="Compact"/>
+                    <w:jc w:val="right"/>
+                    <w:jc w:val="center"/>
+                  </w:pPr>
+                  <w:r>
+                    <w:t xml:space="preserve">1</w:t>
                   </w:r>
                 </w:p>
               </w:tc>
@@ -1260,7 +1468,7 @@
         <w:t xml:space="preserve">12-station South Delta Turbidity</w:t>
       </w:r>
       <w:r>
-        <w:t xml:space="preserve">: The most recent average turbidity was 5.7 FNU as of Feb 11, 2025</w:t>
+        <w:t xml:space="preserve">: The most recent average turbidity was 11.2 FNU as of Mar 09, 2026</w:t>
       </w:r>
     </w:p>
     <w:bookmarkEnd w:id="39"/>
@@ -1512,55 +1720,57 @@
         </w:numPr>
       </w:pPr>
       <w:r>
-        <w:t xml:space="preserve">Although spawning may be occurring, JPF is above 0 cfs. SLS 5 is on the water this</w:t>
+        <w:t xml:space="preserve">Although spawning may be occurring, JPF is above 0 cfs. SLS 5 was on the</w:t>
       </w:r>
       <w:r>
         <w:t xml:space="preserve"> </w:t>
       </w:r>
       <w:r>
-        <w:t xml:space="preserve">week and will provide an updated average south Delta turbidity. Due to JPF &gt; 0 this week, the conditions required</w:t>
+        <w:t xml:space="preserve">water last week, and the most recent 12 station average turbidity in the south</w:t>
       </w:r>
       <w:r>
         <w:t xml:space="preserve"> </w:t>
       </w:r>
       <w:r>
-        <w:t xml:space="preserve">to trigger larval and juvenile Delta smelt entrainment management will not be met. No Delta smelt larvae</w:t>
+        <w:t xml:space="preserve">delta was 12.5 FNU on 2/23/26. Due to JPF &gt; 0 this week, the conditions required to trigger larval and</w:t>
       </w:r>
       <w:r>
         <w:t xml:space="preserve"> </w:t>
       </w:r>
       <w:r>
-        <w:t xml:space="preserve">have been captured in SLS surveys in WY26 to date. Therefore, if a Storm Flex were to be implemented this week, fates of particles</w:t>
+        <w:t xml:space="preserve">juvenile Delta smelt entrainment management will not be met.</w:t>
+      </w:r>
+    </w:p>
+    <w:p>
+      <w:pPr>
+        <w:pStyle w:val="FirstParagraph"/>
+      </w:pPr>
+      <w:r>
+        <w:t xml:space="preserve">No Delta smelt larvae have been captured in SLS surveys in WY26 to date. PTM results</w:t>
       </w:r>
       <w:r>
         <w:t xml:space="preserve"> </w:t>
       </w:r>
       <w:r>
-        <w:t xml:space="preserve">injected at Chipps Island or Cache Slough would be most relevant for larvae, as those locations are closest to recent adult distribution.</w:t>
+        <w:t xml:space="preserve">for this week for neutrally buoyant particles injected at Chipps Island (most recent adult detections used as a proxy</w:t>
       </w:r>
       <w:r>
         <w:t xml:space="preserve"> </w:t>
       </w:r>
       <w:r>
-        <w:t xml:space="preserve">PTM with neutrally buoyant particles injected at Chipps Island and Cache Slough show 0% of particles entrained for the week ending 2/23/2026</w:t>
+        <w:t xml:space="preserve">for potential larval locations) showed 0% particle entrainment at both facilities for all OMRI levels</w:t>
       </w:r>
       <w:r>
         <w:t xml:space="preserve"> </w:t>
       </w:r>
       <w:r>
-        <w:t xml:space="preserve">for all OMR levels (-2,000, -3,500, -5,000, and -6,500 cfs). For week 2 (ending 3/02/2026), 0.1 and 0.3% of particles</w:t>
+        <w:t xml:space="preserve">(−6,500, −5,000, −3,500, and −2,000 cfs). These results indicate that if Delta</w:t>
       </w:r>
       <w:r>
         <w:t xml:space="preserve"> </w:t>
       </w:r>
       <w:r>
-        <w:t xml:space="preserve">were entrained at CVP and SWP, respectively, at OMRI of -6,500 cfs, and 0% for OMRI of -5,000 cfs (see Appendix A for details).</w:t>
-      </w:r>
-      <w:r>
-        <w:t xml:space="preserve"> </w:t>
-      </w:r>
-      <w:r>
-        <w:t xml:space="preserve">These results indicate that if Delta smelt larvae were present, the risk of entrainment under potential Stormflex operations would be low.</w:t>
+        <w:t xml:space="preserve">smelt larvae were present, the risk of entrainment is low.</w:t>
       </w:r>
     </w:p>
     <w:bookmarkEnd w:id="42"/>
@@ -1601,7 +1811,7 @@
         <w:t xml:space="preserve"> </w:t>
       </w:r>
       <w:r>
-        <w:t xml:space="preserve">Adult, Juvenile</w:t>
+        <w:t xml:space="preserve">Adult, Juvenile, Larva</w:t>
       </w:r>
     </w:p>
     <w:p>
@@ -1622,7 +1832,7 @@
         <w:t xml:space="preserve"> </w:t>
       </w:r>
       <w:r>
-        <w:t xml:space="preserve">412 adult, 972 juvenile, and 1776 larval longfin smelt have been detected this water year. See</w:t>
+        <w:t xml:space="preserve">441 adult, 1023 juvenile, and 5446 larval longfin smelt have been detected this water year. See</w:t>
       </w:r>
       <w:r>
         <w:t xml:space="preserve"> </w:t>
@@ -1730,16 +1940,17 @@
           <w:tbl>
             <w:tblPr>
               <w:tblStyle w:val="Table"/>
-              <w:tblW w:type="auto" w:w="0"/>
+              <w:tblW w:type="pct" w:w="5000"/>
+              <w:tblLayout w:type="fixed"/>
               <w:tblLook w:firstRow="1" w:lastRow="0" w:firstColumn="0" w:lastColumn="0" w:noHBand="0" w:noVBand="0" w:val="0020"/>
             </w:tblPr>
             <w:tblGrid>
-              <w:gridCol w:w="1320"/>
-              <w:gridCol w:w="1320"/>
-              <w:gridCol w:w="1320"/>
-              <w:gridCol w:w="1320"/>
-              <w:gridCol w:w="1320"/>
-              <w:gridCol w:w="1320"/>
+              <w:gridCol w:w="770"/>
+              <w:gridCol w:w="1210"/>
+              <w:gridCol w:w="990"/>
+              <w:gridCol w:w="3080"/>
+              <w:gridCol w:w="1210"/>
+              <w:gridCol w:w="660"/>
             </w:tblGrid>
             <w:tr>
               <w:trPr>
@@ -1847,7 +2058,7 @@
                     <w:jc w:val="center"/>
                   </w:pPr>
                   <w:r>
-                    <w:t xml:space="preserve">2026-02-17</w:t>
+                    <w:t xml:space="preserve">2026-03-04</w:t>
                   </w:r>
                 </w:p>
               </w:tc>
@@ -1899,7 +2110,7 @@
                     <w:jc w:val="center"/>
                   </w:pPr>
                   <w:r>
-                    <w:t xml:space="preserve">1</w:t>
+                    <w:t xml:space="preserve">3</w:t>
                   </w:r>
                 </w:p>
               </w:tc>
@@ -1927,7 +2138,7 @@
                     <w:jc w:val="center"/>
                   </w:pPr>
                   <w:r>
-                    <w:t xml:space="preserve">2026-02-25</w:t>
+                    <w:t xml:space="preserve">2026-03-04</w:t>
                   </w:r>
                 </w:p>
               </w:tc>
@@ -1966,7 +2177,7 @@
                     <w:jc w:val="center"/>
                   </w:pPr>
                   <w:r>
-                    <w:t xml:space="preserve">Adult</w:t>
+                    <w:t xml:space="preserve">Juvenile</w:t>
                   </w:r>
                 </w:p>
               </w:tc>
@@ -1979,7 +2190,7 @@
                     <w:jc w:val="center"/>
                   </w:pPr>
                   <w:r>
-                    <w:t xml:space="preserve">3</w:t>
+                    <w:t xml:space="preserve">1</w:t>
                   </w:r>
                 </w:p>
               </w:tc>
@@ -2007,7 +2218,7 @@
                     <w:jc w:val="center"/>
                   </w:pPr>
                   <w:r>
-                    <w:t xml:space="preserve">2026-02-25</w:t>
+                    <w:t xml:space="preserve">2026-03-05</w:t>
                   </w:r>
                 </w:p>
               </w:tc>
@@ -2046,7 +2257,7 @@
                     <w:jc w:val="center"/>
                   </w:pPr>
                   <w:r>
-                    <w:t xml:space="preserve">Juvenile</w:t>
+                    <w:t xml:space="preserve">Adult</w:t>
                   </w:r>
                 </w:p>
               </w:tc>
@@ -2087,7 +2298,7 @@
                     <w:jc w:val="center"/>
                   </w:pPr>
                   <w:r>
-                    <w:t xml:space="preserve">2026-02-26</w:t>
+                    <w:t xml:space="preserve">2026-03-05</w:t>
                   </w:r>
                 </w:p>
               </w:tc>
@@ -2126,7 +2337,7 @@
                     <w:jc w:val="center"/>
                   </w:pPr>
                   <w:r>
-                    <w:t xml:space="preserve">Adult</w:t>
+                    <w:t xml:space="preserve">Juvenile</w:t>
                   </w:r>
                 </w:p>
               </w:tc>
@@ -2167,7 +2378,7 @@
                     <w:jc w:val="center"/>
                   </w:pPr>
                   <w:r>
-                    <w:t xml:space="preserve">2026-02-26</w:t>
+                    <w:t xml:space="preserve">2026-03-08</w:t>
                   </w:r>
                 </w:p>
               </w:tc>
@@ -2206,7 +2417,7 @@
                     <w:jc w:val="center"/>
                   </w:pPr>
                   <w:r>
-                    <w:t xml:space="preserve">Juvenile</w:t>
+                    <w:t xml:space="preserve">Adult</w:t>
                   </w:r>
                 </w:p>
               </w:tc>
@@ -2219,7 +2430,7 @@
                     <w:jc w:val="center"/>
                   </w:pPr>
                   <w:r>
-                    <w:t xml:space="preserve">1</w:t>
+                    <w:t xml:space="preserve">3</w:t>
                   </w:r>
                 </w:p>
               </w:tc>
@@ -2247,7 +2458,7 @@
                     <w:jc w:val="center"/>
                   </w:pPr>
                   <w:r>
-                    <w:t xml:space="preserve">2026-02-27</w:t>
+                    <w:t xml:space="preserve">2026-03-08</w:t>
                   </w:r>
                 </w:p>
               </w:tc>
@@ -2286,7 +2497,1047 @@
                     <w:jc w:val="center"/>
                   </w:pPr>
                   <w:r>
+                    <w:t xml:space="preserve">Juvenile</w:t>
+                  </w:r>
+                </w:p>
+              </w:tc>
+              <w:tc>
+                <w:tcPr/>
+                <w:p>
+                  <w:pPr>
+                    <w:pStyle w:val="Compact"/>
+                    <w:jc w:val="right"/>
+                    <w:jc w:val="center"/>
+                  </w:pPr>
+                  <w:r>
+                    <w:t xml:space="preserve">2</w:t>
+                  </w:r>
+                </w:p>
+              </w:tc>
+            </w:tr>
+            <w:tr>
+              <w:tc>
+                <w:tcPr/>
+                <w:p>
+                  <w:pPr>
+                    <w:pStyle w:val="Compact"/>
+                    <w:jc w:val="left"/>
+                    <w:jc w:val="center"/>
+                  </w:pPr>
+                  <w:r>
+                    <w:t xml:space="preserve">DJFMP</w:t>
+                  </w:r>
+                </w:p>
+              </w:tc>
+              <w:tc>
+                <w:tcPr/>
+                <w:p>
+                  <w:pPr>
+                    <w:pStyle w:val="Compact"/>
+                    <w:jc w:val="left"/>
+                    <w:jc w:val="center"/>
+                  </w:pPr>
+                  <w:r>
+                    <w:t xml:space="preserve">2026-03-09</w:t>
+                  </w:r>
+                </w:p>
+              </w:tc>
+              <w:tc>
+                <w:tcPr/>
+                <w:p>
+                  <w:pPr>
+                    <w:pStyle w:val="Compact"/>
+                    <w:jc w:val="left"/>
+                    <w:jc w:val="center"/>
+                  </w:pPr>
+                  <w:r>
+                    <w:t xml:space="preserve">N/A</w:t>
+                  </w:r>
+                </w:p>
+              </w:tc>
+              <w:tc>
+                <w:tcPr/>
+                <w:p>
+                  <w:pPr>
+                    <w:pStyle w:val="Compact"/>
+                    <w:jc w:val="left"/>
+                    <w:jc w:val="center"/>
+                  </w:pPr>
+                  <w:r>
+                    <w:t xml:space="preserve">Chipps Island</w:t>
+                  </w:r>
+                </w:p>
+              </w:tc>
+              <w:tc>
+                <w:tcPr/>
+                <w:p>
+                  <w:pPr>
+                    <w:pStyle w:val="Compact"/>
+                    <w:jc w:val="left"/>
+                    <w:jc w:val="center"/>
+                  </w:pPr>
+                  <w:r>
                     <w:t xml:space="preserve">Adult</w:t>
+                  </w:r>
+                </w:p>
+              </w:tc>
+              <w:tc>
+                <w:tcPr/>
+                <w:p>
+                  <w:pPr>
+                    <w:pStyle w:val="Compact"/>
+                    <w:jc w:val="right"/>
+                    <w:jc w:val="center"/>
+                  </w:pPr>
+                  <w:r>
+                    <w:t xml:space="preserve">4</w:t>
+                  </w:r>
+                </w:p>
+              </w:tc>
+            </w:tr>
+            <w:tr>
+              <w:tc>
+                <w:tcPr/>
+                <w:p>
+                  <w:pPr>
+                    <w:pStyle w:val="Compact"/>
+                    <w:jc w:val="left"/>
+                    <w:jc w:val="center"/>
+                  </w:pPr>
+                  <w:r>
+                    <w:t xml:space="preserve">DJFMP</w:t>
+                  </w:r>
+                </w:p>
+              </w:tc>
+              <w:tc>
+                <w:tcPr/>
+                <w:p>
+                  <w:pPr>
+                    <w:pStyle w:val="Compact"/>
+                    <w:jc w:val="left"/>
+                    <w:jc w:val="center"/>
+                  </w:pPr>
+                  <w:r>
+                    <w:t xml:space="preserve">2026-03-09</w:t>
+                  </w:r>
+                </w:p>
+              </w:tc>
+              <w:tc>
+                <w:tcPr/>
+                <w:p>
+                  <w:pPr>
+                    <w:pStyle w:val="Compact"/>
+                    <w:jc w:val="left"/>
+                    <w:jc w:val="center"/>
+                  </w:pPr>
+                  <w:r>
+                    <w:t xml:space="preserve">N/A</w:t>
+                  </w:r>
+                </w:p>
+              </w:tc>
+              <w:tc>
+                <w:tcPr/>
+                <w:p>
+                  <w:pPr>
+                    <w:pStyle w:val="Compact"/>
+                    <w:jc w:val="left"/>
+                    <w:jc w:val="center"/>
+                  </w:pPr>
+                  <w:r>
+                    <w:t xml:space="preserve">Chipps Island</w:t>
+                  </w:r>
+                </w:p>
+              </w:tc>
+              <w:tc>
+                <w:tcPr/>
+                <w:p>
+                  <w:pPr>
+                    <w:pStyle w:val="Compact"/>
+                    <w:jc w:val="left"/>
+                    <w:jc w:val="center"/>
+                  </w:pPr>
+                  <w:r>
+                    <w:t xml:space="preserve">Juvenile</w:t>
+                  </w:r>
+                </w:p>
+              </w:tc>
+              <w:tc>
+                <w:tcPr/>
+                <w:p>
+                  <w:pPr>
+                    <w:pStyle w:val="Compact"/>
+                    <w:jc w:val="right"/>
+                    <w:jc w:val="center"/>
+                  </w:pPr>
+                  <w:r>
+                    <w:t xml:space="preserve">2</w:t>
+                  </w:r>
+                </w:p>
+              </w:tc>
+            </w:tr>
+            <w:tr>
+              <w:tc>
+                <w:tcPr/>
+                <w:p>
+                  <w:pPr>
+                    <w:pStyle w:val="Compact"/>
+                    <w:jc w:val="left"/>
+                    <w:jc w:val="center"/>
+                  </w:pPr>
+                  <w:r>
+                    <w:t xml:space="preserve">DJFMP</w:t>
+                  </w:r>
+                </w:p>
+              </w:tc>
+              <w:tc>
+                <w:tcPr/>
+                <w:p>
+                  <w:pPr>
+                    <w:pStyle w:val="Compact"/>
+                    <w:jc w:val="left"/>
+                    <w:jc w:val="center"/>
+                  </w:pPr>
+                  <w:r>
+                    <w:t xml:space="preserve">2026-03-10</w:t>
+                  </w:r>
+                </w:p>
+              </w:tc>
+              <w:tc>
+                <w:tcPr/>
+                <w:p>
+                  <w:pPr>
+                    <w:pStyle w:val="Compact"/>
+                    <w:jc w:val="left"/>
+                    <w:jc w:val="center"/>
+                  </w:pPr>
+                  <w:r>
+                    <w:t xml:space="preserve">N/A</w:t>
+                  </w:r>
+                </w:p>
+              </w:tc>
+              <w:tc>
+                <w:tcPr/>
+                <w:p>
+                  <w:pPr>
+                    <w:pStyle w:val="Compact"/>
+                    <w:jc w:val="left"/>
+                    <w:jc w:val="center"/>
+                  </w:pPr>
+                  <w:r>
+                    <w:t xml:space="preserve">Chipps Island</w:t>
+                  </w:r>
+                </w:p>
+              </w:tc>
+              <w:tc>
+                <w:tcPr/>
+                <w:p>
+                  <w:pPr>
+                    <w:pStyle w:val="Compact"/>
+                    <w:jc w:val="left"/>
+                    <w:jc w:val="center"/>
+                  </w:pPr>
+                  <w:r>
+                    <w:t xml:space="preserve">Adult</w:t>
+                  </w:r>
+                </w:p>
+              </w:tc>
+              <w:tc>
+                <w:tcPr/>
+                <w:p>
+                  <w:pPr>
+                    <w:pStyle w:val="Compact"/>
+                    <w:jc w:val="right"/>
+                    <w:jc w:val="center"/>
+                  </w:pPr>
+                  <w:r>
+                    <w:t xml:space="preserve">4</w:t>
+                  </w:r>
+                </w:p>
+              </w:tc>
+            </w:tr>
+            <w:tr>
+              <w:tc>
+                <w:tcPr/>
+                <w:p>
+                  <w:pPr>
+                    <w:pStyle w:val="Compact"/>
+                    <w:jc w:val="left"/>
+                    <w:jc w:val="center"/>
+                  </w:pPr>
+                  <w:r>
+                    <w:t xml:space="preserve">DJFMP</w:t>
+                  </w:r>
+                </w:p>
+              </w:tc>
+              <w:tc>
+                <w:tcPr/>
+                <w:p>
+                  <w:pPr>
+                    <w:pStyle w:val="Compact"/>
+                    <w:jc w:val="left"/>
+                    <w:jc w:val="center"/>
+                  </w:pPr>
+                  <w:r>
+                    <w:t xml:space="preserve">2026-03-10</w:t>
+                  </w:r>
+                </w:p>
+              </w:tc>
+              <w:tc>
+                <w:tcPr/>
+                <w:p>
+                  <w:pPr>
+                    <w:pStyle w:val="Compact"/>
+                    <w:jc w:val="left"/>
+                    <w:jc w:val="center"/>
+                  </w:pPr>
+                  <w:r>
+                    <w:t xml:space="preserve">N/A</w:t>
+                  </w:r>
+                </w:p>
+              </w:tc>
+              <w:tc>
+                <w:tcPr/>
+                <w:p>
+                  <w:pPr>
+                    <w:pStyle w:val="Compact"/>
+                    <w:jc w:val="left"/>
+                    <w:jc w:val="center"/>
+                  </w:pPr>
+                  <w:r>
+                    <w:t xml:space="preserve">Chipps Island</w:t>
+                  </w:r>
+                </w:p>
+              </w:tc>
+              <w:tc>
+                <w:tcPr/>
+                <w:p>
+                  <w:pPr>
+                    <w:pStyle w:val="Compact"/>
+                    <w:jc w:val="left"/>
+                    <w:jc w:val="center"/>
+                  </w:pPr>
+                  <w:r>
+                    <w:t xml:space="preserve">Juvenile</w:t>
+                  </w:r>
+                </w:p>
+              </w:tc>
+              <w:tc>
+                <w:tcPr/>
+                <w:p>
+                  <w:pPr>
+                    <w:pStyle w:val="Compact"/>
+                    <w:jc w:val="right"/>
+                    <w:jc w:val="center"/>
+                  </w:pPr>
+                  <w:r>
+                    <w:t xml:space="preserve">3</w:t>
+                  </w:r>
+                </w:p>
+              </w:tc>
+            </w:tr>
+            <w:tr>
+              <w:tc>
+                <w:tcPr/>
+                <w:p>
+                  <w:pPr>
+                    <w:pStyle w:val="Compact"/>
+                    <w:jc w:val="left"/>
+                    <w:jc w:val="center"/>
+                  </w:pPr>
+                  <w:r>
+                    <w:t xml:space="preserve">DJFMP</w:t>
+                  </w:r>
+                </w:p>
+              </w:tc>
+              <w:tc>
+                <w:tcPr/>
+                <w:p>
+                  <w:pPr>
+                    <w:pStyle w:val="Compact"/>
+                    <w:jc w:val="left"/>
+                    <w:jc w:val="center"/>
+                  </w:pPr>
+                  <w:r>
+                    <w:t xml:space="preserve">2026-03-12</w:t>
+                  </w:r>
+                </w:p>
+              </w:tc>
+              <w:tc>
+                <w:tcPr/>
+                <w:p>
+                  <w:pPr>
+                    <w:pStyle w:val="Compact"/>
+                    <w:jc w:val="left"/>
+                    <w:jc w:val="center"/>
+                  </w:pPr>
+                  <w:r>
+                    <w:t xml:space="preserve">N/A</w:t>
+                  </w:r>
+                </w:p>
+              </w:tc>
+              <w:tc>
+                <w:tcPr/>
+                <w:p>
+                  <w:pPr>
+                    <w:pStyle w:val="Compact"/>
+                    <w:jc w:val="left"/>
+                    <w:jc w:val="center"/>
+                  </w:pPr>
+                  <w:r>
+                    <w:t xml:space="preserve">Chipps Island</w:t>
+                  </w:r>
+                </w:p>
+              </w:tc>
+              <w:tc>
+                <w:tcPr/>
+                <w:p>
+                  <w:pPr>
+                    <w:pStyle w:val="Compact"/>
+                    <w:jc w:val="left"/>
+                    <w:jc w:val="center"/>
+                  </w:pPr>
+                  <w:r>
+                    <w:t xml:space="preserve">Adult</w:t>
+                  </w:r>
+                </w:p>
+              </w:tc>
+              <w:tc>
+                <w:tcPr/>
+                <w:p>
+                  <w:pPr>
+                    <w:pStyle w:val="Compact"/>
+                    <w:jc w:val="right"/>
+                    <w:jc w:val="center"/>
+                  </w:pPr>
+                  <w:r>
+                    <w:t xml:space="preserve">1</w:t>
+                  </w:r>
+                </w:p>
+              </w:tc>
+            </w:tr>
+            <w:tr>
+              <w:tc>
+                <w:tcPr/>
+                <w:p>
+                  <w:pPr>
+                    <w:pStyle w:val="Compact"/>
+                    <w:jc w:val="left"/>
+                    <w:jc w:val="center"/>
+                  </w:pPr>
+                  <w:r>
+                    <w:t xml:space="preserve">DJFMP</w:t>
+                  </w:r>
+                </w:p>
+              </w:tc>
+              <w:tc>
+                <w:tcPr/>
+                <w:p>
+                  <w:pPr>
+                    <w:pStyle w:val="Compact"/>
+                    <w:jc w:val="left"/>
+                    <w:jc w:val="center"/>
+                  </w:pPr>
+                  <w:r>
+                    <w:t xml:space="preserve">2026-03-12</w:t>
+                  </w:r>
+                </w:p>
+              </w:tc>
+              <w:tc>
+                <w:tcPr/>
+                <w:p>
+                  <w:pPr>
+                    <w:pStyle w:val="Compact"/>
+                    <w:jc w:val="left"/>
+                    <w:jc w:val="center"/>
+                  </w:pPr>
+                  <w:r>
+                    <w:t xml:space="preserve">N/A</w:t>
+                  </w:r>
+                </w:p>
+              </w:tc>
+              <w:tc>
+                <w:tcPr/>
+                <w:p>
+                  <w:pPr>
+                    <w:pStyle w:val="Compact"/>
+                    <w:jc w:val="left"/>
+                    <w:jc w:val="center"/>
+                  </w:pPr>
+                  <w:r>
+                    <w:t xml:space="preserve">Chipps Island</w:t>
+                  </w:r>
+                </w:p>
+              </w:tc>
+              <w:tc>
+                <w:tcPr/>
+                <w:p>
+                  <w:pPr>
+                    <w:pStyle w:val="Compact"/>
+                    <w:jc w:val="left"/>
+                    <w:jc w:val="center"/>
+                  </w:pPr>
+                  <w:r>
+                    <w:t xml:space="preserve">Juvenile</w:t>
+                  </w:r>
+                </w:p>
+              </w:tc>
+              <w:tc>
+                <w:tcPr/>
+                <w:p>
+                  <w:pPr>
+                    <w:pStyle w:val="Compact"/>
+                    <w:jc w:val="right"/>
+                    <w:jc w:val="center"/>
+                  </w:pPr>
+                  <w:r>
+                    <w:t xml:space="preserve">1</w:t>
+                  </w:r>
+                </w:p>
+              </w:tc>
+            </w:tr>
+            <w:tr>
+              <w:tc>
+                <w:tcPr/>
+                <w:p>
+                  <w:pPr>
+                    <w:pStyle w:val="Compact"/>
+                    <w:jc w:val="left"/>
+                    <w:jc w:val="center"/>
+                  </w:pPr>
+                  <w:r>
+                    <w:t xml:space="preserve">EDSM</w:t>
+                  </w:r>
+                </w:p>
+              </w:tc>
+              <w:tc>
+                <w:tcPr/>
+                <w:p>
+                  <w:pPr>
+                    <w:pStyle w:val="Compact"/>
+                    <w:jc w:val="left"/>
+                    <w:jc w:val="center"/>
+                  </w:pPr>
+                  <w:r>
+                    <w:t xml:space="preserve">2026-03-05</w:t>
+                  </w:r>
+                </w:p>
+              </w:tc>
+              <w:tc>
+                <w:tcPr/>
+                <w:p>
+                  <w:pPr>
+                    <w:pStyle w:val="Compact"/>
+                    <w:jc w:val="left"/>
+                    <w:jc w:val="center"/>
+                  </w:pPr>
+                  <w:r>
+                    <w:t xml:space="preserve">Far West</w:t>
+                  </w:r>
+                </w:p>
+              </w:tc>
+              <w:tc>
+                <w:tcPr/>
+                <w:p>
+                  <w:pPr>
+                    <w:pStyle w:val="Compact"/>
+                    <w:jc w:val="left"/>
+                    <w:jc w:val="center"/>
+                  </w:pPr>
+                  <w:r>
+                    <w:t xml:space="preserve">Western Delta</w:t>
+                  </w:r>
+                </w:p>
+              </w:tc>
+              <w:tc>
+                <w:tcPr/>
+                <w:p>
+                  <w:pPr>
+                    <w:pStyle w:val="Compact"/>
+                    <w:jc w:val="left"/>
+                    <w:jc w:val="center"/>
+                  </w:pPr>
+                  <w:r>
+                    <w:t xml:space="preserve">Adult</w:t>
+                  </w:r>
+                </w:p>
+              </w:tc>
+              <w:tc>
+                <w:tcPr/>
+                <w:p>
+                  <w:pPr>
+                    <w:pStyle w:val="Compact"/>
+                    <w:jc w:val="right"/>
+                    <w:jc w:val="center"/>
+                  </w:pPr>
+                  <w:r>
+                    <w:t xml:space="preserve">2</w:t>
+                  </w:r>
+                </w:p>
+              </w:tc>
+            </w:tr>
+            <w:tr>
+              <w:tc>
+                <w:tcPr/>
+                <w:p>
+                  <w:pPr>
+                    <w:pStyle w:val="Compact"/>
+                    <w:jc w:val="left"/>
+                    <w:jc w:val="center"/>
+                  </w:pPr>
+                  <w:r>
+                    <w:t xml:space="preserve">EDSM</w:t>
+                  </w:r>
+                </w:p>
+              </w:tc>
+              <w:tc>
+                <w:tcPr/>
+                <w:p>
+                  <w:pPr>
+                    <w:pStyle w:val="Compact"/>
+                    <w:jc w:val="left"/>
+                    <w:jc w:val="center"/>
+                  </w:pPr>
+                  <w:r>
+                    <w:t xml:space="preserve">2026-03-05</w:t>
+                  </w:r>
+                </w:p>
+              </w:tc>
+              <w:tc>
+                <w:tcPr/>
+                <w:p>
+                  <w:pPr>
+                    <w:pStyle w:val="Compact"/>
+                    <w:jc w:val="left"/>
+                    <w:jc w:val="center"/>
+                  </w:pPr>
+                  <w:r>
+                    <w:t xml:space="preserve">Far West</w:t>
+                  </w:r>
+                </w:p>
+              </w:tc>
+              <w:tc>
+                <w:tcPr/>
+                <w:p>
+                  <w:pPr>
+                    <w:pStyle w:val="Compact"/>
+                    <w:jc w:val="left"/>
+                    <w:jc w:val="center"/>
+                  </w:pPr>
+                  <w:r>
+                    <w:t xml:space="preserve">Western Delta</w:t>
+                  </w:r>
+                </w:p>
+              </w:tc>
+              <w:tc>
+                <w:tcPr/>
+                <w:p>
+                  <w:pPr>
+                    <w:pStyle w:val="Compact"/>
+                    <w:jc w:val="left"/>
+                    <w:jc w:val="center"/>
+                  </w:pPr>
+                  <w:r>
+                    <w:t xml:space="preserve">Juvenile</w:t>
+                  </w:r>
+                </w:p>
+              </w:tc>
+              <w:tc>
+                <w:tcPr/>
+                <w:p>
+                  <w:pPr>
+                    <w:pStyle w:val="Compact"/>
+                    <w:jc w:val="right"/>
+                    <w:jc w:val="center"/>
+                  </w:pPr>
+                  <w:r>
+                    <w:t xml:space="preserve">3</w:t>
+                  </w:r>
+                </w:p>
+              </w:tc>
+            </w:tr>
+            <w:tr>
+              <w:tc>
+                <w:tcPr/>
+                <w:p>
+                  <w:pPr>
+                    <w:pStyle w:val="Compact"/>
+                    <w:jc w:val="left"/>
+                    <w:jc w:val="center"/>
+                  </w:pPr>
+                  <w:r>
+                    <w:t xml:space="preserve">EDSM</w:t>
+                  </w:r>
+                </w:p>
+              </w:tc>
+              <w:tc>
+                <w:tcPr/>
+                <w:p>
+                  <w:pPr>
+                    <w:pStyle w:val="Compact"/>
+                    <w:jc w:val="left"/>
+                    <w:jc w:val="center"/>
+                  </w:pPr>
+                  <w:r>
+                    <w:t xml:space="preserve">2026-03-09</w:t>
+                  </w:r>
+                </w:p>
+              </w:tc>
+              <w:tc>
+                <w:tcPr/>
+                <w:p>
+                  <w:pPr>
+                    <w:pStyle w:val="Compact"/>
+                    <w:jc w:val="left"/>
+                    <w:jc w:val="center"/>
+                  </w:pPr>
+                  <w:r>
+                    <w:t xml:space="preserve">West</w:t>
+                  </w:r>
+                </w:p>
+              </w:tc>
+              <w:tc>
+                <w:tcPr/>
+                <w:p>
+                  <w:pPr>
+                    <w:pStyle w:val="Compact"/>
+                    <w:jc w:val="left"/>
+                    <w:jc w:val="center"/>
+                  </w:pPr>
+                  <w:r>
+                    <w:t xml:space="preserve">Suisun Marsh</w:t>
+                  </w:r>
+                </w:p>
+              </w:tc>
+              <w:tc>
+                <w:tcPr/>
+                <w:p>
+                  <w:pPr>
+                    <w:pStyle w:val="Compact"/>
+                    <w:jc w:val="left"/>
+                    <w:jc w:val="center"/>
+                  </w:pPr>
+                  <w:r>
+                    <w:t xml:space="preserve">Adult</w:t>
+                  </w:r>
+                </w:p>
+              </w:tc>
+              <w:tc>
+                <w:tcPr/>
+                <w:p>
+                  <w:pPr>
+                    <w:pStyle w:val="Compact"/>
+                    <w:jc w:val="right"/>
+                    <w:jc w:val="center"/>
+                  </w:pPr>
+                  <w:r>
+                    <w:t xml:space="preserve">2</w:t>
+                  </w:r>
+                </w:p>
+              </w:tc>
+            </w:tr>
+            <w:tr>
+              <w:tc>
+                <w:tcPr/>
+                <w:p>
+                  <w:pPr>
+                    <w:pStyle w:val="Compact"/>
+                    <w:jc w:val="left"/>
+                    <w:jc w:val="center"/>
+                  </w:pPr>
+                  <w:r>
+                    <w:t xml:space="preserve">EDSM</w:t>
+                  </w:r>
+                </w:p>
+              </w:tc>
+              <w:tc>
+                <w:tcPr/>
+                <w:p>
+                  <w:pPr>
+                    <w:pStyle w:val="Compact"/>
+                    <w:jc w:val="left"/>
+                    <w:jc w:val="center"/>
+                  </w:pPr>
+                  <w:r>
+                    <w:t xml:space="preserve">2026-03-10</w:t>
+                  </w:r>
+                </w:p>
+              </w:tc>
+              <w:tc>
+                <w:tcPr/>
+                <w:p>
+                  <w:pPr>
+                    <w:pStyle w:val="Compact"/>
+                    <w:jc w:val="left"/>
+                    <w:jc w:val="center"/>
+                  </w:pPr>
+                  <w:r>
+                    <w:t xml:space="preserve">Far West</w:t>
+                  </w:r>
+                </w:p>
+              </w:tc>
+              <w:tc>
+                <w:tcPr/>
+                <w:p>
+                  <w:pPr>
+                    <w:pStyle w:val="Compact"/>
+                    <w:jc w:val="left"/>
+                    <w:jc w:val="center"/>
+                  </w:pPr>
+                  <w:r>
+                    <w:t xml:space="preserve">Western Delta</w:t>
+                  </w:r>
+                </w:p>
+              </w:tc>
+              <w:tc>
+                <w:tcPr/>
+                <w:p>
+                  <w:pPr>
+                    <w:pStyle w:val="Compact"/>
+                    <w:jc w:val="left"/>
+                    <w:jc w:val="center"/>
+                  </w:pPr>
+                  <w:r>
+                    <w:t xml:space="preserve">Juvenile</w:t>
+                  </w:r>
+                </w:p>
+              </w:tc>
+              <w:tc>
+                <w:tcPr/>
+                <w:p>
+                  <w:pPr>
+                    <w:pStyle w:val="Compact"/>
+                    <w:jc w:val="right"/>
+                    <w:jc w:val="center"/>
+                  </w:pPr>
+                  <w:r>
+                    <w:t xml:space="preserve">1</w:t>
+                  </w:r>
+                </w:p>
+              </w:tc>
+            </w:tr>
+            <w:tr>
+              <w:tc>
+                <w:tcPr/>
+                <w:p>
+                  <w:pPr>
+                    <w:pStyle w:val="Compact"/>
+                    <w:jc w:val="left"/>
+                    <w:jc w:val="center"/>
+                  </w:pPr>
+                  <w:r>
+                    <w:t xml:space="preserve">sls</w:t>
+                  </w:r>
+                </w:p>
+              </w:tc>
+              <w:tc>
+                <w:tcPr/>
+                <w:p>
+                  <w:pPr>
+                    <w:pStyle w:val="Compact"/>
+                    <w:jc w:val="left"/>
+                    <w:jc w:val="center"/>
+                  </w:pPr>
+                  <w:r>
+                    <w:t xml:space="preserve">2026-03-09</w:t>
+                  </w:r>
+                </w:p>
+              </w:tc>
+              <w:tc>
+                <w:tcPr/>
+                <w:p>
+                  <w:pPr>
+                    <w:pStyle w:val="Compact"/>
+                    <w:jc w:val="left"/>
+                    <w:jc w:val="center"/>
+                  </w:pPr>
+                  <w:r>
+                    <w:t xml:space="preserve">South</w:t>
+                  </w:r>
+                </w:p>
+              </w:tc>
+              <w:tc>
+                <w:tcPr/>
+                <w:p>
+                  <w:pPr>
+                    <w:pStyle w:val="Compact"/>
+                    <w:jc w:val="left"/>
+                    <w:jc w:val="center"/>
+                  </w:pPr>
+                  <w:r>
+                    <w:t xml:space="preserve">Lower San Joaquin</w:t>
+                  </w:r>
+                </w:p>
+              </w:tc>
+              <w:tc>
+                <w:tcPr/>
+                <w:p>
+                  <w:pPr>
+                    <w:pStyle w:val="Compact"/>
+                    <w:jc w:val="left"/>
+                    <w:jc w:val="center"/>
+                  </w:pPr>
+                  <w:r>
+                    <w:t xml:space="preserve">Larva</w:t>
+                  </w:r>
+                </w:p>
+              </w:tc>
+              <w:tc>
+                <w:tcPr/>
+                <w:p>
+                  <w:pPr>
+                    <w:pStyle w:val="Compact"/>
+                    <w:jc w:val="right"/>
+                    <w:jc w:val="center"/>
+                  </w:pPr>
+                  <w:r>
+                    <w:t xml:space="preserve">3</w:t>
+                  </w:r>
+                </w:p>
+              </w:tc>
+            </w:tr>
+            <w:tr>
+              <w:tc>
+                <w:tcPr/>
+                <w:p>
+                  <w:pPr>
+                    <w:pStyle w:val="Compact"/>
+                    <w:jc w:val="left"/>
+                    <w:jc w:val="center"/>
+                  </w:pPr>
+                  <w:r>
+                    <w:t xml:space="preserve">sls</w:t>
+                  </w:r>
+                </w:p>
+              </w:tc>
+              <w:tc>
+                <w:tcPr/>
+                <w:p>
+                  <w:pPr>
+                    <w:pStyle w:val="Compact"/>
+                    <w:jc w:val="left"/>
+                    <w:jc w:val="center"/>
+                  </w:pPr>
+                  <w:r>
+                    <w:t xml:space="preserve">2026-03-09</w:t>
+                  </w:r>
+                </w:p>
+              </w:tc>
+              <w:tc>
+                <w:tcPr/>
+                <w:p>
+                  <w:pPr>
+                    <w:pStyle w:val="Compact"/>
+                    <w:jc w:val="left"/>
+                    <w:jc w:val="center"/>
+                  </w:pPr>
+                  <w:r>
+                    <w:t xml:space="preserve">West</w:t>
+                  </w:r>
+                </w:p>
+              </w:tc>
+              <w:tc>
+                <w:tcPr/>
+                <w:p>
+                  <w:pPr>
+                    <w:pStyle w:val="Compact"/>
+                    <w:jc w:val="left"/>
+                    <w:jc w:val="center"/>
+                  </w:pPr>
+                  <w:r>
+                    <w:t xml:space="preserve">Suisun Bay</w:t>
+                  </w:r>
+                </w:p>
+              </w:tc>
+              <w:tc>
+                <w:tcPr/>
+                <w:p>
+                  <w:pPr>
+                    <w:pStyle w:val="Compact"/>
+                    <w:jc w:val="left"/>
+                    <w:jc w:val="center"/>
+                  </w:pPr>
+                  <w:r>
+                    <w:t xml:space="preserve">Larva</w:t>
+                  </w:r>
+                </w:p>
+              </w:tc>
+              <w:tc>
+                <w:tcPr/>
+                <w:p>
+                  <w:pPr>
+                    <w:pStyle w:val="Compact"/>
+                    <w:jc w:val="right"/>
+                    <w:jc w:val="center"/>
+                  </w:pPr>
+                  <w:r>
+                    <w:t xml:space="preserve">7</w:t>
+                  </w:r>
+                </w:p>
+              </w:tc>
+            </w:tr>
+            <w:tr>
+              <w:tc>
+                <w:tcPr/>
+                <w:p>
+                  <w:pPr>
+                    <w:pStyle w:val="Compact"/>
+                    <w:jc w:val="left"/>
+                    <w:jc w:val="center"/>
+                  </w:pPr>
+                  <w:r>
+                    <w:t xml:space="preserve">sls</w:t>
+                  </w:r>
+                </w:p>
+              </w:tc>
+              <w:tc>
+                <w:tcPr/>
+                <w:p>
+                  <w:pPr>
+                    <w:pStyle w:val="Compact"/>
+                    <w:jc w:val="left"/>
+                    <w:jc w:val="center"/>
+                  </w:pPr>
+                  <w:r>
+                    <w:t xml:space="preserve">2026-03-10</w:t>
+                  </w:r>
+                </w:p>
+              </w:tc>
+              <w:tc>
+                <w:tcPr/>
+                <w:p>
+                  <w:pPr>
+                    <w:pStyle w:val="Compact"/>
+                    <w:jc w:val="left"/>
+                    <w:jc w:val="center"/>
+                  </w:pPr>
+                  <w:r>
+                    <w:t xml:space="preserve">North</w:t>
+                  </w:r>
+                </w:p>
+              </w:tc>
+              <w:tc>
+                <w:tcPr/>
+                <w:p>
+                  <w:pPr>
+                    <w:pStyle w:val="Compact"/>
+                    <w:jc w:val="left"/>
+                    <w:jc w:val="center"/>
+                  </w:pPr>
+                  <w:r>
+                    <w:t xml:space="preserve">Cache Slough/Liberty Island</w:t>
+                  </w:r>
+                </w:p>
+              </w:tc>
+              <w:tc>
+                <w:tcPr/>
+                <w:p>
+                  <w:pPr>
+                    <w:pStyle w:val="Compact"/>
+                    <w:jc w:val="left"/>
+                    <w:jc w:val="center"/>
+                  </w:pPr>
+                  <w:r>
+                    <w:t xml:space="preserve">Larva</w:t>
                   </w:r>
                 </w:p>
               </w:tc>
@@ -2588,7 +3839,7 @@
                     <w:jc w:val="center"/>
                   </w:pPr>
                   <w:r>
-                    <w:t xml:space="preserve">248</w:t>
+                    <w:t xml:space="preserve">267</w:t>
                   </w:r>
                 </w:p>
               </w:tc>
@@ -2642,7 +3893,7 @@
                     <w:jc w:val="center"/>
                   </w:pPr>
                   <w:r>
-                    <w:t xml:space="preserve">20</w:t>
+                    <w:t xml:space="preserve">31</w:t>
                   </w:r>
                 </w:p>
               </w:tc>
@@ -2750,7 +4001,7 @@
                     <w:jc w:val="center"/>
                   </w:pPr>
                   <w:r>
-                    <w:t xml:space="preserve">15</w:t>
+                    <w:t xml:space="preserve">23</w:t>
                   </w:r>
                 </w:p>
               </w:tc>
@@ -2804,7 +4055,7 @@
                     <w:jc w:val="center"/>
                   </w:pPr>
                   <w:r>
-                    <w:t xml:space="preserve">61</w:t>
+                    <w:t xml:space="preserve">92</w:t>
                   </w:r>
                 </w:p>
               </w:tc>
@@ -2912,7 +4163,7 @@
                     <w:jc w:val="center"/>
                   </w:pPr>
                   <w:r>
-                    <w:t xml:space="preserve">80</w:t>
+                    <w:t xml:space="preserve">82</w:t>
                   </w:r>
                 </w:p>
               </w:tc>
@@ -2966,7 +4217,7 @@
                     <w:jc w:val="center"/>
                   </w:pPr>
                   <w:r>
-                    <w:t xml:space="preserve">191</w:t>
+                    <w:t xml:space="preserve">200</w:t>
                   </w:r>
                 </w:p>
               </w:tc>
@@ -3830,7 +5081,7 @@
                     <w:jc w:val="center"/>
                   </w:pPr>
                   <w:r>
-                    <w:t xml:space="preserve">11</w:t>
+                    <w:t xml:space="preserve">300</w:t>
                   </w:r>
                 </w:p>
               </w:tc>
@@ -3884,7 +5135,7 @@
                     <w:jc w:val="center"/>
                   </w:pPr>
                   <w:r>
-                    <w:t xml:space="preserve">949</w:t>
+                    <w:t xml:space="preserve">2654</w:t>
                   </w:r>
                 </w:p>
               </w:tc>
@@ -3938,7 +5189,7 @@
                     <w:jc w:val="center"/>
                   </w:pPr>
                   <w:r>
-                    <w:t xml:space="preserve">77</w:t>
+                    <w:t xml:space="preserve">89</w:t>
                   </w:r>
                 </w:p>
               </w:tc>
@@ -3992,7 +5243,7 @@
                     <w:jc w:val="center"/>
                   </w:pPr>
                   <w:r>
-                    <w:t xml:space="preserve">45</w:t>
+                    <w:t xml:space="preserve">52</w:t>
                   </w:r>
                 </w:p>
               </w:tc>
@@ -4046,7 +5297,7 @@
                     <w:jc w:val="center"/>
                   </w:pPr>
                   <w:r>
-                    <w:t xml:space="preserve">671</w:t>
+                    <w:t xml:space="preserve">2197</w:t>
                   </w:r>
                 </w:p>
               </w:tc>
@@ -4154,7 +5405,7 @@
                     <w:jc w:val="center"/>
                   </w:pPr>
                   <w:r>
-                    <w:t xml:space="preserve">23</w:t>
+                    <w:t xml:space="preserve">154</w:t>
                   </w:r>
                 </w:p>
               </w:tc>
@@ -4316,7 +5567,7 @@
         </w:numPr>
       </w:pPr>
       <w:r>
-        <w:t xml:space="preserve">Daily average JPF: 9,820 cfs as of Mar 01, 2026</w:t>
+        <w:t xml:space="preserve">Daily average JPF: 2,465 cfs as of Mar 16, 2026</w:t>
       </w:r>
     </w:p>
     <w:p>
@@ -4396,7 +5647,7 @@
         </w:numPr>
       </w:pPr>
       <w:r>
-        <w:t xml:space="preserve">Daily average JPF: 9,820 cfs as of Mar 01, 2026</w:t>
+        <w:t xml:space="preserve">Daily average JPF: 2,465 cfs as of Mar 16, 2026</w:t>
       </w:r>
     </w:p>
     <w:bookmarkEnd w:id="57"/>
@@ -4469,55 +5720,31 @@
         </w:numPr>
       </w:pPr>
       <w:r>
-        <w:t xml:space="preserve">JPF is currently not less than 0 cfs and is not predicted to drop below 0 cfs this week.</w:t>
+        <w:t xml:space="preserve">JPF is currently not less than 0 cfs and is not predicted to drop below 0 cfs this week. Zone of Influence modeling indicates</w:t>
       </w:r>
       <w:r>
         <w:t xml:space="preserve"> </w:t>
       </w:r>
       <w:r>
-        <w:t xml:space="preserve">Zone of Influence modeling indicates low differences in the hydrodynamic</w:t>
+        <w:t xml:space="preserve">moderate differences in the hydrodynamic footprint across OMRI scenarios, with no change between current and forecasted conditions.</w:t>
       </w:r>
       <w:r>
         <w:t xml:space="preserve"> </w:t>
       </w:r>
       <w:r>
-        <w:t xml:space="preserve">footprint across OMRI scenarios, with no change between current and forecasted conditions.</w:t>
+        <w:t xml:space="preserve">Population-based PTM results, summarized in Appendix A, project low larval entrainment relative to estimated abundance</w:t>
       </w:r>
       <w:r>
         <w:t xml:space="preserve"> </w:t>
       </w:r>
       <w:r>
-        <w:t xml:space="preserve">If a Stormflex action were implemented, population-based PTM results, summarized in</w:t>
+        <w:t xml:space="preserve">the week ending 03/23/2026. Projected larval entrainment is 0.1% for OMRI of -6,500, and &lt;0.1% for all other</w:t>
       </w:r>
       <w:r>
         <w:t xml:space="preserve"> </w:t>
       </w:r>
       <w:r>
-        <w:t xml:space="preserve">Appendix A, project low larval entrainment relative to estimated abundance.</w:t>
-      </w:r>
-      <w:r>
-        <w:t xml:space="preserve"> </w:t>
-      </w:r>
-      <w:r>
-        <w:t xml:space="preserve">Modeled losses are approximately &lt;0.1% under OMRI of both –5,000 and –6,500 cfs</w:t>
-      </w:r>
-      <w:r>
-        <w:t xml:space="preserve"> </w:t>
-      </w:r>
-      <w:r>
-        <w:t xml:space="preserve">this week. For the week ending in 3/02/2026, larval entrainment is projected to be 0.2% and 0.3% of the</w:t>
-      </w:r>
-      <w:r>
-        <w:t xml:space="preserve"> </w:t>
-      </w:r>
-      <w:r>
-        <w:t xml:space="preserve">larval LFS population at an OMRI of -5,000 and -6,500 cfs, respectively. These projected losses</w:t>
-      </w:r>
-      <w:r>
-        <w:t xml:space="preserve"> </w:t>
-      </w:r>
-      <w:r>
-        <w:t xml:space="preserve">remain below levels suggesting population decline.</w:t>
+        <w:t xml:space="preserve">modeled OMRI levels. These projected losses remain below levels suggesting significant population decline.</w:t>
       </w:r>
     </w:p>
     <w:p>

</xml_diff>

<commit_message>
Fixed LFS Figure point shapes
</commit_message>
<xml_diff>
--- a/smt-assessment-v1.docx
+++ b/smt-assessment-v1.docx
@@ -683,7 +683,7 @@
                 <w:noProof/>
               </w:rPr>
               <w:drawing>
-                <wp:inline distT="0" distB="0" distL="0" distR="0" wp14:anchorId="37E2D89C" wp14:editId="37E2D89D">
+                <wp:inline distT="0" distB="0" distL="0" distR="0" wp14:anchorId="096E0EA7" wp14:editId="096E0EA8">
                   <wp:extent cx="5943600" cy="5200649"/>
                   <wp:effectExtent l="0" t="0" r="0" b="0"/>
                   <wp:docPr id="26" name="Picture"/>
@@ -1197,7 +1197,7 @@
               </w:rPr>
               <w:lastRenderedPageBreak/>
               <w:drawing>
-                <wp:inline distT="0" distB="0" distL="0" distR="0" wp14:anchorId="37E2D89E" wp14:editId="37E2D89F">
+                <wp:inline distT="0" distB="0" distL="0" distR="0" wp14:anchorId="096E0EA9" wp14:editId="096E0EAA">
                   <wp:extent cx="4576576" cy="3661261"/>
                   <wp:effectExtent l="0" t="0" r="0" b="0"/>
                   <wp:docPr id="31" name="Picture"/>
@@ -1760,6 +1760,15 @@
             <w:tblPr>
               <w:tblStyle w:val="Table"/>
               <w:tblW w:w="0" w:type="auto"/>
+              <w:jc w:val="center"/>
+              <w:tblBorders>
+                <w:top w:val="single" w:sz="4" w:space="0" w:color="auto"/>
+                <w:left w:val="single" w:sz="4" w:space="0" w:color="auto"/>
+                <w:bottom w:val="single" w:sz="4" w:space="0" w:color="auto"/>
+                <w:right w:val="single" w:sz="4" w:space="0" w:color="auto"/>
+                <w:insideH w:val="single" w:sz="4" w:space="0" w:color="auto"/>
+                <w:insideV w:val="single" w:sz="4" w:space="0" w:color="auto"/>
+              </w:tblBorders>
               <w:tblLook w:val="0020" w:firstRow="1" w:lastRow="0" w:firstColumn="0" w:lastColumn="0" w:noHBand="0" w:noVBand="0"/>
             </w:tblPr>
             <w:tblGrid>
@@ -1774,10 +1783,14 @@
               <w:trPr>
                 <w:cnfStyle w:val="100000000000" w:firstRow="1" w:lastRow="0" w:firstColumn="0" w:lastColumn="0" w:oddVBand="0" w:evenVBand="0" w:oddHBand="0" w:evenHBand="0" w:firstRowFirstColumn="0" w:firstRowLastColumn="0" w:lastRowFirstColumn="0" w:lastRowLastColumn="0"/>
                 <w:tblHeader/>
+                <w:jc w:val="center"/>
               </w:trPr>
               <w:tc>
                 <w:tcPr>
                   <w:tcW w:w="1320" w:type="dxa"/>
+                  <w:tcBorders>
+                    <w:bottom w:val="none" w:sz="0" w:space="0" w:color="auto"/>
+                  </w:tcBorders>
                 </w:tcPr>
                 <w:p>
                   <w:pPr>
@@ -1792,6 +1805,9 @@
               <w:tc>
                 <w:tcPr>
                   <w:tcW w:w="1320" w:type="dxa"/>
+                  <w:tcBorders>
+                    <w:bottom w:val="none" w:sz="0" w:space="0" w:color="auto"/>
+                  </w:tcBorders>
                 </w:tcPr>
                 <w:p>
                   <w:pPr>
@@ -1806,6 +1822,9 @@
               <w:tc>
                 <w:tcPr>
                   <w:tcW w:w="1320" w:type="dxa"/>
+                  <w:tcBorders>
+                    <w:bottom w:val="none" w:sz="0" w:space="0" w:color="auto"/>
+                  </w:tcBorders>
                 </w:tcPr>
                 <w:p>
                   <w:pPr>
@@ -1820,6 +1839,9 @@
               <w:tc>
                 <w:tcPr>
                   <w:tcW w:w="1320" w:type="dxa"/>
+                  <w:tcBorders>
+                    <w:bottom w:val="none" w:sz="0" w:space="0" w:color="auto"/>
+                  </w:tcBorders>
                 </w:tcPr>
                 <w:p>
                   <w:pPr>
@@ -1834,6 +1856,9 @@
               <w:tc>
                 <w:tcPr>
                   <w:tcW w:w="1320" w:type="dxa"/>
+                  <w:tcBorders>
+                    <w:bottom w:val="none" w:sz="0" w:space="0" w:color="auto"/>
+                  </w:tcBorders>
                 </w:tcPr>
                 <w:p>
                   <w:pPr>
@@ -1848,6 +1873,9 @@
               <w:tc>
                 <w:tcPr>
                   <w:tcW w:w="1320" w:type="dxa"/>
+                  <w:tcBorders>
+                    <w:bottom w:val="none" w:sz="0" w:space="0" w:color="auto"/>
+                  </w:tcBorders>
                 </w:tcPr>
                 <w:p>
                   <w:pPr>
@@ -1861,6 +1889,9 @@
               </w:tc>
             </w:tr>
             <w:tr>
+              <w:trPr>
+                <w:jc w:val="center"/>
+              </w:trPr>
               <w:tc>
                 <w:tcPr>
                   <w:tcW w:w="1320" w:type="dxa"/>
@@ -1947,6 +1978,9 @@
               </w:tc>
             </w:tr>
             <w:tr>
+              <w:trPr>
+                <w:jc w:val="center"/>
+              </w:trPr>
               <w:tc>
                 <w:tcPr>
                   <w:tcW w:w="1320" w:type="dxa"/>
@@ -2033,6 +2067,9 @@
               </w:tc>
             </w:tr>
             <w:tr>
+              <w:trPr>
+                <w:jc w:val="center"/>
+              </w:trPr>
               <w:tc>
                 <w:tcPr>
                   <w:tcW w:w="1320" w:type="dxa"/>
@@ -2119,6 +2156,9 @@
               </w:tc>
             </w:tr>
             <w:tr>
+              <w:trPr>
+                <w:jc w:val="center"/>
+              </w:trPr>
               <w:tc>
                 <w:tcPr>
                   <w:tcW w:w="1320" w:type="dxa"/>
@@ -2205,6 +2245,9 @@
               </w:tc>
             </w:tr>
             <w:tr>
+              <w:trPr>
+                <w:jc w:val="center"/>
+              </w:trPr>
               <w:tc>
                 <w:tcPr>
                   <w:tcW w:w="1320" w:type="dxa"/>
@@ -2291,6 +2334,9 @@
               </w:tc>
             </w:tr>
             <w:tr>
+              <w:trPr>
+                <w:jc w:val="center"/>
+              </w:trPr>
               <w:tc>
                 <w:tcPr>
                   <w:tcW w:w="1320" w:type="dxa"/>
@@ -2377,6 +2423,9 @@
               </w:tc>
             </w:tr>
             <w:tr>
+              <w:trPr>
+                <w:jc w:val="center"/>
+              </w:trPr>
               <w:tc>
                 <w:tcPr>
                   <w:tcW w:w="1320" w:type="dxa"/>
@@ -2463,6 +2512,9 @@
               </w:tc>
             </w:tr>
             <w:tr>
+              <w:trPr>
+                <w:jc w:val="center"/>
+              </w:trPr>
               <w:tc>
                 <w:tcPr>
                   <w:tcW w:w="1320" w:type="dxa"/>
@@ -2570,7 +2622,7 @@
               </w:rPr>
               <w:lastRenderedPageBreak/>
               <w:drawing>
-                <wp:inline distT="0" distB="0" distL="0" distR="0" wp14:anchorId="37E2D8A0" wp14:editId="37E2D8A1">
+                <wp:inline distT="0" distB="0" distL="0" distR="0" wp14:anchorId="096E0EAB" wp14:editId="096E0EAC">
                   <wp:extent cx="5943600" cy="5200649"/>
                   <wp:effectExtent l="0" t="0" r="0" b="0"/>
                   <wp:docPr id="46" name="Picture"/>
@@ -2643,6 +2695,14 @@
             <w:tblPr>
               <w:tblStyle w:val="Table"/>
               <w:tblW w:w="0" w:type="auto"/>
+              <w:tblBorders>
+                <w:top w:val="single" w:sz="4" w:space="0" w:color="auto"/>
+                <w:left w:val="single" w:sz="4" w:space="0" w:color="auto"/>
+                <w:bottom w:val="single" w:sz="4" w:space="0" w:color="auto"/>
+                <w:right w:val="single" w:sz="4" w:space="0" w:color="auto"/>
+                <w:insideH w:val="single" w:sz="4" w:space="0" w:color="auto"/>
+                <w:insideV w:val="single" w:sz="4" w:space="0" w:color="auto"/>
+              </w:tblBorders>
               <w:tblLook w:val="0020" w:firstRow="1" w:lastRow="0" w:firstColumn="0" w:lastColumn="0" w:noHBand="0" w:noVBand="0"/>
             </w:tblPr>
             <w:tblGrid>
@@ -2659,6 +2719,9 @@
               <w:tc>
                 <w:tcPr>
                   <w:tcW w:w="1980" w:type="dxa"/>
+                  <w:tcBorders>
+                    <w:bottom w:val="none" w:sz="0" w:space="0" w:color="auto"/>
+                  </w:tcBorders>
                 </w:tcPr>
                 <w:p>
                   <w:pPr>
@@ -2673,6 +2736,9 @@
               <w:tc>
                 <w:tcPr>
                   <w:tcW w:w="1980" w:type="dxa"/>
+                  <w:tcBorders>
+                    <w:bottom w:val="none" w:sz="0" w:space="0" w:color="auto"/>
+                  </w:tcBorders>
                 </w:tcPr>
                 <w:p>
                   <w:pPr>
@@ -2687,6 +2753,9 @@
               <w:tc>
                 <w:tcPr>
                   <w:tcW w:w="1980" w:type="dxa"/>
+                  <w:tcBorders>
+                    <w:bottom w:val="none" w:sz="0" w:space="0" w:color="auto"/>
+                  </w:tcBorders>
                 </w:tcPr>
                 <w:p>
                   <w:pPr>
@@ -2701,6 +2770,9 @@
               <w:tc>
                 <w:tcPr>
                   <w:tcW w:w="1980" w:type="dxa"/>
+                  <w:tcBorders>
+                    <w:bottom w:val="none" w:sz="0" w:space="0" w:color="auto"/>
+                  </w:tcBorders>
                 </w:tcPr>
                 <w:p>
                   <w:pPr>
@@ -4592,7 +4664,7 @@
               </w:rPr>
               <w:lastRenderedPageBreak/>
               <w:drawing>
-                <wp:inline distT="0" distB="0" distL="0" distR="0" wp14:anchorId="37E2D8A2" wp14:editId="37E2D8A3">
+                <wp:inline distT="0" distB="0" distL="0" distR="0" wp14:anchorId="096E0EAD" wp14:editId="096E0EAE">
                   <wp:extent cx="4576576" cy="3661261"/>
                   <wp:effectExtent l="0" t="0" r="0" b="0"/>
                   <wp:docPr id="51" name="Picture"/>
@@ -5231,7 +5303,7 @@
   <w:abstractNum w:abstractNumId="0" w15:restartNumberingAfterBreak="0">
     <w:nsid w:val="0000A990"/>
     <w:multiLevelType w:val="multilevel"/>
-    <w:tmpl w:val="158E3048"/>
+    <w:tmpl w:val="26E6AFC6"/>
     <w:lvl w:ilvl="0">
       <w:numFmt w:val="bullet"/>
       <w:lvlText w:val=" "/>
@@ -5308,7 +5380,7 @@
   <w:abstractNum w:abstractNumId="1" w15:restartNumberingAfterBreak="0">
     <w:nsid w:val="0000A991"/>
     <w:multiLevelType w:val="multilevel"/>
-    <w:tmpl w:val="2B2804E0"/>
+    <w:tmpl w:val="30300C74"/>
     <w:lvl w:ilvl="0">
       <w:numFmt w:val="bullet"/>
       <w:lvlText w:val=""/>
@@ -5412,7 +5484,7 @@
   <w:abstractNum w:abstractNumId="2" w15:restartNumberingAfterBreak="0">
     <w:nsid w:val="00A99411"/>
     <w:multiLevelType w:val="multilevel"/>
-    <w:tmpl w:val="0BC25E6C"/>
+    <w:tmpl w:val="69EC1D80"/>
     <w:lvl w:ilvl="0">
       <w:start w:val="1"/>
       <w:numFmt w:val="decimal"/>
@@ -5498,7 +5570,7 @@
   <w:abstractNum w:abstractNumId="3" w15:restartNumberingAfterBreak="0">
     <w:nsid w:val="00A99413"/>
     <w:multiLevelType w:val="multilevel"/>
-    <w:tmpl w:val="366C324E"/>
+    <w:tmpl w:val="A71A1604"/>
     <w:lvl w:ilvl="0">
       <w:start w:val="3"/>
       <w:numFmt w:val="decimal"/>
@@ -5688,34 +5760,34 @@
   <w:num w:numId="1" w16cid:durableId="125778032">
     <w:abstractNumId w:val="4"/>
   </w:num>
-  <w:num w:numId="2" w16cid:durableId="768694619">
+  <w:num w:numId="2" w16cid:durableId="95682922">
     <w:abstractNumId w:val="0"/>
   </w:num>
-  <w:num w:numId="3" w16cid:durableId="298414976">
+  <w:num w:numId="3" w16cid:durableId="517893159">
     <w:abstractNumId w:val="1"/>
   </w:num>
-  <w:num w:numId="4" w16cid:durableId="852569369">
+  <w:num w:numId="4" w16cid:durableId="850069354">
     <w:abstractNumId w:val="1"/>
   </w:num>
-  <w:num w:numId="5" w16cid:durableId="1909415431">
+  <w:num w:numId="5" w16cid:durableId="468017786">
     <w:abstractNumId w:val="1"/>
   </w:num>
-  <w:num w:numId="6" w16cid:durableId="1929071043">
+  <w:num w:numId="6" w16cid:durableId="32731662">
     <w:abstractNumId w:val="1"/>
   </w:num>
-  <w:num w:numId="7" w16cid:durableId="1793786731">
+  <w:num w:numId="7" w16cid:durableId="884415866">
     <w:abstractNumId w:val="1"/>
   </w:num>
-  <w:num w:numId="8" w16cid:durableId="1440642597">
+  <w:num w:numId="8" w16cid:durableId="213779591">
     <w:abstractNumId w:val="1"/>
   </w:num>
-  <w:num w:numId="9" w16cid:durableId="83386362">
+  <w:num w:numId="9" w16cid:durableId="356740405">
     <w:abstractNumId w:val="1"/>
   </w:num>
-  <w:num w:numId="10" w16cid:durableId="741483801">
+  <w:num w:numId="10" w16cid:durableId="1684434061">
     <w:abstractNumId w:val="1"/>
   </w:num>
-  <w:num w:numId="11" w16cid:durableId="84806788">
+  <w:num w:numId="11" w16cid:durableId="1870411811">
     <w:abstractNumId w:val="2"/>
     <w:lvlOverride w:ilvl="0">
       <w:startOverride w:val="1"/>
@@ -5745,28 +5817,28 @@
       <w:startOverride w:val="1"/>
     </w:lvlOverride>
   </w:num>
-  <w:num w:numId="12" w16cid:durableId="1818912740">
+  <w:num w:numId="12" w16cid:durableId="1569337714">
     <w:abstractNumId w:val="1"/>
   </w:num>
-  <w:num w:numId="13" w16cid:durableId="754475708">
+  <w:num w:numId="13" w16cid:durableId="2107386608">
     <w:abstractNumId w:val="1"/>
   </w:num>
-  <w:num w:numId="14" w16cid:durableId="159473109">
+  <w:num w:numId="14" w16cid:durableId="1526215427">
     <w:abstractNumId w:val="1"/>
   </w:num>
-  <w:num w:numId="15" w16cid:durableId="326058945">
+  <w:num w:numId="15" w16cid:durableId="1340619158">
     <w:abstractNumId w:val="1"/>
   </w:num>
-  <w:num w:numId="16" w16cid:durableId="538859271">
+  <w:num w:numId="16" w16cid:durableId="2099324400">
     <w:abstractNumId w:val="1"/>
   </w:num>
-  <w:num w:numId="17" w16cid:durableId="657223072">
+  <w:num w:numId="17" w16cid:durableId="1227643426">
     <w:abstractNumId w:val="1"/>
   </w:num>
-  <w:num w:numId="18" w16cid:durableId="1190876972">
+  <w:num w:numId="18" w16cid:durableId="744450257">
     <w:abstractNumId w:val="1"/>
   </w:num>
-  <w:num w:numId="19" w16cid:durableId="1733768221">
+  <w:num w:numId="19" w16cid:durableId="1028799220">
     <w:abstractNumId w:val="2"/>
     <w:lvlOverride w:ilvl="0">
       <w:startOverride w:val="1"/>
@@ -5796,7 +5868,7 @@
       <w:startOverride w:val="1"/>
     </w:lvlOverride>
   </w:num>
-  <w:num w:numId="20" w16cid:durableId="1266041425">
+  <w:num w:numId="20" w16cid:durableId="1374497077">
     <w:abstractNumId w:val="3"/>
     <w:lvlOverride w:ilvl="0">
       <w:startOverride w:val="3"/>
@@ -5826,7 +5898,7 @@
       <w:startOverride w:val="3"/>
     </w:lvlOverride>
   </w:num>
-  <w:num w:numId="21" w16cid:durableId="1115948854">
+  <w:num w:numId="21" w16cid:durableId="2038389367">
     <w:abstractNumId w:val="1"/>
   </w:num>
 </w:numbering>

</xml_diff>